<commit_message>
edited paternity_content.docx - with bitlys and deleted comment
</commit_message>
<xml_diff>
--- a/docassemble/AKA2JBranding/data/templates/paternity_content.docx
+++ b/docassemble/AKA2JBranding/data/templates/paternity_content.docx
@@ -1,6 +1,6 @@
 
 <file path=word/document.xml><?xml version="1.0" encoding="utf-8"?>
-<w:document xmlns:wpc="http://schemas.microsoft.com/office/word/2010/wordprocessingCanvas" xmlns:cx="http://schemas.microsoft.com/office/drawing/2014/chartex" xmlns:cx1="http://schemas.microsoft.com/office/drawing/2015/9/8/chartex" xmlns:cx2="http://schemas.microsoft.com/office/drawing/2015/10/21/chartex" xmlns:cx3="http://schemas.microsoft.com/office/drawing/2016/5/9/chartex" xmlns:cx4="http://schemas.microsoft.com/office/drawing/2016/5/10/chartex" xmlns:cx5="http://schemas.microsoft.com/office/drawing/2016/5/11/chartex" xmlns:cx6="http://schemas.microsoft.com/office/drawing/2016/5/12/chartex" xmlns:cx7="http://schemas.microsoft.com/office/drawing/2016/5/13/chartex" xmlns:cx8="http://schemas.microsoft.com/office/drawing/2016/5/14/chartex" xmlns:mc="http://schemas.openxmlformats.org/markup-compatibility/2006" xmlns:aink="http://schemas.microsoft.com/office/drawing/2016/ink" xmlns:am3d="http://schemas.microsoft.com/office/drawing/2017/model3d" xmlns:o="urn:schemas-microsoft-com:office:office" xmlns:r="http://schemas.openxmlformats.org/officeDocument/2006/relationships" xmlns:m="http://schemas.openxmlformats.org/officeDocument/2006/math" xmlns:v="urn:schemas-microsoft-com:vml" xmlns:wp14="http://schemas.microsoft.com/office/word/2010/wordprocessingDrawing" xmlns:wp="http://schemas.openxmlformats.org/drawingml/2006/wordprocessingDrawing" xmlns:w10="urn:schemas-microsoft-com:office:word" xmlns:w="http://schemas.openxmlformats.org/wordprocessingml/2006/main" xmlns:w14="http://schemas.microsoft.com/office/word/2010/wordml" xmlns:w15="http://schemas.microsoft.com/office/word/2012/wordml" xmlns:w16cex="http://schemas.microsoft.com/office/word/2018/wordml/cex" xmlns:w16cid="http://schemas.microsoft.com/office/word/2016/wordml/cid" xmlns:w16="http://schemas.microsoft.com/office/word/2018/wordml" xmlns:w16sdtdh="http://schemas.microsoft.com/office/word/2020/wordml/sdtdatahash" xmlns:w16se="http://schemas.microsoft.com/office/word/2015/wordml/symex" xmlns:wpg="http://schemas.microsoft.com/office/word/2010/wordprocessingGroup" xmlns:wpi="http://schemas.microsoft.com/office/word/2010/wordprocessingInk" xmlns:wne="http://schemas.microsoft.com/office/word/2006/wordml" xmlns:wps="http://schemas.microsoft.com/office/word/2010/wordprocessingShape" mc:Ignorable="w14 w15 w16se w16cid w16 w16cex w16sdtdh wp14">
+<w:document xmlns:wpc="http://schemas.microsoft.com/office/word/2010/wordprocessingCanvas" xmlns:mc="http://schemas.openxmlformats.org/markup-compatibility/2006" xmlns:o="urn:schemas-microsoft-com:office:office" xmlns:r="http://schemas.openxmlformats.org/officeDocument/2006/relationships" xmlns:m="http://schemas.openxmlformats.org/officeDocument/2006/math" xmlns:v="urn:schemas-microsoft-com:vml" xmlns:wp14="http://schemas.microsoft.com/office/word/2010/wordprocessingDrawing" xmlns:wp="http://schemas.openxmlformats.org/drawingml/2006/wordprocessingDrawing" xmlns:w10="urn:schemas-microsoft-com:office:word" xmlns:w="http://schemas.openxmlformats.org/wordprocessingml/2006/main" xmlns:w14="http://schemas.microsoft.com/office/word/2010/wordml" xmlns:wpg="http://schemas.microsoft.com/office/word/2010/wordprocessingGroup" xmlns:wpi="http://schemas.microsoft.com/office/word/2010/wordprocessingInk" xmlns:wne="http://schemas.microsoft.com/office/word/2006/wordml" xmlns:wps="http://schemas.microsoft.com/office/word/2010/wordprocessingShape" mc:Ignorable="w14 wp14">
   <w:body>
     <w:p>
       <w:pPr>
@@ -45,17 +45,50 @@
         <w:rPr>
           <w:color w:val="FF0000"/>
         </w:rPr>
-        <w:t>{% if user_need in('custody', 'answer custody') %}</w:t>
-      </w:r>
-      <w:r>
-        <w:t>Establishing or disestablishing paternity in your custody case</w:t>
-      </w:r>
+        <w:t xml:space="preserve">{% if </w:t>
+      </w:r>
+      <w:proofErr w:type="spellStart"/>
       <w:r>
         <w:rPr>
           <w:color w:val="FF0000"/>
         </w:rPr>
+        <w:t>user_need</w:t>
+      </w:r>
+      <w:proofErr w:type="spellEnd"/>
+      <w:r>
+        <w:rPr>
+          <w:color w:val="FF0000"/>
+        </w:rPr>
+        <w:t xml:space="preserve"> </w:t>
+      </w:r>
+      <w:proofErr w:type="gramStart"/>
+      <w:r>
+        <w:rPr>
+          <w:color w:val="FF0000"/>
+        </w:rPr>
+        <w:t>in(</w:t>
+      </w:r>
+      <w:proofErr w:type="gramEnd"/>
+      <w:r>
+        <w:rPr>
+          <w:color w:val="FF0000"/>
+        </w:rPr>
+        <w:t>'custody', 'answer custody') %}</w:t>
+      </w:r>
+      <w:r>
+        <w:t xml:space="preserve">Establishing or disestablishing paternity in your custody </w:t>
+      </w:r>
+      <w:proofErr w:type="gramStart"/>
+      <w:r>
+        <w:t>case</w:t>
+      </w:r>
+      <w:r>
+        <w:rPr>
+          <w:color w:val="FF0000"/>
+        </w:rPr>
         <w:t>{</w:t>
       </w:r>
+      <w:proofErr w:type="gramEnd"/>
       <w:r>
         <w:rPr>
           <w:color w:val="FF0000"/>
@@ -138,18 +171,7 @@
         </w:numPr>
       </w:pPr>
       <w:r>
-        <w:t xml:space="preserve">The mother, legal father and biological father sign an affidavit </w:t>
-      </w:r>
-      <w:commentRangeStart w:id="0"/>
-      <w:r>
-        <w:t>stating</w:t>
-      </w:r>
-      <w:commentRangeEnd w:id="0"/>
-      <w:r>
-        <w:commentReference w:id="0"/>
-      </w:r>
-      <w:r>
-        <w:t xml:space="preserve"> the biological father. Fill out:</w:t>
+        <w:t>The mother, legal father and biological father sign an affidavit stating the biological father. Fill out:</w:t>
       </w:r>
       <w:r>
         <w:br/>
@@ -163,7 +185,7 @@
       <w:r>
         <w:t xml:space="preserve"> | [</w:t>
       </w:r>
-      <w:hyperlink r:id="rId8">
+      <w:hyperlink r:id="rId6">
         <w:r>
           <w:rPr>
             <w:rStyle w:val="Hyperlink"/>
@@ -216,7 +238,7 @@
         </w:rPr>
         <w:t xml:space="preserve"> [</w:t>
       </w:r>
-      <w:hyperlink r:id="rId9" w:history="1">
+      <w:hyperlink r:id="rId7" w:history="1">
         <w:r>
           <w:rPr>
             <w:rStyle w:val="Hyperlink"/>
@@ -237,62 +259,6 @@
         </w:rPr>
         <w:t>]</w:t>
       </w:r>
-      <w:r>
-        <w:rPr>
-          <w:b/>
-        </w:rPr>
-        <w:t xml:space="preserve"> </w:t>
-      </w:r>
-    </w:p>
-    <w:p>
-      <w:pPr>
-        <w:pStyle w:val="ListParagraph"/>
-        <w:numPr>
-          <w:ilvl w:val="1"/>
-          <w:numId w:val="41"/>
-        </w:numPr>
-        <w:tabs>
-          <w:tab w:val="clear" w:pos="720"/>
-          <w:tab w:val="num" w:pos="840"/>
-        </w:tabs>
-        <w:ind w:left="840"/>
-      </w:pPr>
-      <w:r>
-        <w:rPr>
-          <w:b/>
-        </w:rPr>
-        <w:t xml:space="preserve">Order for Genetic (DNA) Testing, </w:t>
-      </w:r>
-      <w:r>
-        <w:rPr>
-          <w:b/>
-        </w:rPr>
-        <w:t>DR-531</w:t>
-      </w:r>
-      <w:r>
-        <w:rPr>
-          <w:bCs/>
-        </w:rPr>
-        <w:t xml:space="preserve"> [</w:t>
-      </w:r>
-      <w:hyperlink r:id="rId10" w:history="1">
-        <w:r>
-          <w:rPr>
-            <w:rStyle w:val="Hyperlink"/>
-            <w:bCs/>
-          </w:rPr>
-          <w:t>Fill-in PDF</w:t>
-        </w:r>
-      </w:hyperlink>
-      <w:r>
-        <w:rPr>
-          <w:bCs/>
-        </w:rPr>
-        <w:t>]</w:t>
-      </w:r>
-      <w:r>
-        <w:t xml:space="preserve"> </w:t>
-      </w:r>
     </w:p>
     <w:p>
       <w:pPr>
@@ -392,11 +358,11 @@
         <w:t>{% if user_need == 'divorce' %}</w:t>
       </w:r>
       <w:r>
-        <w:t xml:space="preserve">Courts use genetic testing, more commonly called "DNA testing," to establish or disestablish paternity. To take the test, a DNA sample is collected using a swab, similar to a Q-Tip, inside the cheek to pick up cells. Samples </w:t>
+        <w:t xml:space="preserve">Courts use genetic testing, more commonly called "DNA testing," to establish or disestablish paternity. To take the test, a DNA sample is collected using a swab, similar to a Q-Tip, inside the cheek to pick up cells. Samples are collected from the mother, the child, and the person who may be the father. The </w:t>
       </w:r>
       <w:r>
         <w:lastRenderedPageBreak/>
-        <w:t>are collected from the mother, the child, and the person who may be the father. The testing is painless and the whole process takes about 15 minutes. Once all the samples have been collected, the result is ready within about 3 weeks.</w:t>
+        <w:t>testing is painless and the whole process takes about 15 minutes. Once all the samples have been collected, the result is ready within about 3 weeks.</w:t>
       </w:r>
     </w:p>
     <w:p>
@@ -419,11 +385,10 @@
         <w:t>In Cour</w:t>
       </w:r>
       <w:r>
-        <w:t>t: Once you open a case to end your marriage, you can file:</w:t>
-      </w:r>
-      <w:r>
-        <w:br/>
-        <w:t xml:space="preserve">a </w:t>
+        <w:t xml:space="preserve">t: Once you open a case to </w:t>
+      </w:r>
+      <w:r>
+        <w:t xml:space="preserve">end your marriage, you can file a </w:t>
       </w:r>
       <w:r>
         <w:rPr>
@@ -437,7 +402,7 @@
         </w:rPr>
         <w:t xml:space="preserve"> [</w:t>
       </w:r>
-      <w:hyperlink r:id="rId11" w:history="1">
+      <w:hyperlink r:id="rId8" w:history="1">
         <w:r>
           <w:rPr>
             <w:rStyle w:val="Hyperlink"/>
@@ -458,57 +423,6 @@
         </w:rPr>
         <w:t>]</w:t>
       </w:r>
-      <w:r>
-        <w:rPr>
-          <w:b/>
-        </w:rPr>
-        <w:t xml:space="preserve"> </w:t>
-      </w:r>
-      <w:r>
-        <w:rPr>
-          <w:bCs/>
-        </w:rPr>
-        <w:t>and</w:t>
-      </w:r>
-      <w:r>
-        <w:rPr>
-          <w:bCs/>
-        </w:rPr>
-        <w:t xml:space="preserve"> an</w:t>
-      </w:r>
-      <w:r>
-        <w:rPr>
-          <w:bCs/>
-        </w:rPr>
-        <w:br/>
-      </w:r>
-      <w:r>
-        <w:rPr>
-          <w:b/>
-        </w:rPr>
-        <w:t>Order for Genetic (DNA) Testing, DR-531</w:t>
-      </w:r>
-      <w:r>
-        <w:rPr>
-          <w:bCs/>
-        </w:rPr>
-        <w:t xml:space="preserve"> [</w:t>
-      </w:r>
-      <w:hyperlink r:id="rId12" w:history="1">
-        <w:r>
-          <w:rPr>
-            <w:rStyle w:val="Hyperlink"/>
-            <w:bCs/>
-          </w:rPr>
-          <w:t>Fill-in PDF</w:t>
-        </w:r>
-      </w:hyperlink>
-      <w:r>
-        <w:rPr>
-          <w:bCs/>
-        </w:rPr>
-        <w:t>]</w:t>
-      </w:r>
     </w:p>
     <w:p>
       <w:pPr>
@@ -610,23 +524,47 @@
       <w:r>
         <w:t xml:space="preserve">See CSED's </w:t>
       </w:r>
-      <w:hyperlink r:id="rId13" w:history="1">
+      <w:hyperlink r:id="rId9" w:history="1">
         <w:r>
           <w:rPr>
             <w:rStyle w:val="Hyperlink"/>
           </w:rPr>
-          <w:t>Paternity Establishment FAQ</w:t>
+          <w:t>Paternity Establish</w:t>
         </w:r>
-      </w:hyperlink>
-      <w:r>
-        <w:t xml:space="preserve"> and </w:t>
-      </w:r>
-      <w:hyperlink r:id="rId14" w:history="1">
         <w:r>
           <w:rPr>
             <w:rStyle w:val="Hyperlink"/>
           </w:rPr>
-          <w:t>contact CSED</w:t>
+          <w:t>m</w:t>
+        </w:r>
+        <w:r>
+          <w:rPr>
+            <w:rStyle w:val="Hyperlink"/>
+          </w:rPr>
+          <w:t>ent FAQ</w:t>
+        </w:r>
+      </w:hyperlink>
+      <w:r>
+        <w:t xml:space="preserve"> and </w:t>
+      </w:r>
+      <w:hyperlink r:id="rId10" w:history="1">
+        <w:r>
+          <w:rPr>
+            <w:rStyle w:val="Hyperlink"/>
+          </w:rPr>
+          <w:t>con</w:t>
+        </w:r>
+        <w:r>
+          <w:rPr>
+            <w:rStyle w:val="Hyperlink"/>
+          </w:rPr>
+          <w:t>t</w:t>
+        </w:r>
+        <w:r>
+          <w:rPr>
+            <w:rStyle w:val="Hyperlink"/>
+          </w:rPr>
+          <w:t>act CSED</w:t>
         </w:r>
       </w:hyperlink>
       <w:r>
@@ -708,11 +646,11 @@
         <w:pStyle w:val="Body"/>
       </w:pPr>
       <w:r>
-        <w:t xml:space="preserve"> If a parent thinks the husband is not the biological or adopted father of a child born during the marriage, that parent can ask the court to remove the husband’s rights and </w:t>
+        <w:t xml:space="preserve"> If a parent thinks the husband is not the biological or adopted father of a child born during the marriage, that parent can ask the court to remove the husband’s rights and responsibilities for that child. This is called “disestablishing paternity.” You need clear </w:t>
       </w:r>
       <w:r>
         <w:lastRenderedPageBreak/>
-        <w:t>responsibilities for that child. This is called “disestablishing paternity.” You need clear and convincing evidence. There are different ways to do this depending on the situation so you need to figure out what will work in your case. Some options are:</w:t>
+        <w:t>and convincing evidence. There are different ways to do this depending on the situation so you need to figure out what will work in your case. Some options are:</w:t>
       </w:r>
     </w:p>
     <w:p>
@@ -737,9 +675,12 @@
         <w:t>Three-Way Affidavit to Disestablish and Establish Paternity, DR-521</w:t>
       </w:r>
       <w:r>
-        <w:t xml:space="preserve"> | [</w:t>
-      </w:r>
-      <w:hyperlink r:id="rId15">
+        <w:t xml:space="preserve"> </w:t>
+      </w:r>
+      <w:r>
+        <w:t>[</w:t>
+      </w:r>
+      <w:hyperlink r:id="rId11">
         <w:r>
           <w:rPr>
             <w:rStyle w:val="Hyperlink"/>
@@ -874,7 +815,267 @@
         </w:rPr>
         <w:t xml:space="preserve"> [</w:t>
       </w:r>
-      <w:hyperlink r:id="rId16" w:history="1">
+      <w:hyperlink r:id="rId12" w:history="1">
+        <w:r>
+          <w:rPr>
+            <w:rStyle w:val="Hyperlink"/>
+          </w:rPr>
+          <w:t>F</w:t>
+        </w:r>
+        <w:r>
+          <w:rPr>
+            <w:rStyle w:val="Hyperlink"/>
+            <w:bCs/>
+          </w:rPr>
+          <w:t>ill-I</w:t>
+        </w:r>
+        <w:r>
+          <w:rPr>
+            <w:rStyle w:val="Hyperlink"/>
+            <w:bCs/>
+          </w:rPr>
+          <w:t>n PDF</w:t>
+        </w:r>
+      </w:hyperlink>
+      <w:r>
+        <w:rPr>
+          <w:bCs/>
+        </w:rPr>
+        <w:t>]</w:t>
+      </w:r>
+      <w:r>
+        <w:rPr>
+          <w:color w:val="FF0000"/>
+        </w:rPr>
+        <w:t xml:space="preserve"> </w:t>
+      </w:r>
+      <w:r>
+        <w:rPr>
+          <w:color w:val="FF0000"/>
+        </w:rPr>
+        <w:t xml:space="preserve">{% </w:t>
+      </w:r>
+      <w:proofErr w:type="spellStart"/>
+      <w:r>
+        <w:rPr>
+          <w:color w:val="FF0000"/>
+        </w:rPr>
+        <w:t>endif</w:t>
+      </w:r>
+      <w:proofErr w:type="spellEnd"/>
+      <w:r>
+        <w:rPr>
+          <w:color w:val="FF0000"/>
+        </w:rPr>
+        <w:t xml:space="preserve"> %}</w:t>
+      </w:r>
+    </w:p>
+    <w:p>
+      <w:pPr>
+        <w:pStyle w:val="Heading3"/>
+      </w:pPr>
+      <w:r>
+        <w:t>Change the birth certificate</w:t>
+      </w:r>
+    </w:p>
+    <w:p>
+      <w:pPr>
+        <w:pStyle w:val="Body"/>
+        <w:spacing w:before="280" w:after="280"/>
+      </w:pPr>
+      <w:r>
+        <w:t>If the court decides that the biological father is someone not listed on the birth certificate, you must send a copy of the court order to the Health Analytics &amp; Vital Records to change the birth certificate. After the birth certificate is changed, the child is considered "legitimated" and the heir of that father. This means that if the child should be eligible for any medical or financial benefits connected to the father such as health insurance, or benefits based on military service or being Alaska Native or American Indian. Also, if the father dies, the child will be able to inherit and collect financial or medical benefits that the child may be eligible for such as Social Security Children's Insurance Benefits or military benefits. If you do not notify Health Analytics &amp; Vital Records to change the birth certificate, the child may miss out on these benefits.</w:t>
+      </w:r>
+    </w:p>
+    <w:p>
+      <w:pPr>
+        <w:pStyle w:val="Heading3"/>
+      </w:pPr>
+      <w:r>
+        <w:t>Links in this step</w:t>
+      </w:r>
+    </w:p>
+    <w:p>
+      <w:pPr>
+        <w:pStyle w:val="Body"/>
+        <w:spacing w:before="280" w:after="280"/>
+        <w:rPr>
+          <w:color w:val="FF0000"/>
+        </w:rPr>
+      </w:pPr>
+      <w:r>
+        <w:rPr>
+          <w:color w:val="FF0000"/>
+        </w:rPr>
+        <w:t>{%</w:t>
+      </w:r>
+      <w:r>
+        <w:rPr>
+          <w:color w:val="FF0000"/>
+        </w:rPr>
+        <w:t>p</w:t>
+      </w:r>
+      <w:r>
+        <w:rPr>
+          <w:color w:val="FF0000"/>
+        </w:rPr>
+        <w:t xml:space="preserve"> if </w:t>
+      </w:r>
+      <w:proofErr w:type="spellStart"/>
+      <w:r>
+        <w:rPr>
+          <w:color w:val="FF0000"/>
+        </w:rPr>
+        <w:t>user_</w:t>
+      </w:r>
+      <w:proofErr w:type="gramStart"/>
+      <w:r>
+        <w:rPr>
+          <w:color w:val="FF0000"/>
+        </w:rPr>
+        <w:t>need</w:t>
+      </w:r>
+      <w:proofErr w:type="spellEnd"/>
+      <w:r>
+        <w:rPr>
+          <w:color w:val="FF0000"/>
+        </w:rPr>
+        <w:t xml:space="preserve"> !</w:t>
+      </w:r>
+      <w:proofErr w:type="gramEnd"/>
+      <w:r>
+        <w:rPr>
+          <w:color w:val="FF0000"/>
+        </w:rPr>
+        <w:t>= 'divorce' %}</w:t>
+      </w:r>
+    </w:p>
+    <w:p>
+      <w:pPr>
+        <w:pStyle w:val="Body"/>
+        <w:spacing w:before="280" w:after="280"/>
+        <w:rPr>
+          <w:rStyle w:val="Hyperlink"/>
+          <w:color w:val="auto"/>
+        </w:rPr>
+      </w:pPr>
+      <w:r>
+        <w:rPr>
+          <w:b/>
+        </w:rPr>
+        <w:lastRenderedPageBreak/>
+        <w:t>Three-Way Affidavit to Disestablish and Establish Paternity, DR-521</w:t>
+      </w:r>
+      <w:r>
+        <w:t xml:space="preserve"> [</w:t>
+      </w:r>
+      <w:hyperlink r:id="rId13">
+        <w:r>
+          <w:rPr>
+            <w:rStyle w:val="Hyperlink"/>
+          </w:rPr>
+          <w:t>Fill-in PDF</w:t>
+        </w:r>
+      </w:hyperlink>
+      <w:proofErr w:type="gramStart"/>
+      <w:r>
+        <w:rPr>
+          <w:rStyle w:val="Hyperlink"/>
+        </w:rPr>
+        <w:t>]</w:t>
+      </w:r>
+      <w:proofErr w:type="gramEnd"/>
+      <w:r>
+        <w:rPr>
+          <w:rStyle w:val="Hyperlink"/>
+        </w:rPr>
+        <w:br/>
+      </w:r>
+      <w:hyperlink r:id="rId14" w:history="1">
+        <w:r>
+          <w:rPr>
+            <w:rStyle w:val="Hyperlink"/>
+          </w:rPr>
+          <w:t>ak-courts.info/dr521</w:t>
+        </w:r>
+      </w:hyperlink>
+    </w:p>
+    <w:p>
+      <w:pPr>
+        <w:pStyle w:val="Body"/>
+        <w:spacing w:before="280" w:after="280"/>
+        <w:rPr>
+          <w:rStyle w:val="Hyperlink"/>
+          <w:color w:val="FF0000"/>
+        </w:rPr>
+      </w:pPr>
+      <w:r>
+        <w:rPr>
+          <w:rStyle w:val="Hyperlink"/>
+          <w:color w:val="FF0000"/>
+        </w:rPr>
+        <w:t>{</w:t>
+      </w:r>
+      <w:r>
+        <w:rPr>
+          <w:rStyle w:val="Hyperlink"/>
+          <w:color w:val="FF0000"/>
+        </w:rPr>
+        <w:t>%</w:t>
+      </w:r>
+      <w:r>
+        <w:rPr>
+          <w:rStyle w:val="Hyperlink"/>
+          <w:color w:val="FF0000"/>
+        </w:rPr>
+        <w:t>p</w:t>
+      </w:r>
+      <w:r>
+        <w:rPr>
+          <w:rStyle w:val="Hyperlink"/>
+          <w:color w:val="FF0000"/>
+        </w:rPr>
+        <w:t xml:space="preserve"> </w:t>
+      </w:r>
+      <w:proofErr w:type="spellStart"/>
+      <w:r>
+        <w:rPr>
+          <w:rStyle w:val="Hyperlink"/>
+          <w:color w:val="FF0000"/>
+        </w:rPr>
+        <w:t>endif</w:t>
+      </w:r>
+      <w:proofErr w:type="spellEnd"/>
+      <w:r>
+        <w:rPr>
+          <w:rStyle w:val="Hyperlink"/>
+          <w:color w:val="FF0000"/>
+        </w:rPr>
+        <w:t xml:space="preserve"> %</w:t>
+      </w:r>
+      <w:r>
+        <w:rPr>
+          <w:rStyle w:val="Hyperlink"/>
+          <w:color w:val="FF0000"/>
+        </w:rPr>
+        <w:t>}</w:t>
+      </w:r>
+    </w:p>
+    <w:p>
+      <w:pPr>
+        <w:pStyle w:val="Body"/>
+        <w:spacing w:before="280" w:after="280"/>
+      </w:pPr>
+      <w:r>
+        <w:rPr>
+          <w:b/>
+        </w:rPr>
+        <w:t>Motion &amp; Affidavit for Genetic (DNA) Testing, DR-530</w:t>
+      </w:r>
+      <w:r>
+        <w:t xml:space="preserve"> [</w:t>
+      </w:r>
+      <w:hyperlink r:id="rId15" w:history="1">
         <w:r>
           <w:rPr>
             <w:rStyle w:val="Hyperlink"/>
@@ -889,250 +1090,81 @@
           <w:t>ill-in PDF</w:t>
         </w:r>
       </w:hyperlink>
-      <w:r>
-        <w:rPr>
-          <w:bCs/>
-        </w:rPr>
+      <w:proofErr w:type="gramStart"/>
+      <w:r>
         <w:t>]</w:t>
       </w:r>
-      <w:r>
-        <w:rPr>
-          <w:b/>
-        </w:rPr>
-        <w:t xml:space="preserve"> </w:t>
-      </w:r>
-    </w:p>
-    <w:p>
-      <w:pPr>
-        <w:pStyle w:val="ListParagraph"/>
-        <w:numPr>
-          <w:ilvl w:val="1"/>
-          <w:numId w:val="41"/>
-        </w:numPr>
-        <w:tabs>
-          <w:tab w:val="clear" w:pos="720"/>
-          <w:tab w:val="num" w:pos="840"/>
-        </w:tabs>
-        <w:ind w:left="840"/>
-      </w:pPr>
-      <w:r>
-        <w:rPr>
-          <w:b/>
-        </w:rPr>
-        <w:t>Order for Genetic (</w:t>
-      </w:r>
-      <w:r>
-        <w:t>DNA</w:t>
-      </w:r>
-      <w:r>
-        <w:rPr>
-          <w:b/>
-        </w:rPr>
-        <w:t>) Testing, DR-531</w:t>
-      </w:r>
-      <w:r>
-        <w:rPr>
-          <w:bCs/>
-        </w:rPr>
-        <w:t xml:space="preserve"> [</w:t>
-      </w:r>
-      <w:hyperlink r:id="rId17" w:history="1">
+      <w:proofErr w:type="gramEnd"/>
+      <w:r>
+        <w:br/>
+      </w:r>
+      <w:hyperlink r:id="rId16" w:history="1">
         <w:r>
           <w:rPr>
             <w:rStyle w:val="Hyperlink"/>
-            <w:bCs/>
+            <w:spacing w:val="0"/>
           </w:rPr>
-          <w:t>Fill-in PDF</w:t>
+          <w:t>ak-courts.info/dr530</w:t>
         </w:r>
       </w:hyperlink>
-      <w:r>
-        <w:rPr>
-          <w:bCs/>
-        </w:rPr>
-        <w:t>]</w:t>
-      </w:r>
-      <w:r>
-        <w:rPr>
-          <w:color w:val="FF0000"/>
-        </w:rPr>
-        <w:t>{% endif %}</w:t>
-      </w:r>
     </w:p>
     <w:p>
       <w:pPr>
-        <w:pStyle w:val="Heading3"/>
-      </w:pPr>
-      <w:r>
-        <w:t>Change the birth certificate</w:t>
+        <w:pStyle w:val="Body"/>
+      </w:pPr>
+      <w:r>
+        <w:rPr>
+          <w:color w:val="FF0000"/>
+        </w:rPr>
+        <w:t>{%</w:t>
+      </w:r>
+      <w:r>
+        <w:rPr>
+          <w:color w:val="FF0000"/>
+        </w:rPr>
+        <w:t>p</w:t>
+      </w:r>
+      <w:r>
+        <w:rPr>
+          <w:color w:val="FF0000"/>
+        </w:rPr>
+        <w:t xml:space="preserve"> if </w:t>
+      </w:r>
+      <w:proofErr w:type="spellStart"/>
+      <w:r>
+        <w:rPr>
+          <w:color w:val="FF0000"/>
+        </w:rPr>
+        <w:t>user_need</w:t>
+      </w:r>
+      <w:proofErr w:type="spellEnd"/>
+      <w:r>
+        <w:rPr>
+          <w:color w:val="FF0000"/>
+        </w:rPr>
+        <w:t xml:space="preserve"> </w:t>
+      </w:r>
+      <w:proofErr w:type="gramStart"/>
+      <w:r>
+        <w:rPr>
+          <w:color w:val="FF0000"/>
+        </w:rPr>
+        <w:t>in(</w:t>
+      </w:r>
+      <w:proofErr w:type="gramEnd"/>
+      <w:r>
+        <w:rPr>
+          <w:color w:val="FF0000"/>
+        </w:rPr>
+        <w:t>'divorce', 'custody') %}</w:t>
       </w:r>
     </w:p>
     <w:p>
       <w:pPr>
         <w:pStyle w:val="Body"/>
-        <w:spacing w:before="280" w:after="280"/>
-      </w:pPr>
-      <w:r>
-        <w:t>If the court decides that the biological father is someone not listed on the birth certificate, you must send a copy of the court order to the Health Analytics &amp; Vital Records to change the birth certificate. After the birth certificate is changed, the child is considered "legitimated" and the heir of that father. This means that if the child should be eligible for any medical or financial benefits connected to the father such as health insurance, or benefits based on military service or being Alaska Native or American Indian. Also, if the father dies, the child will be able to inherit and collect financial or medical benefits that the child may be eligible for such as Social Security Children's Insurance Benefits or military benefits. If you do not notify Health Analytics &amp; Vital Records to change the birth certificate, the child may miss out on these benefits.</w:t>
-      </w:r>
-    </w:p>
-    <w:p>
-      <w:pPr>
-        <w:pStyle w:val="Heading3"/>
-      </w:pPr>
-      <w:r>
-        <w:t>Links in this step</w:t>
-      </w:r>
-    </w:p>
-    <w:p>
-      <w:pPr>
-        <w:pStyle w:val="Body"/>
-        <w:spacing w:before="280" w:after="280"/>
-        <w:rPr>
-          <w:rStyle w:val="Hyperlink"/>
-        </w:rPr>
-      </w:pPr>
-      <w:r>
-        <w:rPr>
-          <w:color w:val="FF0000"/>
-        </w:rPr>
-        <w:lastRenderedPageBreak/>
-        <w:t>{% if user_need != 'divorce' %}</w:t>
-      </w:r>
-      <w:r>
-        <w:rPr>
-          <w:b/>
-        </w:rPr>
-        <w:t>Three-Way Affidavit to Disestablish and Establish Paternity, DR-521</w:t>
-      </w:r>
-      <w:r>
-        <w:t xml:space="preserve"> | [</w:t>
-      </w:r>
-      <w:hyperlink r:id="rId18">
-        <w:r>
-          <w:rPr>
-            <w:rStyle w:val="Hyperlink"/>
-          </w:rPr>
-          <w:t>Fill-in PDF</w:t>
-        </w:r>
-      </w:hyperlink>
-      <w:r>
-        <w:rPr>
-          <w:rStyle w:val="Hyperlink"/>
-        </w:rPr>
-        <w:t>]</w:t>
-      </w:r>
-    </w:p>
-    <w:p>
-      <w:pPr>
-        <w:pStyle w:val="Body"/>
-        <w:spacing w:before="280" w:after="280"/>
-      </w:pPr>
-      <w:r>
-        <w:rPr>
-          <w:rStyle w:val="Hyperlink"/>
-          <w:color w:val="FF0000"/>
-        </w:rPr>
-        <w:t>{</w:t>
-      </w:r>
-      <w:r>
-        <w:rPr>
-          <w:rStyle w:val="Hyperlink"/>
-          <w:color w:val="FF0000"/>
-        </w:rPr>
-        <w:t>% endif %</w:t>
-      </w:r>
-      <w:r>
-        <w:rPr>
-          <w:rStyle w:val="Hyperlink"/>
-          <w:color w:val="FF0000"/>
-        </w:rPr>
-        <w:t>}</w:t>
-      </w:r>
-      <w:r>
-        <w:rPr>
-          <w:b/>
-        </w:rPr>
-        <w:t>Motion &amp; Affidavit for Genetic (DNA) Testing, DR-530</w:t>
-      </w:r>
-      <w:r>
-        <w:t xml:space="preserve"> [</w:t>
-      </w:r>
-      <w:hyperlink r:id="rId19" w:history="1">
-        <w:r>
-          <w:rPr>
-            <w:rStyle w:val="Hyperlink"/>
-          </w:rPr>
-          <w:t>F</w:t>
-        </w:r>
-        <w:r>
-          <w:rPr>
-            <w:rStyle w:val="Hyperlink"/>
-            <w:bCs/>
-          </w:rPr>
-          <w:t>ill-in PDF</w:t>
-        </w:r>
-      </w:hyperlink>
-      <w:r>
-        <w:t>]</w:t>
-      </w:r>
-      <w:r>
-        <w:br/>
-      </w:r>
-      <w:r>
-        <w:t>public.courts.alaska.gov/web/forms/docs/dr-530.pdf</w:t>
-      </w:r>
-    </w:p>
-    <w:p>
-      <w:pPr>
-        <w:pStyle w:val="Body"/>
-      </w:pPr>
-      <w:r>
-        <w:rPr>
-          <w:b/>
-        </w:rPr>
-        <w:t>Order for Genetic (</w:t>
-      </w:r>
-      <w:r>
-        <w:t>DNA</w:t>
-      </w:r>
-      <w:r>
-        <w:rPr>
-          <w:b/>
-        </w:rPr>
-        <w:t>) Testing, DR-531</w:t>
-      </w:r>
-      <w:r>
-        <w:t xml:space="preserve"> [</w:t>
-      </w:r>
-      <w:hyperlink r:id="rId20" w:history="1">
-        <w:r>
-          <w:rPr>
-            <w:rStyle w:val="Hyperlink"/>
-            <w:bCs/>
-          </w:rPr>
-          <w:t>Fill-in PDF</w:t>
-        </w:r>
-      </w:hyperlink>
-      <w:r>
-        <w:t>]</w:t>
-      </w:r>
-      <w:r>
-        <w:br/>
-        <w:t>public.courts.alaska.gov/web/forms/docs/dr-531.pdf</w:t>
-      </w:r>
-      <w:r>
-        <w:rPr>
-          <w:color w:val="FF0000"/>
-        </w:rPr>
-        <w:t>{% if user_need in('divorce', 'custody') %}</w:t>
-      </w:r>
-    </w:p>
-    <w:p>
-      <w:pPr>
-        <w:pStyle w:val="Body"/>
         <w:spacing w:before="280" w:after="0"/>
       </w:pPr>
-      <w:hyperlink r:id="rId21" w:history="1">
+      <w:hyperlink r:id="rId17" w:history="1">
         <w:r>
           <w:rPr>
             <w:rStyle w:val="Hyperlink"/>
@@ -1143,12 +1175,20 @@
       <w:r>
         <w:br/>
       </w:r>
-      <w:r>
-        <w:t>childsupport.alaska.gov/child-support-services/information/faqs/paternity-establishment-faq</w:t>
-      </w:r>
+      <w:hyperlink r:id="rId18" w:history="1">
+        <w:r>
+          <w:rPr>
+            <w:rStyle w:val="Hyperlink"/>
+            <w:spacing w:val="0"/>
+          </w:rPr>
+          <w:t>childsupport.alaska.gov/child-support-services/information/faqs/paternity-establishment-faq</w:t>
+        </w:r>
+      </w:hyperlink>
+      <w:bookmarkStart w:id="0" w:name="_GoBack"/>
+      <w:bookmarkEnd w:id="0"/>
     </w:p>
     <w:p>
-      <w:hyperlink r:id="rId22" w:history="1">
+      <w:hyperlink r:id="rId19" w:history="1">
         <w:r>
           <w:rPr>
             <w:rStyle w:val="Hyperlink"/>
@@ -1158,13 +1198,58 @@
       </w:hyperlink>
       <w:r>
         <w:br/>
-        <w:t>childsupport.alaska.gov/child-support-services/contact-us{</w:t>
-      </w:r>
+      </w:r>
+      <w:hyperlink r:id="rId20" w:history="1">
+        <w:r>
+          <w:rPr>
+            <w:rStyle w:val="Hyperlink"/>
+            <w:rFonts w:ascii="Arial" w:hAnsi="Arial" w:cs="Arial"/>
+            <w:spacing w:val="0"/>
+            <w:sz w:val="22"/>
+            <w:szCs w:val="22"/>
+          </w:rPr>
+          <w:t>childsupport.alaska.gov/child-support-services/contact-us</w:t>
+        </w:r>
+      </w:hyperlink>
+    </w:p>
+    <w:p>
       <w:r>
         <w:rPr>
           <w:color w:val="FF0000"/>
         </w:rPr>
-        <w:t>% endif %}</w:t>
+        <w:t>{</w:t>
+      </w:r>
+      <w:r>
+        <w:rPr>
+          <w:color w:val="FF0000"/>
+        </w:rPr>
+        <w:t>%</w:t>
+      </w:r>
+      <w:r>
+        <w:rPr>
+          <w:color w:val="FF0000"/>
+        </w:rPr>
+        <w:t>p</w:t>
+      </w:r>
+      <w:r>
+        <w:rPr>
+          <w:color w:val="FF0000"/>
+        </w:rPr>
+        <w:t xml:space="preserve"> </w:t>
+      </w:r>
+      <w:proofErr w:type="spellStart"/>
+      <w:r>
+        <w:rPr>
+          <w:color w:val="FF0000"/>
+        </w:rPr>
+        <w:t>endif</w:t>
+      </w:r>
+      <w:proofErr w:type="spellEnd"/>
+      <w:r>
+        <w:rPr>
+          <w:color w:val="FF0000"/>
+        </w:rPr>
+        <w:t xml:space="preserve"> %}</w:t>
       </w:r>
     </w:p>
     <w:sectPr>
@@ -1175,24 +1260,6 @@
     </w:sectPr>
   </w:body>
 </w:document>
-</file>
-
-<file path=word/comments.xml><?xml version="1.0" encoding="utf-8"?>
-<w:comments xmlns:wpc="http://schemas.microsoft.com/office/word/2010/wordprocessingCanvas" xmlns:cx="http://schemas.microsoft.com/office/drawing/2014/chartex" xmlns:cx1="http://schemas.microsoft.com/office/drawing/2015/9/8/chartex" xmlns:cx2="http://schemas.microsoft.com/office/drawing/2015/10/21/chartex" xmlns:cx3="http://schemas.microsoft.com/office/drawing/2016/5/9/chartex" xmlns:cx4="http://schemas.microsoft.com/office/drawing/2016/5/10/chartex" xmlns:cx5="http://schemas.microsoft.com/office/drawing/2016/5/11/chartex" xmlns:cx6="http://schemas.microsoft.com/office/drawing/2016/5/12/chartex" xmlns:cx7="http://schemas.microsoft.com/office/drawing/2016/5/13/chartex" xmlns:cx8="http://schemas.microsoft.com/office/drawing/2016/5/14/chartex" xmlns:mc="http://schemas.openxmlformats.org/markup-compatibility/2006" xmlns:aink="http://schemas.microsoft.com/office/drawing/2016/ink" xmlns:am3d="http://schemas.microsoft.com/office/drawing/2017/model3d" xmlns:o="urn:schemas-microsoft-com:office:office" xmlns:r="http://schemas.openxmlformats.org/officeDocument/2006/relationships" xmlns:m="http://schemas.openxmlformats.org/officeDocument/2006/math" xmlns:v="urn:schemas-microsoft-com:vml" xmlns:wp14="http://schemas.microsoft.com/office/word/2010/wordprocessingDrawing" xmlns:wp="http://schemas.openxmlformats.org/drawingml/2006/wordprocessingDrawing" xmlns:w10="urn:schemas-microsoft-com:office:word" xmlns:w="http://schemas.openxmlformats.org/wordprocessingml/2006/main" xmlns:w14="http://schemas.microsoft.com/office/word/2010/wordml" xmlns:w15="http://schemas.microsoft.com/office/word/2012/wordml" xmlns:w16cex="http://schemas.microsoft.com/office/word/2018/wordml/cex" xmlns:w16cid="http://schemas.microsoft.com/office/word/2016/wordml/cid" xmlns:w16="http://schemas.microsoft.com/office/word/2018/wordml" xmlns:w16sdtdh="http://schemas.microsoft.com/office/word/2020/wordml/sdtdatahash" xmlns:w16se="http://schemas.microsoft.com/office/word/2015/wordml/symex" xmlns:wpg="http://schemas.microsoft.com/office/word/2010/wordprocessingGroup" xmlns:wpi="http://schemas.microsoft.com/office/word/2010/wordprocessingInk" xmlns:wne="http://schemas.microsoft.com/office/word/2006/wordml" xmlns:wps="http://schemas.microsoft.com/office/word/2010/wordprocessingShape" mc:Ignorable="w14 w15 w16se w16cid w16 w16cex w16sdtdh wp14">
-  <w:comment w:id="0" w:author="Caroline Robinson [2]" w:date="2026-04-05T09:57:00Z" w:initials="CR">
-    <w:p>
-      <w:r>
-        <w:rPr>
-          <w:rFonts w:ascii="Liberation Serif" w:eastAsia="Segoe UI" w:hAnsi="Liberation Serif" w:cs="Tahoma"/>
-          <w:sz w:val="24"/>
-          <w:szCs w:val="24"/>
-          <w:lang w:bidi="en-US"/>
-        </w:rPr>
-        <w:t xml:space="preserve">that explains their relationship to the children and names the children's biological parents and current legal father. , </w:t>
-      </w:r>
-    </w:p>
-  </w:comment>
-</w:comments>
 </file>
 
 <file path=word/commentsExtended.xml><?xml version="1.0" encoding="utf-8"?>
@@ -1208,8 +1275,8 @@
 </file>
 
 <file path=word/numbering.xml><?xml version="1.0" encoding="utf-8"?>
-<w:numbering xmlns:wpc="http://schemas.microsoft.com/office/word/2010/wordprocessingCanvas" xmlns:cx="http://schemas.microsoft.com/office/drawing/2014/chartex" xmlns:cx1="http://schemas.microsoft.com/office/drawing/2015/9/8/chartex" xmlns:cx2="http://schemas.microsoft.com/office/drawing/2015/10/21/chartex" xmlns:cx3="http://schemas.microsoft.com/office/drawing/2016/5/9/chartex" xmlns:cx4="http://schemas.microsoft.com/office/drawing/2016/5/10/chartex" xmlns:cx5="http://schemas.microsoft.com/office/drawing/2016/5/11/chartex" xmlns:cx6="http://schemas.microsoft.com/office/drawing/2016/5/12/chartex" xmlns:cx7="http://schemas.microsoft.com/office/drawing/2016/5/13/chartex" xmlns:cx8="http://schemas.microsoft.com/office/drawing/2016/5/14/chartex" xmlns:mc="http://schemas.openxmlformats.org/markup-compatibility/2006" xmlns:aink="http://schemas.microsoft.com/office/drawing/2016/ink" xmlns:am3d="http://schemas.microsoft.com/office/drawing/2017/model3d" xmlns:o="urn:schemas-microsoft-com:office:office" xmlns:r="http://schemas.openxmlformats.org/officeDocument/2006/relationships" xmlns:m="http://schemas.openxmlformats.org/officeDocument/2006/math" xmlns:v="urn:schemas-microsoft-com:vml" xmlns:wp14="http://schemas.microsoft.com/office/word/2010/wordprocessingDrawing" xmlns:wp="http://schemas.openxmlformats.org/drawingml/2006/wordprocessingDrawing" xmlns:w10="urn:schemas-microsoft-com:office:word" xmlns:w="http://schemas.openxmlformats.org/wordprocessingml/2006/main" xmlns:w14="http://schemas.microsoft.com/office/word/2010/wordml" xmlns:w15="http://schemas.microsoft.com/office/word/2012/wordml" xmlns:w16cex="http://schemas.microsoft.com/office/word/2018/wordml/cex" xmlns:w16cid="http://schemas.microsoft.com/office/word/2016/wordml/cid" xmlns:w16="http://schemas.microsoft.com/office/word/2018/wordml" xmlns:w16sdtdh="http://schemas.microsoft.com/office/word/2020/wordml/sdtdatahash" xmlns:w16se="http://schemas.microsoft.com/office/word/2015/wordml/symex" xmlns:wpg="http://schemas.microsoft.com/office/word/2010/wordprocessingGroup" xmlns:wpi="http://schemas.microsoft.com/office/word/2010/wordprocessingInk" xmlns:wne="http://schemas.microsoft.com/office/word/2006/wordml" xmlns:wps="http://schemas.microsoft.com/office/word/2010/wordprocessingShape" mc:Ignorable="w14 w15 w16se w16cid w16 w16cex w16sdtdh wp14">
-  <w:abstractNum w:abstractNumId="0" w15:restartNumberingAfterBreak="0">
+<w:numbering xmlns:wpc="http://schemas.microsoft.com/office/word/2010/wordprocessingCanvas" xmlns:mc="http://schemas.openxmlformats.org/markup-compatibility/2006" xmlns:o="urn:schemas-microsoft-com:office:office" xmlns:r="http://schemas.openxmlformats.org/officeDocument/2006/relationships" xmlns:m="http://schemas.openxmlformats.org/officeDocument/2006/math" xmlns:v="urn:schemas-microsoft-com:vml" xmlns:wp14="http://schemas.microsoft.com/office/word/2010/wordprocessingDrawing" xmlns:wp="http://schemas.openxmlformats.org/drawingml/2006/wordprocessingDrawing" xmlns:w10="urn:schemas-microsoft-com:office:word" xmlns:w="http://schemas.openxmlformats.org/wordprocessingml/2006/main" xmlns:w14="http://schemas.microsoft.com/office/word/2010/wordml" xmlns:wpg="http://schemas.microsoft.com/office/word/2010/wordprocessingGroup" xmlns:wpi="http://schemas.microsoft.com/office/word/2010/wordprocessingInk" xmlns:wne="http://schemas.microsoft.com/office/word/2006/wordml" xmlns:wps="http://schemas.microsoft.com/office/word/2010/wordprocessingShape" mc:Ignorable="w14 wp14">
+  <w:abstractNum w:abstractNumId="0">
     <w:nsid w:val="073E10F3"/>
     <w:multiLevelType w:val="hybridMultilevel"/>
     <w:tmpl w:val="8504561E"/>
@@ -1321,7 +1388,7 @@
       </w:rPr>
     </w:lvl>
   </w:abstractNum>
-  <w:abstractNum w:abstractNumId="1" w15:restartNumberingAfterBreak="0">
+  <w:abstractNum w:abstractNumId="1">
     <w:nsid w:val="08C6366F"/>
     <w:multiLevelType w:val="hybridMultilevel"/>
     <w:tmpl w:val="D3561CAA"/>
@@ -1408,7 +1475,7 @@
       </w:pPr>
     </w:lvl>
   </w:abstractNum>
-  <w:abstractNum w:abstractNumId="2" w15:restartNumberingAfterBreak="0">
+  <w:abstractNum w:abstractNumId="2">
     <w:nsid w:val="09F353E3"/>
     <w:multiLevelType w:val="hybridMultilevel"/>
     <w:tmpl w:val="EE5CFEAC"/>
@@ -1521,7 +1588,7 @@
       </w:rPr>
     </w:lvl>
   </w:abstractNum>
-  <w:abstractNum w:abstractNumId="3" w15:restartNumberingAfterBreak="0">
+  <w:abstractNum w:abstractNumId="3">
     <w:nsid w:val="0C357DD6"/>
     <w:multiLevelType w:val="hybridMultilevel"/>
     <w:tmpl w:val="D83AD7E4"/>
@@ -1612,7 +1679,7 @@
       </w:pPr>
     </w:lvl>
   </w:abstractNum>
-  <w:abstractNum w:abstractNumId="4" w15:restartNumberingAfterBreak="0">
+  <w:abstractNum w:abstractNumId="4">
     <w:nsid w:val="0DEA069D"/>
     <w:multiLevelType w:val="multilevel"/>
     <w:tmpl w:val="450C4EF6"/>
@@ -1753,7 +1820,7 @@
       </w:rPr>
     </w:lvl>
   </w:abstractNum>
-  <w:abstractNum w:abstractNumId="5" w15:restartNumberingAfterBreak="0">
+  <w:abstractNum w:abstractNumId="5">
     <w:nsid w:val="1323523E"/>
     <w:multiLevelType w:val="multilevel"/>
     <w:tmpl w:val="873C83DA"/>
@@ -1910,7 +1977,7 @@
       </w:rPr>
     </w:lvl>
   </w:abstractNum>
-  <w:abstractNum w:abstractNumId="6" w15:restartNumberingAfterBreak="0">
+  <w:abstractNum w:abstractNumId="6">
     <w:nsid w:val="15510218"/>
     <w:multiLevelType w:val="hybridMultilevel"/>
     <w:tmpl w:val="8EF49D20"/>
@@ -2000,7 +2067,7 @@
       </w:pPr>
     </w:lvl>
   </w:abstractNum>
-  <w:abstractNum w:abstractNumId="7" w15:restartNumberingAfterBreak="0">
+  <w:abstractNum w:abstractNumId="7">
     <w:nsid w:val="253D4794"/>
     <w:multiLevelType w:val="multilevel"/>
     <w:tmpl w:val="8C80AB36"/>
@@ -2113,7 +2180,7 @@
       </w:rPr>
     </w:lvl>
   </w:abstractNum>
-  <w:abstractNum w:abstractNumId="8" w15:restartNumberingAfterBreak="0">
+  <w:abstractNum w:abstractNumId="8">
     <w:nsid w:val="27FF20A5"/>
     <w:multiLevelType w:val="hybridMultilevel"/>
     <w:tmpl w:val="9036D3D8"/>
@@ -2228,7 +2295,7 @@
       </w:rPr>
     </w:lvl>
   </w:abstractNum>
-  <w:abstractNum w:abstractNumId="9" w15:restartNumberingAfterBreak="0">
+  <w:abstractNum w:abstractNumId="9">
     <w:nsid w:val="296F3872"/>
     <w:multiLevelType w:val="hybridMultilevel"/>
     <w:tmpl w:val="5E9E6A2E"/>
@@ -2342,7 +2409,7 @@
       </w:rPr>
     </w:lvl>
   </w:abstractNum>
-  <w:abstractNum w:abstractNumId="10" w15:restartNumberingAfterBreak="0">
+  <w:abstractNum w:abstractNumId="10">
     <w:nsid w:val="3BB67316"/>
     <w:multiLevelType w:val="hybridMultilevel"/>
     <w:tmpl w:val="D2A20BEA"/>
@@ -2455,7 +2522,7 @@
       </w:rPr>
     </w:lvl>
   </w:abstractNum>
-  <w:abstractNum w:abstractNumId="11" w15:restartNumberingAfterBreak="0">
+  <w:abstractNum w:abstractNumId="11">
     <w:nsid w:val="416740F3"/>
     <w:multiLevelType w:val="hybridMultilevel"/>
     <w:tmpl w:val="F012AB78"/>
@@ -2568,7 +2635,7 @@
       </w:rPr>
     </w:lvl>
   </w:abstractNum>
-  <w:abstractNum w:abstractNumId="12" w15:restartNumberingAfterBreak="0">
+  <w:abstractNum w:abstractNumId="12">
     <w:nsid w:val="4803540D"/>
     <w:multiLevelType w:val="hybridMultilevel"/>
     <w:tmpl w:val="CC58063A"/>
@@ -2682,7 +2749,7 @@
       </w:rPr>
     </w:lvl>
   </w:abstractNum>
-  <w:abstractNum w:abstractNumId="13" w15:restartNumberingAfterBreak="0">
+  <w:abstractNum w:abstractNumId="13">
     <w:nsid w:val="492F4D8F"/>
     <w:multiLevelType w:val="hybridMultilevel"/>
     <w:tmpl w:val="F62C94DE"/>
@@ -2796,7 +2863,7 @@
       </w:rPr>
     </w:lvl>
   </w:abstractNum>
-  <w:abstractNum w:abstractNumId="14" w15:restartNumberingAfterBreak="0">
+  <w:abstractNum w:abstractNumId="14">
     <w:nsid w:val="527D4778"/>
     <w:multiLevelType w:val="hybridMultilevel"/>
     <w:tmpl w:val="EE8038B2"/>
@@ -2909,7 +2976,7 @@
       </w:rPr>
     </w:lvl>
   </w:abstractNum>
-  <w:abstractNum w:abstractNumId="15" w15:restartNumberingAfterBreak="0">
+  <w:abstractNum w:abstractNumId="15">
     <w:nsid w:val="5A0B13C4"/>
     <w:multiLevelType w:val="hybridMultilevel"/>
     <w:tmpl w:val="E84E7C10"/>
@@ -3022,7 +3089,7 @@
       </w:rPr>
     </w:lvl>
   </w:abstractNum>
-  <w:abstractNum w:abstractNumId="16" w15:restartNumberingAfterBreak="0">
+  <w:abstractNum w:abstractNumId="16">
     <w:nsid w:val="636B498A"/>
     <w:multiLevelType w:val="hybridMultilevel"/>
     <w:tmpl w:val="1032CF60"/>
@@ -3135,7 +3202,7 @@
       </w:rPr>
     </w:lvl>
   </w:abstractNum>
-  <w:abstractNum w:abstractNumId="17" w15:restartNumberingAfterBreak="0">
+  <w:abstractNum w:abstractNumId="17">
     <w:nsid w:val="6774194D"/>
     <w:multiLevelType w:val="hybridMultilevel"/>
     <w:tmpl w:val="9CD2C286"/>
@@ -3248,7 +3315,7 @@
       </w:rPr>
     </w:lvl>
   </w:abstractNum>
-  <w:abstractNum w:abstractNumId="18" w15:restartNumberingAfterBreak="0">
+  <w:abstractNum w:abstractNumId="18">
     <w:nsid w:val="6B961852"/>
     <w:multiLevelType w:val="hybridMultilevel"/>
     <w:tmpl w:val="DAAECE10"/>
@@ -3341,7 +3408,7 @@
       </w:pPr>
     </w:lvl>
   </w:abstractNum>
-  <w:abstractNum w:abstractNumId="19" w15:restartNumberingAfterBreak="0">
+  <w:abstractNum w:abstractNumId="19">
     <w:nsid w:val="7BAF36E9"/>
     <w:multiLevelType w:val="multilevel"/>
     <w:tmpl w:val="24180D92"/>
@@ -3624,7 +3691,7 @@
 </file>
 
 <file path=word/styles.xml><?xml version="1.0" encoding="utf-8"?>
-<w:styles xmlns:mc="http://schemas.openxmlformats.org/markup-compatibility/2006" xmlns:r="http://schemas.openxmlformats.org/officeDocument/2006/relationships" xmlns:w="http://schemas.openxmlformats.org/wordprocessingml/2006/main" xmlns:w14="http://schemas.microsoft.com/office/word/2010/wordml" xmlns:w15="http://schemas.microsoft.com/office/word/2012/wordml" xmlns:w16cex="http://schemas.microsoft.com/office/word/2018/wordml/cex" xmlns:w16cid="http://schemas.microsoft.com/office/word/2016/wordml/cid" xmlns:w16="http://schemas.microsoft.com/office/word/2018/wordml" xmlns:w16sdtdh="http://schemas.microsoft.com/office/word/2020/wordml/sdtdatahash" xmlns:w16se="http://schemas.microsoft.com/office/word/2015/wordml/symex" mc:Ignorable="w14 w15 w16se w16cid w16 w16cex w16sdtdh">
+<w:styles xmlns:mc="http://schemas.openxmlformats.org/markup-compatibility/2006" xmlns:r="http://schemas.openxmlformats.org/officeDocument/2006/relationships" xmlns:w="http://schemas.openxmlformats.org/wordprocessingml/2006/main" xmlns:w14="http://schemas.microsoft.com/office/word/2010/wordml" mc:Ignorable="w14">
   <w:docDefaults>
     <w:rPrDefault>
       <w:rPr>
@@ -3640,383 +3707,147 @@
       </w:pPr>
     </w:pPrDefault>
   </w:docDefaults>
-  <w:latentStyles w:defLockedState="0" w:defUIPriority="99" w:defSemiHidden="0" w:defUnhideWhenUsed="0" w:defQFormat="0" w:count="376">
-    <w:lsdException w:name="Normal" w:uiPriority="0" w:qFormat="1"/>
-    <w:lsdException w:name="heading 1" w:uiPriority="9" w:qFormat="1"/>
-    <w:lsdException w:name="heading 2" w:semiHidden="1" w:uiPriority="9" w:unhideWhenUsed="1" w:qFormat="1"/>
-    <w:lsdException w:name="heading 3" w:semiHidden="1" w:uiPriority="9" w:unhideWhenUsed="1" w:qFormat="1"/>
-    <w:lsdException w:name="heading 4" w:semiHidden="1" w:uiPriority="9" w:unhideWhenUsed="1" w:qFormat="1"/>
-    <w:lsdException w:name="heading 5" w:semiHidden="1" w:uiPriority="9" w:unhideWhenUsed="1" w:qFormat="1"/>
-    <w:lsdException w:name="heading 6" w:semiHidden="1" w:uiPriority="9" w:unhideWhenUsed="1" w:qFormat="1"/>
-    <w:lsdException w:name="heading 7" w:semiHidden="1" w:uiPriority="9" w:unhideWhenUsed="1" w:qFormat="1"/>
-    <w:lsdException w:name="heading 8" w:semiHidden="1" w:uiPriority="9" w:unhideWhenUsed="1" w:qFormat="1"/>
-    <w:lsdException w:name="heading 9" w:semiHidden="1" w:uiPriority="9" w:unhideWhenUsed="1" w:qFormat="1"/>
-    <w:lsdException w:name="index 1" w:semiHidden="1" w:unhideWhenUsed="1"/>
-    <w:lsdException w:name="index 2" w:semiHidden="1" w:unhideWhenUsed="1"/>
-    <w:lsdException w:name="index 3" w:semiHidden="1" w:unhideWhenUsed="1"/>
-    <w:lsdException w:name="index 4" w:semiHidden="1" w:unhideWhenUsed="1"/>
-    <w:lsdException w:name="index 5" w:semiHidden="1" w:unhideWhenUsed="1"/>
-    <w:lsdException w:name="index 6" w:semiHidden="1" w:unhideWhenUsed="1"/>
-    <w:lsdException w:name="index 7" w:semiHidden="1" w:unhideWhenUsed="1"/>
-    <w:lsdException w:name="index 8" w:semiHidden="1" w:unhideWhenUsed="1"/>
-    <w:lsdException w:name="index 9" w:semiHidden="1" w:unhideWhenUsed="1"/>
-    <w:lsdException w:name="toc 1" w:semiHidden="1" w:uiPriority="39" w:unhideWhenUsed="1"/>
-    <w:lsdException w:name="toc 2" w:semiHidden="1" w:uiPriority="39" w:unhideWhenUsed="1"/>
-    <w:lsdException w:name="toc 3" w:semiHidden="1" w:uiPriority="39" w:unhideWhenUsed="1"/>
-    <w:lsdException w:name="toc 4" w:semiHidden="1" w:uiPriority="39" w:unhideWhenUsed="1"/>
-    <w:lsdException w:name="toc 5" w:semiHidden="1" w:uiPriority="39" w:unhideWhenUsed="1"/>
-    <w:lsdException w:name="toc 6" w:semiHidden="1" w:uiPriority="39" w:unhideWhenUsed="1"/>
-    <w:lsdException w:name="toc 7" w:semiHidden="1" w:uiPriority="39" w:unhideWhenUsed="1"/>
-    <w:lsdException w:name="toc 8" w:semiHidden="1" w:uiPriority="39" w:unhideWhenUsed="1"/>
-    <w:lsdException w:name="toc 9" w:semiHidden="1" w:uiPriority="39" w:unhideWhenUsed="1"/>
-    <w:lsdException w:name="Normal Indent" w:semiHidden="1" w:unhideWhenUsed="1"/>
-    <w:lsdException w:name="footnote text" w:semiHidden="1" w:unhideWhenUsed="1"/>
-    <w:lsdException w:name="annotation text" w:semiHidden="1" w:unhideWhenUsed="1" w:qFormat="1"/>
-    <w:lsdException w:name="header" w:semiHidden="1" w:unhideWhenUsed="1"/>
-    <w:lsdException w:name="footer" w:semiHidden="1" w:unhideWhenUsed="1"/>
-    <w:lsdException w:name="index heading" w:semiHidden="1" w:unhideWhenUsed="1"/>
-    <w:lsdException w:name="caption" w:semiHidden="1" w:uiPriority="35" w:unhideWhenUsed="1" w:qFormat="1"/>
-    <w:lsdException w:name="table of figures" w:semiHidden="1" w:unhideWhenUsed="1"/>
-    <w:lsdException w:name="envelope address" w:semiHidden="1" w:unhideWhenUsed="1"/>
-    <w:lsdException w:name="envelope return" w:semiHidden="1" w:unhideWhenUsed="1"/>
-    <w:lsdException w:name="footnote reference" w:semiHidden="1" w:unhideWhenUsed="1"/>
-    <w:lsdException w:name="annotation reference" w:semiHidden="1" w:unhideWhenUsed="1" w:qFormat="1"/>
-    <w:lsdException w:name="line number" w:semiHidden="1" w:unhideWhenUsed="1"/>
-    <w:lsdException w:name="page number" w:semiHidden="1" w:unhideWhenUsed="1"/>
-    <w:lsdException w:name="endnote reference" w:semiHidden="1" w:unhideWhenUsed="1"/>
-    <w:lsdException w:name="endnote text" w:semiHidden="1" w:unhideWhenUsed="1"/>
-    <w:lsdException w:name="table of authorities" w:semiHidden="1" w:unhideWhenUsed="1"/>
-    <w:lsdException w:name="macro" w:semiHidden="1" w:unhideWhenUsed="1"/>
-    <w:lsdException w:name="toa heading" w:semiHidden="1" w:unhideWhenUsed="1"/>
-    <w:lsdException w:name="List" w:semiHidden="1" w:unhideWhenUsed="1"/>
-    <w:lsdException w:name="List Bullet" w:semiHidden="1" w:unhideWhenUsed="1"/>
-    <w:lsdException w:name="List Number" w:semiHidden="1" w:unhideWhenUsed="1"/>
-    <w:lsdException w:name="List 2" w:semiHidden="1" w:unhideWhenUsed="1"/>
-    <w:lsdException w:name="List 3" w:semiHidden="1" w:unhideWhenUsed="1"/>
-    <w:lsdException w:name="List 4" w:semiHidden="1" w:unhideWhenUsed="1"/>
-    <w:lsdException w:name="List 5" w:semiHidden="1" w:unhideWhenUsed="1"/>
-    <w:lsdException w:name="List Bullet 2" w:semiHidden="1" w:unhideWhenUsed="1"/>
-    <w:lsdException w:name="List Bullet 3" w:semiHidden="1" w:unhideWhenUsed="1"/>
-    <w:lsdException w:name="List Bullet 4" w:semiHidden="1" w:unhideWhenUsed="1"/>
-    <w:lsdException w:name="List Bullet 5" w:semiHidden="1" w:unhideWhenUsed="1"/>
-    <w:lsdException w:name="List Number 2" w:semiHidden="1" w:unhideWhenUsed="1"/>
-    <w:lsdException w:name="List Number 3" w:semiHidden="1" w:unhideWhenUsed="1"/>
-    <w:lsdException w:name="List Number 4" w:semiHidden="1" w:unhideWhenUsed="1"/>
-    <w:lsdException w:name="List Number 5" w:semiHidden="1" w:unhideWhenUsed="1"/>
-    <w:lsdException w:name="Title" w:uiPriority="10" w:qFormat="1"/>
-    <w:lsdException w:name="Closing" w:semiHidden="1" w:unhideWhenUsed="1"/>
-    <w:lsdException w:name="Signature" w:semiHidden="1" w:unhideWhenUsed="1"/>
-    <w:lsdException w:name="Default Paragraph Font" w:semiHidden="1" w:uiPriority="1" w:unhideWhenUsed="1"/>
-    <w:lsdException w:name="Body Text" w:semiHidden="1" w:uiPriority="1" w:unhideWhenUsed="1" w:qFormat="1"/>
-    <w:lsdException w:name="Body Text Indent" w:semiHidden="1" w:unhideWhenUsed="1"/>
-    <w:lsdException w:name="List Continue" w:semiHidden="1" w:unhideWhenUsed="1"/>
-    <w:lsdException w:name="List Continue 2" w:semiHidden="1" w:unhideWhenUsed="1"/>
-    <w:lsdException w:name="List Continue 3" w:semiHidden="1" w:unhideWhenUsed="1"/>
-    <w:lsdException w:name="List Continue 4" w:semiHidden="1" w:unhideWhenUsed="1"/>
-    <w:lsdException w:name="List Continue 5" w:semiHidden="1" w:unhideWhenUsed="1"/>
-    <w:lsdException w:name="Message Header" w:semiHidden="1" w:unhideWhenUsed="1"/>
-    <w:lsdException w:name="Subtitle" w:uiPriority="11" w:qFormat="1"/>
-    <w:lsdException w:name="Salutation" w:semiHidden="1" w:unhideWhenUsed="1"/>
-    <w:lsdException w:name="Date" w:semiHidden="1" w:unhideWhenUsed="1"/>
-    <w:lsdException w:name="Body Text First Indent" w:semiHidden="1" w:unhideWhenUsed="1"/>
-    <w:lsdException w:name="Body Text First Indent 2" w:semiHidden="1" w:unhideWhenUsed="1"/>
-    <w:lsdException w:name="Note Heading" w:semiHidden="1" w:unhideWhenUsed="1"/>
-    <w:lsdException w:name="Body Text 2" w:semiHidden="1" w:unhideWhenUsed="1"/>
-    <w:lsdException w:name="Body Text 3" w:semiHidden="1" w:unhideWhenUsed="1"/>
-    <w:lsdException w:name="Body Text Indent 2" w:semiHidden="1" w:unhideWhenUsed="1"/>
-    <w:lsdException w:name="Body Text Indent 3" w:semiHidden="1" w:unhideWhenUsed="1"/>
-    <w:lsdException w:name="Block Text" w:semiHidden="1" w:unhideWhenUsed="1"/>
-    <w:lsdException w:name="Hyperlink" w:semiHidden="1" w:unhideWhenUsed="1"/>
-    <w:lsdException w:name="FollowedHyperlink" w:semiHidden="1" w:unhideWhenUsed="1"/>
-    <w:lsdException w:name="Strong" w:uiPriority="22" w:qFormat="1"/>
-    <w:lsdException w:name="Emphasis" w:uiPriority="20" w:qFormat="1"/>
-    <w:lsdException w:name="Document Map" w:semiHidden="1" w:unhideWhenUsed="1"/>
-    <w:lsdException w:name="Plain Text" w:semiHidden="1" w:unhideWhenUsed="1"/>
-    <w:lsdException w:name="E-mail Signature" w:semiHidden="1" w:unhideWhenUsed="1"/>
-    <w:lsdException w:name="HTML Top of Form" w:semiHidden="1" w:unhideWhenUsed="1"/>
-    <w:lsdException w:name="HTML Bottom of Form" w:semiHidden="1" w:unhideWhenUsed="1"/>
-    <w:lsdException w:name="Normal (Web)" w:semiHidden="1" w:unhideWhenUsed="1"/>
-    <w:lsdException w:name="HTML Acronym" w:semiHidden="1" w:unhideWhenUsed="1"/>
-    <w:lsdException w:name="HTML Address" w:semiHidden="1" w:unhideWhenUsed="1"/>
-    <w:lsdException w:name="HTML Cite" w:semiHidden="1" w:unhideWhenUsed="1"/>
-    <w:lsdException w:name="HTML Code" w:semiHidden="1" w:unhideWhenUsed="1"/>
-    <w:lsdException w:name="HTML Definition" w:semiHidden="1" w:unhideWhenUsed="1"/>
-    <w:lsdException w:name="HTML Keyboard" w:semiHidden="1" w:unhideWhenUsed="1"/>
-    <w:lsdException w:name="HTML Preformatted" w:semiHidden="1" w:unhideWhenUsed="1"/>
-    <w:lsdException w:name="HTML Sample" w:semiHidden="1" w:unhideWhenUsed="1"/>
-    <w:lsdException w:name="HTML Typewriter" w:semiHidden="1" w:unhideWhenUsed="1"/>
-    <w:lsdException w:name="HTML Variable" w:semiHidden="1" w:unhideWhenUsed="1"/>
-    <w:lsdException w:name="Normal Table" w:semiHidden="1" w:unhideWhenUsed="1"/>
-    <w:lsdException w:name="annotation subject" w:semiHidden="1" w:unhideWhenUsed="1"/>
-    <w:lsdException w:name="No List" w:semiHidden="1" w:unhideWhenUsed="1"/>
-    <w:lsdException w:name="Outline List 1" w:semiHidden="1" w:unhideWhenUsed="1"/>
-    <w:lsdException w:name="Outline List 2" w:semiHidden="1" w:unhideWhenUsed="1"/>
-    <w:lsdException w:name="Outline List 3" w:semiHidden="1" w:unhideWhenUsed="1"/>
-    <w:lsdException w:name="Table Simple 1" w:semiHidden="1" w:unhideWhenUsed="1"/>
-    <w:lsdException w:name="Table Simple 2" w:semiHidden="1" w:unhideWhenUsed="1"/>
-    <w:lsdException w:name="Table Simple 3" w:semiHidden="1" w:unhideWhenUsed="1"/>
-    <w:lsdException w:name="Table Classic 1" w:semiHidden="1" w:unhideWhenUsed="1"/>
-    <w:lsdException w:name="Table Classic 2" w:semiHidden="1" w:unhideWhenUsed="1"/>
-    <w:lsdException w:name="Table Classic 3" w:semiHidden="1" w:unhideWhenUsed="1"/>
-    <w:lsdException w:name="Table Classic 4" w:semiHidden="1" w:unhideWhenUsed="1"/>
-    <w:lsdException w:name="Table Colorful 1" w:semiHidden="1" w:unhideWhenUsed="1"/>
-    <w:lsdException w:name="Table Colorful 2" w:semiHidden="1" w:unhideWhenUsed="1"/>
-    <w:lsdException w:name="Table Colorful 3" w:semiHidden="1" w:unhideWhenUsed="1"/>
-    <w:lsdException w:name="Table Columns 1" w:semiHidden="1" w:unhideWhenUsed="1"/>
-    <w:lsdException w:name="Table Columns 2" w:semiHidden="1" w:unhideWhenUsed="1"/>
-    <w:lsdException w:name="Table Columns 3" w:semiHidden="1" w:unhideWhenUsed="1"/>
-    <w:lsdException w:name="Table Columns 4" w:semiHidden="1" w:unhideWhenUsed="1"/>
-    <w:lsdException w:name="Table Columns 5" w:semiHidden="1" w:unhideWhenUsed="1"/>
-    <w:lsdException w:name="Table Grid 1" w:semiHidden="1" w:unhideWhenUsed="1"/>
-    <w:lsdException w:name="Table Grid 2" w:semiHidden="1" w:unhideWhenUsed="1"/>
-    <w:lsdException w:name="Table Grid 3" w:semiHidden="1" w:unhideWhenUsed="1"/>
-    <w:lsdException w:name="Table Grid 4" w:semiHidden="1" w:unhideWhenUsed="1"/>
-    <w:lsdException w:name="Table Grid 5" w:semiHidden="1" w:unhideWhenUsed="1"/>
-    <w:lsdException w:name="Table Grid 6" w:semiHidden="1" w:unhideWhenUsed="1"/>
-    <w:lsdException w:name="Table Grid 7" w:semiHidden="1" w:unhideWhenUsed="1"/>
-    <w:lsdException w:name="Table Grid 8" w:semiHidden="1" w:unhideWhenUsed="1"/>
-    <w:lsdException w:name="Table List 1" w:semiHidden="1" w:unhideWhenUsed="1"/>
-    <w:lsdException w:name="Table List 2" w:semiHidden="1" w:unhideWhenUsed="1"/>
-    <w:lsdException w:name="Table List 3" w:semiHidden="1" w:unhideWhenUsed="1"/>
-    <w:lsdException w:name="Table List 4" w:semiHidden="1" w:unhideWhenUsed="1"/>
-    <w:lsdException w:name="Table List 5" w:semiHidden="1" w:unhideWhenUsed="1"/>
-    <w:lsdException w:name="Table List 6" w:semiHidden="1" w:unhideWhenUsed="1"/>
-    <w:lsdException w:name="Table List 7" w:semiHidden="1" w:unhideWhenUsed="1"/>
-    <w:lsdException w:name="Table List 8" w:semiHidden="1" w:unhideWhenUsed="1"/>
-    <w:lsdException w:name="Table 3D effects 1" w:semiHidden="1" w:unhideWhenUsed="1"/>
-    <w:lsdException w:name="Table 3D effects 2" w:semiHidden="1" w:unhideWhenUsed="1"/>
-    <w:lsdException w:name="Table 3D effects 3" w:semiHidden="1" w:unhideWhenUsed="1"/>
-    <w:lsdException w:name="Table Contemporary" w:semiHidden="1" w:unhideWhenUsed="1"/>
-    <w:lsdException w:name="Table Elegant" w:semiHidden="1" w:unhideWhenUsed="1"/>
-    <w:lsdException w:name="Table Professional" w:semiHidden="1" w:unhideWhenUsed="1"/>
-    <w:lsdException w:name="Table Subtle 1" w:semiHidden="1" w:unhideWhenUsed="1"/>
-    <w:lsdException w:name="Table Subtle 2" w:semiHidden="1" w:unhideWhenUsed="1"/>
-    <w:lsdException w:name="Table Web 1" w:semiHidden="1" w:unhideWhenUsed="1"/>
-    <w:lsdException w:name="Table Web 2" w:semiHidden="1" w:unhideWhenUsed="1"/>
-    <w:lsdException w:name="Table Web 3" w:semiHidden="1" w:unhideWhenUsed="1"/>
-    <w:lsdException w:name="Balloon Text" w:semiHidden="1" w:unhideWhenUsed="1"/>
-    <w:lsdException w:name="Table Grid" w:uiPriority="39"/>
-    <w:lsdException w:name="Table Theme" w:semiHidden="1" w:unhideWhenUsed="1"/>
-    <w:lsdException w:name="Placeholder Text" w:semiHidden="1"/>
-    <w:lsdException w:name="No Spacing" w:uiPriority="1" w:qFormat="1"/>
-    <w:lsdException w:name="Light Shading" w:uiPriority="60"/>
-    <w:lsdException w:name="Light List" w:uiPriority="61"/>
-    <w:lsdException w:name="Light Grid" w:uiPriority="62"/>
-    <w:lsdException w:name="Medium Shading 1" w:uiPriority="63"/>
-    <w:lsdException w:name="Medium Shading 2" w:uiPriority="64"/>
-    <w:lsdException w:name="Medium List 1" w:uiPriority="65"/>
-    <w:lsdException w:name="Medium List 2" w:uiPriority="66"/>
-    <w:lsdException w:name="Medium Grid 1" w:uiPriority="67"/>
-    <w:lsdException w:name="Medium Grid 2" w:uiPriority="68"/>
-    <w:lsdException w:name="Medium Grid 3" w:uiPriority="69"/>
-    <w:lsdException w:name="Dark List" w:uiPriority="70"/>
-    <w:lsdException w:name="Colorful Shading" w:uiPriority="71"/>
-    <w:lsdException w:name="Colorful List" w:uiPriority="72"/>
-    <w:lsdException w:name="Colorful Grid" w:uiPriority="73"/>
-    <w:lsdException w:name="Light Shading Accent 1" w:uiPriority="60"/>
-    <w:lsdException w:name="Light List Accent 1" w:uiPriority="61"/>
-    <w:lsdException w:name="Light Grid Accent 1" w:uiPriority="62"/>
-    <w:lsdException w:name="Medium Shading 1 Accent 1" w:uiPriority="63"/>
-    <w:lsdException w:name="Medium Shading 2 Accent 1" w:uiPriority="64"/>
-    <w:lsdException w:name="Medium List 1 Accent 1" w:uiPriority="65"/>
-    <w:lsdException w:name="Revision" w:semiHidden="1"/>
-    <w:lsdException w:name="List Paragraph" w:uiPriority="34" w:qFormat="1"/>
-    <w:lsdException w:name="Quote" w:uiPriority="29" w:qFormat="1"/>
-    <w:lsdException w:name="Intense Quote" w:uiPriority="30" w:qFormat="1"/>
-    <w:lsdException w:name="Medium List 2 Accent 1" w:uiPriority="66"/>
-    <w:lsdException w:name="Medium Grid 1 Accent 1" w:uiPriority="67"/>
-    <w:lsdException w:name="Medium Grid 2 Accent 1" w:uiPriority="68"/>
-    <w:lsdException w:name="Medium Grid 3 Accent 1" w:uiPriority="69"/>
-    <w:lsdException w:name="Dark List Accent 1" w:uiPriority="70"/>
-    <w:lsdException w:name="Colorful Shading Accent 1" w:uiPriority="71"/>
-    <w:lsdException w:name="Colorful List Accent 1" w:uiPriority="72"/>
-    <w:lsdException w:name="Colorful Grid Accent 1" w:uiPriority="73"/>
-    <w:lsdException w:name="Light Shading Accent 2" w:uiPriority="60"/>
-    <w:lsdException w:name="Light List Accent 2" w:uiPriority="61"/>
-    <w:lsdException w:name="Light Grid Accent 2" w:uiPriority="62"/>
-    <w:lsdException w:name="Medium Shading 1 Accent 2" w:uiPriority="63"/>
-    <w:lsdException w:name="Medium Shading 2 Accent 2" w:uiPriority="64"/>
-    <w:lsdException w:name="Medium List 1 Accent 2" w:uiPriority="65"/>
-    <w:lsdException w:name="Medium List 2 Accent 2" w:uiPriority="66"/>
-    <w:lsdException w:name="Medium Grid 1 Accent 2" w:uiPriority="67"/>
-    <w:lsdException w:name="Medium Grid 2 Accent 2" w:uiPriority="68"/>
-    <w:lsdException w:name="Medium Grid 3 Accent 2" w:uiPriority="69"/>
-    <w:lsdException w:name="Dark List Accent 2" w:uiPriority="70"/>
-    <w:lsdException w:name="Colorful Shading Accent 2" w:uiPriority="71"/>
-    <w:lsdException w:name="Colorful List Accent 2" w:uiPriority="72"/>
-    <w:lsdException w:name="Colorful Grid Accent 2" w:uiPriority="73"/>
-    <w:lsdException w:name="Light Shading Accent 3" w:uiPriority="60"/>
-    <w:lsdException w:name="Light List Accent 3" w:uiPriority="61"/>
-    <w:lsdException w:name="Light Grid Accent 3" w:uiPriority="62"/>
-    <w:lsdException w:name="Medium Shading 1 Accent 3" w:uiPriority="63"/>
-    <w:lsdException w:name="Medium Shading 2 Accent 3" w:uiPriority="64"/>
-    <w:lsdException w:name="Medium List 1 Accent 3" w:uiPriority="65"/>
-    <w:lsdException w:name="Medium List 2 Accent 3" w:uiPriority="66"/>
-    <w:lsdException w:name="Medium Grid 1 Accent 3" w:uiPriority="67"/>
-    <w:lsdException w:name="Medium Grid 2 Accent 3" w:uiPriority="68"/>
-    <w:lsdException w:name="Medium Grid 3 Accent 3" w:uiPriority="69"/>
-    <w:lsdException w:name="Dark List Accent 3" w:uiPriority="70"/>
-    <w:lsdException w:name="Colorful Shading Accent 3" w:uiPriority="71"/>
-    <w:lsdException w:name="Colorful List Accent 3" w:uiPriority="72"/>
-    <w:lsdException w:name="Colorful Grid Accent 3" w:uiPriority="73"/>
-    <w:lsdException w:name="Light Shading Accent 4" w:uiPriority="60"/>
-    <w:lsdException w:name="Light List Accent 4" w:uiPriority="61"/>
-    <w:lsdException w:name="Light Grid Accent 4" w:uiPriority="62"/>
-    <w:lsdException w:name="Medium Shading 1 Accent 4" w:uiPriority="63"/>
-    <w:lsdException w:name="Medium Shading 2 Accent 4" w:uiPriority="64"/>
-    <w:lsdException w:name="Medium List 1 Accent 4" w:uiPriority="65"/>
-    <w:lsdException w:name="Medium List 2 Accent 4" w:uiPriority="66"/>
-    <w:lsdException w:name="Medium Grid 1 Accent 4" w:uiPriority="67"/>
-    <w:lsdException w:name="Medium Grid 2 Accent 4" w:uiPriority="68"/>
-    <w:lsdException w:name="Medium Grid 3 Accent 4" w:uiPriority="69"/>
-    <w:lsdException w:name="Dark List Accent 4" w:uiPriority="70"/>
-    <w:lsdException w:name="Colorful Shading Accent 4" w:uiPriority="71"/>
-    <w:lsdException w:name="Colorful List Accent 4" w:uiPriority="72"/>
-    <w:lsdException w:name="Colorful Grid Accent 4" w:uiPriority="73"/>
-    <w:lsdException w:name="Light Shading Accent 5" w:uiPriority="60"/>
-    <w:lsdException w:name="Light List Accent 5" w:uiPriority="61"/>
-    <w:lsdException w:name="Light Grid Accent 5" w:uiPriority="62"/>
-    <w:lsdException w:name="Medium Shading 1 Accent 5" w:uiPriority="63"/>
-    <w:lsdException w:name="Medium Shading 2 Accent 5" w:uiPriority="64"/>
-    <w:lsdException w:name="Medium List 1 Accent 5" w:uiPriority="65"/>
-    <w:lsdException w:name="Medium List 2 Accent 5" w:uiPriority="66"/>
-    <w:lsdException w:name="Medium Grid 1 Accent 5" w:uiPriority="67"/>
-    <w:lsdException w:name="Medium Grid 2 Accent 5" w:uiPriority="68"/>
-    <w:lsdException w:name="Medium Grid 3 Accent 5" w:uiPriority="69"/>
-    <w:lsdException w:name="Dark List Accent 5" w:uiPriority="70"/>
-    <w:lsdException w:name="Colorful Shading Accent 5" w:uiPriority="71"/>
-    <w:lsdException w:name="Colorful List Accent 5" w:uiPriority="72"/>
-    <w:lsdException w:name="Colorful Grid Accent 5" w:uiPriority="73"/>
-    <w:lsdException w:name="Light Shading Accent 6" w:uiPriority="60"/>
-    <w:lsdException w:name="Light List Accent 6" w:uiPriority="61"/>
-    <w:lsdException w:name="Light Grid Accent 6" w:uiPriority="62"/>
-    <w:lsdException w:name="Medium Shading 1 Accent 6" w:uiPriority="63"/>
-    <w:lsdException w:name="Medium Shading 2 Accent 6" w:uiPriority="64"/>
-    <w:lsdException w:name="Medium List 1 Accent 6" w:uiPriority="65"/>
-    <w:lsdException w:name="Medium List 2 Accent 6" w:uiPriority="66"/>
-    <w:lsdException w:name="Medium Grid 1 Accent 6" w:uiPriority="67"/>
-    <w:lsdException w:name="Medium Grid 2 Accent 6" w:uiPriority="68"/>
-    <w:lsdException w:name="Medium Grid 3 Accent 6" w:uiPriority="69"/>
-    <w:lsdException w:name="Dark List Accent 6" w:uiPriority="70"/>
-    <w:lsdException w:name="Colorful Shading Accent 6" w:uiPriority="71"/>
-    <w:lsdException w:name="Colorful List Accent 6" w:uiPriority="72"/>
-    <w:lsdException w:name="Colorful Grid Accent 6" w:uiPriority="73"/>
-    <w:lsdException w:name="Subtle Emphasis" w:uiPriority="19" w:qFormat="1"/>
-    <w:lsdException w:name="Intense Emphasis" w:uiPriority="21" w:qFormat="1"/>
-    <w:lsdException w:name="Subtle Reference" w:uiPriority="31" w:qFormat="1"/>
-    <w:lsdException w:name="Intense Reference" w:uiPriority="32" w:qFormat="1"/>
-    <w:lsdException w:name="Book Title" w:uiPriority="33" w:qFormat="1"/>
-    <w:lsdException w:name="Bibliography" w:semiHidden="1" w:uiPriority="37" w:unhideWhenUsed="1"/>
-    <w:lsdException w:name="TOC Heading" w:semiHidden="1" w:uiPriority="39" w:unhideWhenUsed="1" w:qFormat="1"/>
-    <w:lsdException w:name="Plain Table 1" w:uiPriority="41"/>
-    <w:lsdException w:name="Plain Table 2" w:uiPriority="42"/>
-    <w:lsdException w:name="Plain Table 3" w:uiPriority="43"/>
-    <w:lsdException w:name="Plain Table 4" w:uiPriority="44"/>
-    <w:lsdException w:name="Plain Table 5" w:uiPriority="45"/>
-    <w:lsdException w:name="Grid Table Light" w:uiPriority="40"/>
-    <w:lsdException w:name="Grid Table 1 Light" w:uiPriority="46"/>
-    <w:lsdException w:name="Grid Table 2" w:uiPriority="47"/>
-    <w:lsdException w:name="Grid Table 3" w:uiPriority="48"/>
-    <w:lsdException w:name="Grid Table 4" w:uiPriority="49"/>
-    <w:lsdException w:name="Grid Table 5 Dark" w:uiPriority="50"/>
-    <w:lsdException w:name="Grid Table 6 Colorful" w:uiPriority="51"/>
-    <w:lsdException w:name="Grid Table 7 Colorful" w:uiPriority="52"/>
-    <w:lsdException w:name="Grid Table 1 Light Accent 1" w:uiPriority="46"/>
-    <w:lsdException w:name="Grid Table 2 Accent 1" w:uiPriority="47"/>
-    <w:lsdException w:name="Grid Table 3 Accent 1" w:uiPriority="48"/>
-    <w:lsdException w:name="Grid Table 4 Accent 1" w:uiPriority="49"/>
-    <w:lsdException w:name="Grid Table 5 Dark Accent 1" w:uiPriority="50"/>
-    <w:lsdException w:name="Grid Table 6 Colorful Accent 1" w:uiPriority="51"/>
-    <w:lsdException w:name="Grid Table 7 Colorful Accent 1" w:uiPriority="52"/>
-    <w:lsdException w:name="Grid Table 1 Light Accent 2" w:uiPriority="46"/>
-    <w:lsdException w:name="Grid Table 2 Accent 2" w:uiPriority="47"/>
-    <w:lsdException w:name="Grid Table 3 Accent 2" w:uiPriority="48"/>
-    <w:lsdException w:name="Grid Table 4 Accent 2" w:uiPriority="49"/>
-    <w:lsdException w:name="Grid Table 5 Dark Accent 2" w:uiPriority="50"/>
-    <w:lsdException w:name="Grid Table 6 Colorful Accent 2" w:uiPriority="51"/>
-    <w:lsdException w:name="Grid Table 7 Colorful Accent 2" w:uiPriority="52"/>
-    <w:lsdException w:name="Grid Table 1 Light Accent 3" w:uiPriority="46"/>
-    <w:lsdException w:name="Grid Table 2 Accent 3" w:uiPriority="47"/>
-    <w:lsdException w:name="Grid Table 3 Accent 3" w:uiPriority="48"/>
-    <w:lsdException w:name="Grid Table 4 Accent 3" w:uiPriority="49"/>
-    <w:lsdException w:name="Grid Table 5 Dark Accent 3" w:uiPriority="50"/>
-    <w:lsdException w:name="Grid Table 6 Colorful Accent 3" w:uiPriority="51"/>
-    <w:lsdException w:name="Grid Table 7 Colorful Accent 3" w:uiPriority="52"/>
-    <w:lsdException w:name="Grid Table 1 Light Accent 4" w:uiPriority="46"/>
-    <w:lsdException w:name="Grid Table 2 Accent 4" w:uiPriority="47"/>
-    <w:lsdException w:name="Grid Table 3 Accent 4" w:uiPriority="48"/>
-    <w:lsdException w:name="Grid Table 4 Accent 4" w:uiPriority="49"/>
-    <w:lsdException w:name="Grid Table 5 Dark Accent 4" w:uiPriority="50"/>
-    <w:lsdException w:name="Grid Table 6 Colorful Accent 4" w:uiPriority="51"/>
-    <w:lsdException w:name="Grid Table 7 Colorful Accent 4" w:uiPriority="52"/>
-    <w:lsdException w:name="Grid Table 1 Light Accent 5" w:uiPriority="46"/>
-    <w:lsdException w:name="Grid Table 2 Accent 5" w:uiPriority="47"/>
-    <w:lsdException w:name="Grid Table 3 Accent 5" w:uiPriority="48"/>
-    <w:lsdException w:name="Grid Table 4 Accent 5" w:uiPriority="49"/>
-    <w:lsdException w:name="Grid Table 5 Dark Accent 5" w:uiPriority="50"/>
-    <w:lsdException w:name="Grid Table 6 Colorful Accent 5" w:uiPriority="51"/>
-    <w:lsdException w:name="Grid Table 7 Colorful Accent 5" w:uiPriority="52"/>
-    <w:lsdException w:name="Grid Table 1 Light Accent 6" w:uiPriority="46"/>
-    <w:lsdException w:name="Grid Table 2 Accent 6" w:uiPriority="47"/>
-    <w:lsdException w:name="Grid Table 3 Accent 6" w:uiPriority="48"/>
-    <w:lsdException w:name="Grid Table 4 Accent 6" w:uiPriority="49"/>
-    <w:lsdException w:name="Grid Table 5 Dark Accent 6" w:uiPriority="50"/>
-    <w:lsdException w:name="Grid Table 6 Colorful Accent 6" w:uiPriority="51"/>
-    <w:lsdException w:name="Grid Table 7 Colorful Accent 6" w:uiPriority="52"/>
-    <w:lsdException w:name="List Table 1 Light" w:uiPriority="46"/>
-    <w:lsdException w:name="List Table 2" w:uiPriority="47"/>
-    <w:lsdException w:name="List Table 3" w:uiPriority="48"/>
-    <w:lsdException w:name="List Table 4" w:uiPriority="49"/>
-    <w:lsdException w:name="List Table 5 Dark" w:uiPriority="50"/>
-    <w:lsdException w:name="List Table 6 Colorful" w:uiPriority="51"/>
-    <w:lsdException w:name="List Table 7 Colorful" w:uiPriority="52"/>
-    <w:lsdException w:name="List Table 1 Light Accent 1" w:uiPriority="46"/>
-    <w:lsdException w:name="List Table 2 Accent 1" w:uiPriority="47"/>
-    <w:lsdException w:name="List Table 3 Accent 1" w:uiPriority="48"/>
-    <w:lsdException w:name="List Table 4 Accent 1" w:uiPriority="49"/>
-    <w:lsdException w:name="List Table 5 Dark Accent 1" w:uiPriority="50"/>
-    <w:lsdException w:name="List Table 6 Colorful Accent 1" w:uiPriority="51"/>
-    <w:lsdException w:name="List Table 7 Colorful Accent 1" w:uiPriority="52"/>
-    <w:lsdException w:name="List Table 1 Light Accent 2" w:uiPriority="46"/>
-    <w:lsdException w:name="List Table 2 Accent 2" w:uiPriority="47"/>
-    <w:lsdException w:name="List Table 3 Accent 2" w:uiPriority="48"/>
-    <w:lsdException w:name="List Table 4 Accent 2" w:uiPriority="49"/>
-    <w:lsdException w:name="List Table 5 Dark Accent 2" w:uiPriority="50"/>
-    <w:lsdException w:name="List Table 6 Colorful Accent 2" w:uiPriority="51"/>
-    <w:lsdException w:name="List Table 7 Colorful Accent 2" w:uiPriority="52"/>
-    <w:lsdException w:name="List Table 1 Light Accent 3" w:uiPriority="46"/>
-    <w:lsdException w:name="List Table 2 Accent 3" w:uiPriority="47"/>
-    <w:lsdException w:name="List Table 3 Accent 3" w:uiPriority="48"/>
-    <w:lsdException w:name="List Table 4 Accent 3" w:uiPriority="49"/>
-    <w:lsdException w:name="List Table 5 Dark Accent 3" w:uiPriority="50"/>
-    <w:lsdException w:name="List Table 6 Colorful Accent 3" w:uiPriority="51"/>
-    <w:lsdException w:name="List Table 7 Colorful Accent 3" w:uiPriority="52"/>
-    <w:lsdException w:name="List Table 1 Light Accent 4" w:uiPriority="46"/>
-    <w:lsdException w:name="List Table 2 Accent 4" w:uiPriority="47"/>
-    <w:lsdException w:name="List Table 3 Accent 4" w:uiPriority="48"/>
-    <w:lsdException w:name="List Table 4 Accent 4" w:uiPriority="49"/>
-    <w:lsdException w:name="List Table 5 Dark Accent 4" w:uiPriority="50"/>
-    <w:lsdException w:name="List Table 6 Colorful Accent 4" w:uiPriority="51"/>
-    <w:lsdException w:name="List Table 7 Colorful Accent 4" w:uiPriority="52"/>
-    <w:lsdException w:name="List Table 1 Light Accent 5" w:uiPriority="46"/>
-    <w:lsdException w:name="List Table 2 Accent 5" w:uiPriority="47"/>
-    <w:lsdException w:name="List Table 3 Accent 5" w:uiPriority="48"/>
-    <w:lsdException w:name="List Table 4 Accent 5" w:uiPriority="49"/>
-    <w:lsdException w:name="List Table 5 Dark Accent 5" w:uiPriority="50"/>
-    <w:lsdException w:name="List Table 6 Colorful Accent 5" w:uiPriority="51"/>
-    <w:lsdException w:name="List Table 7 Colorful Accent 5" w:uiPriority="52"/>
-    <w:lsdException w:name="List Table 1 Light Accent 6" w:uiPriority="46"/>
-    <w:lsdException w:name="List Table 2 Accent 6" w:uiPriority="47"/>
-    <w:lsdException w:name="List Table 3 Accent 6" w:uiPriority="48"/>
-    <w:lsdException w:name="List Table 4 Accent 6" w:uiPriority="49"/>
-    <w:lsdException w:name="List Table 5 Dark Accent 6" w:uiPriority="50"/>
-    <w:lsdException w:name="List Table 6 Colorful Accent 6" w:uiPriority="51"/>
-    <w:lsdException w:name="List Table 7 Colorful Accent 6" w:uiPriority="52"/>
-    <w:lsdException w:name="Mention" w:semiHidden="1" w:unhideWhenUsed="1"/>
-    <w:lsdException w:name="Smart Hyperlink" w:semiHidden="1" w:unhideWhenUsed="1"/>
-    <w:lsdException w:name="Hashtag" w:semiHidden="1" w:unhideWhenUsed="1"/>
-    <w:lsdException w:name="Unresolved Mention" w:semiHidden="1" w:unhideWhenUsed="1"/>
-    <w:lsdException w:name="Smart Link" w:semiHidden="1" w:unhideWhenUsed="1"/>
+  <w:latentStyles w:defLockedState="0" w:defUIPriority="99" w:defSemiHidden="1" w:defUnhideWhenUsed="1" w:defQFormat="0" w:count="267">
+    <w:lsdException w:name="Normal" w:semiHidden="0" w:uiPriority="0" w:unhideWhenUsed="0" w:qFormat="1"/>
+    <w:lsdException w:name="heading 1" w:semiHidden="0" w:uiPriority="9" w:unhideWhenUsed="0" w:qFormat="1"/>
+    <w:lsdException w:name="heading 2" w:uiPriority="9" w:qFormat="1"/>
+    <w:lsdException w:name="heading 3" w:uiPriority="9" w:qFormat="1"/>
+    <w:lsdException w:name="heading 4" w:uiPriority="9" w:qFormat="1"/>
+    <w:lsdException w:name="heading 5" w:uiPriority="9" w:qFormat="1"/>
+    <w:lsdException w:name="heading 6" w:uiPriority="9" w:qFormat="1"/>
+    <w:lsdException w:name="heading 7" w:uiPriority="9" w:qFormat="1"/>
+    <w:lsdException w:name="heading 8" w:uiPriority="9" w:qFormat="1"/>
+    <w:lsdException w:name="heading 9" w:uiPriority="9" w:qFormat="1"/>
+    <w:lsdException w:name="toc 1" w:uiPriority="39"/>
+    <w:lsdException w:name="toc 2" w:uiPriority="39"/>
+    <w:lsdException w:name="toc 3" w:uiPriority="39"/>
+    <w:lsdException w:name="toc 4" w:uiPriority="39"/>
+    <w:lsdException w:name="toc 5" w:uiPriority="39"/>
+    <w:lsdException w:name="toc 6" w:uiPriority="39"/>
+    <w:lsdException w:name="toc 7" w:uiPriority="39"/>
+    <w:lsdException w:name="toc 8" w:uiPriority="39"/>
+    <w:lsdException w:name="toc 9" w:uiPriority="39"/>
+    <w:lsdException w:name="annotation text" w:qFormat="1"/>
+    <w:lsdException w:name="caption" w:uiPriority="35" w:qFormat="1"/>
+    <w:lsdException w:name="annotation reference" w:qFormat="1"/>
+    <w:lsdException w:name="Title" w:semiHidden="0" w:uiPriority="10" w:unhideWhenUsed="0" w:qFormat="1"/>
+    <w:lsdException w:name="Default Paragraph Font" w:uiPriority="1"/>
+    <w:lsdException w:name="Body Text" w:uiPriority="1" w:qFormat="1"/>
+    <w:lsdException w:name="Subtitle" w:semiHidden="0" w:uiPriority="11" w:unhideWhenUsed="0" w:qFormat="1"/>
+    <w:lsdException w:name="Strong" w:semiHidden="0" w:uiPriority="22" w:unhideWhenUsed="0" w:qFormat="1"/>
+    <w:lsdException w:name="Emphasis" w:semiHidden="0" w:uiPriority="20" w:unhideWhenUsed="0" w:qFormat="1"/>
+    <w:lsdException w:name="Table Grid" w:semiHidden="0" w:uiPriority="39" w:unhideWhenUsed="0"/>
+    <w:lsdException w:name="Placeholder Text" w:unhideWhenUsed="0"/>
+    <w:lsdException w:name="No Spacing" w:semiHidden="0" w:uiPriority="1" w:unhideWhenUsed="0" w:qFormat="1"/>
+    <w:lsdException w:name="Light Shading" w:semiHidden="0" w:uiPriority="60" w:unhideWhenUsed="0"/>
+    <w:lsdException w:name="Light List" w:semiHidden="0" w:uiPriority="61" w:unhideWhenUsed="0"/>
+    <w:lsdException w:name="Light Grid" w:semiHidden="0" w:uiPriority="62" w:unhideWhenUsed="0"/>
+    <w:lsdException w:name="Medium Shading 1" w:semiHidden="0" w:uiPriority="63" w:unhideWhenUsed="0"/>
+    <w:lsdException w:name="Medium Shading 2" w:semiHidden="0" w:uiPriority="64" w:unhideWhenUsed="0"/>
+    <w:lsdException w:name="Medium List 1" w:semiHidden="0" w:uiPriority="65" w:unhideWhenUsed="0"/>
+    <w:lsdException w:name="Medium List 2" w:semiHidden="0" w:uiPriority="66" w:unhideWhenUsed="0"/>
+    <w:lsdException w:name="Medium Grid 1" w:semiHidden="0" w:uiPriority="67" w:unhideWhenUsed="0"/>
+    <w:lsdException w:name="Medium Grid 2" w:semiHidden="0" w:uiPriority="68" w:unhideWhenUsed="0"/>
+    <w:lsdException w:name="Medium Grid 3" w:semiHidden="0" w:uiPriority="69" w:unhideWhenUsed="0"/>
+    <w:lsdException w:name="Dark List" w:semiHidden="0" w:uiPriority="70" w:unhideWhenUsed="0"/>
+    <w:lsdException w:name="Colorful Shading" w:semiHidden="0" w:uiPriority="71" w:unhideWhenUsed="0"/>
+    <w:lsdException w:name="Colorful List" w:semiHidden="0" w:uiPriority="72" w:unhideWhenUsed="0"/>
+    <w:lsdException w:name="Colorful Grid" w:semiHidden="0" w:uiPriority="73" w:unhideWhenUsed="0"/>
+    <w:lsdException w:name="Light Shading Accent 1" w:semiHidden="0" w:uiPriority="60" w:unhideWhenUsed="0"/>
+    <w:lsdException w:name="Light List Accent 1" w:semiHidden="0" w:uiPriority="61" w:unhideWhenUsed="0"/>
+    <w:lsdException w:name="Light Grid Accent 1" w:semiHidden="0" w:uiPriority="62" w:unhideWhenUsed="0"/>
+    <w:lsdException w:name="Medium Shading 1 Accent 1" w:semiHidden="0" w:uiPriority="63" w:unhideWhenUsed="0"/>
+    <w:lsdException w:name="Medium Shading 2 Accent 1" w:semiHidden="0" w:uiPriority="64" w:unhideWhenUsed="0"/>
+    <w:lsdException w:name="Medium List 1 Accent 1" w:semiHidden="0" w:uiPriority="65" w:unhideWhenUsed="0"/>
+    <w:lsdException w:name="Revision" w:unhideWhenUsed="0"/>
+    <w:lsdException w:name="List Paragraph" w:semiHidden="0" w:uiPriority="34" w:unhideWhenUsed="0" w:qFormat="1"/>
+    <w:lsdException w:name="Quote" w:semiHidden="0" w:uiPriority="29" w:unhideWhenUsed="0" w:qFormat="1"/>
+    <w:lsdException w:name="Intense Quote" w:semiHidden="0" w:uiPriority="30" w:unhideWhenUsed="0" w:qFormat="1"/>
+    <w:lsdException w:name="Medium List 2 Accent 1" w:semiHidden="0" w:uiPriority="66" w:unhideWhenUsed="0"/>
+    <w:lsdException w:name="Medium Grid 1 Accent 1" w:semiHidden="0" w:uiPriority="67" w:unhideWhenUsed="0"/>
+    <w:lsdException w:name="Medium Grid 2 Accent 1" w:semiHidden="0" w:uiPriority="68" w:unhideWhenUsed="0"/>
+    <w:lsdException w:name="Medium Grid 3 Accent 1" w:semiHidden="0" w:uiPriority="69" w:unhideWhenUsed="0"/>
+    <w:lsdException w:name="Dark List Accent 1" w:semiHidden="0" w:uiPriority="70" w:unhideWhenUsed="0"/>
+    <w:lsdException w:name="Colorful Shading Accent 1" w:semiHidden="0" w:uiPriority="71" w:unhideWhenUsed="0"/>
+    <w:lsdException w:name="Colorful List Accent 1" w:semiHidden="0" w:uiPriority="72" w:unhideWhenUsed="0"/>
+    <w:lsdException w:name="Colorful Grid Accent 1" w:semiHidden="0" w:uiPriority="73" w:unhideWhenUsed="0"/>
+    <w:lsdException w:name="Light Shading Accent 2" w:semiHidden="0" w:uiPriority="60" w:unhideWhenUsed="0"/>
+    <w:lsdException w:name="Light List Accent 2" w:semiHidden="0" w:uiPriority="61" w:unhideWhenUsed="0"/>
+    <w:lsdException w:name="Light Grid Accent 2" w:semiHidden="0" w:uiPriority="62" w:unhideWhenUsed="0"/>
+    <w:lsdException w:name="Medium Shading 1 Accent 2" w:semiHidden="0" w:uiPriority="63" w:unhideWhenUsed="0"/>
+    <w:lsdException w:name="Medium Shading 2 Accent 2" w:semiHidden="0" w:uiPriority="64" w:unhideWhenUsed="0"/>
+    <w:lsdException w:name="Medium List 1 Accent 2" w:semiHidden="0" w:uiPriority="65" w:unhideWhenUsed="0"/>
+    <w:lsdException w:name="Medium List 2 Accent 2" w:semiHidden="0" w:uiPriority="66" w:unhideWhenUsed="0"/>
+    <w:lsdException w:name="Medium Grid 1 Accent 2" w:semiHidden="0" w:uiPriority="67" w:unhideWhenUsed="0"/>
+    <w:lsdException w:name="Medium Grid 2 Accent 2" w:semiHidden="0" w:uiPriority="68" w:unhideWhenUsed="0"/>
+    <w:lsdException w:name="Medium Grid 3 Accent 2" w:semiHidden="0" w:uiPriority="69" w:unhideWhenUsed="0"/>
+    <w:lsdException w:name="Dark List Accent 2" w:semiHidden="0" w:uiPriority="70" w:unhideWhenUsed="0"/>
+    <w:lsdException w:name="Colorful Shading Accent 2" w:semiHidden="0" w:uiPriority="71" w:unhideWhenUsed="0"/>
+    <w:lsdException w:name="Colorful List Accent 2" w:semiHidden="0" w:uiPriority="72" w:unhideWhenUsed="0"/>
+    <w:lsdException w:name="Colorful Grid Accent 2" w:semiHidden="0" w:uiPriority="73" w:unhideWhenUsed="0"/>
+    <w:lsdException w:name="Light Shading Accent 3" w:semiHidden="0" w:uiPriority="60" w:unhideWhenUsed="0"/>
+    <w:lsdException w:name="Light List Accent 3" w:semiHidden="0" w:uiPriority="61" w:unhideWhenUsed="0"/>
+    <w:lsdException w:name="Light Grid Accent 3" w:semiHidden="0" w:uiPriority="62" w:unhideWhenUsed="0"/>
+    <w:lsdException w:name="Medium Shading 1 Accent 3" w:semiHidden="0" w:uiPriority="63" w:unhideWhenUsed="0"/>
+    <w:lsdException w:name="Medium Shading 2 Accent 3" w:semiHidden="0" w:uiPriority="64" w:unhideWhenUsed="0"/>
+    <w:lsdException w:name="Medium List 1 Accent 3" w:semiHidden="0" w:uiPriority="65" w:unhideWhenUsed="0"/>
+    <w:lsdException w:name="Medium List 2 Accent 3" w:semiHidden="0" w:uiPriority="66" w:unhideWhenUsed="0"/>
+    <w:lsdException w:name="Medium Grid 1 Accent 3" w:semiHidden="0" w:uiPriority="67" w:unhideWhenUsed="0"/>
+    <w:lsdException w:name="Medium Grid 2 Accent 3" w:semiHidden="0" w:uiPriority="68" w:unhideWhenUsed="0"/>
+    <w:lsdException w:name="Medium Grid 3 Accent 3" w:semiHidden="0" w:uiPriority="69" w:unhideWhenUsed="0"/>
+    <w:lsdException w:name="Dark List Accent 3" w:semiHidden="0" w:uiPriority="70" w:unhideWhenUsed="0"/>
+    <w:lsdException w:name="Colorful Shading Accent 3" w:semiHidden="0" w:uiPriority="71" w:unhideWhenUsed="0"/>
+    <w:lsdException w:name="Colorful List Accent 3" w:semiHidden="0" w:uiPriority="72" w:unhideWhenUsed="0"/>
+    <w:lsdException w:name="Colorful Grid Accent 3" w:semiHidden="0" w:uiPriority="73" w:unhideWhenUsed="0"/>
+    <w:lsdException w:name="Light Shading Accent 4" w:semiHidden="0" w:uiPriority="60" w:unhideWhenUsed="0"/>
+    <w:lsdException w:name="Light List Accent 4" w:semiHidden="0" w:uiPriority="61" w:unhideWhenUsed="0"/>
+    <w:lsdException w:name="Light Grid Accent 4" w:semiHidden="0" w:uiPriority="62" w:unhideWhenUsed="0"/>
+    <w:lsdException w:name="Medium Shading 1 Accent 4" w:semiHidden="0" w:uiPriority="63" w:unhideWhenUsed="0"/>
+    <w:lsdException w:name="Medium Shading 2 Accent 4" w:semiHidden="0" w:uiPriority="64" w:unhideWhenUsed="0"/>
+    <w:lsdException w:name="Medium List 1 Accent 4" w:semiHidden="0" w:uiPriority="65" w:unhideWhenUsed="0"/>
+    <w:lsdException w:name="Medium List 2 Accent 4" w:semiHidden="0" w:uiPriority="66" w:unhideWhenUsed="0"/>
+    <w:lsdException w:name="Medium Grid 1 Accent 4" w:semiHidden="0" w:uiPriority="67" w:unhideWhenUsed="0"/>
+    <w:lsdException w:name="Medium Grid 2 Accent 4" w:semiHidden="0" w:uiPriority="68" w:unhideWhenUsed="0"/>
+    <w:lsdException w:name="Medium Grid 3 Accent 4" w:semiHidden="0" w:uiPriority="69" w:unhideWhenUsed="0"/>
+    <w:lsdException w:name="Dark List Accent 4" w:semiHidden="0" w:uiPriority="70" w:unhideWhenUsed="0"/>
+    <w:lsdException w:name="Colorful Shading Accent 4" w:semiHidden="0" w:uiPriority="71" w:unhideWhenUsed="0"/>
+    <w:lsdException w:name="Colorful List Accent 4" w:semiHidden="0" w:uiPriority="72" w:unhideWhenUsed="0"/>
+    <w:lsdException w:name="Colorful Grid Accent 4" w:semiHidden="0" w:uiPriority="73" w:unhideWhenUsed="0"/>
+    <w:lsdException w:name="Light Shading Accent 5" w:semiHidden="0" w:uiPriority="60" w:unhideWhenUsed="0"/>
+    <w:lsdException w:name="Light List Accent 5" w:semiHidden="0" w:uiPriority="61" w:unhideWhenUsed="0"/>
+    <w:lsdException w:name="Light Grid Accent 5" w:semiHidden="0" w:uiPriority="62" w:unhideWhenUsed="0"/>
+    <w:lsdException w:name="Medium Shading 1 Accent 5" w:semiHidden="0" w:uiPriority="63" w:unhideWhenUsed="0"/>
+    <w:lsdException w:name="Medium Shading 2 Accent 5" w:semiHidden="0" w:uiPriority="64" w:unhideWhenUsed="0"/>
+    <w:lsdException w:name="Medium List 1 Accent 5" w:semiHidden="0" w:uiPriority="65" w:unhideWhenUsed="0"/>
+    <w:lsdException w:name="Medium List 2 Accent 5" w:semiHidden="0" w:uiPriority="66" w:unhideWhenUsed="0"/>
+    <w:lsdException w:name="Medium Grid 1 Accent 5" w:semiHidden="0" w:uiPriority="67" w:unhideWhenUsed="0"/>
+    <w:lsdException w:name="Medium Grid 2 Accent 5" w:semiHidden="0" w:uiPriority="68" w:unhideWhenUsed="0"/>
+    <w:lsdException w:name="Medium Grid 3 Accent 5" w:semiHidden="0" w:uiPriority="69" w:unhideWhenUsed="0"/>
+    <w:lsdException w:name="Dark List Accent 5" w:semiHidden="0" w:uiPriority="70" w:unhideWhenUsed="0"/>
+    <w:lsdException w:name="Colorful Shading Accent 5" w:semiHidden="0" w:uiPriority="71" w:unhideWhenUsed="0"/>
+    <w:lsdException w:name="Colorful List Accent 5" w:semiHidden="0" w:uiPriority="72" w:unhideWhenUsed="0"/>
+    <w:lsdException w:name="Colorful Grid Accent 5" w:semiHidden="0" w:uiPriority="73" w:unhideWhenUsed="0"/>
+    <w:lsdException w:name="Light Shading Accent 6" w:semiHidden="0" w:uiPriority="60" w:unhideWhenUsed="0"/>
+    <w:lsdException w:name="Light List Accent 6" w:semiHidden="0" w:uiPriority="61" w:unhideWhenUsed="0"/>
+    <w:lsdException w:name="Light Grid Accent 6" w:semiHidden="0" w:uiPriority="62" w:unhideWhenUsed="0"/>
+    <w:lsdException w:name="Medium Shading 1 Accent 6" w:semiHidden="0" w:uiPriority="63" w:unhideWhenUsed="0"/>
+    <w:lsdException w:name="Medium Shading 2 Accent 6" w:semiHidden="0" w:uiPriority="64" w:unhideWhenUsed="0"/>
+    <w:lsdException w:name="Medium List 1 Accent 6" w:semiHidden="0" w:uiPriority="65" w:unhideWhenUsed="0"/>
+    <w:lsdException w:name="Medium List 2 Accent 6" w:semiHidden="0" w:uiPriority="66" w:unhideWhenUsed="0"/>
+    <w:lsdException w:name="Medium Grid 1 Accent 6" w:semiHidden="0" w:uiPriority="67" w:unhideWhenUsed="0"/>
+    <w:lsdException w:name="Medium Grid 2 Accent 6" w:semiHidden="0" w:uiPriority="68" w:unhideWhenUsed="0"/>
+    <w:lsdException w:name="Medium Grid 3 Accent 6" w:semiHidden="0" w:uiPriority="69" w:unhideWhenUsed="0"/>
+    <w:lsdException w:name="Dark List Accent 6" w:semiHidden="0" w:uiPriority="70" w:unhideWhenUsed="0"/>
+    <w:lsdException w:name="Colorful Shading Accent 6" w:semiHidden="0" w:uiPriority="71" w:unhideWhenUsed="0"/>
+    <w:lsdException w:name="Colorful List Accent 6" w:semiHidden="0" w:uiPriority="72" w:unhideWhenUsed="0"/>
+    <w:lsdException w:name="Colorful Grid Accent 6" w:semiHidden="0" w:uiPriority="73" w:unhideWhenUsed="0"/>
+    <w:lsdException w:name="Subtle Emphasis" w:semiHidden="0" w:uiPriority="19" w:unhideWhenUsed="0" w:qFormat="1"/>
+    <w:lsdException w:name="Intense Emphasis" w:semiHidden="0" w:uiPriority="21" w:unhideWhenUsed="0" w:qFormat="1"/>
+    <w:lsdException w:name="Subtle Reference" w:semiHidden="0" w:uiPriority="31" w:unhideWhenUsed="0" w:qFormat="1"/>
+    <w:lsdException w:name="Intense Reference" w:semiHidden="0" w:uiPriority="32" w:unhideWhenUsed="0" w:qFormat="1"/>
+    <w:lsdException w:name="Book Title" w:semiHidden="0" w:uiPriority="33" w:unhideWhenUsed="0" w:qFormat="1"/>
+    <w:lsdException w:name="Bibliography" w:uiPriority="37"/>
+    <w:lsdException w:name="TOC Heading" w:uiPriority="39" w:qFormat="1"/>
   </w:latentStyles>
   <w:style w:type="paragraph" w:default="1" w:styleId="Normal">
     <w:name w:val="Normal"/>
@@ -5001,7 +4832,1745 @@
     <w:qFormat/>
     <w:rsid w:val="000F4FEF"/>
   </w:style>
-  <w:style w:type="character" w:styleId="UnresolvedMention">
+  <w:style w:type="character" w:customStyle="1" w:styleId="UnresolvedMention">
+    <w:name w:val="Unresolved Mention"/>
+    <w:basedOn w:val="DefaultParagraphFont"/>
+    <w:uiPriority w:val="99"/>
+    <w:semiHidden/>
+    <w:unhideWhenUsed/>
+    <w:rsid w:val="005E785C"/>
+    <w:rPr>
+      <w:color w:val="605E5C"/>
+      <w:shd w:val="clear" w:color="auto" w:fill="E1DFDD"/>
+    </w:rPr>
+  </w:style>
+  <w:style w:type="paragraph" w:customStyle="1" w:styleId="interviewsituationcondition">
+    <w:name w:val="interview situation condition"/>
+    <w:basedOn w:val="Heading1"/>
+    <w:next w:val="Heading2"/>
+    <w:qFormat/>
+    <w:rsid w:val="000F4FEF"/>
+    <w:pPr>
+      <w:keepNext/>
+      <w:keepLines/>
+      <w:pBdr>
+        <w:bottom w:val="none" w:sz="0" w:space="0" w:color="auto"/>
+      </w:pBdr>
+      <w:spacing w:after="60" w:afterAutospacing="0"/>
+    </w:pPr>
+    <w:rPr>
+      <w:rFonts w:asciiTheme="majorHAnsi" w:eastAsiaTheme="majorEastAsia" w:hAnsiTheme="majorHAnsi" w:cstheme="majorBidi"/>
+      <w:color w:val="FF0000"/>
+      <w:spacing w:val="0"/>
+      <w:sz w:val="24"/>
+      <w:szCs w:val="26"/>
+    </w:rPr>
+  </w:style>
+  <w:style w:type="paragraph" w:customStyle="1" w:styleId="heading">
+    <w:name w:val="heading"/>
+    <w:basedOn w:val="Normal"/>
+    <w:rsid w:val="00DD3DDA"/>
+    <w:pPr>
+      <w:spacing w:before="100" w:after="100"/>
+    </w:pPr>
+    <w:rPr>
+      <w:rFonts w:ascii="Times New Roman" w:eastAsia="Times New Roman" w:hAnsi="Times New Roman" w:cs="Times New Roman"/>
+      <w:sz w:val="24"/>
+      <w:szCs w:val="24"/>
+    </w:rPr>
+  </w:style>
+  <w:style w:type="character" w:customStyle="1" w:styleId="Interviewpinknote">
+    <w:name w:val="Interview pink note"/>
+    <w:basedOn w:val="BodyChar"/>
+    <w:uiPriority w:val="1"/>
+    <w:qFormat/>
+    <w:rsid w:val="00DD3DDA"/>
+    <w:rPr>
+      <w:rFonts w:ascii="Helvetica" w:eastAsiaTheme="minorHAnsi" w:hAnsi="Helvetica" w:cs="Tahoma"/>
+      <w:b w:val="0"/>
+      <w:bCs/>
+      <w:color w:val="FF99FF"/>
+      <w:sz w:val="24"/>
+      <w:szCs w:val="24"/>
+    </w:rPr>
+  </w:style>
+  <w:style w:type="paragraph" w:customStyle="1" w:styleId="interviewsituationp">
+    <w:name w:val="interview situation p"/>
+    <w:basedOn w:val="Body"/>
+    <w:next w:val="interviewsituationcondition"/>
+    <w:qFormat/>
+    <w:rsid w:val="00DD3DDA"/>
+    <w:pPr>
+      <w:spacing w:before="240" w:after="0" w:line="240" w:lineRule="auto"/>
+      <w:contextualSpacing/>
+    </w:pPr>
+  </w:style>
+  <w:style w:type="character" w:customStyle="1" w:styleId="Heading5Char">
+    <w:name w:val="Heading 5 Char"/>
+    <w:basedOn w:val="DefaultParagraphFont"/>
+    <w:link w:val="Heading5"/>
+    <w:uiPriority w:val="9"/>
+    <w:rsid w:val="000F4FEF"/>
+    <w:rPr>
+      <w:rFonts w:ascii="Arial" w:hAnsi="Arial" w:cs="Arial"/>
+      <w:color w:val="666666"/>
+    </w:rPr>
+  </w:style>
+  <w:style w:type="character" w:customStyle="1" w:styleId="Heading6Char">
+    <w:name w:val="Heading 6 Char"/>
+    <w:basedOn w:val="DefaultParagraphFont"/>
+    <w:link w:val="Heading6"/>
+    <w:uiPriority w:val="9"/>
+    <w:semiHidden/>
+    <w:rsid w:val="000F4FEF"/>
+    <w:rPr>
+      <w:rFonts w:ascii="Arial" w:hAnsi="Arial" w:cs="Arial"/>
+      <w:i/>
+      <w:color w:val="666666"/>
+    </w:rPr>
+  </w:style>
+  <w:style w:type="paragraph" w:styleId="TOC1">
+    <w:name w:val="toc 1"/>
+    <w:basedOn w:val="Normal"/>
+    <w:next w:val="Normal"/>
+    <w:autoRedefine/>
+    <w:uiPriority w:val="39"/>
+    <w:unhideWhenUsed/>
+    <w:rsid w:val="000F4FEF"/>
+    <w:pPr>
+      <w:spacing w:after="100"/>
+    </w:pPr>
+  </w:style>
+  <w:style w:type="paragraph" w:styleId="TOC2">
+    <w:name w:val="toc 2"/>
+    <w:basedOn w:val="Normal"/>
+    <w:next w:val="Normal"/>
+    <w:autoRedefine/>
+    <w:uiPriority w:val="39"/>
+    <w:unhideWhenUsed/>
+    <w:rsid w:val="000F4FEF"/>
+    <w:pPr>
+      <w:spacing w:after="100"/>
+      <w:ind w:left="240"/>
+    </w:pPr>
+  </w:style>
+  <w:style w:type="paragraph" w:styleId="TOC3">
+    <w:name w:val="toc 3"/>
+    <w:basedOn w:val="Normal"/>
+    <w:next w:val="Normal"/>
+    <w:autoRedefine/>
+    <w:uiPriority w:val="39"/>
+    <w:unhideWhenUsed/>
+    <w:rsid w:val="000F4FEF"/>
+    <w:pPr>
+      <w:spacing w:after="100"/>
+      <w:ind w:left="480"/>
+    </w:pPr>
+  </w:style>
+  <w:style w:type="paragraph" w:styleId="CommentText">
+    <w:name w:val="annotation text"/>
+    <w:basedOn w:val="Normal"/>
+    <w:link w:val="CommentTextChar"/>
+    <w:uiPriority w:val="99"/>
+    <w:unhideWhenUsed/>
+    <w:qFormat/>
+    <w:rsid w:val="000F4FEF"/>
+    <w:rPr>
+      <w:sz w:val="20"/>
+      <w:szCs w:val="20"/>
+    </w:rPr>
+  </w:style>
+  <w:style w:type="character" w:customStyle="1" w:styleId="CommentTextChar">
+    <w:name w:val="Comment Text Char"/>
+    <w:basedOn w:val="DefaultParagraphFont"/>
+    <w:link w:val="CommentText"/>
+    <w:uiPriority w:val="99"/>
+    <w:qFormat/>
+    <w:rsid w:val="000F4FEF"/>
+    <w:rPr>
+      <w:rFonts w:ascii="Arial" w:hAnsi="Arial" w:cs="Arial"/>
+      <w:sz w:val="20"/>
+      <w:szCs w:val="20"/>
+    </w:rPr>
+  </w:style>
+  <w:style w:type="paragraph" w:styleId="Header">
+    <w:name w:val="header"/>
+    <w:basedOn w:val="Normal"/>
+    <w:link w:val="HeaderChar"/>
+    <w:uiPriority w:val="99"/>
+    <w:unhideWhenUsed/>
+    <w:rsid w:val="000F4FEF"/>
+    <w:pPr>
+      <w:tabs>
+        <w:tab w:val="center" w:pos="4680"/>
+        <w:tab w:val="right" w:pos="9360"/>
+      </w:tabs>
+    </w:pPr>
+  </w:style>
+  <w:style w:type="character" w:customStyle="1" w:styleId="HeaderChar">
+    <w:name w:val="Header Char"/>
+    <w:basedOn w:val="DefaultParagraphFont"/>
+    <w:link w:val="Header"/>
+    <w:uiPriority w:val="99"/>
+    <w:rsid w:val="000F4FEF"/>
+    <w:rPr>
+      <w:rFonts w:ascii="Arial" w:hAnsi="Arial" w:cs="Arial"/>
+    </w:rPr>
+  </w:style>
+  <w:style w:type="character" w:styleId="CommentReference">
+    <w:name w:val="annotation reference"/>
+    <w:basedOn w:val="DefaultParagraphFont"/>
+    <w:uiPriority w:val="99"/>
+    <w:semiHidden/>
+    <w:unhideWhenUsed/>
+    <w:qFormat/>
+    <w:rsid w:val="000F4FEF"/>
+    <w:rPr>
+      <w:sz w:val="16"/>
+      <w:szCs w:val="16"/>
+    </w:rPr>
+  </w:style>
+  <w:style w:type="paragraph" w:styleId="Title">
+    <w:name w:val="Title"/>
+    <w:basedOn w:val="Normal"/>
+    <w:next w:val="Normal"/>
+    <w:link w:val="TitleChar"/>
+    <w:uiPriority w:val="10"/>
+    <w:qFormat/>
+    <w:rsid w:val="000F4FEF"/>
+    <w:pPr>
+      <w:spacing w:before="0" w:beforeAutospacing="0" w:after="100" w:line="276" w:lineRule="auto"/>
+    </w:pPr>
+    <w:rPr>
+      <w:rFonts w:ascii="Helvetica" w:hAnsi="Helvetica" w:cs="Helvetica"/>
+      <w:color w:val="0A2A78"/>
+      <w:spacing w:val="-2"/>
+      <w:sz w:val="48"/>
+      <w:szCs w:val="24"/>
+    </w:rPr>
+  </w:style>
+  <w:style w:type="character" w:customStyle="1" w:styleId="TitleChar">
+    <w:name w:val="Title Char"/>
+    <w:basedOn w:val="DefaultParagraphFont"/>
+    <w:link w:val="Title"/>
+    <w:uiPriority w:val="10"/>
+    <w:qFormat/>
+    <w:rsid w:val="000F4FEF"/>
+    <w:rPr>
+      <w:rFonts w:ascii="Helvetica" w:hAnsi="Helvetica" w:cs="Helvetica"/>
+      <w:color w:val="0A2A78"/>
+      <w:spacing w:val="-2"/>
+      <w:sz w:val="48"/>
+      <w:szCs w:val="24"/>
+    </w:rPr>
+  </w:style>
+  <w:style w:type="paragraph" w:styleId="Subtitle">
+    <w:name w:val="Subtitle"/>
+    <w:basedOn w:val="Normal"/>
+    <w:next w:val="Normal"/>
+    <w:link w:val="SubtitleChar"/>
+    <w:uiPriority w:val="11"/>
+    <w:qFormat/>
+    <w:rsid w:val="000F4FEF"/>
+    <w:pPr>
+      <w:keepNext/>
+      <w:keepLines/>
+      <w:spacing w:after="320"/>
+    </w:pPr>
+    <w:rPr>
+      <w:color w:val="666666"/>
+      <w:sz w:val="30"/>
+      <w:szCs w:val="30"/>
+    </w:rPr>
+  </w:style>
+  <w:style w:type="character" w:customStyle="1" w:styleId="SubtitleChar">
+    <w:name w:val="Subtitle Char"/>
+    <w:basedOn w:val="DefaultParagraphFont"/>
+    <w:link w:val="Subtitle"/>
+    <w:uiPriority w:val="11"/>
+    <w:rsid w:val="000F4FEF"/>
+    <w:rPr>
+      <w:rFonts w:ascii="Arial" w:hAnsi="Arial" w:cs="Arial"/>
+      <w:color w:val="666666"/>
+      <w:sz w:val="30"/>
+      <w:szCs w:val="30"/>
+    </w:rPr>
+  </w:style>
+  <w:style w:type="character" w:styleId="FollowedHyperlink">
+    <w:name w:val="FollowedHyperlink"/>
+    <w:basedOn w:val="DefaultParagraphFont"/>
+    <w:uiPriority w:val="99"/>
+    <w:semiHidden/>
+    <w:unhideWhenUsed/>
+    <w:rsid w:val="000F4FEF"/>
+    <w:rPr>
+      <w:color w:val="954F72" w:themeColor="followedHyperlink"/>
+      <w:u w:val="single"/>
+    </w:rPr>
+  </w:style>
+  <w:style w:type="character" w:styleId="Strong">
+    <w:name w:val="Strong"/>
+    <w:basedOn w:val="DefaultParagraphFont"/>
+    <w:uiPriority w:val="22"/>
+    <w:qFormat/>
+    <w:rsid w:val="000F4FEF"/>
+    <w:rPr>
+      <w:b/>
+      <w:bCs/>
+    </w:rPr>
+  </w:style>
+  <w:style w:type="character" w:styleId="Emphasis">
+    <w:name w:val="Emphasis"/>
+    <w:basedOn w:val="DefaultParagraphFont"/>
+    <w:uiPriority w:val="20"/>
+    <w:qFormat/>
+    <w:rsid w:val="000F4FEF"/>
+    <w:rPr>
+      <w:i/>
+      <w:iCs/>
+    </w:rPr>
+  </w:style>
+  <w:style w:type="paragraph" w:styleId="PlainText">
+    <w:name w:val="Plain Text"/>
+    <w:basedOn w:val="Normal"/>
+    <w:link w:val="PlainTextChar"/>
+    <w:uiPriority w:val="99"/>
+    <w:semiHidden/>
+    <w:unhideWhenUsed/>
+    <w:rsid w:val="00DD3DDA"/>
+    <w:pPr>
+      <w:spacing w:after="0"/>
+    </w:pPr>
+    <w:rPr>
+      <w:sz w:val="24"/>
+      <w:szCs w:val="21"/>
+    </w:rPr>
+  </w:style>
+  <w:style w:type="character" w:customStyle="1" w:styleId="PlainTextChar">
+    <w:name w:val="Plain Text Char"/>
+    <w:basedOn w:val="DefaultParagraphFont"/>
+    <w:link w:val="PlainText"/>
+    <w:uiPriority w:val="99"/>
+    <w:semiHidden/>
+    <w:rsid w:val="00DD3DDA"/>
+    <w:rPr>
+      <w:rFonts w:ascii="Arial" w:hAnsi="Arial" w:cs="Arial"/>
+      <w:sz w:val="24"/>
+      <w:szCs w:val="21"/>
+    </w:rPr>
+  </w:style>
+  <w:style w:type="paragraph" w:styleId="NormalWeb">
+    <w:name w:val="Normal (Web)"/>
+    <w:basedOn w:val="Normal"/>
+    <w:uiPriority w:val="99"/>
+    <w:unhideWhenUsed/>
+    <w:rsid w:val="000F4FEF"/>
+    <w:pPr>
+      <w:spacing w:before="100" w:after="100"/>
+    </w:pPr>
+    <w:rPr>
+      <w:rFonts w:ascii="Times New Roman" w:eastAsia="Times New Roman" w:hAnsi="Times New Roman" w:cs="Times New Roman"/>
+      <w:sz w:val="24"/>
+      <w:szCs w:val="24"/>
+    </w:rPr>
+  </w:style>
+  <w:style w:type="paragraph" w:styleId="HTMLPreformatted">
+    <w:name w:val="HTML Preformatted"/>
+    <w:basedOn w:val="Normal"/>
+    <w:link w:val="HTMLPreformattedChar"/>
+    <w:uiPriority w:val="99"/>
+    <w:semiHidden/>
+    <w:unhideWhenUsed/>
+    <w:rsid w:val="000F4FEF"/>
+    <w:pPr>
+      <w:tabs>
+        <w:tab w:val="left" w:pos="916"/>
+        <w:tab w:val="left" w:pos="1832"/>
+        <w:tab w:val="left" w:pos="2748"/>
+        <w:tab w:val="left" w:pos="3664"/>
+        <w:tab w:val="left" w:pos="4580"/>
+        <w:tab w:val="left" w:pos="5496"/>
+        <w:tab w:val="left" w:pos="6412"/>
+        <w:tab w:val="left" w:pos="7328"/>
+        <w:tab w:val="left" w:pos="8244"/>
+        <w:tab w:val="left" w:pos="9160"/>
+        <w:tab w:val="left" w:pos="10076"/>
+        <w:tab w:val="left" w:pos="10992"/>
+        <w:tab w:val="left" w:pos="11908"/>
+        <w:tab w:val="left" w:pos="12824"/>
+        <w:tab w:val="left" w:pos="13740"/>
+        <w:tab w:val="left" w:pos="14656"/>
+      </w:tabs>
+      <w:spacing w:before="0" w:beforeAutospacing="0" w:after="0" w:afterAutospacing="0"/>
+    </w:pPr>
+    <w:rPr>
+      <w:rFonts w:ascii="Courier New" w:eastAsia="Times New Roman" w:hAnsi="Courier New" w:cs="Courier New"/>
+      <w:sz w:val="20"/>
+      <w:szCs w:val="20"/>
+    </w:rPr>
+  </w:style>
+  <w:style w:type="character" w:customStyle="1" w:styleId="HTMLPreformattedChar">
+    <w:name w:val="HTML Preformatted Char"/>
+    <w:basedOn w:val="DefaultParagraphFont"/>
+    <w:link w:val="HTMLPreformatted"/>
+    <w:uiPriority w:val="99"/>
+    <w:semiHidden/>
+    <w:rsid w:val="000F4FEF"/>
+    <w:rPr>
+      <w:rFonts w:ascii="Courier New" w:eastAsia="Times New Roman" w:hAnsi="Courier New" w:cs="Courier New"/>
+      <w:sz w:val="20"/>
+      <w:szCs w:val="20"/>
+    </w:rPr>
+  </w:style>
+  <w:style w:type="paragraph" w:styleId="CommentSubject">
+    <w:name w:val="annotation subject"/>
+    <w:basedOn w:val="CommentText"/>
+    <w:next w:val="CommentText"/>
+    <w:link w:val="CommentSubjectChar"/>
+    <w:uiPriority w:val="99"/>
+    <w:semiHidden/>
+    <w:unhideWhenUsed/>
+    <w:rsid w:val="000F4FEF"/>
+    <w:rPr>
+      <w:b/>
+      <w:bCs/>
+    </w:rPr>
+  </w:style>
+  <w:style w:type="character" w:customStyle="1" w:styleId="CommentSubjectChar">
+    <w:name w:val="Comment Subject Char"/>
+    <w:basedOn w:val="CommentTextChar"/>
+    <w:link w:val="CommentSubject"/>
+    <w:uiPriority w:val="99"/>
+    <w:semiHidden/>
+    <w:rsid w:val="000F4FEF"/>
+    <w:rPr>
+      <w:rFonts w:ascii="Arial" w:hAnsi="Arial" w:cs="Arial"/>
+      <w:b/>
+      <w:bCs/>
+      <w:sz w:val="20"/>
+      <w:szCs w:val="20"/>
+    </w:rPr>
+  </w:style>
+  <w:style w:type="paragraph" w:styleId="BalloonText">
+    <w:name w:val="Balloon Text"/>
+    <w:basedOn w:val="Normal"/>
+    <w:link w:val="BalloonTextChar"/>
+    <w:uiPriority w:val="99"/>
+    <w:semiHidden/>
+    <w:unhideWhenUsed/>
+    <w:rsid w:val="000F4FEF"/>
+    <w:rPr>
+      <w:rFonts w:ascii="Segoe UI" w:hAnsi="Segoe UI" w:cs="Segoe UI"/>
+      <w:sz w:val="18"/>
+      <w:szCs w:val="18"/>
+    </w:rPr>
+  </w:style>
+  <w:style w:type="character" w:customStyle="1" w:styleId="BalloonTextChar">
+    <w:name w:val="Balloon Text Char"/>
+    <w:basedOn w:val="DefaultParagraphFont"/>
+    <w:link w:val="BalloonText"/>
+    <w:uiPriority w:val="99"/>
+    <w:semiHidden/>
+    <w:rsid w:val="000F4FEF"/>
+    <w:rPr>
+      <w:rFonts w:ascii="Segoe UI" w:hAnsi="Segoe UI" w:cs="Segoe UI"/>
+      <w:sz w:val="18"/>
+      <w:szCs w:val="18"/>
+    </w:rPr>
+  </w:style>
+  <w:style w:type="table" w:styleId="TableGrid">
+    <w:name w:val="Table Grid"/>
+    <w:basedOn w:val="TableNormal"/>
+    <w:uiPriority w:val="39"/>
+    <w:rsid w:val="000F4FEF"/>
+    <w:pPr>
+      <w:widowControl w:val="0"/>
+      <w:autoSpaceDE w:val="0"/>
+      <w:autoSpaceDN w:val="0"/>
+      <w:spacing w:beforeAutospacing="0" w:after="0" w:afterAutospacing="0" w:line="240" w:lineRule="auto"/>
+    </w:pPr>
+    <w:rPr>
+      <w:rFonts w:eastAsiaTheme="minorHAnsi"/>
+    </w:rPr>
+    <w:tblPr>
+      <w:tblBorders>
+        <w:top w:val="single" w:sz="4" w:space="0" w:color="auto"/>
+        <w:left w:val="single" w:sz="4" w:space="0" w:color="auto"/>
+        <w:bottom w:val="single" w:sz="4" w:space="0" w:color="auto"/>
+        <w:right w:val="single" w:sz="4" w:space="0" w:color="auto"/>
+        <w:insideH w:val="single" w:sz="4" w:space="0" w:color="auto"/>
+        <w:insideV w:val="single" w:sz="4" w:space="0" w:color="auto"/>
+      </w:tblBorders>
+    </w:tblPr>
+  </w:style>
+  <w:style w:type="paragraph" w:styleId="NoSpacing">
+    <w:name w:val="No Spacing"/>
+    <w:uiPriority w:val="1"/>
+    <w:qFormat/>
+    <w:rsid w:val="00DD3DDA"/>
+    <w:pPr>
+      <w:spacing w:beforeAutospacing="0" w:after="0" w:afterAutospacing="0"/>
+    </w:pPr>
+    <w:rPr>
+      <w:rFonts w:ascii="Helvetica" w:eastAsiaTheme="minorHAnsi" w:hAnsi="Helvetica"/>
+      <w:sz w:val="24"/>
+    </w:rPr>
+  </w:style>
+  <w:style w:type="paragraph" w:styleId="Quote">
+    <w:name w:val="Quote"/>
+    <w:basedOn w:val="Normal"/>
+    <w:next w:val="Normal"/>
+    <w:link w:val="QuoteChar"/>
+    <w:uiPriority w:val="29"/>
+    <w:rsid w:val="000F4FEF"/>
+    <w:pPr>
+      <w:spacing w:before="200" w:after="160"/>
+      <w:ind w:left="864" w:right="864"/>
+      <w:jc w:val="center"/>
+    </w:pPr>
+    <w:rPr>
+      <w:i/>
+      <w:iCs/>
+      <w:color w:val="404040" w:themeColor="text1" w:themeTint="BF"/>
+    </w:rPr>
+  </w:style>
+  <w:style w:type="character" w:customStyle="1" w:styleId="QuoteChar">
+    <w:name w:val="Quote Char"/>
+    <w:basedOn w:val="DefaultParagraphFont"/>
+    <w:link w:val="Quote"/>
+    <w:uiPriority w:val="29"/>
+    <w:rsid w:val="000F4FEF"/>
+    <w:rPr>
+      <w:rFonts w:ascii="Arial" w:hAnsi="Arial" w:cs="Arial"/>
+      <w:i/>
+      <w:iCs/>
+      <w:color w:val="404040" w:themeColor="text1" w:themeTint="BF"/>
+    </w:rPr>
+  </w:style>
+  <w:style w:type="character" w:styleId="SubtleEmphasis">
+    <w:name w:val="Subtle Emphasis"/>
+    <w:basedOn w:val="DefaultParagraphFont"/>
+    <w:uiPriority w:val="19"/>
+    <w:rsid w:val="000F4FEF"/>
+    <w:rPr>
+      <w:i/>
+      <w:iCs/>
+      <w:color w:val="404040" w:themeColor="text1" w:themeTint="BF"/>
+    </w:rPr>
+  </w:style>
+  <w:style w:type="paragraph" w:styleId="TOCHeading">
+    <w:name w:val="TOC Heading"/>
+    <w:basedOn w:val="Heading1"/>
+    <w:next w:val="Normal"/>
+    <w:uiPriority w:val="39"/>
+    <w:unhideWhenUsed/>
+    <w:qFormat/>
+    <w:rsid w:val="000F4FEF"/>
+    <w:pPr>
+      <w:spacing w:before="240" w:after="0" w:line="259" w:lineRule="auto"/>
+      <w:outlineLvl w:val="9"/>
+    </w:pPr>
+    <w:rPr>
+      <w:rFonts w:asciiTheme="majorHAnsi" w:eastAsiaTheme="majorEastAsia" w:hAnsiTheme="majorHAnsi" w:cstheme="majorBidi"/>
+      <w:color w:val="2F5496" w:themeColor="accent1" w:themeShade="BF"/>
+      <w:sz w:val="32"/>
+      <w:szCs w:val="32"/>
+    </w:rPr>
+  </w:style>
+  <w:style w:type="character" w:customStyle="1" w:styleId="BodyChar">
+    <w:name w:val="Body Char"/>
+    <w:basedOn w:val="DefaultParagraphFont"/>
+    <w:link w:val="Body"/>
+    <w:rsid w:val="000F4FEF"/>
+    <w:rPr>
+      <w:rFonts w:ascii="Helvetica" w:eastAsiaTheme="minorHAnsi" w:hAnsi="Helvetica" w:cs="Helvetica"/>
+      <w:sz w:val="24"/>
+      <w:szCs w:val="24"/>
+    </w:rPr>
+  </w:style>
+  <w:style w:type="paragraph" w:customStyle="1" w:styleId="interviewneedsediting">
+    <w:name w:val="interview needs editing"/>
+    <w:basedOn w:val="Normal"/>
+    <w:next w:val="Normal"/>
+    <w:qFormat/>
+    <w:rsid w:val="000F4FEF"/>
+    <w:pPr>
+      <w:shd w:val="clear" w:color="auto" w:fill="FFFF00"/>
+      <w:spacing w:after="60" w:line="360" w:lineRule="auto"/>
+    </w:pPr>
+    <w:rPr>
+      <w:sz w:val="21"/>
+      <w:szCs w:val="21"/>
+    </w:rPr>
+  </w:style>
+  <w:style w:type="table" w:customStyle="1" w:styleId="TableGridLight1">
+    <w:name w:val="Table Grid Light1"/>
+    <w:basedOn w:val="TableNormal"/>
+    <w:uiPriority w:val="40"/>
+    <w:rsid w:val="000F4FEF"/>
+    <w:pPr>
+      <w:spacing w:beforeAutospacing="0" w:after="0" w:afterAutospacing="0" w:line="240" w:lineRule="auto"/>
+    </w:pPr>
+    <w:rPr>
+      <w:rFonts w:eastAsiaTheme="minorHAnsi"/>
+    </w:rPr>
+    <w:tblPr>
+      <w:tblBorders>
+        <w:top w:val="single" w:sz="4" w:space="0" w:color="BFBFBF" w:themeColor="background1" w:themeShade="BF"/>
+        <w:left w:val="single" w:sz="4" w:space="0" w:color="BFBFBF" w:themeColor="background1" w:themeShade="BF"/>
+        <w:bottom w:val="single" w:sz="4" w:space="0" w:color="BFBFBF" w:themeColor="background1" w:themeShade="BF"/>
+        <w:right w:val="single" w:sz="4" w:space="0" w:color="BFBFBF" w:themeColor="background1" w:themeShade="BF"/>
+        <w:insideH w:val="single" w:sz="4" w:space="0" w:color="BFBFBF" w:themeColor="background1" w:themeShade="BF"/>
+        <w:insideV w:val="single" w:sz="4" w:space="0" w:color="BFBFBF" w:themeColor="background1" w:themeShade="BF"/>
+      </w:tblBorders>
+    </w:tblPr>
+  </w:style>
+</w:styles>
+</file>
+
+<file path=word/stylesWithEffects.xml><?xml version="1.0" encoding="utf-8"?>
+<w:styles xmlns:wpc="http://schemas.microsoft.com/office/word/2010/wordprocessingCanvas" xmlns:mc="http://schemas.openxmlformats.org/markup-compatibility/2006" xmlns:o="urn:schemas-microsoft-com:office:office" xmlns:r="http://schemas.openxmlformats.org/officeDocument/2006/relationships" xmlns:m="http://schemas.openxmlformats.org/officeDocument/2006/math" xmlns:v="urn:schemas-microsoft-com:vml" xmlns:wp14="http://schemas.microsoft.com/office/word/2010/wordprocessingDrawing" xmlns:wp="http://schemas.openxmlformats.org/drawingml/2006/wordprocessingDrawing" xmlns:w10="urn:schemas-microsoft-com:office:word" xmlns:w="http://schemas.openxmlformats.org/wordprocessingml/2006/main" xmlns:w14="http://schemas.microsoft.com/office/word/2010/wordml" xmlns:wpg="http://schemas.microsoft.com/office/word/2010/wordprocessingGroup" xmlns:wpi="http://schemas.microsoft.com/office/word/2010/wordprocessingInk" xmlns:wne="http://schemas.microsoft.com/office/word/2006/wordml" xmlns:wps="http://schemas.microsoft.com/office/word/2010/wordprocessingShape" mc:Ignorable="w14 wp14">
+  <w:docDefaults>
+    <w:rPrDefault>
+      <w:rPr>
+        <w:rFonts w:asciiTheme="minorHAnsi" w:eastAsia="Arial" w:hAnsiTheme="minorHAnsi" w:cstheme="minorBidi"/>
+        <w:sz w:val="22"/>
+        <w:szCs w:val="22"/>
+        <w:lang w:val="en-US" w:eastAsia="en-US" w:bidi="ar-SA"/>
+      </w:rPr>
+    </w:rPrDefault>
+    <w:pPrDefault>
+      <w:pPr>
+        <w:spacing w:beforeAutospacing="1" w:after="160" w:afterAutospacing="1" w:line="259" w:lineRule="auto"/>
+      </w:pPr>
+    </w:pPrDefault>
+  </w:docDefaults>
+  <w:latentStyles w:defLockedState="0" w:defUIPriority="99" w:defSemiHidden="1" w:defUnhideWhenUsed="1" w:defQFormat="0" w:count="267">
+    <w:lsdException w:name="Normal" w:semiHidden="0" w:uiPriority="0" w:unhideWhenUsed="0" w:qFormat="1"/>
+    <w:lsdException w:name="heading 1" w:semiHidden="0" w:uiPriority="9" w:unhideWhenUsed="0" w:qFormat="1"/>
+    <w:lsdException w:name="heading 2" w:uiPriority="9" w:qFormat="1"/>
+    <w:lsdException w:name="heading 3" w:uiPriority="9" w:qFormat="1"/>
+    <w:lsdException w:name="heading 4" w:uiPriority="9" w:qFormat="1"/>
+    <w:lsdException w:name="heading 5" w:uiPriority="9" w:qFormat="1"/>
+    <w:lsdException w:name="heading 6" w:uiPriority="9" w:qFormat="1"/>
+    <w:lsdException w:name="heading 7" w:uiPriority="9" w:qFormat="1"/>
+    <w:lsdException w:name="heading 8" w:uiPriority="9" w:qFormat="1"/>
+    <w:lsdException w:name="heading 9" w:uiPriority="9" w:qFormat="1"/>
+    <w:lsdException w:name="toc 1" w:uiPriority="39"/>
+    <w:lsdException w:name="toc 2" w:uiPriority="39"/>
+    <w:lsdException w:name="toc 3" w:uiPriority="39"/>
+    <w:lsdException w:name="toc 4" w:uiPriority="39"/>
+    <w:lsdException w:name="toc 5" w:uiPriority="39"/>
+    <w:lsdException w:name="toc 6" w:uiPriority="39"/>
+    <w:lsdException w:name="toc 7" w:uiPriority="39"/>
+    <w:lsdException w:name="toc 8" w:uiPriority="39"/>
+    <w:lsdException w:name="toc 9" w:uiPriority="39"/>
+    <w:lsdException w:name="annotation text" w:qFormat="1"/>
+    <w:lsdException w:name="caption" w:uiPriority="35" w:qFormat="1"/>
+    <w:lsdException w:name="annotation reference" w:qFormat="1"/>
+    <w:lsdException w:name="Title" w:semiHidden="0" w:uiPriority="10" w:unhideWhenUsed="0" w:qFormat="1"/>
+    <w:lsdException w:name="Default Paragraph Font" w:uiPriority="1"/>
+    <w:lsdException w:name="Body Text" w:uiPriority="1" w:qFormat="1"/>
+    <w:lsdException w:name="Subtitle" w:semiHidden="0" w:uiPriority="11" w:unhideWhenUsed="0" w:qFormat="1"/>
+    <w:lsdException w:name="Strong" w:semiHidden="0" w:uiPriority="22" w:unhideWhenUsed="0" w:qFormat="1"/>
+    <w:lsdException w:name="Emphasis" w:semiHidden="0" w:uiPriority="20" w:unhideWhenUsed="0" w:qFormat="1"/>
+    <w:lsdException w:name="Table Grid" w:semiHidden="0" w:uiPriority="39" w:unhideWhenUsed="0"/>
+    <w:lsdException w:name="Placeholder Text" w:unhideWhenUsed="0"/>
+    <w:lsdException w:name="No Spacing" w:semiHidden="0" w:uiPriority="1" w:unhideWhenUsed="0" w:qFormat="1"/>
+    <w:lsdException w:name="Light Shading" w:semiHidden="0" w:uiPriority="60" w:unhideWhenUsed="0"/>
+    <w:lsdException w:name="Light List" w:semiHidden="0" w:uiPriority="61" w:unhideWhenUsed="0"/>
+    <w:lsdException w:name="Light Grid" w:semiHidden="0" w:uiPriority="62" w:unhideWhenUsed="0"/>
+    <w:lsdException w:name="Medium Shading 1" w:semiHidden="0" w:uiPriority="63" w:unhideWhenUsed="0"/>
+    <w:lsdException w:name="Medium Shading 2" w:semiHidden="0" w:uiPriority="64" w:unhideWhenUsed="0"/>
+    <w:lsdException w:name="Medium List 1" w:semiHidden="0" w:uiPriority="65" w:unhideWhenUsed="0"/>
+    <w:lsdException w:name="Medium List 2" w:semiHidden="0" w:uiPriority="66" w:unhideWhenUsed="0"/>
+    <w:lsdException w:name="Medium Grid 1" w:semiHidden="0" w:uiPriority="67" w:unhideWhenUsed="0"/>
+    <w:lsdException w:name="Medium Grid 2" w:semiHidden="0" w:uiPriority="68" w:unhideWhenUsed="0"/>
+    <w:lsdException w:name="Medium Grid 3" w:semiHidden="0" w:uiPriority="69" w:unhideWhenUsed="0"/>
+    <w:lsdException w:name="Dark List" w:semiHidden="0" w:uiPriority="70" w:unhideWhenUsed="0"/>
+    <w:lsdException w:name="Colorful Shading" w:semiHidden="0" w:uiPriority="71" w:unhideWhenUsed="0"/>
+    <w:lsdException w:name="Colorful List" w:semiHidden="0" w:uiPriority="72" w:unhideWhenUsed="0"/>
+    <w:lsdException w:name="Colorful Grid" w:semiHidden="0" w:uiPriority="73" w:unhideWhenUsed="0"/>
+    <w:lsdException w:name="Light Shading Accent 1" w:semiHidden="0" w:uiPriority="60" w:unhideWhenUsed="0"/>
+    <w:lsdException w:name="Light List Accent 1" w:semiHidden="0" w:uiPriority="61" w:unhideWhenUsed="0"/>
+    <w:lsdException w:name="Light Grid Accent 1" w:semiHidden="0" w:uiPriority="62" w:unhideWhenUsed="0"/>
+    <w:lsdException w:name="Medium Shading 1 Accent 1" w:semiHidden="0" w:uiPriority="63" w:unhideWhenUsed="0"/>
+    <w:lsdException w:name="Medium Shading 2 Accent 1" w:semiHidden="0" w:uiPriority="64" w:unhideWhenUsed="0"/>
+    <w:lsdException w:name="Medium List 1 Accent 1" w:semiHidden="0" w:uiPriority="65" w:unhideWhenUsed="0"/>
+    <w:lsdException w:name="Revision" w:unhideWhenUsed="0"/>
+    <w:lsdException w:name="List Paragraph" w:semiHidden="0" w:uiPriority="34" w:unhideWhenUsed="0" w:qFormat="1"/>
+    <w:lsdException w:name="Quote" w:semiHidden="0" w:uiPriority="29" w:unhideWhenUsed="0" w:qFormat="1"/>
+    <w:lsdException w:name="Intense Quote" w:semiHidden="0" w:uiPriority="30" w:unhideWhenUsed="0" w:qFormat="1"/>
+    <w:lsdException w:name="Medium List 2 Accent 1" w:semiHidden="0" w:uiPriority="66" w:unhideWhenUsed="0"/>
+    <w:lsdException w:name="Medium Grid 1 Accent 1" w:semiHidden="0" w:uiPriority="67" w:unhideWhenUsed="0"/>
+    <w:lsdException w:name="Medium Grid 2 Accent 1" w:semiHidden="0" w:uiPriority="68" w:unhideWhenUsed="0"/>
+    <w:lsdException w:name="Medium Grid 3 Accent 1" w:semiHidden="0" w:uiPriority="69" w:unhideWhenUsed="0"/>
+    <w:lsdException w:name="Dark List Accent 1" w:semiHidden="0" w:uiPriority="70" w:unhideWhenUsed="0"/>
+    <w:lsdException w:name="Colorful Shading Accent 1" w:semiHidden="0" w:uiPriority="71" w:unhideWhenUsed="0"/>
+    <w:lsdException w:name="Colorful List Accent 1" w:semiHidden="0" w:uiPriority="72" w:unhideWhenUsed="0"/>
+    <w:lsdException w:name="Colorful Grid Accent 1" w:semiHidden="0" w:uiPriority="73" w:unhideWhenUsed="0"/>
+    <w:lsdException w:name="Light Shading Accent 2" w:semiHidden="0" w:uiPriority="60" w:unhideWhenUsed="0"/>
+    <w:lsdException w:name="Light List Accent 2" w:semiHidden="0" w:uiPriority="61" w:unhideWhenUsed="0"/>
+    <w:lsdException w:name="Light Grid Accent 2" w:semiHidden="0" w:uiPriority="62" w:unhideWhenUsed="0"/>
+    <w:lsdException w:name="Medium Shading 1 Accent 2" w:semiHidden="0" w:uiPriority="63" w:unhideWhenUsed="0"/>
+    <w:lsdException w:name="Medium Shading 2 Accent 2" w:semiHidden="0" w:uiPriority="64" w:unhideWhenUsed="0"/>
+    <w:lsdException w:name="Medium List 1 Accent 2" w:semiHidden="0" w:uiPriority="65" w:unhideWhenUsed="0"/>
+    <w:lsdException w:name="Medium List 2 Accent 2" w:semiHidden="0" w:uiPriority="66" w:unhideWhenUsed="0"/>
+    <w:lsdException w:name="Medium Grid 1 Accent 2" w:semiHidden="0" w:uiPriority="67" w:unhideWhenUsed="0"/>
+    <w:lsdException w:name="Medium Grid 2 Accent 2" w:semiHidden="0" w:uiPriority="68" w:unhideWhenUsed="0"/>
+    <w:lsdException w:name="Medium Grid 3 Accent 2" w:semiHidden="0" w:uiPriority="69" w:unhideWhenUsed="0"/>
+    <w:lsdException w:name="Dark List Accent 2" w:semiHidden="0" w:uiPriority="70" w:unhideWhenUsed="0"/>
+    <w:lsdException w:name="Colorful Shading Accent 2" w:semiHidden="0" w:uiPriority="71" w:unhideWhenUsed="0"/>
+    <w:lsdException w:name="Colorful List Accent 2" w:semiHidden="0" w:uiPriority="72" w:unhideWhenUsed="0"/>
+    <w:lsdException w:name="Colorful Grid Accent 2" w:semiHidden="0" w:uiPriority="73" w:unhideWhenUsed="0"/>
+    <w:lsdException w:name="Light Shading Accent 3" w:semiHidden="0" w:uiPriority="60" w:unhideWhenUsed="0"/>
+    <w:lsdException w:name="Light List Accent 3" w:semiHidden="0" w:uiPriority="61" w:unhideWhenUsed="0"/>
+    <w:lsdException w:name="Light Grid Accent 3" w:semiHidden="0" w:uiPriority="62" w:unhideWhenUsed="0"/>
+    <w:lsdException w:name="Medium Shading 1 Accent 3" w:semiHidden="0" w:uiPriority="63" w:unhideWhenUsed="0"/>
+    <w:lsdException w:name="Medium Shading 2 Accent 3" w:semiHidden="0" w:uiPriority="64" w:unhideWhenUsed="0"/>
+    <w:lsdException w:name="Medium List 1 Accent 3" w:semiHidden="0" w:uiPriority="65" w:unhideWhenUsed="0"/>
+    <w:lsdException w:name="Medium List 2 Accent 3" w:semiHidden="0" w:uiPriority="66" w:unhideWhenUsed="0"/>
+    <w:lsdException w:name="Medium Grid 1 Accent 3" w:semiHidden="0" w:uiPriority="67" w:unhideWhenUsed="0"/>
+    <w:lsdException w:name="Medium Grid 2 Accent 3" w:semiHidden="0" w:uiPriority="68" w:unhideWhenUsed="0"/>
+    <w:lsdException w:name="Medium Grid 3 Accent 3" w:semiHidden="0" w:uiPriority="69" w:unhideWhenUsed="0"/>
+    <w:lsdException w:name="Dark List Accent 3" w:semiHidden="0" w:uiPriority="70" w:unhideWhenUsed="0"/>
+    <w:lsdException w:name="Colorful Shading Accent 3" w:semiHidden="0" w:uiPriority="71" w:unhideWhenUsed="0"/>
+    <w:lsdException w:name="Colorful List Accent 3" w:semiHidden="0" w:uiPriority="72" w:unhideWhenUsed="0"/>
+    <w:lsdException w:name="Colorful Grid Accent 3" w:semiHidden="0" w:uiPriority="73" w:unhideWhenUsed="0"/>
+    <w:lsdException w:name="Light Shading Accent 4" w:semiHidden="0" w:uiPriority="60" w:unhideWhenUsed="0"/>
+    <w:lsdException w:name="Light List Accent 4" w:semiHidden="0" w:uiPriority="61" w:unhideWhenUsed="0"/>
+    <w:lsdException w:name="Light Grid Accent 4" w:semiHidden="0" w:uiPriority="62" w:unhideWhenUsed="0"/>
+    <w:lsdException w:name="Medium Shading 1 Accent 4" w:semiHidden="0" w:uiPriority="63" w:unhideWhenUsed="0"/>
+    <w:lsdException w:name="Medium Shading 2 Accent 4" w:semiHidden="0" w:uiPriority="64" w:unhideWhenUsed="0"/>
+    <w:lsdException w:name="Medium List 1 Accent 4" w:semiHidden="0" w:uiPriority="65" w:unhideWhenUsed="0"/>
+    <w:lsdException w:name="Medium List 2 Accent 4" w:semiHidden="0" w:uiPriority="66" w:unhideWhenUsed="0"/>
+    <w:lsdException w:name="Medium Grid 1 Accent 4" w:semiHidden="0" w:uiPriority="67" w:unhideWhenUsed="0"/>
+    <w:lsdException w:name="Medium Grid 2 Accent 4" w:semiHidden="0" w:uiPriority="68" w:unhideWhenUsed="0"/>
+    <w:lsdException w:name="Medium Grid 3 Accent 4" w:semiHidden="0" w:uiPriority="69" w:unhideWhenUsed="0"/>
+    <w:lsdException w:name="Dark List Accent 4" w:semiHidden="0" w:uiPriority="70" w:unhideWhenUsed="0"/>
+    <w:lsdException w:name="Colorful Shading Accent 4" w:semiHidden="0" w:uiPriority="71" w:unhideWhenUsed="0"/>
+    <w:lsdException w:name="Colorful List Accent 4" w:semiHidden="0" w:uiPriority="72" w:unhideWhenUsed="0"/>
+    <w:lsdException w:name="Colorful Grid Accent 4" w:semiHidden="0" w:uiPriority="73" w:unhideWhenUsed="0"/>
+    <w:lsdException w:name="Light Shading Accent 5" w:semiHidden="0" w:uiPriority="60" w:unhideWhenUsed="0"/>
+    <w:lsdException w:name="Light List Accent 5" w:semiHidden="0" w:uiPriority="61" w:unhideWhenUsed="0"/>
+    <w:lsdException w:name="Light Grid Accent 5" w:semiHidden="0" w:uiPriority="62" w:unhideWhenUsed="0"/>
+    <w:lsdException w:name="Medium Shading 1 Accent 5" w:semiHidden="0" w:uiPriority="63" w:unhideWhenUsed="0"/>
+    <w:lsdException w:name="Medium Shading 2 Accent 5" w:semiHidden="0" w:uiPriority="64" w:unhideWhenUsed="0"/>
+    <w:lsdException w:name="Medium List 1 Accent 5" w:semiHidden="0" w:uiPriority="65" w:unhideWhenUsed="0"/>
+    <w:lsdException w:name="Medium List 2 Accent 5" w:semiHidden="0" w:uiPriority="66" w:unhideWhenUsed="0"/>
+    <w:lsdException w:name="Medium Grid 1 Accent 5" w:semiHidden="0" w:uiPriority="67" w:unhideWhenUsed="0"/>
+    <w:lsdException w:name="Medium Grid 2 Accent 5" w:semiHidden="0" w:uiPriority="68" w:unhideWhenUsed="0"/>
+    <w:lsdException w:name="Medium Grid 3 Accent 5" w:semiHidden="0" w:uiPriority="69" w:unhideWhenUsed="0"/>
+    <w:lsdException w:name="Dark List Accent 5" w:semiHidden="0" w:uiPriority="70" w:unhideWhenUsed="0"/>
+    <w:lsdException w:name="Colorful Shading Accent 5" w:semiHidden="0" w:uiPriority="71" w:unhideWhenUsed="0"/>
+    <w:lsdException w:name="Colorful List Accent 5" w:semiHidden="0" w:uiPriority="72" w:unhideWhenUsed="0"/>
+    <w:lsdException w:name="Colorful Grid Accent 5" w:semiHidden="0" w:uiPriority="73" w:unhideWhenUsed="0"/>
+    <w:lsdException w:name="Light Shading Accent 6" w:semiHidden="0" w:uiPriority="60" w:unhideWhenUsed="0"/>
+    <w:lsdException w:name="Light List Accent 6" w:semiHidden="0" w:uiPriority="61" w:unhideWhenUsed="0"/>
+    <w:lsdException w:name="Light Grid Accent 6" w:semiHidden="0" w:uiPriority="62" w:unhideWhenUsed="0"/>
+    <w:lsdException w:name="Medium Shading 1 Accent 6" w:semiHidden="0" w:uiPriority="63" w:unhideWhenUsed="0"/>
+    <w:lsdException w:name="Medium Shading 2 Accent 6" w:semiHidden="0" w:uiPriority="64" w:unhideWhenUsed="0"/>
+    <w:lsdException w:name="Medium List 1 Accent 6" w:semiHidden="0" w:uiPriority="65" w:unhideWhenUsed="0"/>
+    <w:lsdException w:name="Medium List 2 Accent 6" w:semiHidden="0" w:uiPriority="66" w:unhideWhenUsed="0"/>
+    <w:lsdException w:name="Medium Grid 1 Accent 6" w:semiHidden="0" w:uiPriority="67" w:unhideWhenUsed="0"/>
+    <w:lsdException w:name="Medium Grid 2 Accent 6" w:semiHidden="0" w:uiPriority="68" w:unhideWhenUsed="0"/>
+    <w:lsdException w:name="Medium Grid 3 Accent 6" w:semiHidden="0" w:uiPriority="69" w:unhideWhenUsed="0"/>
+    <w:lsdException w:name="Dark List Accent 6" w:semiHidden="0" w:uiPriority="70" w:unhideWhenUsed="0"/>
+    <w:lsdException w:name="Colorful Shading Accent 6" w:semiHidden="0" w:uiPriority="71" w:unhideWhenUsed="0"/>
+    <w:lsdException w:name="Colorful List Accent 6" w:semiHidden="0" w:uiPriority="72" w:unhideWhenUsed="0"/>
+    <w:lsdException w:name="Colorful Grid Accent 6" w:semiHidden="0" w:uiPriority="73" w:unhideWhenUsed="0"/>
+    <w:lsdException w:name="Subtle Emphasis" w:semiHidden="0" w:uiPriority="19" w:unhideWhenUsed="0" w:qFormat="1"/>
+    <w:lsdException w:name="Intense Emphasis" w:semiHidden="0" w:uiPriority="21" w:unhideWhenUsed="0" w:qFormat="1"/>
+    <w:lsdException w:name="Subtle Reference" w:semiHidden="0" w:uiPriority="31" w:unhideWhenUsed="0" w:qFormat="1"/>
+    <w:lsdException w:name="Intense Reference" w:semiHidden="0" w:uiPriority="32" w:unhideWhenUsed="0" w:qFormat="1"/>
+    <w:lsdException w:name="Book Title" w:semiHidden="0" w:uiPriority="33" w:unhideWhenUsed="0" w:qFormat="1"/>
+    <w:lsdException w:name="Bibliography" w:uiPriority="37"/>
+    <w:lsdException w:name="TOC Heading" w:uiPriority="39" w:qFormat="1"/>
+  </w:latentStyles>
+  <w:style w:type="paragraph" w:default="1" w:styleId="Normal">
+    <w:name w:val="Normal"/>
+    <w:qFormat/>
+    <w:rsid w:val="000F4FEF"/>
+    <w:pPr>
+      <w:spacing w:before="-1" w:after="-1" w:line="240" w:lineRule="auto"/>
+    </w:pPr>
+    <w:rPr>
+      <w:rFonts w:ascii="Arial" w:hAnsi="Arial" w:cs="Arial"/>
+    </w:rPr>
+  </w:style>
+  <w:style w:type="paragraph" w:styleId="Heading1">
+    <w:name w:val="heading 1"/>
+    <w:basedOn w:val="Normal"/>
+    <w:link w:val="Heading1Char"/>
+    <w:uiPriority w:val="9"/>
+    <w:qFormat/>
+    <w:rsid w:val="000F4FEF"/>
+    <w:pPr>
+      <w:pBdr>
+        <w:bottom w:val="single" w:sz="4" w:space="1" w:color="A6A6A6" w:themeColor="background1" w:themeShade="A6"/>
+      </w:pBdr>
+      <w:spacing w:before="0" w:beforeAutospacing="0" w:after="100" w:line="276" w:lineRule="auto"/>
+      <w:outlineLvl w:val="0"/>
+    </w:pPr>
+    <w:rPr>
+      <w:rFonts w:ascii="Helvetica" w:hAnsi="Helvetica" w:cs="Helvetica"/>
+      <w:color w:val="0A2A78"/>
+      <w:spacing w:val="-4"/>
+      <w:sz w:val="40"/>
+      <w:szCs w:val="24"/>
+    </w:rPr>
+  </w:style>
+  <w:style w:type="paragraph" w:styleId="Heading2">
+    <w:name w:val="heading 2"/>
+    <w:basedOn w:val="Normal"/>
+    <w:next w:val="Normal"/>
+    <w:link w:val="Heading2Char"/>
+    <w:uiPriority w:val="9"/>
+    <w:unhideWhenUsed/>
+    <w:qFormat/>
+    <w:rsid w:val="000F4FEF"/>
+    <w:pPr>
+      <w:widowControl w:val="0"/>
+      <w:autoSpaceDE w:val="0"/>
+      <w:autoSpaceDN w:val="0"/>
+      <w:spacing w:before="0" w:beforeAutospacing="0" w:after="0" w:afterAutospacing="0" w:line="276" w:lineRule="auto"/>
+      <w:outlineLvl w:val="1"/>
+    </w:pPr>
+    <w:rPr>
+      <w:rFonts w:ascii="Helvetica" w:eastAsiaTheme="minorHAnsi" w:hAnsi="Helvetica" w:cs="Helvetica"/>
+      <w:color w:val="0A2A78"/>
+      <w:spacing w:val="-2"/>
+      <w:sz w:val="36"/>
+      <w:szCs w:val="24"/>
+    </w:rPr>
+  </w:style>
+  <w:style w:type="paragraph" w:styleId="Heading3">
+    <w:name w:val="heading 3"/>
+    <w:basedOn w:val="Heading2"/>
+    <w:next w:val="Body"/>
+    <w:link w:val="Heading3Char"/>
+    <w:uiPriority w:val="9"/>
+    <w:unhideWhenUsed/>
+    <w:qFormat/>
+    <w:rsid w:val="000F4FEF"/>
+    <w:pPr>
+      <w:outlineLvl w:val="2"/>
+    </w:pPr>
+    <w:rPr>
+      <w:sz w:val="32"/>
+    </w:rPr>
+  </w:style>
+  <w:style w:type="paragraph" w:styleId="Heading4">
+    <w:name w:val="heading 4"/>
+    <w:basedOn w:val="Normal"/>
+    <w:next w:val="Normal"/>
+    <w:link w:val="Heading4Char"/>
+    <w:uiPriority w:val="9"/>
+    <w:unhideWhenUsed/>
+    <w:qFormat/>
+    <w:rsid w:val="000F4FEF"/>
+    <w:pPr>
+      <w:widowControl w:val="0"/>
+      <w:autoSpaceDE w:val="0"/>
+      <w:autoSpaceDN w:val="0"/>
+      <w:spacing w:before="54" w:beforeAutospacing="0" w:after="120" w:afterAutospacing="0" w:line="276" w:lineRule="auto"/>
+      <w:ind w:left="360"/>
+      <w:outlineLvl w:val="3"/>
+    </w:pPr>
+    <w:rPr>
+      <w:rFonts w:ascii="Helvetica" w:eastAsiaTheme="minorHAnsi" w:hAnsi="Helvetica" w:cs="Helvetica"/>
+      <w:iCs/>
+      <w:color w:val="0A2A78"/>
+      <w:spacing w:val="-2"/>
+      <w:sz w:val="24"/>
+      <w:szCs w:val="24"/>
+    </w:rPr>
+  </w:style>
+  <w:style w:type="paragraph" w:styleId="Heading5">
+    <w:name w:val="heading 5"/>
+    <w:basedOn w:val="Normal"/>
+    <w:next w:val="Normal"/>
+    <w:link w:val="Heading5Char"/>
+    <w:uiPriority w:val="9"/>
+    <w:unhideWhenUsed/>
+    <w:qFormat/>
+    <w:rsid w:val="000F4FEF"/>
+    <w:pPr>
+      <w:keepNext/>
+      <w:keepLines/>
+      <w:spacing w:before="240" w:after="80"/>
+      <w:outlineLvl w:val="4"/>
+    </w:pPr>
+    <w:rPr>
+      <w:color w:val="666666"/>
+    </w:rPr>
+  </w:style>
+  <w:style w:type="paragraph" w:styleId="Heading6">
+    <w:name w:val="heading 6"/>
+    <w:basedOn w:val="Normal"/>
+    <w:next w:val="Normal"/>
+    <w:link w:val="Heading6Char"/>
+    <w:uiPriority w:val="9"/>
+    <w:semiHidden/>
+    <w:unhideWhenUsed/>
+    <w:qFormat/>
+    <w:rsid w:val="000F4FEF"/>
+    <w:pPr>
+      <w:keepNext/>
+      <w:keepLines/>
+      <w:spacing w:before="240" w:after="80"/>
+      <w:outlineLvl w:val="5"/>
+    </w:pPr>
+    <w:rPr>
+      <w:i/>
+      <w:color w:val="666666"/>
+    </w:rPr>
+  </w:style>
+  <w:style w:type="character" w:default="1" w:styleId="DefaultParagraphFont">
+    <w:name w:val="Default Paragraph Font"/>
+    <w:uiPriority w:val="1"/>
+    <w:semiHidden/>
+    <w:unhideWhenUsed/>
+  </w:style>
+  <w:style w:type="table" w:default="1" w:styleId="TableNormal">
+    <w:name w:val="Normal Table"/>
+    <w:uiPriority w:val="99"/>
+    <w:semiHidden/>
+    <w:unhideWhenUsed/>
+    <w:tblPr>
+      <w:tblInd w:w="0" w:type="dxa"/>
+      <w:tblCellMar>
+        <w:top w:w="0" w:type="dxa"/>
+        <w:left w:w="108" w:type="dxa"/>
+        <w:bottom w:w="0" w:type="dxa"/>
+        <w:right w:w="108" w:type="dxa"/>
+      </w:tblCellMar>
+    </w:tblPr>
+  </w:style>
+  <w:style w:type="numbering" w:default="1" w:styleId="NoList">
+    <w:name w:val="No List"/>
+    <w:uiPriority w:val="99"/>
+    <w:semiHidden/>
+    <w:unhideWhenUsed/>
+  </w:style>
+  <w:style w:type="paragraph" w:customStyle="1" w:styleId="Code">
+    <w:name w:val="Code"/>
+    <w:basedOn w:val="Normal"/>
+    <w:qFormat/>
+    <w:rsid w:val="000F4FEF"/>
+    <w:rPr>
+      <w:rFonts w:ascii="Calibri" w:hAnsi="Calibri"/>
+    </w:rPr>
+  </w:style>
+  <w:style w:type="paragraph" w:customStyle="1" w:styleId="Body">
+    <w:name w:val="Body"/>
+    <w:basedOn w:val="Normal"/>
+    <w:link w:val="BodyChar"/>
+    <w:qFormat/>
+    <w:rsid w:val="000F4FEF"/>
+    <w:pPr>
+      <w:spacing w:before="0" w:beforeAutospacing="0" w:after="120" w:afterAutospacing="0" w:line="276" w:lineRule="auto"/>
+    </w:pPr>
+    <w:rPr>
+      <w:rFonts w:ascii="Helvetica" w:eastAsiaTheme="minorHAnsi" w:hAnsi="Helvetica" w:cs="Helvetica"/>
+      <w:sz w:val="24"/>
+      <w:szCs w:val="24"/>
+    </w:rPr>
+  </w:style>
+  <w:style w:type="character" w:customStyle="1" w:styleId="Heading1Char">
+    <w:name w:val="Heading 1 Char"/>
+    <w:basedOn w:val="DefaultParagraphFont"/>
+    <w:link w:val="Heading1"/>
+    <w:uiPriority w:val="9"/>
+    <w:rsid w:val="000F4FEF"/>
+    <w:rPr>
+      <w:rFonts w:ascii="Helvetica" w:hAnsi="Helvetica" w:cs="Helvetica"/>
+      <w:color w:val="0A2A78"/>
+      <w:spacing w:val="-4"/>
+      <w:sz w:val="40"/>
+      <w:szCs w:val="24"/>
+    </w:rPr>
+  </w:style>
+  <w:style w:type="paragraph" w:styleId="ListParagraph">
+    <w:name w:val="List Paragraph"/>
+    <w:basedOn w:val="BodyText"/>
+    <w:uiPriority w:val="34"/>
+    <w:qFormat/>
+    <w:rsid w:val="000F4FEF"/>
+    <w:pPr>
+      <w:widowControl w:val="0"/>
+      <w:numPr>
+        <w:numId w:val="35"/>
+      </w:numPr>
+      <w:autoSpaceDE w:val="0"/>
+      <w:autoSpaceDN w:val="0"/>
+      <w:spacing w:before="54" w:beforeAutospacing="0" w:afterAutospacing="0" w:line="276" w:lineRule="auto"/>
+    </w:pPr>
+    <w:rPr>
+      <w:rFonts w:ascii="Helvetica" w:eastAsiaTheme="minorHAnsi" w:hAnsi="Helvetica" w:cs="Helvetica"/>
+      <w:color w:val="202529"/>
+      <w:spacing w:val="-2"/>
+      <w:sz w:val="24"/>
+      <w:szCs w:val="24"/>
+    </w:rPr>
+  </w:style>
+  <w:style w:type="paragraph" w:customStyle="1" w:styleId="TFVariable">
+    <w:name w:val="TF Variable"/>
+    <w:basedOn w:val="Heading3"/>
+    <w:next w:val="Body"/>
+    <w:qFormat/>
+    <w:rsid w:val="000F4FEF"/>
+    <w:pPr>
+      <w:numPr>
+        <w:numId w:val="38"/>
+      </w:numPr>
+    </w:pPr>
+  </w:style>
+  <w:style w:type="character" w:customStyle="1" w:styleId="Heading3Char">
+    <w:name w:val="Heading 3 Char"/>
+    <w:basedOn w:val="DefaultParagraphFont"/>
+    <w:link w:val="Heading3"/>
+    <w:uiPriority w:val="9"/>
+    <w:qFormat/>
+    <w:rsid w:val="000F4FEF"/>
+    <w:rPr>
+      <w:rFonts w:ascii="Helvetica" w:eastAsiaTheme="minorHAnsi" w:hAnsi="Helvetica" w:cs="Helvetica"/>
+      <w:color w:val="0A2A78"/>
+      <w:spacing w:val="-2"/>
+      <w:sz w:val="32"/>
+      <w:szCs w:val="24"/>
+    </w:rPr>
+  </w:style>
+  <w:style w:type="paragraph" w:customStyle="1" w:styleId="interviewcondition">
+    <w:name w:val="interview condition"/>
+    <w:basedOn w:val="Normal"/>
+    <w:link w:val="interviewconditionChar"/>
+    <w:qFormat/>
+    <w:rsid w:val="00F44633"/>
+    <w:pPr>
+      <w:spacing w:after="60" w:line="360" w:lineRule="auto"/>
+    </w:pPr>
+    <w:rPr>
+      <w:rFonts w:asciiTheme="minorHAnsi" w:hAnsiTheme="minorHAnsi" w:cstheme="minorBidi"/>
+      <w:color w:val="00B050"/>
+      <w:u w:val="single"/>
+    </w:rPr>
+  </w:style>
+  <w:style w:type="character" w:customStyle="1" w:styleId="interviewconditionChar">
+    <w:name w:val="interview condition Char"/>
+    <w:basedOn w:val="DefaultParagraphFont"/>
+    <w:link w:val="interviewcondition"/>
+    <w:rsid w:val="00F44633"/>
+    <w:rPr>
+      <w:color w:val="00B050"/>
+      <w:u w:val="single"/>
+    </w:rPr>
+  </w:style>
+  <w:style w:type="paragraph" w:customStyle="1" w:styleId="interviewbutton">
+    <w:name w:val="interview button"/>
+    <w:basedOn w:val="Normal"/>
+    <w:next w:val="Normal"/>
+    <w:link w:val="interviewbuttonChar"/>
+    <w:qFormat/>
+    <w:rsid w:val="000F4FEF"/>
+    <w:pPr>
+      <w:shd w:val="clear" w:color="auto" w:fill="0070C0"/>
+      <w:spacing w:after="60" w:line="360" w:lineRule="auto"/>
+    </w:pPr>
+    <w:rPr>
+      <w:rFonts w:asciiTheme="minorHAnsi" w:hAnsiTheme="minorHAnsi" w:cstheme="minorBidi"/>
+      <w:color w:val="FFFFFF" w:themeColor="background1"/>
+      <w:szCs w:val="40"/>
+    </w:rPr>
+  </w:style>
+  <w:style w:type="character" w:customStyle="1" w:styleId="interviewbuttonChar">
+    <w:name w:val="interview button Char"/>
+    <w:basedOn w:val="DefaultParagraphFont"/>
+    <w:link w:val="interviewbutton"/>
+    <w:qFormat/>
+    <w:rsid w:val="000F4FEF"/>
+    <w:rPr>
+      <w:color w:val="FFFFFF" w:themeColor="background1"/>
+      <w:szCs w:val="40"/>
+      <w:shd w:val="clear" w:color="auto" w:fill="0070C0"/>
+    </w:rPr>
+  </w:style>
+  <w:style w:type="paragraph" w:styleId="BodyText">
+    <w:name w:val="Body Text"/>
+    <w:basedOn w:val="Normal"/>
+    <w:link w:val="BodyTextChar"/>
+    <w:uiPriority w:val="1"/>
+    <w:unhideWhenUsed/>
+    <w:qFormat/>
+    <w:rsid w:val="000F4FEF"/>
+    <w:pPr>
+      <w:spacing w:after="120"/>
+    </w:pPr>
+  </w:style>
+  <w:style w:type="character" w:customStyle="1" w:styleId="BodyTextChar">
+    <w:name w:val="Body Text Char"/>
+    <w:basedOn w:val="DefaultParagraphFont"/>
+    <w:link w:val="BodyText"/>
+    <w:uiPriority w:val="1"/>
+    <w:rsid w:val="000F4FEF"/>
+    <w:rPr>
+      <w:rFonts w:ascii="Arial" w:hAnsi="Arial" w:cs="Arial"/>
+    </w:rPr>
+  </w:style>
+  <w:style w:type="character" w:customStyle="1" w:styleId="interviewcondition2">
+    <w:name w:val="interview condition 2"/>
+    <w:basedOn w:val="Hyperlink"/>
+    <w:uiPriority w:val="1"/>
+    <w:qFormat/>
+    <w:rsid w:val="000F4FEF"/>
+    <w:rPr>
+      <w:rFonts w:ascii="Helvetica" w:eastAsia="Arial" w:hAnsi="Helvetica" w:cs="Helvetica"/>
+      <w:color w:val="009999"/>
+      <w:spacing w:val="-2"/>
+      <w:sz w:val="24"/>
+      <w:szCs w:val="24"/>
+      <w:u w:val="none"/>
+    </w:rPr>
+  </w:style>
+  <w:style w:type="character" w:styleId="Hyperlink">
+    <w:name w:val="Hyperlink"/>
+    <w:basedOn w:val="DefaultParagraphFont"/>
+    <w:uiPriority w:val="99"/>
+    <w:unhideWhenUsed/>
+    <w:rsid w:val="000F4FEF"/>
+    <w:rPr>
+      <w:rFonts w:ascii="Helvetica" w:hAnsi="Helvetica" w:cs="Helvetica"/>
+      <w:color w:val="0563C1" w:themeColor="hyperlink"/>
+      <w:spacing w:val="-2"/>
+      <w:sz w:val="24"/>
+      <w:szCs w:val="24"/>
+      <w:u w:val="none"/>
+    </w:rPr>
+  </w:style>
+  <w:style w:type="paragraph" w:customStyle="1" w:styleId="variable">
+    <w:name w:val="variable"/>
+    <w:basedOn w:val="Normal"/>
+    <w:qFormat/>
+    <w:rsid w:val="00B61CCF"/>
+    <w:pPr>
+      <w:spacing w:after="120" w:line="276" w:lineRule="auto"/>
+    </w:pPr>
+    <w:rPr>
+      <w:color w:val="FF7C80"/>
+      <w:shd w:val="clear" w:color="auto" w:fill="FFFFCC"/>
+      <w:lang w:val="en"/>
+    </w:rPr>
+  </w:style>
+  <w:style w:type="character" w:customStyle="1" w:styleId="Heading2Char">
+    <w:name w:val="Heading 2 Char"/>
+    <w:basedOn w:val="DefaultParagraphFont"/>
+    <w:link w:val="Heading2"/>
+    <w:uiPriority w:val="9"/>
+    <w:rsid w:val="000F4FEF"/>
+    <w:rPr>
+      <w:rFonts w:ascii="Helvetica" w:eastAsiaTheme="minorHAnsi" w:hAnsi="Helvetica" w:cs="Helvetica"/>
+      <w:color w:val="0A2A78"/>
+      <w:spacing w:val="-2"/>
+      <w:sz w:val="36"/>
+      <w:szCs w:val="24"/>
+    </w:rPr>
+  </w:style>
+  <w:style w:type="character" w:customStyle="1" w:styleId="Heading4Char">
+    <w:name w:val="Heading 4 Char"/>
+    <w:basedOn w:val="DefaultParagraphFont"/>
+    <w:link w:val="Heading4"/>
+    <w:uiPriority w:val="9"/>
+    <w:qFormat/>
+    <w:rsid w:val="000F4FEF"/>
+    <w:rPr>
+      <w:rFonts w:ascii="Helvetica" w:eastAsiaTheme="minorHAnsi" w:hAnsi="Helvetica" w:cs="Helvetica"/>
+      <w:iCs/>
+      <w:color w:val="0A2A78"/>
+      <w:spacing w:val="-2"/>
+      <w:sz w:val="24"/>
+      <w:szCs w:val="24"/>
+    </w:rPr>
+  </w:style>
+  <w:style w:type="paragraph" w:customStyle="1" w:styleId="Example">
+    <w:name w:val="Example"/>
+    <w:basedOn w:val="Heading4"/>
+    <w:next w:val="Normal"/>
+    <w:qFormat/>
+    <w:rsid w:val="000F4FEF"/>
+  </w:style>
+  <w:style w:type="paragraph" w:customStyle="1" w:styleId="Exampleparagraph">
+    <w:name w:val="Example paragraph"/>
+    <w:basedOn w:val="Body"/>
+    <w:next w:val="Body"/>
+    <w:qFormat/>
+    <w:rsid w:val="00CA58DD"/>
+    <w:pPr>
+      <w:ind w:left="416"/>
+    </w:pPr>
+    <w:rPr>
+      <w:color w:val="202529"/>
+      <w:spacing w:val="-2"/>
+    </w:rPr>
+  </w:style>
+  <w:style w:type="paragraph" w:customStyle="1" w:styleId="ListParagraphNumbered">
+    <w:name w:val="List Paragraph Numbered"/>
+    <w:basedOn w:val="ListParagraph"/>
+    <w:qFormat/>
+    <w:rsid w:val="000F4FEF"/>
+    <w:pPr>
+      <w:numPr>
+        <w:numId w:val="36"/>
+      </w:numPr>
+    </w:pPr>
+    <w:rPr>
+      <w:b/>
+    </w:rPr>
+  </w:style>
+  <w:style w:type="paragraph" w:customStyle="1" w:styleId="ExampleorImportantblock">
+    <w:name w:val="Example or Important block"/>
+    <w:basedOn w:val="Body"/>
+    <w:qFormat/>
+    <w:rsid w:val="000F4FEF"/>
+    <w:pPr>
+      <w:widowControl w:val="0"/>
+      <w:suppressAutoHyphens/>
+      <w:ind w:left="403"/>
+    </w:pPr>
+    <w:rPr>
+      <w:color w:val="202529"/>
+      <w:spacing w:val="-2"/>
+    </w:rPr>
+  </w:style>
+  <w:style w:type="paragraph" w:customStyle="1" w:styleId="Listnumbered">
+    <w:name w:val="List numbered"/>
+    <w:basedOn w:val="Normal"/>
+    <w:qFormat/>
+    <w:rsid w:val="000F4FEF"/>
+    <w:pPr>
+      <w:widowControl w:val="0"/>
+      <w:autoSpaceDE w:val="0"/>
+      <w:autoSpaceDN w:val="0"/>
+      <w:spacing w:before="54" w:beforeAutospacing="0" w:after="120" w:afterAutospacing="0" w:line="276" w:lineRule="auto"/>
+    </w:pPr>
+    <w:rPr>
+      <w:rFonts w:ascii="Helvetica" w:eastAsiaTheme="minorHAnsi" w:hAnsi="Helvetica" w:cs="Helvetica"/>
+      <w:color w:val="202529"/>
+      <w:spacing w:val="-2"/>
+      <w:sz w:val="24"/>
+      <w:szCs w:val="24"/>
+    </w:rPr>
+  </w:style>
+  <w:style w:type="character" w:customStyle="1" w:styleId="Helptextinquestionmark">
+    <w:name w:val="Help text in question mark"/>
+    <w:basedOn w:val="DefaultParagraphFont"/>
+    <w:uiPriority w:val="1"/>
+    <w:qFormat/>
+    <w:rsid w:val="000F4FEF"/>
+    <w:rPr>
+      <w:rFonts w:ascii="Tahoma" w:hAnsi="Tahoma" w:cs="Tahoma"/>
+      <w:color w:val="FFFFFF" w:themeColor="background1"/>
+      <w:szCs w:val="24"/>
+      <w:shd w:val="clear" w:color="auto" w:fill="33CCFF"/>
+    </w:rPr>
+  </w:style>
+  <w:style w:type="character" w:customStyle="1" w:styleId="interviewtextbox">
+    <w:name w:val="interview text box"/>
+    <w:basedOn w:val="DefaultParagraphFont"/>
+    <w:uiPriority w:val="1"/>
+    <w:qFormat/>
+    <w:rsid w:val="000F4FEF"/>
+    <w:rPr>
+      <w:shd w:val="clear" w:color="auto" w:fill="D9D9D9" w:themeFill="background1" w:themeFillShade="D9"/>
+    </w:rPr>
+  </w:style>
+  <w:style w:type="character" w:customStyle="1" w:styleId="interviewhelpquestionmark">
+    <w:name w:val="interview help question mark"/>
+    <w:basedOn w:val="DefaultParagraphFont"/>
+    <w:uiPriority w:val="1"/>
+    <w:qFormat/>
+    <w:rsid w:val="000F4FEF"/>
+    <w:rPr>
+      <w:color w:val="FFFFFF" w:themeColor="background1"/>
+      <w:shd w:val="clear" w:color="auto" w:fill="9CC2E5" w:themeFill="accent5" w:themeFillTint="99"/>
+    </w:rPr>
+  </w:style>
+  <w:style w:type="paragraph" w:customStyle="1" w:styleId="ListPlevel2">
+    <w:name w:val="List P level 2"/>
+    <w:basedOn w:val="ListParagraph"/>
+    <w:qFormat/>
+    <w:rsid w:val="000F4FEF"/>
+    <w:pPr>
+      <w:ind w:left="765"/>
+    </w:pPr>
+    <w:rPr>
+      <w:color w:val="auto"/>
+      <w:spacing w:val="0"/>
+    </w:rPr>
+  </w:style>
+  <w:style w:type="paragraph" w:customStyle="1" w:styleId="ListPlevel3">
+    <w:name w:val="List P level 3"/>
+    <w:basedOn w:val="ListPlevel2"/>
+    <w:qFormat/>
+    <w:rsid w:val="000F4FEF"/>
+    <w:pPr>
+      <w:tabs>
+        <w:tab w:val="num" w:pos="360"/>
+      </w:tabs>
+      <w:ind w:left="2160"/>
+    </w:pPr>
+  </w:style>
+  <w:style w:type="paragraph" w:customStyle="1" w:styleId="ListParagraphNumberedBold">
+    <w:name w:val="List Paragraph Numbered (Bold)"/>
+    <w:basedOn w:val="ListParagraphNumbered"/>
+    <w:qFormat/>
+    <w:rsid w:val="00AA522D"/>
+    <w:pPr>
+      <w:ind w:left="405"/>
+    </w:pPr>
+    <w:rPr>
+      <w:color w:val="auto"/>
+      <w:spacing w:val="0"/>
+    </w:rPr>
+  </w:style>
+  <w:style w:type="paragraph" w:styleId="Footer">
+    <w:name w:val="footer"/>
+    <w:basedOn w:val="Normal"/>
+    <w:link w:val="FooterChar"/>
+    <w:uiPriority w:val="99"/>
+    <w:unhideWhenUsed/>
+    <w:rsid w:val="000F4FEF"/>
+    <w:pPr>
+      <w:tabs>
+        <w:tab w:val="center" w:pos="4680"/>
+        <w:tab w:val="right" w:pos="9360"/>
+      </w:tabs>
+    </w:pPr>
+  </w:style>
+  <w:style w:type="character" w:customStyle="1" w:styleId="FooterChar">
+    <w:name w:val="Footer Char"/>
+    <w:basedOn w:val="DefaultParagraphFont"/>
+    <w:link w:val="Footer"/>
+    <w:uiPriority w:val="99"/>
+    <w:qFormat/>
+    <w:rsid w:val="000F4FEF"/>
+    <w:rPr>
+      <w:rFonts w:ascii="Arial" w:hAnsi="Arial" w:cs="Arial"/>
+    </w:rPr>
+  </w:style>
+  <w:style w:type="paragraph" w:customStyle="1" w:styleId="FooterRight">
+    <w:name w:val="Footer Right"/>
+    <w:basedOn w:val="Footer"/>
+    <w:qFormat/>
+    <w:rsid w:val="00FA6057"/>
+    <w:pPr>
+      <w:jc w:val="right"/>
+    </w:pPr>
+  </w:style>
+  <w:style w:type="paragraph" w:customStyle="1" w:styleId="interviewsituationpara">
+    <w:name w:val="interview situation para"/>
+    <w:basedOn w:val="Body"/>
+    <w:next w:val="interviewsituationcondition"/>
+    <w:link w:val="interviewsituationparaChar"/>
+    <w:qFormat/>
+    <w:rsid w:val="00DD3DDA"/>
+    <w:pPr>
+      <w:spacing w:before="120" w:after="0" w:line="240" w:lineRule="auto"/>
+      <w:contextualSpacing/>
+    </w:pPr>
+  </w:style>
+  <w:style w:type="character" w:customStyle="1" w:styleId="interviewsituationparaChar">
+    <w:name w:val="interview situation para Char"/>
+    <w:basedOn w:val="BodyChar"/>
+    <w:link w:val="interviewsituationpara"/>
+    <w:rsid w:val="00DD3DDA"/>
+    <w:rPr>
+      <w:rFonts w:ascii="Helvetica" w:eastAsiaTheme="minorHAnsi" w:hAnsi="Helvetica" w:cs="Helvetica"/>
+      <w:sz w:val="24"/>
+      <w:szCs w:val="24"/>
+    </w:rPr>
+  </w:style>
+  <w:style w:type="paragraph" w:customStyle="1" w:styleId="Done">
+    <w:name w:val="Done"/>
+    <w:basedOn w:val="ListParagraph"/>
+    <w:qFormat/>
+    <w:rsid w:val="00DD3DDA"/>
+    <w:pPr>
+      <w:numPr>
+        <w:ilvl w:val="1"/>
+        <w:numId w:val="19"/>
+      </w:numPr>
+    </w:pPr>
+  </w:style>
+  <w:style w:type="character" w:customStyle="1" w:styleId="subject">
+    <w:name w:val="subject"/>
+    <w:basedOn w:val="DefaultParagraphFont"/>
+    <w:rsid w:val="000F4FEF"/>
+  </w:style>
+  <w:style w:type="character" w:customStyle="1" w:styleId="convention">
+    <w:name w:val="convention"/>
+    <w:basedOn w:val="DefaultParagraphFont"/>
+    <w:uiPriority w:val="1"/>
+    <w:qFormat/>
+    <w:rsid w:val="000F4FEF"/>
+    <w:rPr>
+      <w:sz w:val="22"/>
+      <w:szCs w:val="22"/>
+      <w:shd w:val="clear" w:color="auto" w:fill="A6A6A6" w:themeFill="background1" w:themeFillShade="A6"/>
+    </w:rPr>
+  </w:style>
+  <w:style w:type="paragraph" w:customStyle="1" w:styleId="Default">
+    <w:name w:val="Default"/>
+    <w:rsid w:val="000F4FEF"/>
+    <w:pPr>
+      <w:autoSpaceDE w:val="0"/>
+      <w:autoSpaceDN w:val="0"/>
+      <w:adjustRightInd w:val="0"/>
+      <w:spacing w:beforeAutospacing="0" w:after="0" w:afterAutospacing="0" w:line="240" w:lineRule="auto"/>
+    </w:pPr>
+    <w:rPr>
+      <w:rFonts w:ascii="Arial" w:eastAsiaTheme="minorHAnsi" w:hAnsi="Arial" w:cs="Arial"/>
+      <w:color w:val="000000"/>
+      <w:sz w:val="24"/>
+      <w:szCs w:val="24"/>
+    </w:rPr>
+  </w:style>
+  <w:style w:type="paragraph" w:customStyle="1" w:styleId="Example-bulleted">
+    <w:name w:val="Example - bulleted"/>
+    <w:basedOn w:val="Body"/>
+    <w:qFormat/>
+    <w:rsid w:val="000F4FEF"/>
+    <w:pPr>
+      <w:widowControl w:val="0"/>
+      <w:numPr>
+        <w:numId w:val="28"/>
+      </w:numPr>
+      <w:suppressAutoHyphens/>
+      <w:autoSpaceDE w:val="0"/>
+      <w:autoSpaceDN w:val="0"/>
+      <w:spacing w:before="60"/>
+    </w:pPr>
+    <w:rPr>
+      <w:rFonts w:eastAsia="Calibri"/>
+    </w:rPr>
+  </w:style>
+  <w:style w:type="character" w:customStyle="1" w:styleId="f1-light">
+    <w:name w:val="f1-light"/>
+    <w:basedOn w:val="DefaultParagraphFont"/>
+    <w:rsid w:val="000F4FEF"/>
+  </w:style>
+  <w:style w:type="paragraph" w:customStyle="1" w:styleId="H3numberedfordirections">
+    <w:name w:val="H3 numbered for directions"/>
+    <w:basedOn w:val="Heading3"/>
+    <w:next w:val="Normal"/>
+    <w:qFormat/>
+    <w:rsid w:val="000F4FEF"/>
+    <w:pPr>
+      <w:numPr>
+        <w:numId w:val="29"/>
+      </w:numPr>
+      <w:outlineLvl w:val="9"/>
+    </w:pPr>
+  </w:style>
+  <w:style w:type="character" w:customStyle="1" w:styleId="Interviewbutton0">
+    <w:name w:val="Interview button"/>
+    <w:basedOn w:val="DefaultParagraphFont"/>
+    <w:uiPriority w:val="1"/>
+    <w:qFormat/>
+    <w:rsid w:val="000F4FEF"/>
+    <w:rPr>
+      <w:color w:val="FFFFFF" w:themeColor="background1"/>
+      <w:bdr w:val="none" w:sz="0" w:space="0" w:color="auto"/>
+      <w:shd w:val="clear" w:color="auto" w:fill="0B5ED8"/>
+    </w:rPr>
+  </w:style>
+  <w:style w:type="paragraph" w:customStyle="1" w:styleId="interviewbuttons">
+    <w:name w:val="interview buttons"/>
+    <w:basedOn w:val="Normal"/>
+    <w:qFormat/>
+    <w:rsid w:val="000F4FEF"/>
+    <w:pPr>
+      <w:pBdr>
+        <w:top w:val="single" w:sz="12" w:space="1" w:color="0070C0"/>
+        <w:left w:val="single" w:sz="12" w:space="4" w:color="0070C0"/>
+        <w:bottom w:val="single" w:sz="12" w:space="1" w:color="0070C0"/>
+        <w:right w:val="single" w:sz="12" w:space="4" w:color="0070C0"/>
+        <w:between w:val="single" w:sz="12" w:space="1" w:color="0070C0"/>
+        <w:bar w:val="single" w:sz="12" w:color="0070C0"/>
+      </w:pBdr>
+      <w:shd w:val="clear" w:color="auto" w:fill="FFFFFF"/>
+      <w:spacing w:after="0"/>
+      <w:ind w:left="-58" w:right="-216"/>
+    </w:pPr>
+    <w:rPr>
+      <w:sz w:val="21"/>
+      <w:szCs w:val="21"/>
+    </w:rPr>
+  </w:style>
+  <w:style w:type="paragraph" w:customStyle="1" w:styleId="interviewcheckboxes">
+    <w:name w:val="interview checkboxes"/>
+    <w:basedOn w:val="ListParagraph"/>
+    <w:qFormat/>
+    <w:rsid w:val="000F4FEF"/>
+    <w:pPr>
+      <w:numPr>
+        <w:numId w:val="31"/>
+      </w:numPr>
+      <w:pBdr>
+        <w:top w:val="single" w:sz="12" w:space="1" w:color="0070C0"/>
+        <w:left w:val="single" w:sz="12" w:space="4" w:color="0070C0"/>
+        <w:bottom w:val="single" w:sz="12" w:space="1" w:color="0070C0"/>
+        <w:right w:val="single" w:sz="12" w:space="4" w:color="0070C0"/>
+        <w:between w:val="single" w:sz="12" w:space="1" w:color="0070C0"/>
+        <w:bar w:val="single" w:sz="12" w:color="0070C0"/>
+      </w:pBdr>
+    </w:pPr>
+  </w:style>
+  <w:style w:type="character" w:customStyle="1" w:styleId="interviewclickformoreinfo-definition">
+    <w:name w:val="interview click for more info - definition"/>
+    <w:uiPriority w:val="1"/>
+    <w:qFormat/>
+    <w:rsid w:val="000F4FEF"/>
+    <w:rPr>
+      <w:color w:val="00B050"/>
+      <w:u w:val="dash" w:color="92D050"/>
+    </w:rPr>
+  </w:style>
+  <w:style w:type="character" w:customStyle="1" w:styleId="InterviewCommentText">
+    <w:name w:val="Interview Comment Text"/>
+    <w:basedOn w:val="BodyTextChar"/>
+    <w:uiPriority w:val="1"/>
+    <w:qFormat/>
+    <w:rsid w:val="000F4FEF"/>
+    <w:rPr>
+      <w:rFonts w:ascii="Helvetica" w:eastAsia="Arial" w:hAnsi="Helvetica" w:cs="Helvetica"/>
+      <w:color w:val="7030A0"/>
+      <w:spacing w:val="-2"/>
+      <w:sz w:val="24"/>
+      <w:szCs w:val="24"/>
+    </w:rPr>
+  </w:style>
+  <w:style w:type="character" w:customStyle="1" w:styleId="interviewconvention">
+    <w:name w:val="interview convention"/>
+    <w:basedOn w:val="DefaultParagraphFont"/>
+    <w:uiPriority w:val="1"/>
+    <w:qFormat/>
+    <w:rsid w:val="000F4FEF"/>
+    <w:rPr>
+      <w:sz w:val="22"/>
+      <w:szCs w:val="22"/>
+      <w:shd w:val="clear" w:color="auto" w:fill="A6A6A6" w:themeFill="background1" w:themeFillShade="A6"/>
+    </w:rPr>
+  </w:style>
+  <w:style w:type="paragraph" w:customStyle="1" w:styleId="interviewglossarywordintemplate">
+    <w:name w:val="interview glossary word in template"/>
+    <w:basedOn w:val="Normal"/>
+    <w:link w:val="interviewglossarywordintemplateChar"/>
+    <w:qFormat/>
+    <w:rsid w:val="000F4FEF"/>
+    <w:pPr>
+      <w:spacing w:after="60" w:line="360" w:lineRule="auto"/>
+    </w:pPr>
+    <w:rPr>
+      <w:rFonts w:asciiTheme="minorHAnsi" w:hAnsiTheme="minorHAnsi" w:cstheme="minorBidi"/>
+    </w:rPr>
+  </w:style>
+  <w:style w:type="character" w:customStyle="1" w:styleId="interviewglossarywordintemplateChar">
+    <w:name w:val="interview glossary word in template Char"/>
+    <w:basedOn w:val="DefaultParagraphFont"/>
+    <w:link w:val="interviewglossarywordintemplate"/>
+    <w:rsid w:val="000F4FEF"/>
+  </w:style>
+  <w:style w:type="character" w:customStyle="1" w:styleId="interviewsituation">
+    <w:name w:val="interview situation"/>
+    <w:basedOn w:val="interviewneedstobewritten"/>
+    <w:uiPriority w:val="1"/>
+    <w:qFormat/>
+    <w:rsid w:val="00DD3DDA"/>
+    <w:rPr>
+      <w:shd w:val="clear" w:color="auto" w:fill="FFFF00"/>
+    </w:rPr>
+  </w:style>
+  <w:style w:type="character" w:customStyle="1" w:styleId="interviewneedstobewritten">
+    <w:name w:val="interview needs to be written"/>
+    <w:basedOn w:val="DefaultParagraphFont"/>
+    <w:uiPriority w:val="1"/>
+    <w:qFormat/>
+    <w:rsid w:val="000F4FEF"/>
+    <w:rPr>
+      <w:shd w:val="clear" w:color="auto" w:fill="FFFF00"/>
+    </w:rPr>
+  </w:style>
+  <w:style w:type="character" w:customStyle="1" w:styleId="interviewPAPtexttrigger">
+    <w:name w:val="interview PAP text trigger"/>
+    <w:basedOn w:val="DefaultParagraphFont"/>
+    <w:uiPriority w:val="1"/>
+    <w:qFormat/>
+    <w:rsid w:val="000F4FEF"/>
+    <w:rPr>
+      <w:shd w:val="clear" w:color="auto" w:fill="009999"/>
+    </w:rPr>
+  </w:style>
+  <w:style w:type="character" w:customStyle="1" w:styleId="interviewpdf">
+    <w:name w:val="interview pdf"/>
+    <w:basedOn w:val="DefaultParagraphFont"/>
+    <w:uiPriority w:val="1"/>
+    <w:qFormat/>
+    <w:rsid w:val="000F4FEF"/>
+    <w:rPr>
+      <w:b/>
+      <w:szCs w:val="24"/>
+      <w:shd w:val="clear" w:color="auto" w:fill="FF00FF"/>
+    </w:rPr>
+  </w:style>
+  <w:style w:type="paragraph" w:customStyle="1" w:styleId="interviewquestionid">
+    <w:name w:val="interview question id"/>
+    <w:basedOn w:val="BodyText"/>
+    <w:qFormat/>
+    <w:rsid w:val="000F4FEF"/>
+    <w:pPr>
+      <w:spacing w:before="240" w:after="0"/>
+    </w:pPr>
+    <w:rPr>
+      <w:color w:val="FF9F9F"/>
+    </w:rPr>
+  </w:style>
+  <w:style w:type="paragraph" w:customStyle="1" w:styleId="interviewradiobuttons">
+    <w:name w:val="interview radio buttons"/>
+    <w:basedOn w:val="ListParagraph"/>
+    <w:qFormat/>
+    <w:rsid w:val="000F4FEF"/>
+    <w:pPr>
+      <w:numPr>
+        <w:numId w:val="32"/>
+      </w:numPr>
+      <w:pBdr>
+        <w:top w:val="single" w:sz="12" w:space="1" w:color="0070C0"/>
+        <w:left w:val="single" w:sz="12" w:space="4" w:color="0070C0"/>
+        <w:bottom w:val="single" w:sz="12" w:space="1" w:color="0070C0"/>
+        <w:right w:val="single" w:sz="12" w:space="4" w:color="0070C0"/>
+        <w:between w:val="single" w:sz="12" w:space="1" w:color="0070C0"/>
+        <w:bar w:val="single" w:sz="12" w:color="0070C0"/>
+      </w:pBdr>
+      <w:shd w:val="clear" w:color="auto" w:fill="FFFFFF"/>
+      <w:spacing w:after="480" w:line="360" w:lineRule="auto"/>
+      <w:ind w:right="-220"/>
+    </w:pPr>
+    <w:rPr>
+      <w:szCs w:val="21"/>
+    </w:rPr>
+  </w:style>
+  <w:style w:type="character" w:customStyle="1" w:styleId="interviewvariable">
+    <w:name w:val="interview variable"/>
+    <w:basedOn w:val="DefaultParagraphFont"/>
+    <w:uiPriority w:val="1"/>
+    <w:qFormat/>
+    <w:rsid w:val="000F4FEF"/>
+    <w:rPr>
+      <w:color w:val="FF7C80"/>
+      <w:shd w:val="clear" w:color="auto" w:fill="FFFFCC"/>
+    </w:rPr>
+  </w:style>
+  <w:style w:type="paragraph" w:customStyle="1" w:styleId="Listnumberedunderbullet">
+    <w:name w:val="List numbered under bullet"/>
+    <w:basedOn w:val="Normal"/>
+    <w:qFormat/>
+    <w:rsid w:val="000F4FEF"/>
+    <w:pPr>
+      <w:widowControl w:val="0"/>
+      <w:numPr>
+        <w:ilvl w:val="4"/>
+        <w:numId w:val="33"/>
+      </w:numPr>
+      <w:autoSpaceDE w:val="0"/>
+      <w:autoSpaceDN w:val="0"/>
+      <w:spacing w:before="54" w:beforeAutospacing="0" w:after="120" w:afterAutospacing="0" w:line="276" w:lineRule="auto"/>
+    </w:pPr>
+    <w:rPr>
+      <w:rFonts w:ascii="Helvetica" w:eastAsiaTheme="minorHAnsi" w:hAnsi="Helvetica" w:cs="Helvetica"/>
+      <w:color w:val="202529"/>
+      <w:spacing w:val="-2"/>
+      <w:sz w:val="24"/>
+      <w:szCs w:val="24"/>
+    </w:rPr>
+  </w:style>
+  <w:style w:type="paragraph" w:customStyle="1" w:styleId="MLRIAdvocacyguideforPDFPart">
+    <w:name w:val="MLRI Advocacy guide for PDF Part"/>
+    <w:basedOn w:val="Normal"/>
+    <w:qFormat/>
+    <w:rsid w:val="000F4FEF"/>
+    <w:pPr>
+      <w:spacing w:before="480" w:after="80" w:line="320" w:lineRule="exact"/>
+      <w:ind w:left="187"/>
+    </w:pPr>
+    <w:rPr>
+      <w:rFonts w:ascii="Bookman Old Style" w:hAnsi="Bookman Old Style"/>
+      <w:color w:val="808080"/>
+      <w:szCs w:val="28"/>
+    </w:rPr>
+  </w:style>
+  <w:style w:type="character" w:customStyle="1" w:styleId="NumChar">
+    <w:name w:val="NumChar"/>
+    <w:basedOn w:val="DefaultParagraphFont"/>
+    <w:uiPriority w:val="1"/>
+    <w:qFormat/>
+    <w:rsid w:val="000F4FEF"/>
+    <w:rPr>
+      <w:rFonts w:eastAsiaTheme="minorHAnsi"/>
+    </w:rPr>
+  </w:style>
+  <w:style w:type="paragraph" w:customStyle="1" w:styleId="one-indent">
+    <w:name w:val="one-indent"/>
+    <w:basedOn w:val="Normal"/>
+    <w:rsid w:val="000F4FEF"/>
+    <w:pPr>
+      <w:spacing w:before="100" w:after="100"/>
+    </w:pPr>
+    <w:rPr>
+      <w:rFonts w:ascii="Times New Roman" w:eastAsia="Times New Roman" w:hAnsi="Times New Roman" w:cs="Times New Roman"/>
+      <w:sz w:val="24"/>
+      <w:szCs w:val="24"/>
+    </w:rPr>
+  </w:style>
+  <w:style w:type="character" w:customStyle="1" w:styleId="small">
+    <w:name w:val="small"/>
+    <w:basedOn w:val="DefaultParagraphFont"/>
+    <w:rsid w:val="000F4FEF"/>
+    <w:rPr>
+      <w:rFonts w:cs="Times New Roman"/>
+    </w:rPr>
+  </w:style>
+  <w:style w:type="paragraph" w:customStyle="1" w:styleId="StyleHeading1Hanging008">
+    <w:name w:val="Style Heading 1 + Hanging:  0.08&quot;"/>
+    <w:basedOn w:val="Heading1"/>
+    <w:qFormat/>
+    <w:rsid w:val="000F4FEF"/>
+    <w:pPr>
+      <w:spacing w:before="120"/>
+      <w:ind w:hanging="115"/>
+    </w:pPr>
+    <w:rPr>
+      <w:rFonts w:eastAsia="Times New Roman" w:cs="Times New Roman"/>
+      <w:szCs w:val="20"/>
+    </w:rPr>
+  </w:style>
+  <w:style w:type="numbering" w:customStyle="1" w:styleId="Style1">
+    <w:name w:val="Style1"/>
+    <w:uiPriority w:val="99"/>
+    <w:rsid w:val="000F4FEF"/>
+    <w:pPr>
+      <w:numPr>
+        <w:numId w:val="17"/>
+      </w:numPr>
+    </w:pPr>
+  </w:style>
+  <w:style w:type="paragraph" w:customStyle="1" w:styleId="TableParagraph">
+    <w:name w:val="Table Paragraph"/>
+    <w:basedOn w:val="Normal"/>
+    <w:uiPriority w:val="1"/>
+    <w:qFormat/>
+    <w:rsid w:val="000F4FEF"/>
+  </w:style>
+  <w:style w:type="character" w:customStyle="1" w:styleId="UnresolvedMention">
     <w:name w:val="Unresolved Mention"/>
     <w:basedOn w:val="DefaultParagraphFont"/>
     <w:uiPriority w:val="99"/>
@@ -5886,7 +7455,7 @@
   <a:extraClrSchemeLst/>
   <a:extLst>
     <a:ext uri="{05A4C25C-085E-4340-85A3-A5531E510DB2}">
-      <thm15:themeFamily xmlns:thm15="http://schemas.microsoft.com/office/thememl/2012/main" name="Office Theme" id="{62F939B6-93AF-4DB8-9C6B-D6C7DFDC589F}" vid="{4A3C46E8-61CC-4603-A589-7422A47A8E4A}"/>
+      <thm15:themeFamily xmlns:thm15="http://schemas.microsoft.com/office/thememl/2012/main" xmlns="" name="Office Theme" id="{62F939B6-93AF-4DB8-9C6B-D6C7DFDC589F}" vid="{4A3C46E8-61CC-4603-A589-7422A47A8E4A}"/>
     </a:ext>
   </a:extLst>
 </a:theme>

</xml_diff>

<commit_message>
double checking and matching paternity_steps in docx and yml templates
</commit_message>
<xml_diff>
--- a/docassemble/AKA2JBranding/data/templates/paternity_content.docx
+++ b/docassemble/AKA2JBranding/data/templates/paternity_content.docx
@@ -39,13 +39,28 @@
     </w:p>
     <w:p>
       <w:pPr>
-        <w:pStyle w:val="Heading3"/>
-      </w:pPr>
-      <w:r>
+        <w:pStyle w:val="Body"/>
         <w:rPr>
           <w:color w:val="FF0000"/>
         </w:rPr>
-        <w:t xml:space="preserve">{% if </w:t>
+      </w:pPr>
+      <w:r>
+        <w:rPr>
+          <w:color w:val="FF0000"/>
+        </w:rPr>
+        <w:t>{%</w:t>
+      </w:r>
+      <w:r>
+        <w:rPr>
+          <w:color w:val="FF0000"/>
+        </w:rPr>
+        <w:t>p</w:t>
+      </w:r>
+      <w:r>
+        <w:rPr>
+          <w:color w:val="FF0000"/>
+        </w:rPr>
+        <w:t xml:space="preserve"> if </w:t>
       </w:r>
       <w:proofErr w:type="spellStart"/>
       <w:r>
@@ -59,362 +74,90 @@
         <w:rPr>
           <w:color w:val="FF0000"/>
         </w:rPr>
-        <w:t xml:space="preserve"> </w:t>
-      </w:r>
-      <w:proofErr w:type="gramStart"/>
-      <w:r>
-        <w:rPr>
-          <w:color w:val="FF0000"/>
-        </w:rPr>
-        <w:t>in(</w:t>
-      </w:r>
-      <w:proofErr w:type="gramEnd"/>
-      <w:r>
-        <w:rPr>
-          <w:color w:val="FF0000"/>
-        </w:rPr>
-        <w:t>'custody', 'answer custody') %}</w:t>
-      </w:r>
-      <w:r>
-        <w:t xml:space="preserve">Establishing or disestablishing paternity in your custody </w:t>
-      </w:r>
-      <w:proofErr w:type="gramStart"/>
-      <w:r>
-        <w:t>case</w:t>
-      </w:r>
-      <w:r>
-        <w:rPr>
-          <w:color w:val="FF0000"/>
-        </w:rPr>
-        <w:t>{</w:t>
-      </w:r>
-      <w:proofErr w:type="gramEnd"/>
-      <w:r>
-        <w:rPr>
-          <w:color w:val="FF0000"/>
-        </w:rPr>
-        <w:t>% endif %</w:t>
-      </w:r>
-      <w:r>
-        <w:rPr>
-          <w:color w:val="FF0000"/>
-        </w:rPr>
-        <w:t>}</w:t>
+        <w:t xml:space="preserve"> == 'divorce' %}</w:t>
       </w:r>
     </w:p>
     <w:p>
       <w:pPr>
         <w:pStyle w:val="Body"/>
-        <w:spacing w:before="280" w:after="280"/>
-      </w:pPr>
-      <w:r>
-        <w:rPr>
-          <w:color w:val="9CC2E5" w:themeColor="accent5" w:themeTint="99"/>
-        </w:rPr>
-        <w:t>{% if user_need == 'custody' %}</w:t>
-      </w:r>
-      <w:r>
-        <w:t>When you file your complaint, state that paternity is an issue in section 3D</w:t>
-      </w:r>
-      <w:r>
-        <w:rPr>
-          <w:color w:val="9CC2E5" w:themeColor="accent5" w:themeTint="99"/>
-        </w:rPr>
-        <w:t xml:space="preserve"> </w:t>
-      </w:r>
-      <w:r>
-        <w:t>of the complaint.</w:t>
-      </w:r>
-      <w:r>
-        <w:rPr>
-          <w:color w:val="9CC2E5" w:themeColor="accent5" w:themeTint="99"/>
-        </w:rPr>
-        <w:t>{% elif user_need == 'answer custody' %}</w:t>
-      </w:r>
-      <w:r>
-        <w:t>When you file your Answer, state that paternity is an issue in section 4</w:t>
-      </w:r>
-      <w:r>
-        <w:rPr>
-          <w:color w:val="9CC2E5" w:themeColor="accent5" w:themeTint="99"/>
-        </w:rPr>
-        <w:t xml:space="preserve"> </w:t>
-      </w:r>
-      <w:r>
-        <w:t>of the Counterclaims section of the Answer.</w:t>
-      </w:r>
-      <w:r>
-        <w:rPr>
-          <w:color w:val="9CC2E5" w:themeColor="accent5" w:themeTint="99"/>
-        </w:rPr>
-        <w:t>{% endif %}</w:t>
-      </w:r>
-      <w:r>
-        <w:t xml:space="preserve"> </w:t>
+      </w:pPr>
+      <w:r>
+        <w:t>Courts use genetic testing, more commonly called "DNA testing," to establish or disestablish paternity. To take the test, a DNA sample is collected using a swab, similar to a Q-Tip, inside the cheek to pick up cells. Samples are collected from the mother, the child, and the person who may be the father. The testing is painless and the whole process takes about 15 minutes. Once all the samples have been collected, the result is ready within about 3 weeks.</w:t>
       </w:r>
     </w:p>
     <w:p>
       <w:pPr>
-        <w:pStyle w:val="Body"/>
-        <w:spacing w:before="280" w:after="280"/>
-      </w:pPr>
-      <w:r>
-        <w:t xml:space="preserve"> You can prove or disprove paternity several ways.</w:t>
+        <w:pStyle w:val="Heading3"/>
+      </w:pPr>
+      <w:r>
+        <w:t>If you are unsure, you can ask for a paternity test</w:t>
+      </w:r>
+      <w:r>
+        <w:t xml:space="preserve"> </w:t>
+      </w:r>
+      <w:r>
+        <w:rPr>
+          <w:bCs/>
+        </w:rPr>
+        <w:t>i</w:t>
+      </w:r>
+      <w:r>
+        <w:rPr>
+          <w:bCs/>
+        </w:rPr>
+        <w:t xml:space="preserve">n </w:t>
+      </w:r>
+      <w:r>
+        <w:rPr>
+          <w:bCs/>
+        </w:rPr>
+        <w:t>c</w:t>
+      </w:r>
+      <w:r>
+        <w:rPr>
+          <w:bCs/>
+        </w:rPr>
+        <w:t>our</w:t>
+      </w:r>
+      <w:r>
+        <w:t>t</w:t>
       </w:r>
     </w:p>
     <w:p>
       <w:pPr>
-        <w:pStyle w:val="ListParagraph"/>
-        <w:numPr>
-          <w:ilvl w:val="0"/>
-          <w:numId w:val="41"/>
-        </w:numPr>
-      </w:pPr>
-      <w:r>
-        <w:t>The mother, legal father and biological father sign an affidavit stating the biological father. Fill out:</w:t>
-      </w:r>
-      <w:r>
-        <w:br/>
+        <w:pStyle w:val="Body"/>
+      </w:pPr>
+      <w:r>
+        <w:t xml:space="preserve">Once you open a case to </w:t>
+      </w:r>
+      <w:r>
+        <w:t xml:space="preserve">end your marriage, you can file a </w:t>
       </w:r>
       <w:r>
         <w:rPr>
           <w:b/>
         </w:rPr>
-        <w:t>Three-Way Affidavit to Disestablish and Establish Paternity, DR-521</w:t>
-      </w:r>
-      <w:r>
-        <w:t xml:space="preserve"> | [</w:t>
-      </w:r>
-      <w:hyperlink r:id="rId6">
+        <w:t>Motion &amp; Affidavit for Genetic (DNA) Testing, DR-530</w:t>
+      </w:r>
+      <w:r>
+        <w:rPr>
+          <w:bCs/>
+        </w:rPr>
+        <w:t xml:space="preserve"> [</w:t>
+      </w:r>
+      <w:hyperlink r:id="rId6" w:history="1">
         <w:r>
           <w:rPr>
             <w:rStyle w:val="Hyperlink"/>
           </w:rPr>
-          <w:t>Fill-in PDF</w:t>
-        </w:r>
-      </w:hyperlink>
-      <w:r>
-        <w:rPr>
-          <w:rStyle w:val="Hyperlink"/>
-          <w:color w:val="auto"/>
-        </w:rPr>
-        <w:t>]</w:t>
-      </w:r>
-    </w:p>
-    <w:p>
-      <w:pPr>
-        <w:pStyle w:val="ListParagraph"/>
-        <w:numPr>
-          <w:ilvl w:val="0"/>
-          <w:numId w:val="41"/>
-        </w:numPr>
-      </w:pPr>
-      <w:r>
-        <w:t>The mother, child, and person who may be the father take a DNA test using a painless swab inside the cheek. The whole process takes about 15 minutes and the result is ready within about 3 weeks. If someone is not cooperating or you want Child Support Services Division to do the testing, fill out and attach these forms to your complaint:</w:t>
-      </w:r>
-    </w:p>
-    <w:p>
-      <w:pPr>
-        <w:pStyle w:val="ListParagraph"/>
-        <w:numPr>
-          <w:ilvl w:val="1"/>
-          <w:numId w:val="41"/>
-        </w:numPr>
-        <w:tabs>
-          <w:tab w:val="clear" w:pos="720"/>
-          <w:tab w:val="num" w:pos="840"/>
-        </w:tabs>
-        <w:ind w:left="840"/>
-      </w:pPr>
-      <w:r>
-        <w:rPr>
-          <w:b/>
-        </w:rPr>
-        <w:t>Motion &amp; Affidavit for Genetic (DNA) Testing, DR-530</w:t>
-      </w:r>
-      <w:r>
-        <w:rPr>
-          <w:bCs/>
-        </w:rPr>
-        <w:t xml:space="preserve"> [</w:t>
-      </w:r>
-      <w:hyperlink r:id="rId7" w:history="1">
-        <w:r>
-          <w:rPr>
-            <w:rStyle w:val="Hyperlink"/>
-          </w:rPr>
-          <w:t>F</w:t>
+          <w:t xml:space="preserve">Fill-In </w:t>
         </w:r>
         <w:r>
           <w:rPr>
             <w:rStyle w:val="Hyperlink"/>
             <w:bCs/>
           </w:rPr>
-          <w:t>ill-in PDF</w:t>
-        </w:r>
-      </w:hyperlink>
-      <w:r>
-        <w:rPr>
-          <w:bCs/>
-        </w:rPr>
-        <w:t>]</w:t>
-      </w:r>
-    </w:p>
-    <w:p>
-      <w:pPr>
-        <w:pStyle w:val="ListParagraph"/>
-        <w:numPr>
-          <w:ilvl w:val="0"/>
-          <w:numId w:val="41"/>
-        </w:numPr>
-      </w:pPr>
-      <w:r>
-        <w:t xml:space="preserve">You can attach any DNA test results that have already been done to your </w:t>
-      </w:r>
-      <w:r>
-        <w:rPr>
-          <w:color w:val="FF0000"/>
-        </w:rPr>
-        <w:t xml:space="preserve"> {% if user_need </w:t>
-      </w:r>
-      <w:r>
-        <w:rPr>
-          <w:color w:val="FF0000"/>
-        </w:rPr>
-        <w:t xml:space="preserve">== </w:t>
-      </w:r>
-      <w:r>
-        <w:rPr>
-          <w:color w:val="FF0000"/>
-        </w:rPr>
-        <w:t>'custody' %}</w:t>
-      </w:r>
-      <w:r>
-        <w:t>complaint.</w:t>
-      </w:r>
-      <w:r>
-        <w:rPr>
-          <w:color w:val="FF0000"/>
-        </w:rPr>
-        <w:t>{% e</w:t>
-      </w:r>
-      <w:r>
-        <w:rPr>
-          <w:color w:val="FF0000"/>
-        </w:rPr>
-        <w:t>l</w:t>
-      </w:r>
-      <w:r>
-        <w:rPr>
-          <w:color w:val="FF0000"/>
-        </w:rPr>
-        <w:t>if</w:t>
-      </w:r>
-      <w:r>
-        <w:rPr>
-          <w:color w:val="FF0000"/>
-        </w:rPr>
-        <w:t xml:space="preserve"> </w:t>
-      </w:r>
-      <w:r>
-        <w:rPr>
-          <w:color w:val="FF0000"/>
-        </w:rPr>
-        <w:t xml:space="preserve">user_need </w:t>
-      </w:r>
-      <w:r>
-        <w:rPr>
-          <w:color w:val="FF0000"/>
-        </w:rPr>
-        <w:t xml:space="preserve">== </w:t>
-      </w:r>
-      <w:r>
-        <w:rPr>
-          <w:color w:val="FF0000"/>
-        </w:rPr>
-        <w:t>'answer custody' %}</w:t>
-      </w:r>
-      <w:r>
-        <w:rPr>
-          <w:color w:val="auto"/>
-        </w:rPr>
-        <w:t>Answer.</w:t>
-      </w:r>
-      <w:r>
-        <w:rPr>
-          <w:color w:val="FF0000"/>
-        </w:rPr>
-        <w:t>{% endif %}</w:t>
-      </w:r>
-    </w:p>
-    <w:p>
-      <w:pPr>
-        <w:pStyle w:val="Body"/>
-      </w:pPr>
-      <w:r>
-        <w:rPr>
-          <w:color w:val="FF0000"/>
-        </w:rPr>
-        <w:t>{% if user_need == 'divorce' %}</w:t>
-      </w:r>
-      <w:r>
-        <w:t xml:space="preserve">Courts use genetic testing, more commonly called "DNA testing," to establish or disestablish paternity. To take the test, a DNA sample is collected using a swab, similar to a Q-Tip, inside the cheek to pick up cells. Samples are collected from the mother, the child, and the person who may be the father. The </w:t>
-      </w:r>
-      <w:r>
-        <w:lastRenderedPageBreak/>
-        <w:t>testing is painless and the whole process takes about 15 minutes. Once all the samples have been collected, the result is ready within about 3 weeks.</w:t>
-      </w:r>
-    </w:p>
-    <w:p>
-      <w:pPr>
-        <w:pStyle w:val="Heading3"/>
-      </w:pPr>
-      <w:r>
-        <w:t>If you are unsure, you can ask for a paternity test</w:t>
-      </w:r>
-    </w:p>
-    <w:p>
-      <w:pPr>
-        <w:pStyle w:val="Body"/>
-      </w:pPr>
-      <w:r>
-        <w:rPr>
-          <w:b/>
-          <w:bCs/>
-        </w:rPr>
-        <w:t>In Cour</w:t>
-      </w:r>
-      <w:r>
-        <w:t xml:space="preserve">t: Once you open a case to </w:t>
-      </w:r>
-      <w:r>
-        <w:t xml:space="preserve">end your marriage, you can file a </w:t>
-      </w:r>
-      <w:r>
-        <w:rPr>
-          <w:b/>
-        </w:rPr>
-        <w:t>Motion &amp; Affidavit for Genetic (DNA) Testing, DR-530</w:t>
-      </w:r>
-      <w:r>
-        <w:rPr>
-          <w:bCs/>
-        </w:rPr>
-        <w:t xml:space="preserve"> [</w:t>
-      </w:r>
-      <w:hyperlink r:id="rId8" w:history="1">
-        <w:r>
-          <w:rPr>
-            <w:rStyle w:val="Hyperlink"/>
-          </w:rPr>
-          <w:t>F</w:t>
-        </w:r>
-        <w:r>
-          <w:rPr>
-            <w:rStyle w:val="Hyperlink"/>
-            <w:bCs/>
-          </w:rPr>
-          <w:t>ill-in PDF</w:t>
+          <w:t>PDF</w:t>
         </w:r>
       </w:hyperlink>
       <w:r>
@@ -522,49 +265,26 @@
         <w:ind w:left="495"/>
       </w:pPr>
       <w:r>
+        <w:lastRenderedPageBreak/>
         <w:t xml:space="preserve">See CSED's </w:t>
       </w:r>
-      <w:hyperlink r:id="rId9" w:history="1">
+      <w:hyperlink r:id="rId7" w:history="1">
         <w:r>
           <w:rPr>
             <w:rStyle w:val="Hyperlink"/>
           </w:rPr>
-          <w:t>Paternity Establish</w:t>
+          <w:t>Paternity Establishment FAQ</w:t>
         </w:r>
+      </w:hyperlink>
+      <w:r>
+        <w:t xml:space="preserve"> and </w:t>
+      </w:r>
+      <w:hyperlink r:id="rId8" w:history="1">
         <w:r>
           <w:rPr>
             <w:rStyle w:val="Hyperlink"/>
           </w:rPr>
-          <w:t>m</w:t>
-        </w:r>
-        <w:r>
-          <w:rPr>
-            <w:rStyle w:val="Hyperlink"/>
-          </w:rPr>
-          <w:t>ent FAQ</w:t>
-        </w:r>
-      </w:hyperlink>
-      <w:r>
-        <w:t xml:space="preserve"> and </w:t>
-      </w:r>
-      <w:hyperlink r:id="rId10" w:history="1">
-        <w:r>
-          <w:rPr>
-            <w:rStyle w:val="Hyperlink"/>
-          </w:rPr>
-          <w:t>con</w:t>
-        </w:r>
-        <w:r>
-          <w:rPr>
-            <w:rStyle w:val="Hyperlink"/>
-          </w:rPr>
-          <w:t>t</w:t>
-        </w:r>
-        <w:r>
-          <w:rPr>
-            <w:rStyle w:val="Hyperlink"/>
-          </w:rPr>
-          <w:t>act CSED</w:t>
+          <w:t>contact CSED</w:t>
         </w:r>
       </w:hyperlink>
       <w:r>
@@ -602,7 +322,15 @@
         <w:ind w:left="495"/>
       </w:pPr>
       <w:r>
-        <w:t>They are usually more expensive. You and {{ other_party_in_case }} will have to work out who pays.</w:t>
+        <w:t>They are usually more expensive. You and {</w:t>
+      </w:r>
+      <w:proofErr w:type="gramStart"/>
+      <w:r>
+        <w:t>{ other</w:t>
+      </w:r>
+      <w:proofErr w:type="gramEnd"/>
+      <w:r>
+        <w:t>_party_in_case }} will have to work out who pays.</w:t>
       </w:r>
     </w:p>
     <w:p>
@@ -617,28 +345,42 @@
       <w:r>
         <w:t>The court does not accept do-it-yourself DNA tests as evidence.</w:t>
       </w:r>
-      <w:r>
-        <w:rPr>
-          <w:color w:val="FF0000"/>
-        </w:rPr>
-        <w:t>{% endif %}</w:t>
-      </w:r>
     </w:p>
     <w:p>
       <w:pPr>
-        <w:pStyle w:val="Heading3"/>
+        <w:pStyle w:val="Body"/>
       </w:pPr>
       <w:r>
         <w:rPr>
           <w:color w:val="FF0000"/>
         </w:rPr>
-        <w:t>{% if user_need == 'answer divorce' %}</w:t>
-      </w:r>
-      <w:r>
-        <w:t>Dis</w:t>
-      </w:r>
-      <w:r>
-        <w:t>establishing paternity in your {{ case_type }} case</w:t>
+        <w:t>{%</w:t>
+      </w:r>
+      <w:r>
+        <w:rPr>
+          <w:color w:val="FF0000"/>
+        </w:rPr>
+        <w:t>p</w:t>
+      </w:r>
+      <w:r>
+        <w:rPr>
+          <w:color w:val="FF0000"/>
+        </w:rPr>
+        <w:t xml:space="preserve"> </w:t>
+      </w:r>
+      <w:proofErr w:type="spellStart"/>
+      <w:r>
+        <w:rPr>
+          <w:color w:val="FF0000"/>
+        </w:rPr>
+        <w:t>endif</w:t>
+      </w:r>
+      <w:proofErr w:type="spellEnd"/>
+      <w:r>
+        <w:rPr>
+          <w:color w:val="FF0000"/>
+        </w:rPr>
+        <w:t xml:space="preserve"> %}</w:t>
       </w:r>
     </w:p>
     <w:p>
@@ -646,335 +388,764 @@
         <w:pStyle w:val="Body"/>
       </w:pPr>
       <w:r>
-        <w:t xml:space="preserve"> If a parent thinks the husband is not the biological or adopted father of a child born during the marriage, that parent can ask the court to remove the husband’s rights and responsibilities for that child. This is called “disestablishing paternity.” You need clear </w:t>
-      </w:r>
-      <w:r>
-        <w:lastRenderedPageBreak/>
-        <w:t>and convincing evidence. There are different ways to do this depending on the situation so you need to figure out what will work in your case. Some options are:</w:t>
+        <w:rPr>
+          <w:color w:val="FF0000"/>
+        </w:rPr>
+        <w:t>{%</w:t>
+      </w:r>
+      <w:r>
+        <w:rPr>
+          <w:color w:val="FF0000"/>
+        </w:rPr>
+        <w:t>p</w:t>
+      </w:r>
+      <w:r>
+        <w:rPr>
+          <w:color w:val="FF0000"/>
+        </w:rPr>
+        <w:t xml:space="preserve"> if </w:t>
+      </w:r>
+      <w:proofErr w:type="spellStart"/>
+      <w:r>
+        <w:rPr>
+          <w:color w:val="FF0000"/>
+        </w:rPr>
+        <w:t>user_need</w:t>
+      </w:r>
+      <w:proofErr w:type="spellEnd"/>
+      <w:r>
+        <w:rPr>
+          <w:color w:val="FF0000"/>
+        </w:rPr>
+        <w:t xml:space="preserve"> </w:t>
+      </w:r>
+      <w:proofErr w:type="gramStart"/>
+      <w:r>
+        <w:rPr>
+          <w:color w:val="FF0000"/>
+        </w:rPr>
+        <w:t>in(</w:t>
+      </w:r>
+      <w:proofErr w:type="gramEnd"/>
+      <w:r>
+        <w:rPr>
+          <w:color w:val="FF0000"/>
+        </w:rPr>
+        <w:t>'custody', 'answer custody',</w:t>
+      </w:r>
+      <w:r>
+        <w:rPr>
+          <w:color w:val="FF0000"/>
+        </w:rPr>
+        <w:t xml:space="preserve"> </w:t>
+      </w:r>
+      <w:r>
+        <w:rPr>
+          <w:color w:val="FF0000"/>
+        </w:rPr>
+        <w:t>'answer divorce'</w:t>
+      </w:r>
+      <w:r>
+        <w:rPr>
+          <w:color w:val="FF0000"/>
+        </w:rPr>
+        <w:t>) %}</w:t>
       </w:r>
     </w:p>
     <w:p>
       <w:pPr>
+        <w:pStyle w:val="Heading3"/>
+      </w:pPr>
+      <w:r>
+        <w:t>{</w:t>
+      </w:r>
+      <w:proofErr w:type="gramStart"/>
+      <w:r>
+        <w:t xml:space="preserve">{ </w:t>
+      </w:r>
+      <w:r>
+        <w:t>'Establishing</w:t>
+      </w:r>
+      <w:proofErr w:type="gramEnd"/>
+      <w:r>
+        <w:t xml:space="preserve"> or disestablishing' if </w:t>
+      </w:r>
+      <w:proofErr w:type="spellStart"/>
+      <w:r>
+        <w:t>user_need</w:t>
+      </w:r>
+      <w:proofErr w:type="spellEnd"/>
+      <w:r>
+        <w:t xml:space="preserve"> in('custody', 'answer custody') else 'Disestablishing'</w:t>
+      </w:r>
+      <w:r>
+        <w:t xml:space="preserve"> }</w:t>
+      </w:r>
+      <w:r>
+        <w:t xml:space="preserve">} paternity in your ${ </w:t>
+      </w:r>
+      <w:proofErr w:type="spellStart"/>
+      <w:r>
+        <w:t>case_type</w:t>
+      </w:r>
+      <w:proofErr w:type="spellEnd"/>
+      <w:r>
+        <w:t xml:space="preserve"> } case</w:t>
+      </w:r>
+    </w:p>
+    <w:p>
+      <w:pPr>
+        <w:pStyle w:val="Body"/>
+      </w:pPr>
+      <w:r>
+        <w:rPr>
+          <w:color w:val="FFC000"/>
+        </w:rPr>
+        <w:t>{%</w:t>
+      </w:r>
+      <w:r>
+        <w:rPr>
+          <w:color w:val="FFC000"/>
+        </w:rPr>
+        <w:t>p</w:t>
+      </w:r>
+      <w:r>
+        <w:rPr>
+          <w:color w:val="FFC000"/>
+        </w:rPr>
+        <w:t xml:space="preserve"> if </w:t>
+      </w:r>
+      <w:proofErr w:type="spellStart"/>
+      <w:r>
+        <w:rPr>
+          <w:color w:val="FFC000"/>
+        </w:rPr>
+        <w:t>user_need</w:t>
+      </w:r>
+      <w:proofErr w:type="spellEnd"/>
+      <w:r>
+        <w:rPr>
+          <w:color w:val="FFC000"/>
+        </w:rPr>
+        <w:t xml:space="preserve"> == 'answer divorce' %}</w:t>
+      </w:r>
+    </w:p>
+    <w:p>
+      <w:pPr>
+        <w:pStyle w:val="Heading3"/>
+      </w:pPr>
+      <w:r>
+        <w:t>Dis</w:t>
+      </w:r>
+      <w:r>
+        <w:t>establishing paternity in your {</w:t>
+      </w:r>
+      <w:proofErr w:type="gramStart"/>
+      <w:r>
+        <w:t xml:space="preserve">{ </w:t>
+      </w:r>
+      <w:proofErr w:type="spellStart"/>
+      <w:r>
+        <w:t>case</w:t>
+      </w:r>
+      <w:proofErr w:type="gramEnd"/>
+      <w:r>
+        <w:t>_type</w:t>
+      </w:r>
+      <w:proofErr w:type="spellEnd"/>
+      <w:r>
+        <w:t xml:space="preserve"> }} case</w:t>
+      </w:r>
+    </w:p>
+    <w:p>
+      <w:pPr>
+        <w:pStyle w:val="Body"/>
+      </w:pPr>
+      <w:r>
+        <w:t>If a parent thinks the husband is not the biological or adopted father of a child born during the marriage, that parent can ask the court to remove the husband’s rights and responsibilities for that child. This is called “disestablishing paternity.” You need clear and convincing evidence. There are different ways to do this depending on the situation so you need to figure out what will work in your case. Some options are:</w:t>
+      </w:r>
+    </w:p>
+    <w:p>
+      <w:r>
+        <w:t xml:space="preserve">All of the people involved in the case sign affidavits: </w:t>
+      </w:r>
+    </w:p>
+    <w:p>
+      <w:pPr>
+        <w:pStyle w:val="Body"/>
+      </w:pPr>
+      <w:r>
+        <w:rPr>
+          <w:color w:val="FFC000"/>
+        </w:rPr>
+        <w:t>{%</w:t>
+      </w:r>
+      <w:r>
+        <w:rPr>
+          <w:color w:val="FFC000"/>
+        </w:rPr>
+        <w:t>p</w:t>
+      </w:r>
+      <w:r>
+        <w:rPr>
+          <w:color w:val="FFC000"/>
+        </w:rPr>
+        <w:t xml:space="preserve"> else %}</w:t>
+      </w:r>
+    </w:p>
+    <w:p>
+      <w:pPr>
+        <w:pStyle w:val="Body"/>
+      </w:pPr>
+      <w:r>
+        <w:t>When you file your $</w:t>
+      </w:r>
+      <w:proofErr w:type="gramStart"/>
+      <w:r>
+        <w:t>{ 'complaint'</w:t>
+      </w:r>
+      <w:proofErr w:type="gramEnd"/>
+      <w:r>
+        <w:t xml:space="preserve">  if </w:t>
+      </w:r>
+      <w:proofErr w:type="spellStart"/>
+      <w:r>
+        <w:t>user_need</w:t>
+      </w:r>
+      <w:proofErr w:type="spellEnd"/>
+      <w:r>
+        <w:t xml:space="preserve"> == 'custody' else 'Answer' }, state that paternity is an issue in ${ 'section 3D of the Complaint' if </w:t>
+      </w:r>
+      <w:proofErr w:type="spellStart"/>
+      <w:r>
+        <w:t>user_need</w:t>
+      </w:r>
+      <w:proofErr w:type="spellEnd"/>
+      <w:r>
+        <w:t xml:space="preserve"> == 'custody' else '4 of the Counterclaims section of the Answer' }.</w:t>
+      </w:r>
+    </w:p>
+    <w:p>
+      <w:pPr>
+        <w:pStyle w:val="Body"/>
+      </w:pPr>
+      <w:r>
+        <w:t>You can prove or d</w:t>
+      </w:r>
+      <w:r>
+        <w:t>isprove paternity several ways:</w:t>
+      </w:r>
+    </w:p>
+    <w:p>
+      <w:pPr>
         <w:pStyle w:val="ListParagraph"/>
-        <w:numPr>
-          <w:ilvl w:val="0"/>
-          <w:numId w:val="7"/>
-        </w:numPr>
-        <w:ind w:left="495"/>
-      </w:pPr>
-      <w:r>
-        <w:t xml:space="preserve">All of the people involved in the case sign affidavits: </w:t>
-      </w:r>
-      <w:r>
-        <w:br/>
-      </w:r>
+        <w:ind w:left="360"/>
+      </w:pPr>
+      <w:r>
+        <w:t xml:space="preserve">Each parent signs an affidavit stating the biological father. Fill out a </w:t>
+      </w:r>
+    </w:p>
+    <w:p>
+      <w:pPr>
+        <w:rPr>
+          <w:color w:val="202529"/>
+        </w:rPr>
+      </w:pPr>
+      <w:r>
+        <w:rPr>
+          <w:color w:val="FFC000"/>
+        </w:rPr>
+        <w:t>{%p</w:t>
+      </w:r>
+      <w:r>
+        <w:rPr>
+          <w:color w:val="FFC000"/>
+        </w:rPr>
+        <w:t xml:space="preserve"> </w:t>
+      </w:r>
+      <w:proofErr w:type="spellStart"/>
+      <w:r>
+        <w:rPr>
+          <w:color w:val="FFC000"/>
+        </w:rPr>
+        <w:t>endif</w:t>
+      </w:r>
+      <w:proofErr w:type="spellEnd"/>
+      <w:r>
+        <w:rPr>
+          <w:color w:val="FFC000"/>
+        </w:rPr>
+        <w:t xml:space="preserve"> %}</w:t>
+      </w:r>
+    </w:p>
+    <w:p>
+      <w:pPr>
+        <w:pStyle w:val="Body"/>
+      </w:pPr>
       <w:r>
         <w:rPr>
           <w:b/>
         </w:rPr>
+        <w:t xml:space="preserve">Three-Way </w:t>
+      </w:r>
+      <w:r>
+        <w:rPr>
+          <w:b/>
+        </w:rPr>
+        <w:t>Affidavit to Disestablish and Establish Paternity, DR-521</w:t>
+      </w:r>
+      <w:r>
+        <w:t xml:space="preserve"> [</w:t>
+      </w:r>
+      <w:hyperlink r:id="rId9" w:history="1">
+        <w:r>
+          <w:rPr>
+            <w:rStyle w:val="Hyperlink"/>
+            <w:spacing w:val="0"/>
+          </w:rPr>
+          <w:t>Fill-in PDF</w:t>
+        </w:r>
+      </w:hyperlink>
+      <w:r>
+        <w:t>]</w:t>
+      </w:r>
+    </w:p>
+    <w:p>
+      <w:pPr>
+        <w:pStyle w:val="Body"/>
+      </w:pPr>
+      <w:r>
+        <w:rPr>
+          <w:color w:val="FFC000"/>
+        </w:rPr>
+        <w:t>{%</w:t>
+      </w:r>
+      <w:r>
+        <w:rPr>
+          <w:color w:val="FFC000"/>
+        </w:rPr>
+        <w:t>p</w:t>
+      </w:r>
+      <w:r>
+        <w:rPr>
+          <w:color w:val="FFC000"/>
+        </w:rPr>
+        <w:t xml:space="preserve"> </w:t>
+      </w:r>
+      <w:r>
+        <w:rPr>
+          <w:color w:val="FFC000"/>
+        </w:rPr>
+        <w:t xml:space="preserve">if </w:t>
+      </w:r>
+      <w:proofErr w:type="spellStart"/>
+      <w:r>
+        <w:rPr>
+          <w:color w:val="FFC000"/>
+        </w:rPr>
+        <w:t>user_need</w:t>
+      </w:r>
+      <w:proofErr w:type="spellEnd"/>
+      <w:r>
+        <w:rPr>
+          <w:color w:val="FFC000"/>
+        </w:rPr>
+        <w:t xml:space="preserve"> == 'answer divorce'</w:t>
+      </w:r>
+      <w:r>
+        <w:rPr>
+          <w:color w:val="FFC000"/>
+        </w:rPr>
+        <w:t xml:space="preserve"> </w:t>
+      </w:r>
+      <w:r>
+        <w:rPr>
+          <w:color w:val="FFC000"/>
+        </w:rPr>
+        <w:t>%}</w:t>
+      </w:r>
+    </w:p>
+    <w:p>
+      <w:pPr>
+        <w:pStyle w:val="ListParagraph"/>
+        <w:ind w:left="360"/>
+      </w:pPr>
+      <w:proofErr w:type="gramStart"/>
+      <w:r>
+        <w:t>the</w:t>
+      </w:r>
+      <w:proofErr w:type="gramEnd"/>
+      <w:r>
+        <w:t xml:space="preserve"> mother, the husband and the man who is the father say the husband is not the father and that the man is the biological father.</w:t>
+      </w:r>
+    </w:p>
+    <w:p>
+      <w:pPr>
+        <w:pStyle w:val="ListParagraph"/>
+        <w:ind w:left="360"/>
+      </w:pPr>
+      <w:proofErr w:type="gramStart"/>
+      <w:r>
+        <w:lastRenderedPageBreak/>
+        <w:t>the</w:t>
+      </w:r>
+      <w:proofErr w:type="gramEnd"/>
+      <w:r>
+        <w:t xml:space="preserve"> mother and the husband say the husband is not the father to disestablish the husband as the biological father.</w:t>
+      </w:r>
+    </w:p>
+    <w:p>
+      <w:pPr>
+        <w:pStyle w:val="ListParagraph"/>
+        <w:ind w:left="360"/>
+      </w:pPr>
+      <w:proofErr w:type="gramStart"/>
+      <w:r>
+        <w:t>the</w:t>
+      </w:r>
+      <w:proofErr w:type="gramEnd"/>
+      <w:r>
+        <w:t xml:space="preserve"> mother and the man say he is the father to establish him as the biological father.</w:t>
+      </w:r>
+    </w:p>
+    <w:p>
+      <w:pPr>
+        <w:pStyle w:val="ListParagraph"/>
+        <w:ind w:left="360"/>
+      </w:pPr>
+      <w:proofErr w:type="gramStart"/>
+      <w:r>
+        <w:t>the</w:t>
+      </w:r>
+      <w:proofErr w:type="gramEnd"/>
+      <w:r>
+        <w:t xml:space="preserve"> mother, only if others are not cooperating and she can provide convincing facts about the paternity.</w:t>
+      </w:r>
+    </w:p>
+    <w:p>
+      <w:pPr>
+        <w:pStyle w:val="ListParagraph"/>
+        <w:ind w:left="360"/>
+      </w:pPr>
+      <w:proofErr w:type="gramStart"/>
+      <w:r>
+        <w:t>get</w:t>
+      </w:r>
+      <w:proofErr w:type="gramEnd"/>
+      <w:r>
+        <w:t xml:space="preserve"> genetic (DNA) testing of the child, the mother, the man believed to be the father, and the husband. The test results must be provided to the court. This can be done voluntarily if all of the people are cooperating or by court order. To ask for a court order, file: </w:t>
+      </w:r>
+    </w:p>
+    <w:p>
+      <w:pPr>
+        <w:pStyle w:val="Body"/>
+      </w:pPr>
+      <w:r>
+        <w:rPr>
+          <w:color w:val="FFC000"/>
+        </w:rPr>
+        <w:t>{%</w:t>
+      </w:r>
+      <w:r>
+        <w:rPr>
+          <w:color w:val="FFC000"/>
+        </w:rPr>
+        <w:t>p</w:t>
+      </w:r>
+      <w:r>
+        <w:rPr>
+          <w:color w:val="FFC000"/>
+        </w:rPr>
+        <w:t xml:space="preserve"> else %}</w:t>
+      </w:r>
+    </w:p>
+    <w:p>
+      <w:pPr>
+        <w:pStyle w:val="ListParagraph"/>
+        <w:ind w:left="360"/>
+      </w:pPr>
+      <w:r>
+        <w:t>The mother, child, and person who may be the father take a DNA test using a painless swab inside the cheek. The whole process takes about 15 minutes and the result is ready within about 3 weeks</w:t>
+      </w:r>
+      <w:r>
+        <w:t>.</w:t>
+      </w:r>
+    </w:p>
+    <w:p>
+      <w:pPr>
+        <w:pStyle w:val="Body"/>
+      </w:pPr>
+      <w:r>
+        <w:t xml:space="preserve">If someone is not cooperating or you want the Child Support Enforcement Division to do </w:t>
+      </w:r>
+      <w:proofErr w:type="gramStart"/>
+      <w:r>
+        <w:t>the</w:t>
+      </w:r>
+      <w:proofErr w:type="gramEnd"/>
+      <w:r>
+        <w:t xml:space="preserve"> testing, fill out and attach to your </w:t>
+      </w:r>
+      <w:r>
+        <w:t>{</w:t>
+      </w:r>
+      <w:r>
+        <w:t xml:space="preserve">{ 'complaint' if </w:t>
+      </w:r>
+      <w:proofErr w:type="spellStart"/>
+      <w:r>
+        <w:t>user_need</w:t>
+      </w:r>
+      <w:proofErr w:type="spellEnd"/>
+      <w:r>
+        <w:t xml:space="preserve"> == 'custody' else 'Answer' }</w:t>
+      </w:r>
+      <w:r>
+        <w:t>}</w:t>
+      </w:r>
+      <w:r>
+        <w:t xml:space="preserve"> a</w:t>
+      </w:r>
+    </w:p>
+    <w:p>
+      <w:pPr>
+        <w:pStyle w:val="Body"/>
+      </w:pPr>
+      <w:r>
+        <w:rPr>
+          <w:color w:val="FFC000"/>
+        </w:rPr>
+        <w:t xml:space="preserve">{%p </w:t>
+      </w:r>
+      <w:proofErr w:type="spellStart"/>
+      <w:r>
+        <w:rPr>
+          <w:color w:val="FFC000"/>
+        </w:rPr>
+        <w:t>endif</w:t>
+      </w:r>
+      <w:proofErr w:type="spellEnd"/>
+      <w:r>
+        <w:rPr>
+          <w:color w:val="FFC000"/>
+        </w:rPr>
+        <w:t xml:space="preserve"> %}</w:t>
+      </w:r>
+    </w:p>
+    <w:p>
+      <w:pPr>
+        <w:pStyle w:val="Body"/>
+      </w:pPr>
+      <w:r>
+        <w:t xml:space="preserve"> </w:t>
+      </w:r>
+      <w:proofErr w:type="gramStart"/>
+      <w:r>
+        <w:rPr>
+          <w:b/>
+        </w:rPr>
+        <w:t>Motion &amp; Affidavit for Genetic (DNA) Testing, DR-530</w:t>
+      </w:r>
+      <w:r>
+        <w:t xml:space="preserve"> </w:t>
+      </w:r>
+      <w:r>
+        <w:t>[</w:t>
+      </w:r>
+      <w:hyperlink r:id="rId10" w:history="1">
+        <w:r>
+          <w:rPr>
+            <w:rStyle w:val="Hyperlink"/>
+            <w:spacing w:val="0"/>
+          </w:rPr>
+          <w:t>Fill-In PDF</w:t>
+        </w:r>
+      </w:hyperlink>
+      <w:r>
+        <w:t>]</w:t>
+      </w:r>
+      <w:r>
+        <w:t>.</w:t>
+      </w:r>
+      <w:proofErr w:type="gramEnd"/>
+    </w:p>
+    <w:p>
+      <w:pPr>
+        <w:pStyle w:val="Body"/>
+      </w:pPr>
+      <w:r>
+        <w:t>You can attach any DNA test results that have already be</w:t>
+      </w:r>
+      <w:r>
+        <w:t>en done to your {</w:t>
+      </w:r>
+      <w:proofErr w:type="gramStart"/>
+      <w:r>
+        <w:t>{ 'complaint'</w:t>
+      </w:r>
+      <w:proofErr w:type="gramEnd"/>
+      <w:r>
+        <w:t xml:space="preserve"> </w:t>
+      </w:r>
+      <w:r>
+        <w:t xml:space="preserve">if </w:t>
+      </w:r>
+      <w:proofErr w:type="spellStart"/>
+      <w:r>
+        <w:t>user_need</w:t>
+      </w:r>
+      <w:proofErr w:type="spellEnd"/>
+      <w:r>
+        <w:t xml:space="preserve"> == 'custody' else 'Answer' </w:t>
+      </w:r>
+      <w:r>
+        <w:t>}</w:t>
+      </w:r>
+      <w:r>
+        <w:t>}.</w:t>
+      </w:r>
+    </w:p>
+    <w:p>
+      <w:pPr>
+        <w:pStyle w:val="Body"/>
+        <w:rPr>
+          <w:color w:val="202529"/>
+        </w:rPr>
+      </w:pPr>
+      <w:bookmarkStart w:id="0" w:name="_GoBack"/>
+      <w:bookmarkEnd w:id="0"/>
+      <w:r>
+        <w:rPr>
+          <w:color w:val="FF0000"/>
+        </w:rPr>
+        <w:t xml:space="preserve">{%p </w:t>
+      </w:r>
+      <w:proofErr w:type="spellStart"/>
+      <w:r>
+        <w:rPr>
+          <w:color w:val="FF0000"/>
+        </w:rPr>
+        <w:t>endif</w:t>
+      </w:r>
+      <w:proofErr w:type="spellEnd"/>
+      <w:r>
+        <w:rPr>
+          <w:color w:val="FF0000"/>
+        </w:rPr>
+        <w:t xml:space="preserve"> %}</w:t>
+      </w:r>
+    </w:p>
+    <w:p>
+      <w:pPr>
+        <w:pStyle w:val="Heading3"/>
+      </w:pPr>
+      <w:r>
+        <w:t>Change the birth certificate</w:t>
+      </w:r>
+    </w:p>
+    <w:p>
+      <w:pPr>
+        <w:pStyle w:val="Body"/>
+        <w:spacing w:before="280" w:after="280"/>
+      </w:pPr>
+      <w:r>
+        <w:t>If the court decides that the biological father is someone not listed on the birth certificate, you must send a copy of the court order to the Health Analytics &amp; Vital Records to change the birth certificate. After the birth certificate is changed, the child is considered "legitimated" and the heir of that father. This means that if the child should be eligible for any medical or financial benefits connected to the father such as health insurance, or benefits based on military service or being Alaska Native or American Indian. Also, if the father dies, the child will be able to inherit and collect financial or medical benefits that the child may be eligible for such as Social Security Children's Insurance Benefits or military benefits. If you do not notify Health Analytics &amp; Vital Records to change the birth certificate, the child may miss out on these benefits.</w:t>
+      </w:r>
+    </w:p>
+    <w:p>
+      <w:pPr>
+        <w:pStyle w:val="Heading3"/>
+      </w:pPr>
+      <w:r>
+        <w:t>Links in this step</w:t>
+      </w:r>
+    </w:p>
+    <w:p>
+      <w:pPr>
+        <w:pStyle w:val="Body"/>
+        <w:spacing w:before="280" w:after="280"/>
+        <w:rPr>
+          <w:color w:val="FF0000"/>
+        </w:rPr>
+      </w:pPr>
+      <w:r>
+        <w:rPr>
+          <w:color w:val="FF0000"/>
+        </w:rPr>
+        <w:lastRenderedPageBreak/>
+        <w:t>{%</w:t>
+      </w:r>
+      <w:r>
+        <w:rPr>
+          <w:color w:val="FF0000"/>
+        </w:rPr>
+        <w:t>p</w:t>
+      </w:r>
+      <w:r>
+        <w:rPr>
+          <w:color w:val="FF0000"/>
+        </w:rPr>
+        <w:t xml:space="preserve"> if </w:t>
+      </w:r>
+      <w:proofErr w:type="spellStart"/>
+      <w:r>
+        <w:rPr>
+          <w:color w:val="FF0000"/>
+        </w:rPr>
+        <w:t>user_</w:t>
+      </w:r>
+      <w:proofErr w:type="gramStart"/>
+      <w:r>
+        <w:rPr>
+          <w:color w:val="FF0000"/>
+        </w:rPr>
+        <w:t>need</w:t>
+      </w:r>
+      <w:proofErr w:type="spellEnd"/>
+      <w:r>
+        <w:rPr>
+          <w:color w:val="FF0000"/>
+        </w:rPr>
+        <w:t xml:space="preserve"> !</w:t>
+      </w:r>
+      <w:proofErr w:type="gramEnd"/>
+      <w:r>
+        <w:rPr>
+          <w:color w:val="FF0000"/>
+        </w:rPr>
+        <w:t>= 'divorce' %}</w:t>
+      </w:r>
+    </w:p>
+    <w:p>
+      <w:pPr>
+        <w:pStyle w:val="Body"/>
+        <w:spacing w:before="280" w:after="280"/>
+        <w:rPr>
+          <w:rStyle w:val="Hyperlink"/>
+          <w:color w:val="auto"/>
+        </w:rPr>
+      </w:pPr>
+      <w:r>
+        <w:rPr>
+          <w:b/>
+        </w:rPr>
         <w:t>Three-Way Affidavit to Disestablish and Establish Paternity, DR-521</w:t>
       </w:r>
       <w:r>
-        <w:t xml:space="preserve"> </w:t>
-      </w:r>
-      <w:r>
-        <w:t>[</w:t>
+        <w:t xml:space="preserve"> [</w:t>
       </w:r>
       <w:hyperlink r:id="rId11">
         <w:r>
           <w:rPr>
             <w:rStyle w:val="Hyperlink"/>
           </w:rPr>
-          <w:t>Fill-in PDF</w:t>
+          <w:t xml:space="preserve">Fill-In </w:t>
         </w:r>
-      </w:hyperlink>
-      <w:r>
-        <w:rPr>
-          <w:rStyle w:val="Hyperlink"/>
-          <w:color w:val="auto"/>
-        </w:rPr>
-        <w:t>]</w:t>
-      </w:r>
-      <w:r>
-        <w:rPr>
-          <w:rStyle w:val="Hyperlink"/>
-          <w:color w:val="auto"/>
-        </w:rPr>
-        <w:br/>
-      </w:r>
-      <w:r>
-        <w:t>This can be</w:t>
-      </w:r>
-    </w:p>
-    <w:p>
-      <w:pPr>
-        <w:pStyle w:val="ListParagraph"/>
-        <w:numPr>
-          <w:ilvl w:val="1"/>
-          <w:numId w:val="41"/>
-        </w:numPr>
-        <w:tabs>
-          <w:tab w:val="clear" w:pos="720"/>
-          <w:tab w:val="num" w:pos="840"/>
-        </w:tabs>
-        <w:ind w:left="840"/>
-      </w:pPr>
-      <w:r>
-        <w:t>the mother, the husband and the man who is the father stating the husband is NOT the father and that the man is the biological father</w:t>
-      </w:r>
-    </w:p>
-    <w:p>
-      <w:pPr>
-        <w:pStyle w:val="ListParagraph"/>
-        <w:numPr>
-          <w:ilvl w:val="1"/>
-          <w:numId w:val="41"/>
-        </w:numPr>
-        <w:tabs>
-          <w:tab w:val="clear" w:pos="720"/>
-          <w:tab w:val="num" w:pos="840"/>
-        </w:tabs>
-        <w:ind w:left="840"/>
-      </w:pPr>
-      <w:r>
-        <w:t>the mother and the husband saying the husband is NOT the father to disestablish the husband as the biological father</w:t>
-      </w:r>
-    </w:p>
-    <w:p>
-      <w:pPr>
-        <w:pStyle w:val="ListParagraph"/>
-        <w:numPr>
-          <w:ilvl w:val="1"/>
-          <w:numId w:val="41"/>
-        </w:numPr>
-        <w:tabs>
-          <w:tab w:val="clear" w:pos="720"/>
-          <w:tab w:val="num" w:pos="840"/>
-        </w:tabs>
-        <w:ind w:left="840"/>
-      </w:pPr>
-      <w:r>
-        <w:t xml:space="preserve"> the mother and the man saying he IS the father to establish him as the biological father</w:t>
-      </w:r>
-    </w:p>
-    <w:p>
-      <w:pPr>
-        <w:pStyle w:val="ListParagraph"/>
-        <w:numPr>
-          <w:ilvl w:val="1"/>
-          <w:numId w:val="41"/>
-        </w:numPr>
-        <w:tabs>
-          <w:tab w:val="clear" w:pos="720"/>
-          <w:tab w:val="num" w:pos="840"/>
-        </w:tabs>
-        <w:ind w:left="840"/>
-      </w:pPr>
-      <w:r>
-        <w:t xml:space="preserve"> the mother only if others are not cooperating and she can provide convincing facts about the paternity</w:t>
-      </w:r>
-    </w:p>
-    <w:p>
-      <w:pPr>
-        <w:pStyle w:val="ListParagraph"/>
-        <w:numPr>
-          <w:ilvl w:val="0"/>
-          <w:numId w:val="7"/>
-        </w:numPr>
-        <w:ind w:left="495"/>
-      </w:pPr>
-      <w:r>
-        <w:t>Get genetic (DNA) testing of the child, the mother and the man believed to be</w:t>
-      </w:r>
-      <w:r>
-        <w:t xml:space="preserve"> the father and the husband if the mother is married. The test results must be provided to the court. This can be done voluntarily if all of the people are cooperating or by court order. To ask for a court order, you can file:</w:t>
-      </w:r>
-    </w:p>
-    <w:p>
-      <w:pPr>
-        <w:pStyle w:val="ListParagraph"/>
-        <w:numPr>
-          <w:ilvl w:val="1"/>
-          <w:numId w:val="41"/>
-        </w:numPr>
-        <w:tabs>
-          <w:tab w:val="clear" w:pos="720"/>
-          <w:tab w:val="num" w:pos="840"/>
-        </w:tabs>
-        <w:ind w:left="840"/>
-      </w:pPr>
-      <w:r>
-        <w:rPr>
-          <w:b/>
-        </w:rPr>
-        <w:t>Motion &amp; Affidavit for Genetic (DNA) Testing, DR-530</w:t>
-      </w:r>
-      <w:r>
-        <w:rPr>
-          <w:bCs/>
-        </w:rPr>
-        <w:t xml:space="preserve"> [</w:t>
-      </w:r>
-      <w:hyperlink r:id="rId12" w:history="1">
         <w:r>
           <w:rPr>
             <w:rStyle w:val="Hyperlink"/>
           </w:rPr>
-          <w:t>F</w:t>
-        </w:r>
-        <w:r>
-          <w:rPr>
-            <w:rStyle w:val="Hyperlink"/>
-            <w:bCs/>
-          </w:rPr>
-          <w:t>ill-I</w:t>
-        </w:r>
-        <w:r>
-          <w:rPr>
-            <w:rStyle w:val="Hyperlink"/>
-            <w:bCs/>
-          </w:rPr>
-          <w:t>n PDF</w:t>
-        </w:r>
-      </w:hyperlink>
-      <w:r>
-        <w:rPr>
-          <w:bCs/>
-        </w:rPr>
-        <w:t>]</w:t>
-      </w:r>
-      <w:r>
-        <w:rPr>
-          <w:color w:val="FF0000"/>
-        </w:rPr>
-        <w:t xml:space="preserve"> </w:t>
-      </w:r>
-      <w:r>
-        <w:rPr>
-          <w:color w:val="FF0000"/>
-        </w:rPr>
-        <w:t xml:space="preserve">{% </w:t>
-      </w:r>
-      <w:proofErr w:type="spellStart"/>
-      <w:r>
-        <w:rPr>
-          <w:color w:val="FF0000"/>
-        </w:rPr>
-        <w:t>endif</w:t>
-      </w:r>
-      <w:proofErr w:type="spellEnd"/>
-      <w:r>
-        <w:rPr>
-          <w:color w:val="FF0000"/>
-        </w:rPr>
-        <w:t xml:space="preserve"> %}</w:t>
-      </w:r>
-    </w:p>
-    <w:p>
-      <w:pPr>
-        <w:pStyle w:val="Heading3"/>
-      </w:pPr>
-      <w:r>
-        <w:t>Change the birth certificate</w:t>
-      </w:r>
-    </w:p>
-    <w:p>
-      <w:pPr>
-        <w:pStyle w:val="Body"/>
-        <w:spacing w:before="280" w:after="280"/>
-      </w:pPr>
-      <w:r>
-        <w:t>If the court decides that the biological father is someone not listed on the birth certificate, you must send a copy of the court order to the Health Analytics &amp; Vital Records to change the birth certificate. After the birth certificate is changed, the child is considered "legitimated" and the heir of that father. This means that if the child should be eligible for any medical or financial benefits connected to the father such as health insurance, or benefits based on military service or being Alaska Native or American Indian. Also, if the father dies, the child will be able to inherit and collect financial or medical benefits that the child may be eligible for such as Social Security Children's Insurance Benefits or military benefits. If you do not notify Health Analytics &amp; Vital Records to change the birth certificate, the child may miss out on these benefits.</w:t>
-      </w:r>
-    </w:p>
-    <w:p>
-      <w:pPr>
-        <w:pStyle w:val="Heading3"/>
-      </w:pPr>
-      <w:r>
-        <w:t>Links in this step</w:t>
-      </w:r>
-    </w:p>
-    <w:p>
-      <w:pPr>
-        <w:pStyle w:val="Body"/>
-        <w:spacing w:before="280" w:after="280"/>
-        <w:rPr>
-          <w:color w:val="FF0000"/>
-        </w:rPr>
-      </w:pPr>
-      <w:r>
-        <w:rPr>
-          <w:color w:val="FF0000"/>
-        </w:rPr>
-        <w:t>{%</w:t>
-      </w:r>
-      <w:r>
-        <w:rPr>
-          <w:color w:val="FF0000"/>
-        </w:rPr>
-        <w:t>p</w:t>
-      </w:r>
-      <w:r>
-        <w:rPr>
-          <w:color w:val="FF0000"/>
-        </w:rPr>
-        <w:t xml:space="preserve"> if </w:t>
-      </w:r>
-      <w:proofErr w:type="spellStart"/>
-      <w:r>
-        <w:rPr>
-          <w:color w:val="FF0000"/>
-        </w:rPr>
-        <w:t>user_</w:t>
-      </w:r>
-      <w:proofErr w:type="gramStart"/>
-      <w:r>
-        <w:rPr>
-          <w:color w:val="FF0000"/>
-        </w:rPr>
-        <w:t>need</w:t>
-      </w:r>
-      <w:proofErr w:type="spellEnd"/>
-      <w:r>
-        <w:rPr>
-          <w:color w:val="FF0000"/>
-        </w:rPr>
-        <w:t xml:space="preserve"> !</w:t>
-      </w:r>
-      <w:proofErr w:type="gramEnd"/>
-      <w:r>
-        <w:rPr>
-          <w:color w:val="FF0000"/>
-        </w:rPr>
-        <w:t>= 'divorce' %}</w:t>
-      </w:r>
-    </w:p>
-    <w:p>
-      <w:pPr>
-        <w:pStyle w:val="Body"/>
-        <w:spacing w:before="280" w:after="280"/>
-        <w:rPr>
-          <w:rStyle w:val="Hyperlink"/>
-          <w:color w:val="auto"/>
-        </w:rPr>
-      </w:pPr>
-      <w:r>
-        <w:rPr>
-          <w:b/>
-        </w:rPr>
-        <w:lastRenderedPageBreak/>
-        <w:t>Three-Way Affidavit to Disestablish and Establish Paternity, DR-521</w:t>
-      </w:r>
-      <w:r>
-        <w:t xml:space="preserve"> [</w:t>
-      </w:r>
-      <w:hyperlink r:id="rId13">
-        <w:r>
-          <w:rPr>
-            <w:rStyle w:val="Hyperlink"/>
-          </w:rPr>
-          <w:t>Fill-in PDF</w:t>
+          <w:t>PDF</w:t>
         </w:r>
       </w:hyperlink>
       <w:proofErr w:type="gramStart"/>
@@ -991,7 +1162,7 @@
         </w:rPr>
         <w:br/>
       </w:r>
-      <w:hyperlink r:id="rId14" w:history="1">
+      <w:hyperlink r:id="rId12" w:history="1">
         <w:r>
           <w:rPr>
             <w:rStyle w:val="Hyperlink"/>
@@ -1075,19 +1246,19 @@
       <w:r>
         <w:t xml:space="preserve"> [</w:t>
       </w:r>
-      <w:hyperlink r:id="rId15" w:history="1">
+      <w:hyperlink r:id="rId13" w:history="1">
         <w:r>
           <w:rPr>
             <w:rStyle w:val="Hyperlink"/>
           </w:rPr>
-          <w:t>F</w:t>
+          <w:t xml:space="preserve">Fill-In </w:t>
         </w:r>
         <w:r>
           <w:rPr>
             <w:rStyle w:val="Hyperlink"/>
             <w:bCs/>
           </w:rPr>
-          <w:t>ill-in PDF</w:t>
+          <w:t>PDF</w:t>
         </w:r>
       </w:hyperlink>
       <w:proofErr w:type="gramStart"/>
@@ -1098,7 +1269,7 @@
       <w:r>
         <w:br/>
       </w:r>
-      <w:hyperlink r:id="rId16" w:history="1">
+      <w:hyperlink r:id="rId14" w:history="1">
         <w:r>
           <w:rPr>
             <w:rStyle w:val="Hyperlink"/>
@@ -1144,19 +1315,17 @@
         </w:rPr>
         <w:t xml:space="preserve"> </w:t>
       </w:r>
-      <w:proofErr w:type="gramStart"/>
       <w:r>
         <w:rPr>
           <w:color w:val="FF0000"/>
         </w:rPr>
-        <w:t>in(</w:t>
-      </w:r>
-      <w:proofErr w:type="gramEnd"/>
+        <w:t>== 'custody'</w:t>
+      </w:r>
       <w:r>
         <w:rPr>
           <w:color w:val="FF0000"/>
         </w:rPr>
-        <w:t>'divorce', 'custody') %}</w:t>
+        <w:t xml:space="preserve"> %}</w:t>
       </w:r>
     </w:p>
     <w:p>
@@ -1164,7 +1333,7 @@
         <w:pStyle w:val="Body"/>
         <w:spacing w:before="280" w:after="0"/>
       </w:pPr>
-      <w:hyperlink r:id="rId17" w:history="1">
+      <w:hyperlink r:id="rId15" w:history="1">
         <w:r>
           <w:rPr>
             <w:rStyle w:val="Hyperlink"/>
@@ -1175,7 +1344,7 @@
       <w:r>
         <w:br/>
       </w:r>
-      <w:hyperlink r:id="rId18" w:history="1">
+      <w:hyperlink r:id="rId16" w:history="1">
         <w:r>
           <w:rPr>
             <w:rStyle w:val="Hyperlink"/>
@@ -1184,11 +1353,9 @@
           <w:t>childsupport.alaska.gov/child-support-services/information/faqs/paternity-establishment-faq</w:t>
         </w:r>
       </w:hyperlink>
-      <w:bookmarkStart w:id="0" w:name="_GoBack"/>
-      <w:bookmarkEnd w:id="0"/>
     </w:p>
     <w:p>
-      <w:hyperlink r:id="rId19" w:history="1">
+      <w:hyperlink r:id="rId17" w:history="1">
         <w:r>
           <w:rPr>
             <w:rStyle w:val="Hyperlink"/>
@@ -1199,7 +1366,7 @@
       <w:r>
         <w:br/>
       </w:r>
-      <w:hyperlink r:id="rId20" w:history="1">
+      <w:hyperlink r:id="rId18" w:history="1">
         <w:r>
           <w:rPr>
             <w:rStyle w:val="Hyperlink"/>
@@ -2298,7 +2465,7 @@
   <w:abstractNum w:abstractNumId="9">
     <w:nsid w:val="296F3872"/>
     <w:multiLevelType w:val="hybridMultilevel"/>
-    <w:tmpl w:val="5E9E6A2E"/>
+    <w:tmpl w:val="F634C142"/>
     <w:lvl w:ilvl="0" w:tplc="C32CFEB2">
       <w:start w:val="1"/>
       <w:numFmt w:val="bullet"/>
@@ -3409,6 +3576,119 @@
     </w:lvl>
   </w:abstractNum>
   <w:abstractNum w:abstractNumId="19">
+    <w:nsid w:val="6D157CF3"/>
+    <w:multiLevelType w:val="hybridMultilevel"/>
+    <w:tmpl w:val="8D744066"/>
+    <w:lvl w:ilvl="0" w:tplc="04090001">
+      <w:start w:val="1"/>
+      <w:numFmt w:val="bullet"/>
+      <w:lvlText w:val=""/>
+      <w:lvlJc w:val="left"/>
+      <w:pPr>
+        <w:ind w:left="990" w:hanging="360"/>
+      </w:pPr>
+      <w:rPr>
+        <w:rFonts w:ascii="Symbol" w:hAnsi="Symbol" w:hint="default"/>
+      </w:rPr>
+    </w:lvl>
+    <w:lvl w:ilvl="1" w:tplc="04090003" w:tentative="1">
+      <w:start w:val="1"/>
+      <w:numFmt w:val="bullet"/>
+      <w:lvlText w:val="o"/>
+      <w:lvlJc w:val="left"/>
+      <w:pPr>
+        <w:ind w:left="1710" w:hanging="360"/>
+      </w:pPr>
+      <w:rPr>
+        <w:rFonts w:ascii="Courier New" w:hAnsi="Courier New" w:cs="Courier New" w:hint="default"/>
+      </w:rPr>
+    </w:lvl>
+    <w:lvl w:ilvl="2" w:tplc="04090005" w:tentative="1">
+      <w:start w:val="1"/>
+      <w:numFmt w:val="bullet"/>
+      <w:lvlText w:val=""/>
+      <w:lvlJc w:val="left"/>
+      <w:pPr>
+        <w:ind w:left="2430" w:hanging="360"/>
+      </w:pPr>
+      <w:rPr>
+        <w:rFonts w:ascii="Wingdings" w:hAnsi="Wingdings" w:hint="default"/>
+      </w:rPr>
+    </w:lvl>
+    <w:lvl w:ilvl="3" w:tplc="04090001" w:tentative="1">
+      <w:start w:val="1"/>
+      <w:numFmt w:val="bullet"/>
+      <w:lvlText w:val=""/>
+      <w:lvlJc w:val="left"/>
+      <w:pPr>
+        <w:ind w:left="3150" w:hanging="360"/>
+      </w:pPr>
+      <w:rPr>
+        <w:rFonts w:ascii="Symbol" w:hAnsi="Symbol" w:hint="default"/>
+      </w:rPr>
+    </w:lvl>
+    <w:lvl w:ilvl="4" w:tplc="04090003" w:tentative="1">
+      <w:start w:val="1"/>
+      <w:numFmt w:val="bullet"/>
+      <w:lvlText w:val="o"/>
+      <w:lvlJc w:val="left"/>
+      <w:pPr>
+        <w:ind w:left="3870" w:hanging="360"/>
+      </w:pPr>
+      <w:rPr>
+        <w:rFonts w:ascii="Courier New" w:hAnsi="Courier New" w:cs="Courier New" w:hint="default"/>
+      </w:rPr>
+    </w:lvl>
+    <w:lvl w:ilvl="5" w:tplc="04090005" w:tentative="1">
+      <w:start w:val="1"/>
+      <w:numFmt w:val="bullet"/>
+      <w:lvlText w:val=""/>
+      <w:lvlJc w:val="left"/>
+      <w:pPr>
+        <w:ind w:left="4590" w:hanging="360"/>
+      </w:pPr>
+      <w:rPr>
+        <w:rFonts w:ascii="Wingdings" w:hAnsi="Wingdings" w:hint="default"/>
+      </w:rPr>
+    </w:lvl>
+    <w:lvl w:ilvl="6" w:tplc="04090001" w:tentative="1">
+      <w:start w:val="1"/>
+      <w:numFmt w:val="bullet"/>
+      <w:lvlText w:val=""/>
+      <w:lvlJc w:val="left"/>
+      <w:pPr>
+        <w:ind w:left="5310" w:hanging="360"/>
+      </w:pPr>
+      <w:rPr>
+        <w:rFonts w:ascii="Symbol" w:hAnsi="Symbol" w:hint="default"/>
+      </w:rPr>
+    </w:lvl>
+    <w:lvl w:ilvl="7" w:tplc="04090003" w:tentative="1">
+      <w:start w:val="1"/>
+      <w:numFmt w:val="bullet"/>
+      <w:lvlText w:val="o"/>
+      <w:lvlJc w:val="left"/>
+      <w:pPr>
+        <w:ind w:left="6030" w:hanging="360"/>
+      </w:pPr>
+      <w:rPr>
+        <w:rFonts w:ascii="Courier New" w:hAnsi="Courier New" w:cs="Courier New" w:hint="default"/>
+      </w:rPr>
+    </w:lvl>
+    <w:lvl w:ilvl="8" w:tplc="04090005" w:tentative="1">
+      <w:start w:val="1"/>
+      <w:numFmt w:val="bullet"/>
+      <w:lvlText w:val=""/>
+      <w:lvlJc w:val="left"/>
+      <w:pPr>
+        <w:ind w:left="6750" w:hanging="360"/>
+      </w:pPr>
+      <w:rPr>
+        <w:rFonts w:ascii="Wingdings" w:hAnsi="Wingdings" w:hint="default"/>
+      </w:rPr>
+    </w:lvl>
+  </w:abstractNum>
+  <w:abstractNum w:abstractNumId="20">
     <w:nsid w:val="7BAF36E9"/>
     <w:multiLevelType w:val="multilevel"/>
     <w:tmpl w:val="24180D92"/>
@@ -3670,7 +3950,7 @@
     <w:abstractNumId w:val="16"/>
   </w:num>
   <w:num w:numId="41">
-    <w:abstractNumId w:val="19"/>
+    <w:abstractNumId w:val="20"/>
   </w:num>
   <w:num w:numId="42">
     <w:abstractNumId w:val="14"/>
@@ -3686,6 +3966,9 @@
   </w:num>
   <w:num w:numId="46">
     <w:abstractNumId w:val="0"/>
+  </w:num>
+  <w:num w:numId="47">
+    <w:abstractNumId w:val="19"/>
   </w:num>
 </w:numbering>
 </file>
@@ -3991,7 +4274,6 @@
   <w:style w:type="character" w:default="1" w:styleId="DefaultParagraphFont">
     <w:name w:val="Default Paragraph Font"/>
     <w:uiPriority w:val="1"/>
-    <w:semiHidden/>
     <w:unhideWhenUsed/>
   </w:style>
   <w:style w:type="table" w:default="1" w:styleId="TableNormal">
@@ -5729,7 +6011,6 @@
   <w:style w:type="character" w:default="1" w:styleId="DefaultParagraphFont">
     <w:name w:val="Default Paragraph Font"/>
     <w:uiPriority w:val="1"/>
-    <w:semiHidden/>
     <w:unhideWhenUsed/>
   </w:style>
   <w:style w:type="table" w:default="1" w:styleId="TableNormal">
@@ -7455,7 +7736,7 @@
   <a:extraClrSchemeLst/>
   <a:extLst>
     <a:ext uri="{05A4C25C-085E-4340-85A3-A5531E510DB2}">
-      <thm15:themeFamily xmlns:thm15="http://schemas.microsoft.com/office/thememl/2012/main" xmlns="" name="Office Theme" id="{62F939B6-93AF-4DB8-9C6B-D6C7DFDC589F}" vid="{4A3C46E8-61CC-4603-A589-7422A47A8E4A}"/>
+      <thm15:themeFamily xmlns="" xmlns:thm15="http://schemas.microsoft.com/office/thememl/2012/main" name="Office Theme" id="{62F939B6-93AF-4DB8-9C6B-D6C7DFDC589F}" vid="{4A3C46E8-61CC-4603-A589-7422A47A8E4A}"/>
     </a:ext>
   </a:extLst>
 </a:theme>

</xml_diff>

<commit_message>
formatting truefiling content docxes
</commit_message>
<xml_diff>
--- a/docassemble/AKA2JBranding/data/templates/paternity_content.docx
+++ b/docassemble/AKA2JBranding/data/templates/paternity_content.docx
@@ -1,6 +1,6 @@
 
 <file path=word/document.xml><?xml version="1.0" encoding="utf-8"?>
-<w:document xmlns:wpc="http://schemas.microsoft.com/office/word/2010/wordprocessingCanvas" xmlns:mc="http://schemas.openxmlformats.org/markup-compatibility/2006" xmlns:o="urn:schemas-microsoft-com:office:office" xmlns:r="http://schemas.openxmlformats.org/officeDocument/2006/relationships" xmlns:m="http://schemas.openxmlformats.org/officeDocument/2006/math" xmlns:v="urn:schemas-microsoft-com:vml" xmlns:wp14="http://schemas.microsoft.com/office/word/2010/wordprocessingDrawing" xmlns:wp="http://schemas.openxmlformats.org/drawingml/2006/wordprocessingDrawing" xmlns:w10="urn:schemas-microsoft-com:office:word" xmlns:w="http://schemas.openxmlformats.org/wordprocessingml/2006/main" xmlns:w14="http://schemas.microsoft.com/office/word/2010/wordml" xmlns:wpg="http://schemas.microsoft.com/office/word/2010/wordprocessingGroup" xmlns:wpi="http://schemas.microsoft.com/office/word/2010/wordprocessingInk" xmlns:wne="http://schemas.microsoft.com/office/word/2006/wordml" xmlns:wps="http://schemas.microsoft.com/office/word/2010/wordprocessingShape" mc:Ignorable="w14 wp14">
+<w:document xmlns:wpc="http://schemas.microsoft.com/office/word/2010/wordprocessingCanvas" xmlns:cx="http://schemas.microsoft.com/office/drawing/2014/chartex" xmlns:cx1="http://schemas.microsoft.com/office/drawing/2015/9/8/chartex" xmlns:cx2="http://schemas.microsoft.com/office/drawing/2015/10/21/chartex" xmlns:cx3="http://schemas.microsoft.com/office/drawing/2016/5/9/chartex" xmlns:cx4="http://schemas.microsoft.com/office/drawing/2016/5/10/chartex" xmlns:cx5="http://schemas.microsoft.com/office/drawing/2016/5/11/chartex" xmlns:cx6="http://schemas.microsoft.com/office/drawing/2016/5/12/chartex" xmlns:cx7="http://schemas.microsoft.com/office/drawing/2016/5/13/chartex" xmlns:cx8="http://schemas.microsoft.com/office/drawing/2016/5/14/chartex" xmlns:mc="http://schemas.openxmlformats.org/markup-compatibility/2006" xmlns:aink="http://schemas.microsoft.com/office/drawing/2016/ink" xmlns:am3d="http://schemas.microsoft.com/office/drawing/2017/model3d" xmlns:o="urn:schemas-microsoft-com:office:office" xmlns:r="http://schemas.openxmlformats.org/officeDocument/2006/relationships" xmlns:m="http://schemas.openxmlformats.org/officeDocument/2006/math" xmlns:v="urn:schemas-microsoft-com:vml" xmlns:wp14="http://schemas.microsoft.com/office/word/2010/wordprocessingDrawing" xmlns:wp="http://schemas.openxmlformats.org/drawingml/2006/wordprocessingDrawing" xmlns:w10="urn:schemas-microsoft-com:office:word" xmlns:w="http://schemas.openxmlformats.org/wordprocessingml/2006/main" xmlns:w14="http://schemas.microsoft.com/office/word/2010/wordml" xmlns:w15="http://schemas.microsoft.com/office/word/2012/wordml" xmlns:w16cex="http://schemas.microsoft.com/office/word/2018/wordml/cex" xmlns:w16cid="http://schemas.microsoft.com/office/word/2016/wordml/cid" xmlns:w16="http://schemas.microsoft.com/office/word/2018/wordml" xmlns:w16sdtdh="http://schemas.microsoft.com/office/word/2020/wordml/sdtdatahash" xmlns:w16se="http://schemas.microsoft.com/office/word/2015/wordml/symex" xmlns:wpg="http://schemas.microsoft.com/office/word/2010/wordprocessingGroup" xmlns:wpi="http://schemas.microsoft.com/office/word/2010/wordprocessingInk" xmlns:wne="http://schemas.microsoft.com/office/word/2006/wordml" xmlns:wps="http://schemas.microsoft.com/office/word/2010/wordprocessingShape" mc:Ignorable="w14 w15 w16se w16cid w16 w16cex w16sdtdh wp14">
   <w:body>
     <w:p>
       <w:pPr>
@@ -60,21 +60,7 @@
         <w:rPr>
           <w:color w:val="FF0000"/>
         </w:rPr>
-        <w:t xml:space="preserve"> if </w:t>
-      </w:r>
-      <w:proofErr w:type="spellStart"/>
-      <w:r>
-        <w:rPr>
-          <w:color w:val="FF0000"/>
-        </w:rPr>
-        <w:t>user_need</w:t>
-      </w:r>
-      <w:proofErr w:type="spellEnd"/>
-      <w:r>
-        <w:rPr>
-          <w:color w:val="FF0000"/>
-        </w:rPr>
-        <w:t xml:space="preserve"> == 'divorce' %}</w:t>
+        <w:t xml:space="preserve"> if user_need == 'divorce' %}</w:t>
       </w:r>
     </w:p>
     <w:p>
@@ -145,7 +131,7 @@
         </w:rPr>
         <w:t xml:space="preserve"> [</w:t>
       </w:r>
-      <w:hyperlink r:id="rId6" w:history="1">
+      <w:hyperlink r:id="rId5" w:history="1">
         <w:r>
           <w:rPr>
             <w:rStyle w:val="Hyperlink"/>
@@ -268,7 +254,7 @@
         <w:lastRenderedPageBreak/>
         <w:t xml:space="preserve">See CSED's </w:t>
       </w:r>
-      <w:hyperlink r:id="rId7" w:history="1">
+      <w:hyperlink r:id="rId6" w:history="1">
         <w:r>
           <w:rPr>
             <w:rStyle w:val="Hyperlink"/>
@@ -279,7 +265,7 @@
       <w:r>
         <w:t xml:space="preserve"> and </w:t>
       </w:r>
-      <w:hyperlink r:id="rId8" w:history="1">
+      <w:hyperlink r:id="rId7" w:history="1">
         <w:r>
           <w:rPr>
             <w:rStyle w:val="Hyperlink"/>
@@ -322,15 +308,7 @@
         <w:ind w:left="495"/>
       </w:pPr>
       <w:r>
-        <w:t>They are usually more expensive. You and {</w:t>
-      </w:r>
-      <w:proofErr w:type="gramStart"/>
-      <w:r>
-        <w:t>{ other</w:t>
-      </w:r>
-      <w:proofErr w:type="gramEnd"/>
-      <w:r>
-        <w:t>_party_in_case }} will have to work out who pays.</w:t>
+        <w:t>They are usually more expensive. You and {{ other_party_in_case }} will have to work out who pays.</w:t>
       </w:r>
     </w:p>
     <w:p>
@@ -366,21 +344,7 @@
         <w:rPr>
           <w:color w:val="FF0000"/>
         </w:rPr>
-        <w:t xml:space="preserve"> </w:t>
-      </w:r>
-      <w:proofErr w:type="spellStart"/>
-      <w:r>
-        <w:rPr>
-          <w:color w:val="FF0000"/>
-        </w:rPr>
-        <w:t>endif</w:t>
-      </w:r>
-      <w:proofErr w:type="spellEnd"/>
-      <w:r>
-        <w:rPr>
-          <w:color w:val="FF0000"/>
-        </w:rPr>
-        <w:t xml:space="preserve"> %}</w:t>
+        <w:t xml:space="preserve"> endif %}</w:t>
       </w:r>
     </w:p>
     <w:p>
@@ -403,30 +367,8 @@
         <w:rPr>
           <w:color w:val="FF0000"/>
         </w:rPr>
-        <w:t xml:space="preserve"> if </w:t>
-      </w:r>
-      <w:proofErr w:type="spellStart"/>
-      <w:r>
-        <w:rPr>
-          <w:color w:val="FF0000"/>
-        </w:rPr>
-        <w:t>user_need</w:t>
-      </w:r>
-      <w:proofErr w:type="spellEnd"/>
-      <w:r>
-        <w:rPr>
-          <w:color w:val="FF0000"/>
-        </w:rPr>
-        <w:t xml:space="preserve"> </w:t>
-      </w:r>
-      <w:proofErr w:type="gramStart"/>
-      <w:r>
-        <w:rPr>
-          <w:color w:val="FF0000"/>
-        </w:rPr>
-        <w:t>in(</w:t>
-      </w:r>
-      <w:proofErr w:type="gramEnd"/>
+        <w:t xml:space="preserve"> if user_need in(</w:t>
+      </w:r>
       <w:r>
         <w:rPr>
           <w:color w:val="FF0000"/>
@@ -457,40 +399,28 @@
         <w:pStyle w:val="Heading3"/>
       </w:pPr>
       <w:r>
+        <w:t xml:space="preserve">{{ </w:t>
+      </w:r>
+      <w:r>
+        <w:t>'Establishing or disestablishing' if user_need in('custody', 'answer custody') else 'Disestablishing'</w:t>
+      </w:r>
+      <w:r>
+        <w:t xml:space="preserve"> }</w:t>
+      </w:r>
+      <w:r>
+        <w:t xml:space="preserve">} paternity in your </w:t>
+      </w:r>
+      <w:r>
         <w:t>{</w:t>
       </w:r>
-      <w:proofErr w:type="gramStart"/>
-      <w:r>
-        <w:t xml:space="preserve">{ </w:t>
-      </w:r>
-      <w:r>
-        <w:t>'Establishing</w:t>
-      </w:r>
-      <w:proofErr w:type="gramEnd"/>
-      <w:r>
-        <w:t xml:space="preserve"> or disestablishing' if </w:t>
-      </w:r>
-      <w:proofErr w:type="spellStart"/>
-      <w:r>
-        <w:t>user_need</w:t>
-      </w:r>
-      <w:proofErr w:type="spellEnd"/>
-      <w:r>
-        <w:t xml:space="preserve"> in('custody', 'answer custody') else 'Disestablishing'</w:t>
-      </w:r>
-      <w:r>
-        <w:t xml:space="preserve"> }</w:t>
-      </w:r>
-      <w:r>
-        <w:t xml:space="preserve">} paternity in your ${ </w:t>
-      </w:r>
-      <w:proofErr w:type="spellStart"/>
-      <w:r>
-        <w:t>case_type</w:t>
-      </w:r>
-      <w:proofErr w:type="spellEnd"/>
-      <w:r>
-        <w:t xml:space="preserve"> } case</w:t>
+      <w:r>
+        <w:t>{ case_type }</w:t>
+      </w:r>
+      <w:r>
+        <w:t>}</w:t>
+      </w:r>
+      <w:r>
+        <w:t xml:space="preserve"> case</w:t>
       </w:r>
     </w:p>
     <w:p>
@@ -501,33 +431,7 @@
         <w:rPr>
           <w:color w:val="FFC000"/>
         </w:rPr>
-        <w:t>{%</w:t>
-      </w:r>
-      <w:r>
-        <w:rPr>
-          <w:color w:val="FFC000"/>
-        </w:rPr>
-        <w:t>p</w:t>
-      </w:r>
-      <w:r>
-        <w:rPr>
-          <w:color w:val="FFC000"/>
-        </w:rPr>
-        <w:t xml:space="preserve"> if </w:t>
-      </w:r>
-      <w:proofErr w:type="spellStart"/>
-      <w:r>
-        <w:rPr>
-          <w:color w:val="FFC000"/>
-        </w:rPr>
-        <w:t>user_need</w:t>
-      </w:r>
-      <w:proofErr w:type="spellEnd"/>
-      <w:r>
-        <w:rPr>
-          <w:color w:val="FFC000"/>
-        </w:rPr>
-        <w:t xml:space="preserve"> == 'answer divorce' %}</w:t>
+        <w:t>{%p if user_need == 'answer divorce' %}</w:t>
       </w:r>
     </w:p>
     <w:p>
@@ -538,23 +442,7 @@
         <w:t>Dis</w:t>
       </w:r>
       <w:r>
-        <w:t>establishing paternity in your {</w:t>
-      </w:r>
-      <w:proofErr w:type="gramStart"/>
-      <w:r>
-        <w:t xml:space="preserve">{ </w:t>
-      </w:r>
-      <w:proofErr w:type="spellStart"/>
-      <w:r>
-        <w:t>case</w:t>
-      </w:r>
-      <w:proofErr w:type="gramEnd"/>
-      <w:r>
-        <w:t>_type</w:t>
-      </w:r>
-      <w:proofErr w:type="spellEnd"/>
-      <w:r>
-        <w:t xml:space="preserve"> }} case</w:t>
+        <w:t>establishing paternity in your {{ case_type }} case</w:t>
       </w:r>
     </w:p>
     <w:p>
@@ -598,31 +486,7 @@
         <w:pStyle w:val="Body"/>
       </w:pPr>
       <w:r>
-        <w:t>When you file your $</w:t>
-      </w:r>
-      <w:proofErr w:type="gramStart"/>
-      <w:r>
-        <w:t>{ 'complaint'</w:t>
-      </w:r>
-      <w:proofErr w:type="gramEnd"/>
-      <w:r>
-        <w:t xml:space="preserve">  if </w:t>
-      </w:r>
-      <w:proofErr w:type="spellStart"/>
-      <w:r>
-        <w:t>user_need</w:t>
-      </w:r>
-      <w:proofErr w:type="spellEnd"/>
-      <w:r>
-        <w:t xml:space="preserve"> == 'custody' else 'Answer' }, state that paternity is an issue in ${ 'section 3D of the Complaint' if </w:t>
-      </w:r>
-      <w:proofErr w:type="spellStart"/>
-      <w:r>
-        <w:t>user_need</w:t>
-      </w:r>
-      <w:proofErr w:type="spellEnd"/>
-      <w:r>
-        <w:t xml:space="preserve"> == 'custody' else '4 of the Counterclaims section of the Answer' }.</w:t>
+        <w:t>When you file your ${ 'complaint'  if user_need == 'custody' else 'Answer' }, state that paternity is an issue in ${ 'section 3D of the Complaint' if user_need == 'custody' else '4 of the Counterclaims section of the Answer' }.</w:t>
       </w:r>
     </w:p>
     <w:p>
@@ -661,16 +525,8 @@
         <w:rPr>
           <w:color w:val="FFC000"/>
         </w:rPr>
-        <w:t xml:space="preserve"> </w:t>
-      </w:r>
-      <w:proofErr w:type="spellStart"/>
-      <w:r>
-        <w:rPr>
-          <w:color w:val="FFC000"/>
-        </w:rPr>
-        <w:t>endif</w:t>
-      </w:r>
-      <w:proofErr w:type="spellEnd"/>
+        <w:t xml:space="preserve"> endif</w:t>
+      </w:r>
       <w:r>
         <w:rPr>
           <w:color w:val="FFC000"/>
@@ -697,7 +553,7 @@
       <w:r>
         <w:t xml:space="preserve"> [</w:t>
       </w:r>
-      <w:hyperlink r:id="rId9" w:history="1">
+      <w:hyperlink r:id="rId8" w:history="1">
         <w:r>
           <w:rPr>
             <w:rStyle w:val="Hyperlink"/>
@@ -718,51 +574,19 @@
         <w:rPr>
           <w:color w:val="FFC000"/>
         </w:rPr>
-        <w:t>{%</w:t>
+        <w:t xml:space="preserve">{%p if </w:t>
       </w:r>
       <w:r>
         <w:rPr>
           <w:color w:val="FFC000"/>
         </w:rPr>
-        <w:t>p</w:t>
+        <w:t>user_need == 'answer divorce'</w:t>
       </w:r>
       <w:r>
         <w:rPr>
           <w:color w:val="FFC000"/>
         </w:rPr>
-        <w:t xml:space="preserve"> </w:t>
-      </w:r>
-      <w:r>
-        <w:rPr>
-          <w:color w:val="FFC000"/>
-        </w:rPr>
-        <w:t xml:space="preserve">if </w:t>
-      </w:r>
-      <w:proofErr w:type="spellStart"/>
-      <w:r>
-        <w:rPr>
-          <w:color w:val="FFC000"/>
-        </w:rPr>
-        <w:t>user_need</w:t>
-      </w:r>
-      <w:proofErr w:type="spellEnd"/>
-      <w:r>
-        <w:rPr>
-          <w:color w:val="FFC000"/>
-        </w:rPr>
-        <w:t xml:space="preserve"> == 'answer divorce'</w:t>
-      </w:r>
-      <w:r>
-        <w:rPr>
-          <w:color w:val="FFC000"/>
-        </w:rPr>
-        <w:t xml:space="preserve"> </w:t>
-      </w:r>
-      <w:r>
-        <w:rPr>
-          <w:color w:val="FFC000"/>
-        </w:rPr>
-        <w:t>%}</w:t>
+        <w:t xml:space="preserve"> %}</w:t>
       </w:r>
     </w:p>
     <w:p>
@@ -770,13 +594,8 @@
         <w:pStyle w:val="ListParagraph"/>
         <w:ind w:left="360"/>
       </w:pPr>
-      <w:proofErr w:type="gramStart"/>
-      <w:r>
-        <w:t>the</w:t>
-      </w:r>
-      <w:proofErr w:type="gramEnd"/>
-      <w:r>
-        <w:t xml:space="preserve"> mother, the husband and the man who is the father say the husband is not the father and that the man is the biological father.</w:t>
+      <w:r>
+        <w:t>the mother, the husband and the man who is the father say the husband is not the father and that the man is the biological father.</w:t>
       </w:r>
     </w:p>
     <w:p>
@@ -784,14 +603,9 @@
         <w:pStyle w:val="ListParagraph"/>
         <w:ind w:left="360"/>
       </w:pPr>
-      <w:proofErr w:type="gramStart"/>
       <w:r>
         <w:lastRenderedPageBreak/>
-        <w:t>the</w:t>
-      </w:r>
-      <w:proofErr w:type="gramEnd"/>
-      <w:r>
-        <w:t xml:space="preserve"> mother and the husband say the husband is not the father to disestablish the husband as the biological father.</w:t>
+        <w:t>the mother and the husband say the husband is not the father to disestablish the husband as the biological father.</w:t>
       </w:r>
     </w:p>
     <w:p>
@@ -799,13 +613,8 @@
         <w:pStyle w:val="ListParagraph"/>
         <w:ind w:left="360"/>
       </w:pPr>
-      <w:proofErr w:type="gramStart"/>
-      <w:r>
-        <w:t>the</w:t>
-      </w:r>
-      <w:proofErr w:type="gramEnd"/>
-      <w:r>
-        <w:t xml:space="preserve"> mother and the man say he is the father to establish him as the biological father.</w:t>
+      <w:r>
+        <w:t>the mother and the man say he is the father to establish him as the biological father.</w:t>
       </w:r>
     </w:p>
     <w:p>
@@ -813,13 +622,8 @@
         <w:pStyle w:val="ListParagraph"/>
         <w:ind w:left="360"/>
       </w:pPr>
-      <w:proofErr w:type="gramStart"/>
-      <w:r>
-        <w:t>the</w:t>
-      </w:r>
-      <w:proofErr w:type="gramEnd"/>
-      <w:r>
-        <w:t xml:space="preserve"> mother, only if others are not cooperating and she can provide convincing facts about the paternity.</w:t>
+      <w:r>
+        <w:t>the mother, only if others are not cooperating and she can provide convincing facts about the paternity.</w:t>
       </w:r>
     </w:p>
     <w:p>
@@ -827,13 +631,8 @@
         <w:pStyle w:val="ListParagraph"/>
         <w:ind w:left="360"/>
       </w:pPr>
-      <w:proofErr w:type="gramStart"/>
-      <w:r>
-        <w:t>get</w:t>
-      </w:r>
-      <w:proofErr w:type="gramEnd"/>
-      <w:r>
-        <w:t xml:space="preserve"> genetic (DNA) testing of the child, the mother, the man believed to be the father, and the husband. The test results must be provided to the court. This can be done voluntarily if all of the people are cooperating or by court order. To ask for a court order, file: </w:t>
+      <w:r>
+        <w:t xml:space="preserve">get genetic (DNA) testing of the child, the mother, the man believed to be the father, and the husband. The test results must be provided to the court. This can be done voluntarily if all of the people are cooperating or by court order. To ask for a court order, file: </w:t>
       </w:r>
     </w:p>
     <w:p>
@@ -844,19 +643,7 @@
         <w:rPr>
           <w:color w:val="FFC000"/>
         </w:rPr>
-        <w:t>{%</w:t>
-      </w:r>
-      <w:r>
-        <w:rPr>
-          <w:color w:val="FFC000"/>
-        </w:rPr>
-        <w:t>p</w:t>
-      </w:r>
-      <w:r>
-        <w:rPr>
-          <w:color w:val="FFC000"/>
-        </w:rPr>
-        <w:t xml:space="preserve"> else %}</w:t>
+        <w:t>{%p else %}</w:t>
       </w:r>
     </w:p>
     <w:p>
@@ -876,29 +663,13 @@
         <w:pStyle w:val="Body"/>
       </w:pPr>
       <w:r>
-        <w:t xml:space="preserve">If someone is not cooperating or you want the Child Support Enforcement Division to do </w:t>
-      </w:r>
-      <w:proofErr w:type="gramStart"/>
-      <w:r>
-        <w:t>the</w:t>
-      </w:r>
-      <w:proofErr w:type="gramEnd"/>
-      <w:r>
-        <w:t xml:space="preserve"> testing, fill out and attach to your </w:t>
+        <w:t xml:space="preserve">If someone is not cooperating or you want the Child Support Enforcement Division to do the testing, fill out and attach to your </w:t>
       </w:r>
       <w:r>
         <w:t>{</w:t>
       </w:r>
       <w:r>
-        <w:t xml:space="preserve">{ 'complaint' if </w:t>
-      </w:r>
-      <w:proofErr w:type="spellStart"/>
-      <w:r>
-        <w:t>user_need</w:t>
-      </w:r>
-      <w:proofErr w:type="spellEnd"/>
-      <w:r>
-        <w:t xml:space="preserve"> == 'custody' else 'Answer' }</w:t>
+        <w:t>{ 'complaint' if user_need == 'custody' else 'Answer' }</w:t>
       </w:r>
       <w:r>
         <w:t>}</w:t>
@@ -915,21 +686,7 @@
         <w:rPr>
           <w:color w:val="FFC000"/>
         </w:rPr>
-        <w:t xml:space="preserve">{%p </w:t>
-      </w:r>
-      <w:proofErr w:type="spellStart"/>
-      <w:r>
-        <w:rPr>
-          <w:color w:val="FFC000"/>
-        </w:rPr>
-        <w:t>endif</w:t>
-      </w:r>
-      <w:proofErr w:type="spellEnd"/>
-      <w:r>
-        <w:rPr>
-          <w:color w:val="FFC000"/>
-        </w:rPr>
-        <w:t xml:space="preserve"> %}</w:t>
+        <w:t>{%p endif %}</w:t>
       </w:r>
     </w:p>
     <w:p>
@@ -939,7 +696,6 @@
       <w:r>
         <w:t xml:space="preserve"> </w:t>
       </w:r>
-      <w:proofErr w:type="gramStart"/>
       <w:r>
         <w:rPr>
           <w:b/>
@@ -952,7 +708,7 @@
       <w:r>
         <w:t>[</w:t>
       </w:r>
-      <w:hyperlink r:id="rId10" w:history="1">
+      <w:hyperlink r:id="rId9" w:history="1">
         <w:r>
           <w:rPr>
             <w:rStyle w:val="Hyperlink"/>
@@ -967,7 +723,6 @@
       <w:r>
         <w:t>.</w:t>
       </w:r>
-      <w:proofErr w:type="gramEnd"/>
     </w:p>
     <w:p>
       <w:pPr>
@@ -977,26 +732,10 @@
         <w:t>You can attach any DNA test results that have already be</w:t>
       </w:r>
       <w:r>
-        <w:t>en done to your {</w:t>
-      </w:r>
-      <w:proofErr w:type="gramStart"/>
-      <w:r>
-        <w:t>{ 'complaint'</w:t>
-      </w:r>
-      <w:proofErr w:type="gramEnd"/>
-      <w:r>
-        <w:t xml:space="preserve"> </w:t>
-      </w:r>
-      <w:r>
-        <w:t xml:space="preserve">if </w:t>
-      </w:r>
-      <w:proofErr w:type="spellStart"/>
-      <w:r>
-        <w:t>user_need</w:t>
-      </w:r>
-      <w:proofErr w:type="spellEnd"/>
-      <w:r>
-        <w:t xml:space="preserve"> == 'custody' else 'Answer' </w:t>
+        <w:t xml:space="preserve">en done to your {{ 'complaint' </w:t>
+      </w:r>
+      <w:r>
+        <w:t xml:space="preserve">if user_need == 'custody' else 'Answer' </w:t>
       </w:r>
       <w:r>
         <w:t>}</w:t>
@@ -1012,27 +751,11 @@
           <w:color w:val="202529"/>
         </w:rPr>
       </w:pPr>
-      <w:bookmarkStart w:id="0" w:name="_GoBack"/>
-      <w:bookmarkEnd w:id="0"/>
       <w:r>
         <w:rPr>
           <w:color w:val="FF0000"/>
         </w:rPr>
-        <w:t xml:space="preserve">{%p </w:t>
-      </w:r>
-      <w:proofErr w:type="spellStart"/>
-      <w:r>
-        <w:rPr>
-          <w:color w:val="FF0000"/>
-        </w:rPr>
-        <w:t>endif</w:t>
-      </w:r>
-      <w:proofErr w:type="spellEnd"/>
-      <w:r>
-        <w:rPr>
-          <w:color w:val="FF0000"/>
-        </w:rPr>
-        <w:t xml:space="preserve"> %}</w:t>
+        <w:t>{%p endif %}</w:t>
       </w:r>
     </w:p>
     <w:p>
@@ -1085,35 +808,7 @@
         <w:rPr>
           <w:color w:val="FF0000"/>
         </w:rPr>
-        <w:t xml:space="preserve"> if </w:t>
-      </w:r>
-      <w:proofErr w:type="spellStart"/>
-      <w:r>
-        <w:rPr>
-          <w:color w:val="FF0000"/>
-        </w:rPr>
-        <w:t>user_</w:t>
-      </w:r>
-      <w:proofErr w:type="gramStart"/>
-      <w:r>
-        <w:rPr>
-          <w:color w:val="FF0000"/>
-        </w:rPr>
-        <w:t>need</w:t>
-      </w:r>
-      <w:proofErr w:type="spellEnd"/>
-      <w:r>
-        <w:rPr>
-          <w:color w:val="FF0000"/>
-        </w:rPr>
-        <w:t xml:space="preserve"> !</w:t>
-      </w:r>
-      <w:proofErr w:type="gramEnd"/>
-      <w:r>
-        <w:rPr>
-          <w:color w:val="FF0000"/>
-        </w:rPr>
-        <w:t>= 'divorce' %}</w:t>
+        <w:t xml:space="preserve"> if user_need != 'divorce' %}</w:t>
       </w:r>
     </w:p>
     <w:p>
@@ -1134,7 +829,7 @@
       <w:r>
         <w:t xml:space="preserve"> [</w:t>
       </w:r>
-      <w:hyperlink r:id="rId11">
+      <w:hyperlink r:id="rId10">
         <w:r>
           <w:rPr>
             <w:rStyle w:val="Hyperlink"/>
@@ -1148,21 +843,19 @@
           <w:t>PDF</w:t>
         </w:r>
       </w:hyperlink>
-      <w:proofErr w:type="gramStart"/>
       <w:r>
         <w:rPr>
           <w:rStyle w:val="Hyperlink"/>
         </w:rPr>
         <w:t>]</w:t>
       </w:r>
-      <w:proofErr w:type="gramEnd"/>
       <w:r>
         <w:rPr>
           <w:rStyle w:val="Hyperlink"/>
         </w:rPr>
         <w:br/>
       </w:r>
-      <w:hyperlink r:id="rId12" w:history="1">
+      <w:hyperlink r:id="rId11" w:history="1">
         <w:r>
           <w:rPr>
             <w:rStyle w:val="Hyperlink"/>
@@ -1206,29 +899,13 @@
           <w:rStyle w:val="Hyperlink"/>
           <w:color w:val="FF0000"/>
         </w:rPr>
-        <w:t xml:space="preserve"> </w:t>
-      </w:r>
-      <w:proofErr w:type="spellStart"/>
+        <w:t xml:space="preserve"> endif %</w:t>
+      </w:r>
       <w:r>
         <w:rPr>
           <w:rStyle w:val="Hyperlink"/>
           <w:color w:val="FF0000"/>
         </w:rPr>
-        <w:t>endif</w:t>
-      </w:r>
-      <w:proofErr w:type="spellEnd"/>
-      <w:r>
-        <w:rPr>
-          <w:rStyle w:val="Hyperlink"/>
-          <w:color w:val="FF0000"/>
-        </w:rPr>
-        <w:t xml:space="preserve"> %</w:t>
-      </w:r>
-      <w:r>
-        <w:rPr>
-          <w:rStyle w:val="Hyperlink"/>
-          <w:color w:val="FF0000"/>
-        </w:rPr>
         <w:t>}</w:t>
       </w:r>
     </w:p>
@@ -1246,7 +923,7 @@
       <w:r>
         <w:t xml:space="preserve"> [</w:t>
       </w:r>
-      <w:hyperlink r:id="rId13" w:history="1">
+      <w:hyperlink r:id="rId12" w:history="1">
         <w:r>
           <w:rPr>
             <w:rStyle w:val="Hyperlink"/>
@@ -1261,15 +938,13 @@
           <w:t>PDF</w:t>
         </w:r>
       </w:hyperlink>
-      <w:proofErr w:type="gramStart"/>
       <w:r>
         <w:t>]</w:t>
       </w:r>
-      <w:proofErr w:type="gramEnd"/>
       <w:r>
         <w:br/>
       </w:r>
-      <w:hyperlink r:id="rId14" w:history="1">
+      <w:hyperlink r:id="rId13" w:history="1">
         <w:r>
           <w:rPr>
             <w:rStyle w:val="Hyperlink"/>
@@ -1299,21 +974,7 @@
         <w:rPr>
           <w:color w:val="FF0000"/>
         </w:rPr>
-        <w:t xml:space="preserve"> if </w:t>
-      </w:r>
-      <w:proofErr w:type="spellStart"/>
-      <w:r>
-        <w:rPr>
-          <w:color w:val="FF0000"/>
-        </w:rPr>
-        <w:t>user_need</w:t>
-      </w:r>
-      <w:proofErr w:type="spellEnd"/>
-      <w:r>
-        <w:rPr>
-          <w:color w:val="FF0000"/>
-        </w:rPr>
-        <w:t xml:space="preserve"> </w:t>
+        <w:t xml:space="preserve"> if user_need </w:t>
       </w:r>
       <w:r>
         <w:rPr>
@@ -1333,7 +994,7 @@
         <w:pStyle w:val="Body"/>
         <w:spacing w:before="280" w:after="0"/>
       </w:pPr>
-      <w:hyperlink r:id="rId15" w:history="1">
+      <w:hyperlink r:id="rId14" w:history="1">
         <w:r>
           <w:rPr>
             <w:rStyle w:val="Hyperlink"/>
@@ -1344,7 +1005,7 @@
       <w:r>
         <w:br/>
       </w:r>
-      <w:hyperlink r:id="rId16" w:history="1">
+      <w:hyperlink r:id="rId15" w:history="1">
         <w:r>
           <w:rPr>
             <w:rStyle w:val="Hyperlink"/>
@@ -1355,7 +1016,7 @@
       </w:hyperlink>
     </w:p>
     <w:p>
-      <w:hyperlink r:id="rId17" w:history="1">
+      <w:hyperlink r:id="rId16" w:history="1">
         <w:r>
           <w:rPr>
             <w:rStyle w:val="Hyperlink"/>
@@ -1366,7 +1027,7 @@
       <w:r>
         <w:br/>
       </w:r>
-      <w:hyperlink r:id="rId18" w:history="1">
+      <w:hyperlink r:id="rId17" w:history="1">
         <w:r>
           <w:rPr>
             <w:rStyle w:val="Hyperlink"/>
@@ -1402,21 +1063,7 @@
         <w:rPr>
           <w:color w:val="FF0000"/>
         </w:rPr>
-        <w:t xml:space="preserve"> </w:t>
-      </w:r>
-      <w:proofErr w:type="spellStart"/>
-      <w:r>
-        <w:rPr>
-          <w:color w:val="FF0000"/>
-        </w:rPr>
-        <w:t>endif</w:t>
-      </w:r>
-      <w:proofErr w:type="spellEnd"/>
-      <w:r>
-        <w:rPr>
-          <w:color w:val="FF0000"/>
-        </w:rPr>
-        <w:t xml:space="preserve"> %}</w:t>
+        <w:t xml:space="preserve"> endif %}</w:t>
       </w:r>
     </w:p>
     <w:sectPr>
@@ -1429,21 +1076,9 @@
 </w:document>
 </file>
 
-<file path=word/commentsExtended.xml><?xml version="1.0" encoding="utf-8"?>
-<w15:commentsEx xmlns:wpc="http://schemas.microsoft.com/office/word/2010/wordprocessingCanvas" xmlns:cx="http://schemas.microsoft.com/office/drawing/2014/chartex" xmlns:cx1="http://schemas.microsoft.com/office/drawing/2015/9/8/chartex" xmlns:cx2="http://schemas.microsoft.com/office/drawing/2015/10/21/chartex" xmlns:cx3="http://schemas.microsoft.com/office/drawing/2016/5/9/chartex" xmlns:cx4="http://schemas.microsoft.com/office/drawing/2016/5/10/chartex" xmlns:cx5="http://schemas.microsoft.com/office/drawing/2016/5/11/chartex" xmlns:cx6="http://schemas.microsoft.com/office/drawing/2016/5/12/chartex" xmlns:cx7="http://schemas.microsoft.com/office/drawing/2016/5/13/chartex" xmlns:cx8="http://schemas.microsoft.com/office/drawing/2016/5/14/chartex" xmlns:mc="http://schemas.openxmlformats.org/markup-compatibility/2006" xmlns:aink="http://schemas.microsoft.com/office/drawing/2016/ink" xmlns:am3d="http://schemas.microsoft.com/office/drawing/2017/model3d" xmlns:o="urn:schemas-microsoft-com:office:office" xmlns:r="http://schemas.openxmlformats.org/officeDocument/2006/relationships" xmlns:m="http://schemas.openxmlformats.org/officeDocument/2006/math" xmlns:v="urn:schemas-microsoft-com:vml" xmlns:wp14="http://schemas.microsoft.com/office/word/2010/wordprocessingDrawing" xmlns:wp="http://schemas.openxmlformats.org/drawingml/2006/wordprocessingDrawing" xmlns:w10="urn:schemas-microsoft-com:office:word" xmlns:w="http://schemas.openxmlformats.org/wordprocessingml/2006/main" xmlns:w14="http://schemas.microsoft.com/office/word/2010/wordml" xmlns:w15="http://schemas.microsoft.com/office/word/2012/wordml" xmlns:w16cex="http://schemas.microsoft.com/office/word/2018/wordml/cex" xmlns:w16cid="http://schemas.microsoft.com/office/word/2016/wordml/cid" xmlns:w16="http://schemas.microsoft.com/office/word/2018/wordml" xmlns:w16sdtdh="http://schemas.microsoft.com/office/word/2020/wordml/sdtdatahash" xmlns:w16se="http://schemas.microsoft.com/office/word/2015/wordml/symex" xmlns:wpg="http://schemas.microsoft.com/office/word/2010/wordprocessingGroup" xmlns:wpi="http://schemas.microsoft.com/office/word/2010/wordprocessingInk" xmlns:wne="http://schemas.microsoft.com/office/word/2006/wordml" xmlns:wps="http://schemas.microsoft.com/office/word/2010/wordprocessingShape" mc:Ignorable="w14 w15 w16se w16cid w16 w16cex w16sdtdh wp14">
-  <w15:commentEx w15:paraId="2570A775" w15:done="0"/>
-</w15:commentsEx>
-</file>
-
-<file path=word/commentsIds.xml><?xml version="1.0" encoding="utf-8"?>
-<w16cid:commentsIds xmlns:wpc="http://schemas.microsoft.com/office/word/2010/wordprocessingCanvas" xmlns:cx="http://schemas.microsoft.com/office/drawing/2014/chartex" xmlns:cx1="http://schemas.microsoft.com/office/drawing/2015/9/8/chartex" xmlns:cx2="http://schemas.microsoft.com/office/drawing/2015/10/21/chartex" xmlns:cx3="http://schemas.microsoft.com/office/drawing/2016/5/9/chartex" xmlns:cx4="http://schemas.microsoft.com/office/drawing/2016/5/10/chartex" xmlns:cx5="http://schemas.microsoft.com/office/drawing/2016/5/11/chartex" xmlns:cx6="http://schemas.microsoft.com/office/drawing/2016/5/12/chartex" xmlns:cx7="http://schemas.microsoft.com/office/drawing/2016/5/13/chartex" xmlns:cx8="http://schemas.microsoft.com/office/drawing/2016/5/14/chartex" xmlns:mc="http://schemas.openxmlformats.org/markup-compatibility/2006" xmlns:aink="http://schemas.microsoft.com/office/drawing/2016/ink" xmlns:am3d="http://schemas.microsoft.com/office/drawing/2017/model3d" xmlns:o="urn:schemas-microsoft-com:office:office" xmlns:r="http://schemas.openxmlformats.org/officeDocument/2006/relationships" xmlns:m="http://schemas.openxmlformats.org/officeDocument/2006/math" xmlns:v="urn:schemas-microsoft-com:vml" xmlns:wp14="http://schemas.microsoft.com/office/word/2010/wordprocessingDrawing" xmlns:wp="http://schemas.openxmlformats.org/drawingml/2006/wordprocessingDrawing" xmlns:w10="urn:schemas-microsoft-com:office:word" xmlns:w="http://schemas.openxmlformats.org/wordprocessingml/2006/main" xmlns:w14="http://schemas.microsoft.com/office/word/2010/wordml" xmlns:w15="http://schemas.microsoft.com/office/word/2012/wordml" xmlns:w16cex="http://schemas.microsoft.com/office/word/2018/wordml/cex" xmlns:w16cid="http://schemas.microsoft.com/office/word/2016/wordml/cid" xmlns:w16="http://schemas.microsoft.com/office/word/2018/wordml" xmlns:w16sdtdh="http://schemas.microsoft.com/office/word/2020/wordml/sdtdatahash" xmlns:w16se="http://schemas.microsoft.com/office/word/2015/wordml/symex" xmlns:wpg="http://schemas.microsoft.com/office/word/2010/wordprocessingGroup" xmlns:wpi="http://schemas.microsoft.com/office/word/2010/wordprocessingInk" xmlns:wne="http://schemas.microsoft.com/office/word/2006/wordml" xmlns:wps="http://schemas.microsoft.com/office/word/2010/wordprocessingShape" mc:Ignorable="w14 w15 w16se w16cid w16 w16cex w16sdtdh wp14">
-  <w16cid:commentId w16cid:paraId="2570A775" w16cid:durableId="2D7F2AE3"/>
-</w16cid:commentsIds>
-</file>
-
 <file path=word/numbering.xml><?xml version="1.0" encoding="utf-8"?>
-<w:numbering xmlns:wpc="http://schemas.microsoft.com/office/word/2010/wordprocessingCanvas" xmlns:mc="http://schemas.openxmlformats.org/markup-compatibility/2006" xmlns:o="urn:schemas-microsoft-com:office:office" xmlns:r="http://schemas.openxmlformats.org/officeDocument/2006/relationships" xmlns:m="http://schemas.openxmlformats.org/officeDocument/2006/math" xmlns:v="urn:schemas-microsoft-com:vml" xmlns:wp14="http://schemas.microsoft.com/office/word/2010/wordprocessingDrawing" xmlns:wp="http://schemas.openxmlformats.org/drawingml/2006/wordprocessingDrawing" xmlns:w10="urn:schemas-microsoft-com:office:word" xmlns:w="http://schemas.openxmlformats.org/wordprocessingml/2006/main" xmlns:w14="http://schemas.microsoft.com/office/word/2010/wordml" xmlns:wpg="http://schemas.microsoft.com/office/word/2010/wordprocessingGroup" xmlns:wpi="http://schemas.microsoft.com/office/word/2010/wordprocessingInk" xmlns:wne="http://schemas.microsoft.com/office/word/2006/wordml" xmlns:wps="http://schemas.microsoft.com/office/word/2010/wordprocessingShape" mc:Ignorable="w14 wp14">
-  <w:abstractNum w:abstractNumId="0">
+<w:numbering xmlns:wpc="http://schemas.microsoft.com/office/word/2010/wordprocessingCanvas" xmlns:cx="http://schemas.microsoft.com/office/drawing/2014/chartex" xmlns:cx1="http://schemas.microsoft.com/office/drawing/2015/9/8/chartex" xmlns:cx2="http://schemas.microsoft.com/office/drawing/2015/10/21/chartex" xmlns:cx3="http://schemas.microsoft.com/office/drawing/2016/5/9/chartex" xmlns:cx4="http://schemas.microsoft.com/office/drawing/2016/5/10/chartex" xmlns:cx5="http://schemas.microsoft.com/office/drawing/2016/5/11/chartex" xmlns:cx6="http://schemas.microsoft.com/office/drawing/2016/5/12/chartex" xmlns:cx7="http://schemas.microsoft.com/office/drawing/2016/5/13/chartex" xmlns:cx8="http://schemas.microsoft.com/office/drawing/2016/5/14/chartex" xmlns:mc="http://schemas.openxmlformats.org/markup-compatibility/2006" xmlns:aink="http://schemas.microsoft.com/office/drawing/2016/ink" xmlns:am3d="http://schemas.microsoft.com/office/drawing/2017/model3d" xmlns:o="urn:schemas-microsoft-com:office:office" xmlns:r="http://schemas.openxmlformats.org/officeDocument/2006/relationships" xmlns:m="http://schemas.openxmlformats.org/officeDocument/2006/math" xmlns:v="urn:schemas-microsoft-com:vml" xmlns:wp14="http://schemas.microsoft.com/office/word/2010/wordprocessingDrawing" xmlns:wp="http://schemas.openxmlformats.org/drawingml/2006/wordprocessingDrawing" xmlns:w10="urn:schemas-microsoft-com:office:word" xmlns:w="http://schemas.openxmlformats.org/wordprocessingml/2006/main" xmlns:w14="http://schemas.microsoft.com/office/word/2010/wordml" xmlns:w15="http://schemas.microsoft.com/office/word/2012/wordml" xmlns:w16cex="http://schemas.microsoft.com/office/word/2018/wordml/cex" xmlns:w16cid="http://schemas.microsoft.com/office/word/2016/wordml/cid" xmlns:w16="http://schemas.microsoft.com/office/word/2018/wordml" xmlns:w16sdtdh="http://schemas.microsoft.com/office/word/2020/wordml/sdtdatahash" xmlns:w16se="http://schemas.microsoft.com/office/word/2015/wordml/symex" xmlns:wpg="http://schemas.microsoft.com/office/word/2010/wordprocessingGroup" xmlns:wpi="http://schemas.microsoft.com/office/word/2010/wordprocessingInk" xmlns:wne="http://schemas.microsoft.com/office/word/2006/wordml" xmlns:wps="http://schemas.microsoft.com/office/word/2010/wordprocessingShape" mc:Ignorable="w14 w15 w16se w16cid w16 w16cex w16sdtdh wp14">
+  <w:abstractNum w:abstractNumId="0" w15:restartNumberingAfterBreak="0">
     <w:nsid w:val="073E10F3"/>
     <w:multiLevelType w:val="hybridMultilevel"/>
     <w:tmpl w:val="8504561E"/>
@@ -1555,7 +1190,7 @@
       </w:rPr>
     </w:lvl>
   </w:abstractNum>
-  <w:abstractNum w:abstractNumId="1">
+  <w:abstractNum w:abstractNumId="1" w15:restartNumberingAfterBreak="0">
     <w:nsid w:val="08C6366F"/>
     <w:multiLevelType w:val="hybridMultilevel"/>
     <w:tmpl w:val="D3561CAA"/>
@@ -1642,7 +1277,7 @@
       </w:pPr>
     </w:lvl>
   </w:abstractNum>
-  <w:abstractNum w:abstractNumId="2">
+  <w:abstractNum w:abstractNumId="2" w15:restartNumberingAfterBreak="0">
     <w:nsid w:val="09F353E3"/>
     <w:multiLevelType w:val="hybridMultilevel"/>
     <w:tmpl w:val="EE5CFEAC"/>
@@ -1755,7 +1390,7 @@
       </w:rPr>
     </w:lvl>
   </w:abstractNum>
-  <w:abstractNum w:abstractNumId="3">
+  <w:abstractNum w:abstractNumId="3" w15:restartNumberingAfterBreak="0">
     <w:nsid w:val="0C357DD6"/>
     <w:multiLevelType w:val="hybridMultilevel"/>
     <w:tmpl w:val="D83AD7E4"/>
@@ -1846,7 +1481,7 @@
       </w:pPr>
     </w:lvl>
   </w:abstractNum>
-  <w:abstractNum w:abstractNumId="4">
+  <w:abstractNum w:abstractNumId="4" w15:restartNumberingAfterBreak="0">
     <w:nsid w:val="0DEA069D"/>
     <w:multiLevelType w:val="multilevel"/>
     <w:tmpl w:val="450C4EF6"/>
@@ -1987,7 +1622,7 @@
       </w:rPr>
     </w:lvl>
   </w:abstractNum>
-  <w:abstractNum w:abstractNumId="5">
+  <w:abstractNum w:abstractNumId="5" w15:restartNumberingAfterBreak="0">
     <w:nsid w:val="1323523E"/>
     <w:multiLevelType w:val="multilevel"/>
     <w:tmpl w:val="873C83DA"/>
@@ -2144,7 +1779,7 @@
       </w:rPr>
     </w:lvl>
   </w:abstractNum>
-  <w:abstractNum w:abstractNumId="6">
+  <w:abstractNum w:abstractNumId="6" w15:restartNumberingAfterBreak="0">
     <w:nsid w:val="15510218"/>
     <w:multiLevelType w:val="hybridMultilevel"/>
     <w:tmpl w:val="8EF49D20"/>
@@ -2234,7 +1869,7 @@
       </w:pPr>
     </w:lvl>
   </w:abstractNum>
-  <w:abstractNum w:abstractNumId="7">
+  <w:abstractNum w:abstractNumId="7" w15:restartNumberingAfterBreak="0">
     <w:nsid w:val="253D4794"/>
     <w:multiLevelType w:val="multilevel"/>
     <w:tmpl w:val="8C80AB36"/>
@@ -2347,7 +1982,7 @@
       </w:rPr>
     </w:lvl>
   </w:abstractNum>
-  <w:abstractNum w:abstractNumId="8">
+  <w:abstractNum w:abstractNumId="8" w15:restartNumberingAfterBreak="0">
     <w:nsid w:val="27FF20A5"/>
     <w:multiLevelType w:val="hybridMultilevel"/>
     <w:tmpl w:val="9036D3D8"/>
@@ -2462,7 +2097,7 @@
       </w:rPr>
     </w:lvl>
   </w:abstractNum>
-  <w:abstractNum w:abstractNumId="9">
+  <w:abstractNum w:abstractNumId="9" w15:restartNumberingAfterBreak="0">
     <w:nsid w:val="296F3872"/>
     <w:multiLevelType w:val="hybridMultilevel"/>
     <w:tmpl w:val="F634C142"/>
@@ -2576,7 +2211,7 @@
       </w:rPr>
     </w:lvl>
   </w:abstractNum>
-  <w:abstractNum w:abstractNumId="10">
+  <w:abstractNum w:abstractNumId="10" w15:restartNumberingAfterBreak="0">
     <w:nsid w:val="3BB67316"/>
     <w:multiLevelType w:val="hybridMultilevel"/>
     <w:tmpl w:val="D2A20BEA"/>
@@ -2689,7 +2324,7 @@
       </w:rPr>
     </w:lvl>
   </w:abstractNum>
-  <w:abstractNum w:abstractNumId="11">
+  <w:abstractNum w:abstractNumId="11" w15:restartNumberingAfterBreak="0">
     <w:nsid w:val="416740F3"/>
     <w:multiLevelType w:val="hybridMultilevel"/>
     <w:tmpl w:val="F012AB78"/>
@@ -2802,7 +2437,7 @@
       </w:rPr>
     </w:lvl>
   </w:abstractNum>
-  <w:abstractNum w:abstractNumId="12">
+  <w:abstractNum w:abstractNumId="12" w15:restartNumberingAfterBreak="0">
     <w:nsid w:val="4803540D"/>
     <w:multiLevelType w:val="hybridMultilevel"/>
     <w:tmpl w:val="CC58063A"/>
@@ -2916,7 +2551,7 @@
       </w:rPr>
     </w:lvl>
   </w:abstractNum>
-  <w:abstractNum w:abstractNumId="13">
+  <w:abstractNum w:abstractNumId="13" w15:restartNumberingAfterBreak="0">
     <w:nsid w:val="492F4D8F"/>
     <w:multiLevelType w:val="hybridMultilevel"/>
     <w:tmpl w:val="F62C94DE"/>
@@ -3030,7 +2665,7 @@
       </w:rPr>
     </w:lvl>
   </w:abstractNum>
-  <w:abstractNum w:abstractNumId="14">
+  <w:abstractNum w:abstractNumId="14" w15:restartNumberingAfterBreak="0">
     <w:nsid w:val="527D4778"/>
     <w:multiLevelType w:val="hybridMultilevel"/>
     <w:tmpl w:val="EE8038B2"/>
@@ -3143,7 +2778,7 @@
       </w:rPr>
     </w:lvl>
   </w:abstractNum>
-  <w:abstractNum w:abstractNumId="15">
+  <w:abstractNum w:abstractNumId="15" w15:restartNumberingAfterBreak="0">
     <w:nsid w:val="5A0B13C4"/>
     <w:multiLevelType w:val="hybridMultilevel"/>
     <w:tmpl w:val="E84E7C10"/>
@@ -3256,7 +2891,7 @@
       </w:rPr>
     </w:lvl>
   </w:abstractNum>
-  <w:abstractNum w:abstractNumId="16">
+  <w:abstractNum w:abstractNumId="16" w15:restartNumberingAfterBreak="0">
     <w:nsid w:val="636B498A"/>
     <w:multiLevelType w:val="hybridMultilevel"/>
     <w:tmpl w:val="1032CF60"/>
@@ -3369,7 +3004,7 @@
       </w:rPr>
     </w:lvl>
   </w:abstractNum>
-  <w:abstractNum w:abstractNumId="17">
+  <w:abstractNum w:abstractNumId="17" w15:restartNumberingAfterBreak="0">
     <w:nsid w:val="6774194D"/>
     <w:multiLevelType w:val="hybridMultilevel"/>
     <w:tmpl w:val="9CD2C286"/>
@@ -3482,7 +3117,7 @@
       </w:rPr>
     </w:lvl>
   </w:abstractNum>
-  <w:abstractNum w:abstractNumId="18">
+  <w:abstractNum w:abstractNumId="18" w15:restartNumberingAfterBreak="0">
     <w:nsid w:val="6B961852"/>
     <w:multiLevelType w:val="hybridMultilevel"/>
     <w:tmpl w:val="DAAECE10"/>
@@ -3575,7 +3210,7 @@
       </w:pPr>
     </w:lvl>
   </w:abstractNum>
-  <w:abstractNum w:abstractNumId="19">
+  <w:abstractNum w:abstractNumId="19" w15:restartNumberingAfterBreak="0">
     <w:nsid w:val="6D157CF3"/>
     <w:multiLevelType w:val="hybridMultilevel"/>
     <w:tmpl w:val="8D744066"/>
@@ -3688,7 +3323,7 @@
       </w:rPr>
     </w:lvl>
   </w:abstractNum>
-  <w:abstractNum w:abstractNumId="20">
+  <w:abstractNum w:abstractNumId="20" w15:restartNumberingAfterBreak="0">
     <w:nsid w:val="7BAF36E9"/>
     <w:multiLevelType w:val="multilevel"/>
     <w:tmpl w:val="24180D92"/>
@@ -3974,7 +3609,7 @@
 </file>
 
 <file path=word/styles.xml><?xml version="1.0" encoding="utf-8"?>
-<w:styles xmlns:mc="http://schemas.openxmlformats.org/markup-compatibility/2006" xmlns:r="http://schemas.openxmlformats.org/officeDocument/2006/relationships" xmlns:w="http://schemas.openxmlformats.org/wordprocessingml/2006/main" xmlns:w14="http://schemas.microsoft.com/office/word/2010/wordml" mc:Ignorable="w14">
+<w:styles xmlns:mc="http://schemas.openxmlformats.org/markup-compatibility/2006" xmlns:r="http://schemas.openxmlformats.org/officeDocument/2006/relationships" xmlns:w="http://schemas.openxmlformats.org/wordprocessingml/2006/main" xmlns:w14="http://schemas.microsoft.com/office/word/2010/wordml" xmlns:w15="http://schemas.microsoft.com/office/word/2012/wordml" xmlns:w16cex="http://schemas.microsoft.com/office/word/2018/wordml/cex" xmlns:w16cid="http://schemas.microsoft.com/office/word/2016/wordml/cid" xmlns:w16="http://schemas.microsoft.com/office/word/2018/wordml" xmlns:w16sdtdh="http://schemas.microsoft.com/office/word/2020/wordml/sdtdatahash" xmlns:w16se="http://schemas.microsoft.com/office/word/2015/wordml/symex" mc:Ignorable="w14 w15 w16se w16cid w16 w16cex w16sdtdh">
   <w:docDefaults>
     <w:rPrDefault>
       <w:rPr>
@@ -3990,147 +3625,383 @@
       </w:pPr>
     </w:pPrDefault>
   </w:docDefaults>
-  <w:latentStyles w:defLockedState="0" w:defUIPriority="99" w:defSemiHidden="1" w:defUnhideWhenUsed="1" w:defQFormat="0" w:count="267">
-    <w:lsdException w:name="Normal" w:semiHidden="0" w:uiPriority="0" w:unhideWhenUsed="0" w:qFormat="1"/>
-    <w:lsdException w:name="heading 1" w:semiHidden="0" w:uiPriority="9" w:unhideWhenUsed="0" w:qFormat="1"/>
-    <w:lsdException w:name="heading 2" w:uiPriority="9" w:qFormat="1"/>
-    <w:lsdException w:name="heading 3" w:uiPriority="9" w:qFormat="1"/>
-    <w:lsdException w:name="heading 4" w:uiPriority="9" w:qFormat="1"/>
-    <w:lsdException w:name="heading 5" w:uiPriority="9" w:qFormat="1"/>
-    <w:lsdException w:name="heading 6" w:uiPriority="9" w:qFormat="1"/>
-    <w:lsdException w:name="heading 7" w:uiPriority="9" w:qFormat="1"/>
-    <w:lsdException w:name="heading 8" w:uiPriority="9" w:qFormat="1"/>
-    <w:lsdException w:name="heading 9" w:uiPriority="9" w:qFormat="1"/>
-    <w:lsdException w:name="toc 1" w:uiPriority="39"/>
-    <w:lsdException w:name="toc 2" w:uiPriority="39"/>
-    <w:lsdException w:name="toc 3" w:uiPriority="39"/>
-    <w:lsdException w:name="toc 4" w:uiPriority="39"/>
-    <w:lsdException w:name="toc 5" w:uiPriority="39"/>
-    <w:lsdException w:name="toc 6" w:uiPriority="39"/>
-    <w:lsdException w:name="toc 7" w:uiPriority="39"/>
-    <w:lsdException w:name="toc 8" w:uiPriority="39"/>
-    <w:lsdException w:name="toc 9" w:uiPriority="39"/>
-    <w:lsdException w:name="annotation text" w:qFormat="1"/>
-    <w:lsdException w:name="caption" w:uiPriority="35" w:qFormat="1"/>
-    <w:lsdException w:name="annotation reference" w:qFormat="1"/>
-    <w:lsdException w:name="Title" w:semiHidden="0" w:uiPriority="10" w:unhideWhenUsed="0" w:qFormat="1"/>
-    <w:lsdException w:name="Default Paragraph Font" w:uiPriority="1"/>
-    <w:lsdException w:name="Body Text" w:uiPriority="1" w:qFormat="1"/>
-    <w:lsdException w:name="Subtitle" w:semiHidden="0" w:uiPriority="11" w:unhideWhenUsed="0" w:qFormat="1"/>
-    <w:lsdException w:name="Strong" w:semiHidden="0" w:uiPriority="22" w:unhideWhenUsed="0" w:qFormat="1"/>
-    <w:lsdException w:name="Emphasis" w:semiHidden="0" w:uiPriority="20" w:unhideWhenUsed="0" w:qFormat="1"/>
-    <w:lsdException w:name="Table Grid" w:semiHidden="0" w:uiPriority="39" w:unhideWhenUsed="0"/>
-    <w:lsdException w:name="Placeholder Text" w:unhideWhenUsed="0"/>
-    <w:lsdException w:name="No Spacing" w:semiHidden="0" w:uiPriority="1" w:unhideWhenUsed="0" w:qFormat="1"/>
-    <w:lsdException w:name="Light Shading" w:semiHidden="0" w:uiPriority="60" w:unhideWhenUsed="0"/>
-    <w:lsdException w:name="Light List" w:semiHidden="0" w:uiPriority="61" w:unhideWhenUsed="0"/>
-    <w:lsdException w:name="Light Grid" w:semiHidden="0" w:uiPriority="62" w:unhideWhenUsed="0"/>
-    <w:lsdException w:name="Medium Shading 1" w:semiHidden="0" w:uiPriority="63" w:unhideWhenUsed="0"/>
-    <w:lsdException w:name="Medium Shading 2" w:semiHidden="0" w:uiPriority="64" w:unhideWhenUsed="0"/>
-    <w:lsdException w:name="Medium List 1" w:semiHidden="0" w:uiPriority="65" w:unhideWhenUsed="0"/>
-    <w:lsdException w:name="Medium List 2" w:semiHidden="0" w:uiPriority="66" w:unhideWhenUsed="0"/>
-    <w:lsdException w:name="Medium Grid 1" w:semiHidden="0" w:uiPriority="67" w:unhideWhenUsed="0"/>
-    <w:lsdException w:name="Medium Grid 2" w:semiHidden="0" w:uiPriority="68" w:unhideWhenUsed="0"/>
-    <w:lsdException w:name="Medium Grid 3" w:semiHidden="0" w:uiPriority="69" w:unhideWhenUsed="0"/>
-    <w:lsdException w:name="Dark List" w:semiHidden="0" w:uiPriority="70" w:unhideWhenUsed="0"/>
-    <w:lsdException w:name="Colorful Shading" w:semiHidden="0" w:uiPriority="71" w:unhideWhenUsed="0"/>
-    <w:lsdException w:name="Colorful List" w:semiHidden="0" w:uiPriority="72" w:unhideWhenUsed="0"/>
-    <w:lsdException w:name="Colorful Grid" w:semiHidden="0" w:uiPriority="73" w:unhideWhenUsed="0"/>
-    <w:lsdException w:name="Light Shading Accent 1" w:semiHidden="0" w:uiPriority="60" w:unhideWhenUsed="0"/>
-    <w:lsdException w:name="Light List Accent 1" w:semiHidden="0" w:uiPriority="61" w:unhideWhenUsed="0"/>
-    <w:lsdException w:name="Light Grid Accent 1" w:semiHidden="0" w:uiPriority="62" w:unhideWhenUsed="0"/>
-    <w:lsdException w:name="Medium Shading 1 Accent 1" w:semiHidden="0" w:uiPriority="63" w:unhideWhenUsed="0"/>
-    <w:lsdException w:name="Medium Shading 2 Accent 1" w:semiHidden="0" w:uiPriority="64" w:unhideWhenUsed="0"/>
-    <w:lsdException w:name="Medium List 1 Accent 1" w:semiHidden="0" w:uiPriority="65" w:unhideWhenUsed="0"/>
-    <w:lsdException w:name="Revision" w:unhideWhenUsed="0"/>
-    <w:lsdException w:name="List Paragraph" w:semiHidden="0" w:uiPriority="34" w:unhideWhenUsed="0" w:qFormat="1"/>
-    <w:lsdException w:name="Quote" w:semiHidden="0" w:uiPriority="29" w:unhideWhenUsed="0" w:qFormat="1"/>
-    <w:lsdException w:name="Intense Quote" w:semiHidden="0" w:uiPriority="30" w:unhideWhenUsed="0" w:qFormat="1"/>
-    <w:lsdException w:name="Medium List 2 Accent 1" w:semiHidden="0" w:uiPriority="66" w:unhideWhenUsed="0"/>
-    <w:lsdException w:name="Medium Grid 1 Accent 1" w:semiHidden="0" w:uiPriority="67" w:unhideWhenUsed="0"/>
-    <w:lsdException w:name="Medium Grid 2 Accent 1" w:semiHidden="0" w:uiPriority="68" w:unhideWhenUsed="0"/>
-    <w:lsdException w:name="Medium Grid 3 Accent 1" w:semiHidden="0" w:uiPriority="69" w:unhideWhenUsed="0"/>
-    <w:lsdException w:name="Dark List Accent 1" w:semiHidden="0" w:uiPriority="70" w:unhideWhenUsed="0"/>
-    <w:lsdException w:name="Colorful Shading Accent 1" w:semiHidden="0" w:uiPriority="71" w:unhideWhenUsed="0"/>
-    <w:lsdException w:name="Colorful List Accent 1" w:semiHidden="0" w:uiPriority="72" w:unhideWhenUsed="0"/>
-    <w:lsdException w:name="Colorful Grid Accent 1" w:semiHidden="0" w:uiPriority="73" w:unhideWhenUsed="0"/>
-    <w:lsdException w:name="Light Shading Accent 2" w:semiHidden="0" w:uiPriority="60" w:unhideWhenUsed="0"/>
-    <w:lsdException w:name="Light List Accent 2" w:semiHidden="0" w:uiPriority="61" w:unhideWhenUsed="0"/>
-    <w:lsdException w:name="Light Grid Accent 2" w:semiHidden="0" w:uiPriority="62" w:unhideWhenUsed="0"/>
-    <w:lsdException w:name="Medium Shading 1 Accent 2" w:semiHidden="0" w:uiPriority="63" w:unhideWhenUsed="0"/>
-    <w:lsdException w:name="Medium Shading 2 Accent 2" w:semiHidden="0" w:uiPriority="64" w:unhideWhenUsed="0"/>
-    <w:lsdException w:name="Medium List 1 Accent 2" w:semiHidden="0" w:uiPriority="65" w:unhideWhenUsed="0"/>
-    <w:lsdException w:name="Medium List 2 Accent 2" w:semiHidden="0" w:uiPriority="66" w:unhideWhenUsed="0"/>
-    <w:lsdException w:name="Medium Grid 1 Accent 2" w:semiHidden="0" w:uiPriority="67" w:unhideWhenUsed="0"/>
-    <w:lsdException w:name="Medium Grid 2 Accent 2" w:semiHidden="0" w:uiPriority="68" w:unhideWhenUsed="0"/>
-    <w:lsdException w:name="Medium Grid 3 Accent 2" w:semiHidden="0" w:uiPriority="69" w:unhideWhenUsed="0"/>
-    <w:lsdException w:name="Dark List Accent 2" w:semiHidden="0" w:uiPriority="70" w:unhideWhenUsed="0"/>
-    <w:lsdException w:name="Colorful Shading Accent 2" w:semiHidden="0" w:uiPriority="71" w:unhideWhenUsed="0"/>
-    <w:lsdException w:name="Colorful List Accent 2" w:semiHidden="0" w:uiPriority="72" w:unhideWhenUsed="0"/>
-    <w:lsdException w:name="Colorful Grid Accent 2" w:semiHidden="0" w:uiPriority="73" w:unhideWhenUsed="0"/>
-    <w:lsdException w:name="Light Shading Accent 3" w:semiHidden="0" w:uiPriority="60" w:unhideWhenUsed="0"/>
-    <w:lsdException w:name="Light List Accent 3" w:semiHidden="0" w:uiPriority="61" w:unhideWhenUsed="0"/>
-    <w:lsdException w:name="Light Grid Accent 3" w:semiHidden="0" w:uiPriority="62" w:unhideWhenUsed="0"/>
-    <w:lsdException w:name="Medium Shading 1 Accent 3" w:semiHidden="0" w:uiPriority="63" w:unhideWhenUsed="0"/>
-    <w:lsdException w:name="Medium Shading 2 Accent 3" w:semiHidden="0" w:uiPriority="64" w:unhideWhenUsed="0"/>
-    <w:lsdException w:name="Medium List 1 Accent 3" w:semiHidden="0" w:uiPriority="65" w:unhideWhenUsed="0"/>
-    <w:lsdException w:name="Medium List 2 Accent 3" w:semiHidden="0" w:uiPriority="66" w:unhideWhenUsed="0"/>
-    <w:lsdException w:name="Medium Grid 1 Accent 3" w:semiHidden="0" w:uiPriority="67" w:unhideWhenUsed="0"/>
-    <w:lsdException w:name="Medium Grid 2 Accent 3" w:semiHidden="0" w:uiPriority="68" w:unhideWhenUsed="0"/>
-    <w:lsdException w:name="Medium Grid 3 Accent 3" w:semiHidden="0" w:uiPriority="69" w:unhideWhenUsed="0"/>
-    <w:lsdException w:name="Dark List Accent 3" w:semiHidden="0" w:uiPriority="70" w:unhideWhenUsed="0"/>
-    <w:lsdException w:name="Colorful Shading Accent 3" w:semiHidden="0" w:uiPriority="71" w:unhideWhenUsed="0"/>
-    <w:lsdException w:name="Colorful List Accent 3" w:semiHidden="0" w:uiPriority="72" w:unhideWhenUsed="0"/>
-    <w:lsdException w:name="Colorful Grid Accent 3" w:semiHidden="0" w:uiPriority="73" w:unhideWhenUsed="0"/>
-    <w:lsdException w:name="Light Shading Accent 4" w:semiHidden="0" w:uiPriority="60" w:unhideWhenUsed="0"/>
-    <w:lsdException w:name="Light List Accent 4" w:semiHidden="0" w:uiPriority="61" w:unhideWhenUsed="0"/>
-    <w:lsdException w:name="Light Grid Accent 4" w:semiHidden="0" w:uiPriority="62" w:unhideWhenUsed="0"/>
-    <w:lsdException w:name="Medium Shading 1 Accent 4" w:semiHidden="0" w:uiPriority="63" w:unhideWhenUsed="0"/>
-    <w:lsdException w:name="Medium Shading 2 Accent 4" w:semiHidden="0" w:uiPriority="64" w:unhideWhenUsed="0"/>
-    <w:lsdException w:name="Medium List 1 Accent 4" w:semiHidden="0" w:uiPriority="65" w:unhideWhenUsed="0"/>
-    <w:lsdException w:name="Medium List 2 Accent 4" w:semiHidden="0" w:uiPriority="66" w:unhideWhenUsed="0"/>
-    <w:lsdException w:name="Medium Grid 1 Accent 4" w:semiHidden="0" w:uiPriority="67" w:unhideWhenUsed="0"/>
-    <w:lsdException w:name="Medium Grid 2 Accent 4" w:semiHidden="0" w:uiPriority="68" w:unhideWhenUsed="0"/>
-    <w:lsdException w:name="Medium Grid 3 Accent 4" w:semiHidden="0" w:uiPriority="69" w:unhideWhenUsed="0"/>
-    <w:lsdException w:name="Dark List Accent 4" w:semiHidden="0" w:uiPriority="70" w:unhideWhenUsed="0"/>
-    <w:lsdException w:name="Colorful Shading Accent 4" w:semiHidden="0" w:uiPriority="71" w:unhideWhenUsed="0"/>
-    <w:lsdException w:name="Colorful List Accent 4" w:semiHidden="0" w:uiPriority="72" w:unhideWhenUsed="0"/>
-    <w:lsdException w:name="Colorful Grid Accent 4" w:semiHidden="0" w:uiPriority="73" w:unhideWhenUsed="0"/>
-    <w:lsdException w:name="Light Shading Accent 5" w:semiHidden="0" w:uiPriority="60" w:unhideWhenUsed="0"/>
-    <w:lsdException w:name="Light List Accent 5" w:semiHidden="0" w:uiPriority="61" w:unhideWhenUsed="0"/>
-    <w:lsdException w:name="Light Grid Accent 5" w:semiHidden="0" w:uiPriority="62" w:unhideWhenUsed="0"/>
-    <w:lsdException w:name="Medium Shading 1 Accent 5" w:semiHidden="0" w:uiPriority="63" w:unhideWhenUsed="0"/>
-    <w:lsdException w:name="Medium Shading 2 Accent 5" w:semiHidden="0" w:uiPriority="64" w:unhideWhenUsed="0"/>
-    <w:lsdException w:name="Medium List 1 Accent 5" w:semiHidden="0" w:uiPriority="65" w:unhideWhenUsed="0"/>
-    <w:lsdException w:name="Medium List 2 Accent 5" w:semiHidden="0" w:uiPriority="66" w:unhideWhenUsed="0"/>
-    <w:lsdException w:name="Medium Grid 1 Accent 5" w:semiHidden="0" w:uiPriority="67" w:unhideWhenUsed="0"/>
-    <w:lsdException w:name="Medium Grid 2 Accent 5" w:semiHidden="0" w:uiPriority="68" w:unhideWhenUsed="0"/>
-    <w:lsdException w:name="Medium Grid 3 Accent 5" w:semiHidden="0" w:uiPriority="69" w:unhideWhenUsed="0"/>
-    <w:lsdException w:name="Dark List Accent 5" w:semiHidden="0" w:uiPriority="70" w:unhideWhenUsed="0"/>
-    <w:lsdException w:name="Colorful Shading Accent 5" w:semiHidden="0" w:uiPriority="71" w:unhideWhenUsed="0"/>
-    <w:lsdException w:name="Colorful List Accent 5" w:semiHidden="0" w:uiPriority="72" w:unhideWhenUsed="0"/>
-    <w:lsdException w:name="Colorful Grid Accent 5" w:semiHidden="0" w:uiPriority="73" w:unhideWhenUsed="0"/>
-    <w:lsdException w:name="Light Shading Accent 6" w:semiHidden="0" w:uiPriority="60" w:unhideWhenUsed="0"/>
-    <w:lsdException w:name="Light List Accent 6" w:semiHidden="0" w:uiPriority="61" w:unhideWhenUsed="0"/>
-    <w:lsdException w:name="Light Grid Accent 6" w:semiHidden="0" w:uiPriority="62" w:unhideWhenUsed="0"/>
-    <w:lsdException w:name="Medium Shading 1 Accent 6" w:semiHidden="0" w:uiPriority="63" w:unhideWhenUsed="0"/>
-    <w:lsdException w:name="Medium Shading 2 Accent 6" w:semiHidden="0" w:uiPriority="64" w:unhideWhenUsed="0"/>
-    <w:lsdException w:name="Medium List 1 Accent 6" w:semiHidden="0" w:uiPriority="65" w:unhideWhenUsed="0"/>
-    <w:lsdException w:name="Medium List 2 Accent 6" w:semiHidden="0" w:uiPriority="66" w:unhideWhenUsed="0"/>
-    <w:lsdException w:name="Medium Grid 1 Accent 6" w:semiHidden="0" w:uiPriority="67" w:unhideWhenUsed="0"/>
-    <w:lsdException w:name="Medium Grid 2 Accent 6" w:semiHidden="0" w:uiPriority="68" w:unhideWhenUsed="0"/>
-    <w:lsdException w:name="Medium Grid 3 Accent 6" w:semiHidden="0" w:uiPriority="69" w:unhideWhenUsed="0"/>
-    <w:lsdException w:name="Dark List Accent 6" w:semiHidden="0" w:uiPriority="70" w:unhideWhenUsed="0"/>
-    <w:lsdException w:name="Colorful Shading Accent 6" w:semiHidden="0" w:uiPriority="71" w:unhideWhenUsed="0"/>
-    <w:lsdException w:name="Colorful List Accent 6" w:semiHidden="0" w:uiPriority="72" w:unhideWhenUsed="0"/>
-    <w:lsdException w:name="Colorful Grid Accent 6" w:semiHidden="0" w:uiPriority="73" w:unhideWhenUsed="0"/>
-    <w:lsdException w:name="Subtle Emphasis" w:semiHidden="0" w:uiPriority="19" w:unhideWhenUsed="0" w:qFormat="1"/>
-    <w:lsdException w:name="Intense Emphasis" w:semiHidden="0" w:uiPriority="21" w:unhideWhenUsed="0" w:qFormat="1"/>
-    <w:lsdException w:name="Subtle Reference" w:semiHidden="0" w:uiPriority="31" w:unhideWhenUsed="0" w:qFormat="1"/>
-    <w:lsdException w:name="Intense Reference" w:semiHidden="0" w:uiPriority="32" w:unhideWhenUsed="0" w:qFormat="1"/>
-    <w:lsdException w:name="Book Title" w:semiHidden="0" w:uiPriority="33" w:unhideWhenUsed="0" w:qFormat="1"/>
-    <w:lsdException w:name="Bibliography" w:uiPriority="37"/>
-    <w:lsdException w:name="TOC Heading" w:uiPriority="39" w:qFormat="1"/>
+  <w:latentStyles w:defLockedState="0" w:defUIPriority="99" w:defSemiHidden="0" w:defUnhideWhenUsed="0" w:defQFormat="0" w:count="376">
+    <w:lsdException w:name="Normal" w:uiPriority="0" w:qFormat="1"/>
+    <w:lsdException w:name="heading 1" w:uiPriority="9" w:qFormat="1"/>
+    <w:lsdException w:name="heading 2" w:semiHidden="1" w:uiPriority="9" w:unhideWhenUsed="1" w:qFormat="1"/>
+    <w:lsdException w:name="heading 3" w:semiHidden="1" w:uiPriority="9" w:unhideWhenUsed="1" w:qFormat="1"/>
+    <w:lsdException w:name="heading 4" w:semiHidden="1" w:uiPriority="9" w:unhideWhenUsed="1" w:qFormat="1"/>
+    <w:lsdException w:name="heading 5" w:semiHidden="1" w:uiPriority="9" w:unhideWhenUsed="1" w:qFormat="1"/>
+    <w:lsdException w:name="heading 6" w:semiHidden="1" w:uiPriority="9" w:unhideWhenUsed="1" w:qFormat="1"/>
+    <w:lsdException w:name="heading 7" w:semiHidden="1" w:uiPriority="9" w:unhideWhenUsed="1" w:qFormat="1"/>
+    <w:lsdException w:name="heading 8" w:semiHidden="1" w:uiPriority="9" w:unhideWhenUsed="1" w:qFormat="1"/>
+    <w:lsdException w:name="heading 9" w:semiHidden="1" w:uiPriority="9" w:unhideWhenUsed="1" w:qFormat="1"/>
+    <w:lsdException w:name="index 1" w:semiHidden="1" w:unhideWhenUsed="1"/>
+    <w:lsdException w:name="index 2" w:semiHidden="1" w:unhideWhenUsed="1"/>
+    <w:lsdException w:name="index 3" w:semiHidden="1" w:unhideWhenUsed="1"/>
+    <w:lsdException w:name="index 4" w:semiHidden="1" w:unhideWhenUsed="1"/>
+    <w:lsdException w:name="index 5" w:semiHidden="1" w:unhideWhenUsed="1"/>
+    <w:lsdException w:name="index 6" w:semiHidden="1" w:unhideWhenUsed="1"/>
+    <w:lsdException w:name="index 7" w:semiHidden="1" w:unhideWhenUsed="1"/>
+    <w:lsdException w:name="index 8" w:semiHidden="1" w:unhideWhenUsed="1"/>
+    <w:lsdException w:name="index 9" w:semiHidden="1" w:unhideWhenUsed="1"/>
+    <w:lsdException w:name="toc 1" w:semiHidden="1" w:uiPriority="39" w:unhideWhenUsed="1"/>
+    <w:lsdException w:name="toc 2" w:semiHidden="1" w:uiPriority="39" w:unhideWhenUsed="1"/>
+    <w:lsdException w:name="toc 3" w:semiHidden="1" w:uiPriority="39" w:unhideWhenUsed="1"/>
+    <w:lsdException w:name="toc 4" w:semiHidden="1" w:uiPriority="39" w:unhideWhenUsed="1"/>
+    <w:lsdException w:name="toc 5" w:semiHidden="1" w:uiPriority="39" w:unhideWhenUsed="1"/>
+    <w:lsdException w:name="toc 6" w:semiHidden="1" w:uiPriority="39" w:unhideWhenUsed="1"/>
+    <w:lsdException w:name="toc 7" w:semiHidden="1" w:uiPriority="39" w:unhideWhenUsed="1"/>
+    <w:lsdException w:name="toc 8" w:semiHidden="1" w:uiPriority="39" w:unhideWhenUsed="1"/>
+    <w:lsdException w:name="toc 9" w:semiHidden="1" w:uiPriority="39" w:unhideWhenUsed="1"/>
+    <w:lsdException w:name="Normal Indent" w:semiHidden="1" w:unhideWhenUsed="1"/>
+    <w:lsdException w:name="footnote text" w:semiHidden="1" w:unhideWhenUsed="1"/>
+    <w:lsdException w:name="annotation text" w:semiHidden="1" w:unhideWhenUsed="1" w:qFormat="1"/>
+    <w:lsdException w:name="header" w:semiHidden="1" w:unhideWhenUsed="1"/>
+    <w:lsdException w:name="footer" w:semiHidden="1" w:unhideWhenUsed="1"/>
+    <w:lsdException w:name="index heading" w:semiHidden="1" w:unhideWhenUsed="1"/>
+    <w:lsdException w:name="caption" w:semiHidden="1" w:uiPriority="35" w:unhideWhenUsed="1" w:qFormat="1"/>
+    <w:lsdException w:name="table of figures" w:semiHidden="1" w:unhideWhenUsed="1"/>
+    <w:lsdException w:name="envelope address" w:semiHidden="1" w:unhideWhenUsed="1"/>
+    <w:lsdException w:name="envelope return" w:semiHidden="1" w:unhideWhenUsed="1"/>
+    <w:lsdException w:name="footnote reference" w:semiHidden="1" w:unhideWhenUsed="1"/>
+    <w:lsdException w:name="annotation reference" w:semiHidden="1" w:unhideWhenUsed="1" w:qFormat="1"/>
+    <w:lsdException w:name="line number" w:semiHidden="1" w:unhideWhenUsed="1"/>
+    <w:lsdException w:name="page number" w:semiHidden="1" w:unhideWhenUsed="1"/>
+    <w:lsdException w:name="endnote reference" w:semiHidden="1" w:unhideWhenUsed="1"/>
+    <w:lsdException w:name="endnote text" w:semiHidden="1" w:unhideWhenUsed="1"/>
+    <w:lsdException w:name="table of authorities" w:semiHidden="1" w:unhideWhenUsed="1"/>
+    <w:lsdException w:name="macro" w:semiHidden="1" w:unhideWhenUsed="1"/>
+    <w:lsdException w:name="toa heading" w:semiHidden="1" w:unhideWhenUsed="1"/>
+    <w:lsdException w:name="List" w:semiHidden="1" w:unhideWhenUsed="1"/>
+    <w:lsdException w:name="List Bullet" w:semiHidden="1" w:unhideWhenUsed="1"/>
+    <w:lsdException w:name="List Number" w:semiHidden="1" w:unhideWhenUsed="1"/>
+    <w:lsdException w:name="List 2" w:semiHidden="1" w:unhideWhenUsed="1"/>
+    <w:lsdException w:name="List 3" w:semiHidden="1" w:unhideWhenUsed="1"/>
+    <w:lsdException w:name="List 4" w:semiHidden="1" w:unhideWhenUsed="1"/>
+    <w:lsdException w:name="List 5" w:semiHidden="1" w:unhideWhenUsed="1"/>
+    <w:lsdException w:name="List Bullet 2" w:semiHidden="1" w:unhideWhenUsed="1"/>
+    <w:lsdException w:name="List Bullet 3" w:semiHidden="1" w:unhideWhenUsed="1"/>
+    <w:lsdException w:name="List Bullet 4" w:semiHidden="1" w:unhideWhenUsed="1"/>
+    <w:lsdException w:name="List Bullet 5" w:semiHidden="1" w:unhideWhenUsed="1"/>
+    <w:lsdException w:name="List Number 2" w:semiHidden="1" w:unhideWhenUsed="1"/>
+    <w:lsdException w:name="List Number 3" w:semiHidden="1" w:unhideWhenUsed="1"/>
+    <w:lsdException w:name="List Number 4" w:semiHidden="1" w:unhideWhenUsed="1"/>
+    <w:lsdException w:name="List Number 5" w:semiHidden="1" w:unhideWhenUsed="1"/>
+    <w:lsdException w:name="Title" w:uiPriority="10" w:qFormat="1"/>
+    <w:lsdException w:name="Closing" w:semiHidden="1" w:unhideWhenUsed="1"/>
+    <w:lsdException w:name="Signature" w:semiHidden="1" w:unhideWhenUsed="1"/>
+    <w:lsdException w:name="Default Paragraph Font" w:semiHidden="1" w:uiPriority="1" w:unhideWhenUsed="1"/>
+    <w:lsdException w:name="Body Text" w:semiHidden="1" w:uiPriority="1" w:unhideWhenUsed="1" w:qFormat="1"/>
+    <w:lsdException w:name="Body Text Indent" w:semiHidden="1" w:unhideWhenUsed="1"/>
+    <w:lsdException w:name="List Continue" w:semiHidden="1" w:unhideWhenUsed="1"/>
+    <w:lsdException w:name="List Continue 2" w:semiHidden="1" w:unhideWhenUsed="1"/>
+    <w:lsdException w:name="List Continue 3" w:semiHidden="1" w:unhideWhenUsed="1"/>
+    <w:lsdException w:name="List Continue 4" w:semiHidden="1" w:unhideWhenUsed="1"/>
+    <w:lsdException w:name="List Continue 5" w:semiHidden="1" w:unhideWhenUsed="1"/>
+    <w:lsdException w:name="Message Header" w:semiHidden="1" w:unhideWhenUsed="1"/>
+    <w:lsdException w:name="Subtitle" w:uiPriority="11" w:qFormat="1"/>
+    <w:lsdException w:name="Salutation" w:semiHidden="1" w:unhideWhenUsed="1"/>
+    <w:lsdException w:name="Date" w:semiHidden="1" w:unhideWhenUsed="1"/>
+    <w:lsdException w:name="Body Text First Indent" w:semiHidden="1" w:unhideWhenUsed="1"/>
+    <w:lsdException w:name="Body Text First Indent 2" w:semiHidden="1" w:unhideWhenUsed="1"/>
+    <w:lsdException w:name="Note Heading" w:semiHidden="1" w:unhideWhenUsed="1"/>
+    <w:lsdException w:name="Body Text 2" w:semiHidden="1" w:unhideWhenUsed="1"/>
+    <w:lsdException w:name="Body Text 3" w:semiHidden="1" w:unhideWhenUsed="1"/>
+    <w:lsdException w:name="Body Text Indent 2" w:semiHidden="1" w:unhideWhenUsed="1"/>
+    <w:lsdException w:name="Body Text Indent 3" w:semiHidden="1" w:unhideWhenUsed="1"/>
+    <w:lsdException w:name="Block Text" w:semiHidden="1" w:unhideWhenUsed="1"/>
+    <w:lsdException w:name="Hyperlink" w:semiHidden="1" w:unhideWhenUsed="1"/>
+    <w:lsdException w:name="FollowedHyperlink" w:semiHidden="1" w:unhideWhenUsed="1"/>
+    <w:lsdException w:name="Strong" w:uiPriority="22" w:qFormat="1"/>
+    <w:lsdException w:name="Emphasis" w:uiPriority="20" w:qFormat="1"/>
+    <w:lsdException w:name="Document Map" w:semiHidden="1" w:unhideWhenUsed="1"/>
+    <w:lsdException w:name="Plain Text" w:semiHidden="1" w:unhideWhenUsed="1"/>
+    <w:lsdException w:name="E-mail Signature" w:semiHidden="1" w:unhideWhenUsed="1"/>
+    <w:lsdException w:name="HTML Top of Form" w:semiHidden="1" w:unhideWhenUsed="1"/>
+    <w:lsdException w:name="HTML Bottom of Form" w:semiHidden="1" w:unhideWhenUsed="1"/>
+    <w:lsdException w:name="Normal (Web)" w:semiHidden="1" w:unhideWhenUsed="1"/>
+    <w:lsdException w:name="HTML Acronym" w:semiHidden="1" w:unhideWhenUsed="1"/>
+    <w:lsdException w:name="HTML Address" w:semiHidden="1" w:unhideWhenUsed="1"/>
+    <w:lsdException w:name="HTML Cite" w:semiHidden="1" w:unhideWhenUsed="1"/>
+    <w:lsdException w:name="HTML Code" w:semiHidden="1" w:unhideWhenUsed="1"/>
+    <w:lsdException w:name="HTML Definition" w:semiHidden="1" w:unhideWhenUsed="1"/>
+    <w:lsdException w:name="HTML Keyboard" w:semiHidden="1" w:unhideWhenUsed="1"/>
+    <w:lsdException w:name="HTML Preformatted" w:semiHidden="1" w:unhideWhenUsed="1"/>
+    <w:lsdException w:name="HTML Sample" w:semiHidden="1" w:unhideWhenUsed="1"/>
+    <w:lsdException w:name="HTML Typewriter" w:semiHidden="1" w:unhideWhenUsed="1"/>
+    <w:lsdException w:name="HTML Variable" w:semiHidden="1" w:unhideWhenUsed="1"/>
+    <w:lsdException w:name="Normal Table" w:semiHidden="1" w:unhideWhenUsed="1"/>
+    <w:lsdException w:name="annotation subject" w:semiHidden="1" w:unhideWhenUsed="1"/>
+    <w:lsdException w:name="No List" w:semiHidden="1" w:unhideWhenUsed="1"/>
+    <w:lsdException w:name="Outline List 1" w:semiHidden="1" w:unhideWhenUsed="1"/>
+    <w:lsdException w:name="Outline List 2" w:semiHidden="1" w:unhideWhenUsed="1"/>
+    <w:lsdException w:name="Outline List 3" w:semiHidden="1" w:unhideWhenUsed="1"/>
+    <w:lsdException w:name="Table Simple 1" w:semiHidden="1" w:unhideWhenUsed="1"/>
+    <w:lsdException w:name="Table Simple 2" w:semiHidden="1" w:unhideWhenUsed="1"/>
+    <w:lsdException w:name="Table Simple 3" w:semiHidden="1" w:unhideWhenUsed="1"/>
+    <w:lsdException w:name="Table Classic 1" w:semiHidden="1" w:unhideWhenUsed="1"/>
+    <w:lsdException w:name="Table Classic 2" w:semiHidden="1" w:unhideWhenUsed="1"/>
+    <w:lsdException w:name="Table Classic 3" w:semiHidden="1" w:unhideWhenUsed="1"/>
+    <w:lsdException w:name="Table Classic 4" w:semiHidden="1" w:unhideWhenUsed="1"/>
+    <w:lsdException w:name="Table Colorful 1" w:semiHidden="1" w:unhideWhenUsed="1"/>
+    <w:lsdException w:name="Table Colorful 2" w:semiHidden="1" w:unhideWhenUsed="1"/>
+    <w:lsdException w:name="Table Colorful 3" w:semiHidden="1" w:unhideWhenUsed="1"/>
+    <w:lsdException w:name="Table Columns 1" w:semiHidden="1" w:unhideWhenUsed="1"/>
+    <w:lsdException w:name="Table Columns 2" w:semiHidden="1" w:unhideWhenUsed="1"/>
+    <w:lsdException w:name="Table Columns 3" w:semiHidden="1" w:unhideWhenUsed="1"/>
+    <w:lsdException w:name="Table Columns 4" w:semiHidden="1" w:unhideWhenUsed="1"/>
+    <w:lsdException w:name="Table Columns 5" w:semiHidden="1" w:unhideWhenUsed="1"/>
+    <w:lsdException w:name="Table Grid 1" w:semiHidden="1" w:unhideWhenUsed="1"/>
+    <w:lsdException w:name="Table Grid 2" w:semiHidden="1" w:unhideWhenUsed="1"/>
+    <w:lsdException w:name="Table Grid 3" w:semiHidden="1" w:unhideWhenUsed="1"/>
+    <w:lsdException w:name="Table Grid 4" w:semiHidden="1" w:unhideWhenUsed="1"/>
+    <w:lsdException w:name="Table Grid 5" w:semiHidden="1" w:unhideWhenUsed="1"/>
+    <w:lsdException w:name="Table Grid 6" w:semiHidden="1" w:unhideWhenUsed="1"/>
+    <w:lsdException w:name="Table Grid 7" w:semiHidden="1" w:unhideWhenUsed="1"/>
+    <w:lsdException w:name="Table Grid 8" w:semiHidden="1" w:unhideWhenUsed="1"/>
+    <w:lsdException w:name="Table List 1" w:semiHidden="1" w:unhideWhenUsed="1"/>
+    <w:lsdException w:name="Table List 2" w:semiHidden="1" w:unhideWhenUsed="1"/>
+    <w:lsdException w:name="Table List 3" w:semiHidden="1" w:unhideWhenUsed="1"/>
+    <w:lsdException w:name="Table List 4" w:semiHidden="1" w:unhideWhenUsed="1"/>
+    <w:lsdException w:name="Table List 5" w:semiHidden="1" w:unhideWhenUsed="1"/>
+    <w:lsdException w:name="Table List 6" w:semiHidden="1" w:unhideWhenUsed="1"/>
+    <w:lsdException w:name="Table List 7" w:semiHidden="1" w:unhideWhenUsed="1"/>
+    <w:lsdException w:name="Table List 8" w:semiHidden="1" w:unhideWhenUsed="1"/>
+    <w:lsdException w:name="Table 3D effects 1" w:semiHidden="1" w:unhideWhenUsed="1"/>
+    <w:lsdException w:name="Table 3D effects 2" w:semiHidden="1" w:unhideWhenUsed="1"/>
+    <w:lsdException w:name="Table 3D effects 3" w:semiHidden="1" w:unhideWhenUsed="1"/>
+    <w:lsdException w:name="Table Contemporary" w:semiHidden="1" w:unhideWhenUsed="1"/>
+    <w:lsdException w:name="Table Elegant" w:semiHidden="1" w:unhideWhenUsed="1"/>
+    <w:lsdException w:name="Table Professional" w:semiHidden="1" w:unhideWhenUsed="1"/>
+    <w:lsdException w:name="Table Subtle 1" w:semiHidden="1" w:unhideWhenUsed="1"/>
+    <w:lsdException w:name="Table Subtle 2" w:semiHidden="1" w:unhideWhenUsed="1"/>
+    <w:lsdException w:name="Table Web 1" w:semiHidden="1" w:unhideWhenUsed="1"/>
+    <w:lsdException w:name="Table Web 2" w:semiHidden="1" w:unhideWhenUsed="1"/>
+    <w:lsdException w:name="Table Web 3" w:semiHidden="1" w:unhideWhenUsed="1"/>
+    <w:lsdException w:name="Balloon Text" w:semiHidden="1" w:unhideWhenUsed="1"/>
+    <w:lsdException w:name="Table Grid" w:semiHidden="1" w:uiPriority="39" w:unhideWhenUsed="1"/>
+    <w:lsdException w:name="Table Theme" w:semiHidden="1" w:unhideWhenUsed="1"/>
+    <w:lsdException w:name="Placeholder Text" w:semiHidden="1"/>
+    <w:lsdException w:name="No Spacing" w:uiPriority="1" w:qFormat="1"/>
+    <w:lsdException w:name="Light Shading" w:uiPriority="60"/>
+    <w:lsdException w:name="Light List" w:uiPriority="61"/>
+    <w:lsdException w:name="Light Grid" w:uiPriority="62"/>
+    <w:lsdException w:name="Medium Shading 1" w:uiPriority="63"/>
+    <w:lsdException w:name="Medium Shading 2" w:uiPriority="64"/>
+    <w:lsdException w:name="Medium List 1" w:uiPriority="65"/>
+    <w:lsdException w:name="Medium List 2" w:uiPriority="66"/>
+    <w:lsdException w:name="Medium Grid 1" w:uiPriority="67"/>
+    <w:lsdException w:name="Medium Grid 2" w:uiPriority="68"/>
+    <w:lsdException w:name="Medium Grid 3" w:uiPriority="69"/>
+    <w:lsdException w:name="Dark List" w:uiPriority="70"/>
+    <w:lsdException w:name="Colorful Shading" w:uiPriority="71"/>
+    <w:lsdException w:name="Colorful List" w:uiPriority="72"/>
+    <w:lsdException w:name="Colorful Grid" w:uiPriority="73"/>
+    <w:lsdException w:name="Light Shading Accent 1" w:uiPriority="60"/>
+    <w:lsdException w:name="Light List Accent 1" w:uiPriority="61"/>
+    <w:lsdException w:name="Light Grid Accent 1" w:uiPriority="62"/>
+    <w:lsdException w:name="Medium Shading 1 Accent 1" w:uiPriority="63"/>
+    <w:lsdException w:name="Medium Shading 2 Accent 1" w:uiPriority="64"/>
+    <w:lsdException w:name="Medium List 1 Accent 1" w:uiPriority="65"/>
+    <w:lsdException w:name="Revision" w:semiHidden="1"/>
+    <w:lsdException w:name="List Paragraph" w:uiPriority="34" w:qFormat="1"/>
+    <w:lsdException w:name="Quote" w:uiPriority="29" w:qFormat="1"/>
+    <w:lsdException w:name="Intense Quote" w:uiPriority="30" w:qFormat="1"/>
+    <w:lsdException w:name="Medium List 2 Accent 1" w:uiPriority="66"/>
+    <w:lsdException w:name="Medium Grid 1 Accent 1" w:uiPriority="67"/>
+    <w:lsdException w:name="Medium Grid 2 Accent 1" w:uiPriority="68"/>
+    <w:lsdException w:name="Medium Grid 3 Accent 1" w:uiPriority="69"/>
+    <w:lsdException w:name="Dark List Accent 1" w:uiPriority="70"/>
+    <w:lsdException w:name="Colorful Shading Accent 1" w:uiPriority="71"/>
+    <w:lsdException w:name="Colorful List Accent 1" w:uiPriority="72"/>
+    <w:lsdException w:name="Colorful Grid Accent 1" w:uiPriority="73"/>
+    <w:lsdException w:name="Light Shading Accent 2" w:uiPriority="60"/>
+    <w:lsdException w:name="Light List Accent 2" w:uiPriority="61"/>
+    <w:lsdException w:name="Light Grid Accent 2" w:uiPriority="62"/>
+    <w:lsdException w:name="Medium Shading 1 Accent 2" w:uiPriority="63"/>
+    <w:lsdException w:name="Medium Shading 2 Accent 2" w:uiPriority="64"/>
+    <w:lsdException w:name="Medium List 1 Accent 2" w:uiPriority="65"/>
+    <w:lsdException w:name="Medium List 2 Accent 2" w:uiPriority="66"/>
+    <w:lsdException w:name="Medium Grid 1 Accent 2" w:uiPriority="67"/>
+    <w:lsdException w:name="Medium Grid 2 Accent 2" w:uiPriority="68"/>
+    <w:lsdException w:name="Medium Grid 3 Accent 2" w:uiPriority="69"/>
+    <w:lsdException w:name="Dark List Accent 2" w:uiPriority="70"/>
+    <w:lsdException w:name="Colorful Shading Accent 2" w:uiPriority="71"/>
+    <w:lsdException w:name="Colorful List Accent 2" w:uiPriority="72"/>
+    <w:lsdException w:name="Colorful Grid Accent 2" w:uiPriority="73"/>
+    <w:lsdException w:name="Light Shading Accent 3" w:uiPriority="60"/>
+    <w:lsdException w:name="Light List Accent 3" w:uiPriority="61"/>
+    <w:lsdException w:name="Light Grid Accent 3" w:uiPriority="62"/>
+    <w:lsdException w:name="Medium Shading 1 Accent 3" w:uiPriority="63"/>
+    <w:lsdException w:name="Medium Shading 2 Accent 3" w:uiPriority="64"/>
+    <w:lsdException w:name="Medium List 1 Accent 3" w:uiPriority="65"/>
+    <w:lsdException w:name="Medium List 2 Accent 3" w:uiPriority="66"/>
+    <w:lsdException w:name="Medium Grid 1 Accent 3" w:uiPriority="67"/>
+    <w:lsdException w:name="Medium Grid 2 Accent 3" w:uiPriority="68"/>
+    <w:lsdException w:name="Medium Grid 3 Accent 3" w:uiPriority="69"/>
+    <w:lsdException w:name="Dark List Accent 3" w:uiPriority="70"/>
+    <w:lsdException w:name="Colorful Shading Accent 3" w:uiPriority="71"/>
+    <w:lsdException w:name="Colorful List Accent 3" w:uiPriority="72"/>
+    <w:lsdException w:name="Colorful Grid Accent 3" w:uiPriority="73"/>
+    <w:lsdException w:name="Light Shading Accent 4" w:uiPriority="60"/>
+    <w:lsdException w:name="Light List Accent 4" w:uiPriority="61"/>
+    <w:lsdException w:name="Light Grid Accent 4" w:uiPriority="62"/>
+    <w:lsdException w:name="Medium Shading 1 Accent 4" w:uiPriority="63"/>
+    <w:lsdException w:name="Medium Shading 2 Accent 4" w:uiPriority="64"/>
+    <w:lsdException w:name="Medium List 1 Accent 4" w:uiPriority="65"/>
+    <w:lsdException w:name="Medium List 2 Accent 4" w:uiPriority="66"/>
+    <w:lsdException w:name="Medium Grid 1 Accent 4" w:uiPriority="67"/>
+    <w:lsdException w:name="Medium Grid 2 Accent 4" w:uiPriority="68"/>
+    <w:lsdException w:name="Medium Grid 3 Accent 4" w:uiPriority="69"/>
+    <w:lsdException w:name="Dark List Accent 4" w:uiPriority="70"/>
+    <w:lsdException w:name="Colorful Shading Accent 4" w:uiPriority="71"/>
+    <w:lsdException w:name="Colorful List Accent 4" w:uiPriority="72"/>
+    <w:lsdException w:name="Colorful Grid Accent 4" w:uiPriority="73"/>
+    <w:lsdException w:name="Light Shading Accent 5" w:uiPriority="60"/>
+    <w:lsdException w:name="Light List Accent 5" w:uiPriority="61"/>
+    <w:lsdException w:name="Light Grid Accent 5" w:uiPriority="62"/>
+    <w:lsdException w:name="Medium Shading 1 Accent 5" w:uiPriority="63"/>
+    <w:lsdException w:name="Medium Shading 2 Accent 5" w:uiPriority="64"/>
+    <w:lsdException w:name="Medium List 1 Accent 5" w:uiPriority="65"/>
+    <w:lsdException w:name="Medium List 2 Accent 5" w:uiPriority="66"/>
+    <w:lsdException w:name="Medium Grid 1 Accent 5" w:uiPriority="67"/>
+    <w:lsdException w:name="Medium Grid 2 Accent 5" w:uiPriority="68"/>
+    <w:lsdException w:name="Medium Grid 3 Accent 5" w:uiPriority="69"/>
+    <w:lsdException w:name="Dark List Accent 5" w:uiPriority="70"/>
+    <w:lsdException w:name="Colorful Shading Accent 5" w:uiPriority="71"/>
+    <w:lsdException w:name="Colorful List Accent 5" w:uiPriority="72"/>
+    <w:lsdException w:name="Colorful Grid Accent 5" w:uiPriority="73"/>
+    <w:lsdException w:name="Light Shading Accent 6" w:uiPriority="60"/>
+    <w:lsdException w:name="Light List Accent 6" w:uiPriority="61"/>
+    <w:lsdException w:name="Light Grid Accent 6" w:uiPriority="62"/>
+    <w:lsdException w:name="Medium Shading 1 Accent 6" w:uiPriority="63"/>
+    <w:lsdException w:name="Medium Shading 2 Accent 6" w:uiPriority="64"/>
+    <w:lsdException w:name="Medium List 1 Accent 6" w:uiPriority="65"/>
+    <w:lsdException w:name="Medium List 2 Accent 6" w:uiPriority="66"/>
+    <w:lsdException w:name="Medium Grid 1 Accent 6" w:uiPriority="67"/>
+    <w:lsdException w:name="Medium Grid 2 Accent 6" w:uiPriority="68"/>
+    <w:lsdException w:name="Medium Grid 3 Accent 6" w:uiPriority="69"/>
+    <w:lsdException w:name="Dark List Accent 6" w:uiPriority="70"/>
+    <w:lsdException w:name="Colorful Shading Accent 6" w:uiPriority="71"/>
+    <w:lsdException w:name="Colorful List Accent 6" w:uiPriority="72"/>
+    <w:lsdException w:name="Colorful Grid Accent 6" w:uiPriority="73"/>
+    <w:lsdException w:name="Subtle Emphasis" w:uiPriority="19" w:qFormat="1"/>
+    <w:lsdException w:name="Intense Emphasis" w:uiPriority="21" w:qFormat="1"/>
+    <w:lsdException w:name="Subtle Reference" w:uiPriority="31" w:qFormat="1"/>
+    <w:lsdException w:name="Intense Reference" w:uiPriority="32" w:qFormat="1"/>
+    <w:lsdException w:name="Book Title" w:uiPriority="33" w:qFormat="1"/>
+    <w:lsdException w:name="Bibliography" w:semiHidden="1" w:uiPriority="37" w:unhideWhenUsed="1"/>
+    <w:lsdException w:name="TOC Heading" w:semiHidden="1" w:uiPriority="39" w:unhideWhenUsed="1" w:qFormat="1"/>
+    <w:lsdException w:name="Plain Table 1" w:uiPriority="41"/>
+    <w:lsdException w:name="Plain Table 2" w:uiPriority="42"/>
+    <w:lsdException w:name="Plain Table 3" w:uiPriority="43"/>
+    <w:lsdException w:name="Plain Table 4" w:uiPriority="44"/>
+    <w:lsdException w:name="Plain Table 5" w:uiPriority="45"/>
+    <w:lsdException w:name="Grid Table Light" w:uiPriority="40"/>
+    <w:lsdException w:name="Grid Table 1 Light" w:uiPriority="46"/>
+    <w:lsdException w:name="Grid Table 2" w:uiPriority="47"/>
+    <w:lsdException w:name="Grid Table 3" w:uiPriority="48"/>
+    <w:lsdException w:name="Grid Table 4" w:uiPriority="49"/>
+    <w:lsdException w:name="Grid Table 5 Dark" w:uiPriority="50"/>
+    <w:lsdException w:name="Grid Table 6 Colorful" w:uiPriority="51"/>
+    <w:lsdException w:name="Grid Table 7 Colorful" w:uiPriority="52"/>
+    <w:lsdException w:name="Grid Table 1 Light Accent 1" w:uiPriority="46"/>
+    <w:lsdException w:name="Grid Table 2 Accent 1" w:uiPriority="47"/>
+    <w:lsdException w:name="Grid Table 3 Accent 1" w:uiPriority="48"/>
+    <w:lsdException w:name="Grid Table 4 Accent 1" w:uiPriority="49"/>
+    <w:lsdException w:name="Grid Table 5 Dark Accent 1" w:uiPriority="50"/>
+    <w:lsdException w:name="Grid Table 6 Colorful Accent 1" w:uiPriority="51"/>
+    <w:lsdException w:name="Grid Table 7 Colorful Accent 1" w:uiPriority="52"/>
+    <w:lsdException w:name="Grid Table 1 Light Accent 2" w:uiPriority="46"/>
+    <w:lsdException w:name="Grid Table 2 Accent 2" w:uiPriority="47"/>
+    <w:lsdException w:name="Grid Table 3 Accent 2" w:uiPriority="48"/>
+    <w:lsdException w:name="Grid Table 4 Accent 2" w:uiPriority="49"/>
+    <w:lsdException w:name="Grid Table 5 Dark Accent 2" w:uiPriority="50"/>
+    <w:lsdException w:name="Grid Table 6 Colorful Accent 2" w:uiPriority="51"/>
+    <w:lsdException w:name="Grid Table 7 Colorful Accent 2" w:uiPriority="52"/>
+    <w:lsdException w:name="Grid Table 1 Light Accent 3" w:uiPriority="46"/>
+    <w:lsdException w:name="Grid Table 2 Accent 3" w:uiPriority="47"/>
+    <w:lsdException w:name="Grid Table 3 Accent 3" w:uiPriority="48"/>
+    <w:lsdException w:name="Grid Table 4 Accent 3" w:uiPriority="49"/>
+    <w:lsdException w:name="Grid Table 5 Dark Accent 3" w:uiPriority="50"/>
+    <w:lsdException w:name="Grid Table 6 Colorful Accent 3" w:uiPriority="51"/>
+    <w:lsdException w:name="Grid Table 7 Colorful Accent 3" w:uiPriority="52"/>
+    <w:lsdException w:name="Grid Table 1 Light Accent 4" w:uiPriority="46"/>
+    <w:lsdException w:name="Grid Table 2 Accent 4" w:uiPriority="47"/>
+    <w:lsdException w:name="Grid Table 3 Accent 4" w:uiPriority="48"/>
+    <w:lsdException w:name="Grid Table 4 Accent 4" w:uiPriority="49"/>
+    <w:lsdException w:name="Grid Table 5 Dark Accent 4" w:uiPriority="50"/>
+    <w:lsdException w:name="Grid Table 6 Colorful Accent 4" w:uiPriority="51"/>
+    <w:lsdException w:name="Grid Table 7 Colorful Accent 4" w:uiPriority="52"/>
+    <w:lsdException w:name="Grid Table 1 Light Accent 5" w:uiPriority="46"/>
+    <w:lsdException w:name="Grid Table 2 Accent 5" w:uiPriority="47"/>
+    <w:lsdException w:name="Grid Table 3 Accent 5" w:uiPriority="48"/>
+    <w:lsdException w:name="Grid Table 4 Accent 5" w:uiPriority="49"/>
+    <w:lsdException w:name="Grid Table 5 Dark Accent 5" w:uiPriority="50"/>
+    <w:lsdException w:name="Grid Table 6 Colorful Accent 5" w:uiPriority="51"/>
+    <w:lsdException w:name="Grid Table 7 Colorful Accent 5" w:uiPriority="52"/>
+    <w:lsdException w:name="Grid Table 1 Light Accent 6" w:uiPriority="46"/>
+    <w:lsdException w:name="Grid Table 2 Accent 6" w:uiPriority="47"/>
+    <w:lsdException w:name="Grid Table 3 Accent 6" w:uiPriority="48"/>
+    <w:lsdException w:name="Grid Table 4 Accent 6" w:uiPriority="49"/>
+    <w:lsdException w:name="Grid Table 5 Dark Accent 6" w:uiPriority="50"/>
+    <w:lsdException w:name="Grid Table 6 Colorful Accent 6" w:uiPriority="51"/>
+    <w:lsdException w:name="Grid Table 7 Colorful Accent 6" w:uiPriority="52"/>
+    <w:lsdException w:name="List Table 1 Light" w:uiPriority="46"/>
+    <w:lsdException w:name="List Table 2" w:uiPriority="47"/>
+    <w:lsdException w:name="List Table 3" w:uiPriority="48"/>
+    <w:lsdException w:name="List Table 4" w:uiPriority="49"/>
+    <w:lsdException w:name="List Table 5 Dark" w:uiPriority="50"/>
+    <w:lsdException w:name="List Table 6 Colorful" w:uiPriority="51"/>
+    <w:lsdException w:name="List Table 7 Colorful" w:uiPriority="52"/>
+    <w:lsdException w:name="List Table 1 Light Accent 1" w:uiPriority="46"/>
+    <w:lsdException w:name="List Table 2 Accent 1" w:uiPriority="47"/>
+    <w:lsdException w:name="List Table 3 Accent 1" w:uiPriority="48"/>
+    <w:lsdException w:name="List Table 4 Accent 1" w:uiPriority="49"/>
+    <w:lsdException w:name="List Table 5 Dark Accent 1" w:uiPriority="50"/>
+    <w:lsdException w:name="List Table 6 Colorful Accent 1" w:uiPriority="51"/>
+    <w:lsdException w:name="List Table 7 Colorful Accent 1" w:uiPriority="52"/>
+    <w:lsdException w:name="List Table 1 Light Accent 2" w:uiPriority="46"/>
+    <w:lsdException w:name="List Table 2 Accent 2" w:uiPriority="47"/>
+    <w:lsdException w:name="List Table 3 Accent 2" w:uiPriority="48"/>
+    <w:lsdException w:name="List Table 4 Accent 2" w:uiPriority="49"/>
+    <w:lsdException w:name="List Table 5 Dark Accent 2" w:uiPriority="50"/>
+    <w:lsdException w:name="List Table 6 Colorful Accent 2" w:uiPriority="51"/>
+    <w:lsdException w:name="List Table 7 Colorful Accent 2" w:uiPriority="52"/>
+    <w:lsdException w:name="List Table 1 Light Accent 3" w:uiPriority="46"/>
+    <w:lsdException w:name="List Table 2 Accent 3" w:uiPriority="47"/>
+    <w:lsdException w:name="List Table 3 Accent 3" w:uiPriority="48"/>
+    <w:lsdException w:name="List Table 4 Accent 3" w:uiPriority="49"/>
+    <w:lsdException w:name="List Table 5 Dark Accent 3" w:uiPriority="50"/>
+    <w:lsdException w:name="List Table 6 Colorful Accent 3" w:uiPriority="51"/>
+    <w:lsdException w:name="List Table 7 Colorful Accent 3" w:uiPriority="52"/>
+    <w:lsdException w:name="List Table 1 Light Accent 4" w:uiPriority="46"/>
+    <w:lsdException w:name="List Table 2 Accent 4" w:uiPriority="47"/>
+    <w:lsdException w:name="List Table 3 Accent 4" w:uiPriority="48"/>
+    <w:lsdException w:name="List Table 4 Accent 4" w:uiPriority="49"/>
+    <w:lsdException w:name="List Table 5 Dark Accent 4" w:uiPriority="50"/>
+    <w:lsdException w:name="List Table 6 Colorful Accent 4" w:uiPriority="51"/>
+    <w:lsdException w:name="List Table 7 Colorful Accent 4" w:uiPriority="52"/>
+    <w:lsdException w:name="List Table 1 Light Accent 5" w:uiPriority="46"/>
+    <w:lsdException w:name="List Table 2 Accent 5" w:uiPriority="47"/>
+    <w:lsdException w:name="List Table 3 Accent 5" w:uiPriority="48"/>
+    <w:lsdException w:name="List Table 4 Accent 5" w:uiPriority="49"/>
+    <w:lsdException w:name="List Table 5 Dark Accent 5" w:uiPriority="50"/>
+    <w:lsdException w:name="List Table 6 Colorful Accent 5" w:uiPriority="51"/>
+    <w:lsdException w:name="List Table 7 Colorful Accent 5" w:uiPriority="52"/>
+    <w:lsdException w:name="List Table 1 Light Accent 6" w:uiPriority="46"/>
+    <w:lsdException w:name="List Table 2 Accent 6" w:uiPriority="47"/>
+    <w:lsdException w:name="List Table 3 Accent 6" w:uiPriority="48"/>
+    <w:lsdException w:name="List Table 4 Accent 6" w:uiPriority="49"/>
+    <w:lsdException w:name="List Table 5 Dark Accent 6" w:uiPriority="50"/>
+    <w:lsdException w:name="List Table 6 Colorful Accent 6" w:uiPriority="51"/>
+    <w:lsdException w:name="List Table 7 Colorful Accent 6" w:uiPriority="52"/>
+    <w:lsdException w:name="Mention" w:semiHidden="1" w:unhideWhenUsed="1"/>
+    <w:lsdException w:name="Smart Hyperlink" w:semiHidden="1" w:unhideWhenUsed="1"/>
+    <w:lsdException w:name="Hashtag" w:semiHidden="1" w:unhideWhenUsed="1"/>
+    <w:lsdException w:name="Unresolved Mention" w:semiHidden="1" w:unhideWhenUsed="1"/>
+    <w:lsdException w:name="Smart Link" w:semiHidden="1" w:unhideWhenUsed="1"/>
   </w:latentStyles>
   <w:style w:type="paragraph" w:default="1" w:styleId="Normal">
     <w:name w:val="Normal"/>
@@ -4274,6 +4145,7 @@
   <w:style w:type="character" w:default="1" w:styleId="DefaultParagraphFont">
     <w:name w:val="Default Paragraph Font"/>
     <w:uiPriority w:val="1"/>
+    <w:semiHidden/>
     <w:unhideWhenUsed/>
   </w:style>
   <w:style w:type="table" w:default="1" w:styleId="TableNormal">
@@ -5114,1745 +4986,8 @@
     <w:qFormat/>
     <w:rsid w:val="000F4FEF"/>
   </w:style>
-  <w:style w:type="character" w:customStyle="1" w:styleId="UnresolvedMention">
-    <w:name w:val="Unresolved Mention"/>
-    <w:basedOn w:val="DefaultParagraphFont"/>
-    <w:uiPriority w:val="99"/>
-    <w:semiHidden/>
-    <w:unhideWhenUsed/>
-    <w:rsid w:val="005E785C"/>
-    <w:rPr>
-      <w:color w:val="605E5C"/>
-      <w:shd w:val="clear" w:color="auto" w:fill="E1DFDD"/>
-    </w:rPr>
-  </w:style>
-  <w:style w:type="paragraph" w:customStyle="1" w:styleId="interviewsituationcondition">
-    <w:name w:val="interview situation condition"/>
-    <w:basedOn w:val="Heading1"/>
-    <w:next w:val="Heading2"/>
-    <w:qFormat/>
-    <w:rsid w:val="000F4FEF"/>
-    <w:pPr>
-      <w:keepNext/>
-      <w:keepLines/>
-      <w:pBdr>
-        <w:bottom w:val="none" w:sz="0" w:space="0" w:color="auto"/>
-      </w:pBdr>
-      <w:spacing w:after="60" w:afterAutospacing="0"/>
-    </w:pPr>
-    <w:rPr>
-      <w:rFonts w:asciiTheme="majorHAnsi" w:eastAsiaTheme="majorEastAsia" w:hAnsiTheme="majorHAnsi" w:cstheme="majorBidi"/>
-      <w:color w:val="FF0000"/>
-      <w:spacing w:val="0"/>
-      <w:sz w:val="24"/>
-      <w:szCs w:val="26"/>
-    </w:rPr>
-  </w:style>
-  <w:style w:type="paragraph" w:customStyle="1" w:styleId="heading">
-    <w:name w:val="heading"/>
-    <w:basedOn w:val="Normal"/>
-    <w:rsid w:val="00DD3DDA"/>
-    <w:pPr>
-      <w:spacing w:before="100" w:after="100"/>
-    </w:pPr>
-    <w:rPr>
-      <w:rFonts w:ascii="Times New Roman" w:eastAsia="Times New Roman" w:hAnsi="Times New Roman" w:cs="Times New Roman"/>
-      <w:sz w:val="24"/>
-      <w:szCs w:val="24"/>
-    </w:rPr>
-  </w:style>
-  <w:style w:type="character" w:customStyle="1" w:styleId="Interviewpinknote">
-    <w:name w:val="Interview pink note"/>
-    <w:basedOn w:val="BodyChar"/>
-    <w:uiPriority w:val="1"/>
-    <w:qFormat/>
-    <w:rsid w:val="00DD3DDA"/>
-    <w:rPr>
-      <w:rFonts w:ascii="Helvetica" w:eastAsiaTheme="minorHAnsi" w:hAnsi="Helvetica" w:cs="Tahoma"/>
-      <w:b w:val="0"/>
-      <w:bCs/>
-      <w:color w:val="FF99FF"/>
-      <w:sz w:val="24"/>
-      <w:szCs w:val="24"/>
-    </w:rPr>
-  </w:style>
-  <w:style w:type="paragraph" w:customStyle="1" w:styleId="interviewsituationp">
-    <w:name w:val="interview situation p"/>
-    <w:basedOn w:val="Body"/>
-    <w:next w:val="interviewsituationcondition"/>
-    <w:qFormat/>
-    <w:rsid w:val="00DD3DDA"/>
-    <w:pPr>
-      <w:spacing w:before="240" w:after="0" w:line="240" w:lineRule="auto"/>
-      <w:contextualSpacing/>
-    </w:pPr>
-  </w:style>
-  <w:style w:type="character" w:customStyle="1" w:styleId="Heading5Char">
-    <w:name w:val="Heading 5 Char"/>
-    <w:basedOn w:val="DefaultParagraphFont"/>
-    <w:link w:val="Heading5"/>
-    <w:uiPriority w:val="9"/>
-    <w:rsid w:val="000F4FEF"/>
-    <w:rPr>
-      <w:rFonts w:ascii="Arial" w:hAnsi="Arial" w:cs="Arial"/>
-      <w:color w:val="666666"/>
-    </w:rPr>
-  </w:style>
-  <w:style w:type="character" w:customStyle="1" w:styleId="Heading6Char">
-    <w:name w:val="Heading 6 Char"/>
-    <w:basedOn w:val="DefaultParagraphFont"/>
-    <w:link w:val="Heading6"/>
-    <w:uiPriority w:val="9"/>
-    <w:semiHidden/>
-    <w:rsid w:val="000F4FEF"/>
-    <w:rPr>
-      <w:rFonts w:ascii="Arial" w:hAnsi="Arial" w:cs="Arial"/>
-      <w:i/>
-      <w:color w:val="666666"/>
-    </w:rPr>
-  </w:style>
-  <w:style w:type="paragraph" w:styleId="TOC1">
-    <w:name w:val="toc 1"/>
-    <w:basedOn w:val="Normal"/>
-    <w:next w:val="Normal"/>
-    <w:autoRedefine/>
-    <w:uiPriority w:val="39"/>
-    <w:unhideWhenUsed/>
-    <w:rsid w:val="000F4FEF"/>
-    <w:pPr>
-      <w:spacing w:after="100"/>
-    </w:pPr>
-  </w:style>
-  <w:style w:type="paragraph" w:styleId="TOC2">
-    <w:name w:val="toc 2"/>
-    <w:basedOn w:val="Normal"/>
-    <w:next w:val="Normal"/>
-    <w:autoRedefine/>
-    <w:uiPriority w:val="39"/>
-    <w:unhideWhenUsed/>
-    <w:rsid w:val="000F4FEF"/>
-    <w:pPr>
-      <w:spacing w:after="100"/>
-      <w:ind w:left="240"/>
-    </w:pPr>
-  </w:style>
-  <w:style w:type="paragraph" w:styleId="TOC3">
-    <w:name w:val="toc 3"/>
-    <w:basedOn w:val="Normal"/>
-    <w:next w:val="Normal"/>
-    <w:autoRedefine/>
-    <w:uiPriority w:val="39"/>
-    <w:unhideWhenUsed/>
-    <w:rsid w:val="000F4FEF"/>
-    <w:pPr>
-      <w:spacing w:after="100"/>
-      <w:ind w:left="480"/>
-    </w:pPr>
-  </w:style>
-  <w:style w:type="paragraph" w:styleId="CommentText">
-    <w:name w:val="annotation text"/>
-    <w:basedOn w:val="Normal"/>
-    <w:link w:val="CommentTextChar"/>
-    <w:uiPriority w:val="99"/>
-    <w:unhideWhenUsed/>
-    <w:qFormat/>
-    <w:rsid w:val="000F4FEF"/>
-    <w:rPr>
-      <w:sz w:val="20"/>
-      <w:szCs w:val="20"/>
-    </w:rPr>
-  </w:style>
-  <w:style w:type="character" w:customStyle="1" w:styleId="CommentTextChar">
-    <w:name w:val="Comment Text Char"/>
-    <w:basedOn w:val="DefaultParagraphFont"/>
-    <w:link w:val="CommentText"/>
-    <w:uiPriority w:val="99"/>
-    <w:qFormat/>
-    <w:rsid w:val="000F4FEF"/>
-    <w:rPr>
-      <w:rFonts w:ascii="Arial" w:hAnsi="Arial" w:cs="Arial"/>
-      <w:sz w:val="20"/>
-      <w:szCs w:val="20"/>
-    </w:rPr>
-  </w:style>
-  <w:style w:type="paragraph" w:styleId="Header">
-    <w:name w:val="header"/>
-    <w:basedOn w:val="Normal"/>
-    <w:link w:val="HeaderChar"/>
-    <w:uiPriority w:val="99"/>
-    <w:unhideWhenUsed/>
-    <w:rsid w:val="000F4FEF"/>
-    <w:pPr>
-      <w:tabs>
-        <w:tab w:val="center" w:pos="4680"/>
-        <w:tab w:val="right" w:pos="9360"/>
-      </w:tabs>
-    </w:pPr>
-  </w:style>
-  <w:style w:type="character" w:customStyle="1" w:styleId="HeaderChar">
-    <w:name w:val="Header Char"/>
-    <w:basedOn w:val="DefaultParagraphFont"/>
-    <w:link w:val="Header"/>
-    <w:uiPriority w:val="99"/>
-    <w:rsid w:val="000F4FEF"/>
-    <w:rPr>
-      <w:rFonts w:ascii="Arial" w:hAnsi="Arial" w:cs="Arial"/>
-    </w:rPr>
-  </w:style>
-  <w:style w:type="character" w:styleId="CommentReference">
-    <w:name w:val="annotation reference"/>
-    <w:basedOn w:val="DefaultParagraphFont"/>
-    <w:uiPriority w:val="99"/>
-    <w:semiHidden/>
-    <w:unhideWhenUsed/>
-    <w:qFormat/>
-    <w:rsid w:val="000F4FEF"/>
-    <w:rPr>
-      <w:sz w:val="16"/>
-      <w:szCs w:val="16"/>
-    </w:rPr>
-  </w:style>
-  <w:style w:type="paragraph" w:styleId="Title">
-    <w:name w:val="Title"/>
-    <w:basedOn w:val="Normal"/>
-    <w:next w:val="Normal"/>
-    <w:link w:val="TitleChar"/>
-    <w:uiPriority w:val="10"/>
-    <w:qFormat/>
-    <w:rsid w:val="000F4FEF"/>
-    <w:pPr>
-      <w:spacing w:before="0" w:beforeAutospacing="0" w:after="100" w:line="276" w:lineRule="auto"/>
-    </w:pPr>
-    <w:rPr>
-      <w:rFonts w:ascii="Helvetica" w:hAnsi="Helvetica" w:cs="Helvetica"/>
-      <w:color w:val="0A2A78"/>
-      <w:spacing w:val="-2"/>
-      <w:sz w:val="48"/>
-      <w:szCs w:val="24"/>
-    </w:rPr>
-  </w:style>
-  <w:style w:type="character" w:customStyle="1" w:styleId="TitleChar">
-    <w:name w:val="Title Char"/>
-    <w:basedOn w:val="DefaultParagraphFont"/>
-    <w:link w:val="Title"/>
-    <w:uiPriority w:val="10"/>
-    <w:qFormat/>
-    <w:rsid w:val="000F4FEF"/>
-    <w:rPr>
-      <w:rFonts w:ascii="Helvetica" w:hAnsi="Helvetica" w:cs="Helvetica"/>
-      <w:color w:val="0A2A78"/>
-      <w:spacing w:val="-2"/>
-      <w:sz w:val="48"/>
-      <w:szCs w:val="24"/>
-    </w:rPr>
-  </w:style>
-  <w:style w:type="paragraph" w:styleId="Subtitle">
-    <w:name w:val="Subtitle"/>
-    <w:basedOn w:val="Normal"/>
-    <w:next w:val="Normal"/>
-    <w:link w:val="SubtitleChar"/>
-    <w:uiPriority w:val="11"/>
-    <w:qFormat/>
-    <w:rsid w:val="000F4FEF"/>
-    <w:pPr>
-      <w:keepNext/>
-      <w:keepLines/>
-      <w:spacing w:after="320"/>
-    </w:pPr>
-    <w:rPr>
-      <w:color w:val="666666"/>
-      <w:sz w:val="30"/>
-      <w:szCs w:val="30"/>
-    </w:rPr>
-  </w:style>
-  <w:style w:type="character" w:customStyle="1" w:styleId="SubtitleChar">
-    <w:name w:val="Subtitle Char"/>
-    <w:basedOn w:val="DefaultParagraphFont"/>
-    <w:link w:val="Subtitle"/>
-    <w:uiPriority w:val="11"/>
-    <w:rsid w:val="000F4FEF"/>
-    <w:rPr>
-      <w:rFonts w:ascii="Arial" w:hAnsi="Arial" w:cs="Arial"/>
-      <w:color w:val="666666"/>
-      <w:sz w:val="30"/>
-      <w:szCs w:val="30"/>
-    </w:rPr>
-  </w:style>
-  <w:style w:type="character" w:styleId="FollowedHyperlink">
-    <w:name w:val="FollowedHyperlink"/>
-    <w:basedOn w:val="DefaultParagraphFont"/>
-    <w:uiPriority w:val="99"/>
-    <w:semiHidden/>
-    <w:unhideWhenUsed/>
-    <w:rsid w:val="000F4FEF"/>
-    <w:rPr>
-      <w:color w:val="954F72" w:themeColor="followedHyperlink"/>
-      <w:u w:val="single"/>
-    </w:rPr>
-  </w:style>
-  <w:style w:type="character" w:styleId="Strong">
-    <w:name w:val="Strong"/>
-    <w:basedOn w:val="DefaultParagraphFont"/>
-    <w:uiPriority w:val="22"/>
-    <w:qFormat/>
-    <w:rsid w:val="000F4FEF"/>
-    <w:rPr>
-      <w:b/>
-      <w:bCs/>
-    </w:rPr>
-  </w:style>
-  <w:style w:type="character" w:styleId="Emphasis">
-    <w:name w:val="Emphasis"/>
-    <w:basedOn w:val="DefaultParagraphFont"/>
-    <w:uiPriority w:val="20"/>
-    <w:qFormat/>
-    <w:rsid w:val="000F4FEF"/>
-    <w:rPr>
-      <w:i/>
-      <w:iCs/>
-    </w:rPr>
-  </w:style>
-  <w:style w:type="paragraph" w:styleId="PlainText">
-    <w:name w:val="Plain Text"/>
-    <w:basedOn w:val="Normal"/>
-    <w:link w:val="PlainTextChar"/>
-    <w:uiPriority w:val="99"/>
-    <w:semiHidden/>
-    <w:unhideWhenUsed/>
-    <w:rsid w:val="00DD3DDA"/>
-    <w:pPr>
-      <w:spacing w:after="0"/>
-    </w:pPr>
-    <w:rPr>
-      <w:sz w:val="24"/>
-      <w:szCs w:val="21"/>
-    </w:rPr>
-  </w:style>
-  <w:style w:type="character" w:customStyle="1" w:styleId="PlainTextChar">
-    <w:name w:val="Plain Text Char"/>
-    <w:basedOn w:val="DefaultParagraphFont"/>
-    <w:link w:val="PlainText"/>
-    <w:uiPriority w:val="99"/>
-    <w:semiHidden/>
-    <w:rsid w:val="00DD3DDA"/>
-    <w:rPr>
-      <w:rFonts w:ascii="Arial" w:hAnsi="Arial" w:cs="Arial"/>
-      <w:sz w:val="24"/>
-      <w:szCs w:val="21"/>
-    </w:rPr>
-  </w:style>
-  <w:style w:type="paragraph" w:styleId="NormalWeb">
-    <w:name w:val="Normal (Web)"/>
-    <w:basedOn w:val="Normal"/>
-    <w:uiPriority w:val="99"/>
-    <w:unhideWhenUsed/>
-    <w:rsid w:val="000F4FEF"/>
-    <w:pPr>
-      <w:spacing w:before="100" w:after="100"/>
-    </w:pPr>
-    <w:rPr>
-      <w:rFonts w:ascii="Times New Roman" w:eastAsia="Times New Roman" w:hAnsi="Times New Roman" w:cs="Times New Roman"/>
-      <w:sz w:val="24"/>
-      <w:szCs w:val="24"/>
-    </w:rPr>
-  </w:style>
-  <w:style w:type="paragraph" w:styleId="HTMLPreformatted">
-    <w:name w:val="HTML Preformatted"/>
-    <w:basedOn w:val="Normal"/>
-    <w:link w:val="HTMLPreformattedChar"/>
-    <w:uiPriority w:val="99"/>
-    <w:semiHidden/>
-    <w:unhideWhenUsed/>
-    <w:rsid w:val="000F4FEF"/>
-    <w:pPr>
-      <w:tabs>
-        <w:tab w:val="left" w:pos="916"/>
-        <w:tab w:val="left" w:pos="1832"/>
-        <w:tab w:val="left" w:pos="2748"/>
-        <w:tab w:val="left" w:pos="3664"/>
-        <w:tab w:val="left" w:pos="4580"/>
-        <w:tab w:val="left" w:pos="5496"/>
-        <w:tab w:val="left" w:pos="6412"/>
-        <w:tab w:val="left" w:pos="7328"/>
-        <w:tab w:val="left" w:pos="8244"/>
-        <w:tab w:val="left" w:pos="9160"/>
-        <w:tab w:val="left" w:pos="10076"/>
-        <w:tab w:val="left" w:pos="10992"/>
-        <w:tab w:val="left" w:pos="11908"/>
-        <w:tab w:val="left" w:pos="12824"/>
-        <w:tab w:val="left" w:pos="13740"/>
-        <w:tab w:val="left" w:pos="14656"/>
-      </w:tabs>
-      <w:spacing w:before="0" w:beforeAutospacing="0" w:after="0" w:afterAutospacing="0"/>
-    </w:pPr>
-    <w:rPr>
-      <w:rFonts w:ascii="Courier New" w:eastAsia="Times New Roman" w:hAnsi="Courier New" w:cs="Courier New"/>
-      <w:sz w:val="20"/>
-      <w:szCs w:val="20"/>
-    </w:rPr>
-  </w:style>
-  <w:style w:type="character" w:customStyle="1" w:styleId="HTMLPreformattedChar">
-    <w:name w:val="HTML Preformatted Char"/>
-    <w:basedOn w:val="DefaultParagraphFont"/>
-    <w:link w:val="HTMLPreformatted"/>
-    <w:uiPriority w:val="99"/>
-    <w:semiHidden/>
-    <w:rsid w:val="000F4FEF"/>
-    <w:rPr>
-      <w:rFonts w:ascii="Courier New" w:eastAsia="Times New Roman" w:hAnsi="Courier New" w:cs="Courier New"/>
-      <w:sz w:val="20"/>
-      <w:szCs w:val="20"/>
-    </w:rPr>
-  </w:style>
-  <w:style w:type="paragraph" w:styleId="CommentSubject">
-    <w:name w:val="annotation subject"/>
-    <w:basedOn w:val="CommentText"/>
-    <w:next w:val="CommentText"/>
-    <w:link w:val="CommentSubjectChar"/>
-    <w:uiPriority w:val="99"/>
-    <w:semiHidden/>
-    <w:unhideWhenUsed/>
-    <w:rsid w:val="000F4FEF"/>
-    <w:rPr>
-      <w:b/>
-      <w:bCs/>
-    </w:rPr>
-  </w:style>
-  <w:style w:type="character" w:customStyle="1" w:styleId="CommentSubjectChar">
-    <w:name w:val="Comment Subject Char"/>
-    <w:basedOn w:val="CommentTextChar"/>
-    <w:link w:val="CommentSubject"/>
-    <w:uiPriority w:val="99"/>
-    <w:semiHidden/>
-    <w:rsid w:val="000F4FEF"/>
-    <w:rPr>
-      <w:rFonts w:ascii="Arial" w:hAnsi="Arial" w:cs="Arial"/>
-      <w:b/>
-      <w:bCs/>
-      <w:sz w:val="20"/>
-      <w:szCs w:val="20"/>
-    </w:rPr>
-  </w:style>
-  <w:style w:type="paragraph" w:styleId="BalloonText">
-    <w:name w:val="Balloon Text"/>
-    <w:basedOn w:val="Normal"/>
-    <w:link w:val="BalloonTextChar"/>
-    <w:uiPriority w:val="99"/>
-    <w:semiHidden/>
-    <w:unhideWhenUsed/>
-    <w:rsid w:val="000F4FEF"/>
-    <w:rPr>
-      <w:rFonts w:ascii="Segoe UI" w:hAnsi="Segoe UI" w:cs="Segoe UI"/>
-      <w:sz w:val="18"/>
-      <w:szCs w:val="18"/>
-    </w:rPr>
-  </w:style>
-  <w:style w:type="character" w:customStyle="1" w:styleId="BalloonTextChar">
-    <w:name w:val="Balloon Text Char"/>
-    <w:basedOn w:val="DefaultParagraphFont"/>
-    <w:link w:val="BalloonText"/>
-    <w:uiPriority w:val="99"/>
-    <w:semiHidden/>
-    <w:rsid w:val="000F4FEF"/>
-    <w:rPr>
-      <w:rFonts w:ascii="Segoe UI" w:hAnsi="Segoe UI" w:cs="Segoe UI"/>
-      <w:sz w:val="18"/>
-      <w:szCs w:val="18"/>
-    </w:rPr>
-  </w:style>
-  <w:style w:type="table" w:styleId="TableGrid">
-    <w:name w:val="Table Grid"/>
-    <w:basedOn w:val="TableNormal"/>
-    <w:uiPriority w:val="39"/>
-    <w:rsid w:val="000F4FEF"/>
-    <w:pPr>
-      <w:widowControl w:val="0"/>
-      <w:autoSpaceDE w:val="0"/>
-      <w:autoSpaceDN w:val="0"/>
-      <w:spacing w:beforeAutospacing="0" w:after="0" w:afterAutospacing="0" w:line="240" w:lineRule="auto"/>
-    </w:pPr>
-    <w:rPr>
-      <w:rFonts w:eastAsiaTheme="minorHAnsi"/>
-    </w:rPr>
-    <w:tblPr>
-      <w:tblBorders>
-        <w:top w:val="single" w:sz="4" w:space="0" w:color="auto"/>
-        <w:left w:val="single" w:sz="4" w:space="0" w:color="auto"/>
-        <w:bottom w:val="single" w:sz="4" w:space="0" w:color="auto"/>
-        <w:right w:val="single" w:sz="4" w:space="0" w:color="auto"/>
-        <w:insideH w:val="single" w:sz="4" w:space="0" w:color="auto"/>
-        <w:insideV w:val="single" w:sz="4" w:space="0" w:color="auto"/>
-      </w:tblBorders>
-    </w:tblPr>
-  </w:style>
-  <w:style w:type="paragraph" w:styleId="NoSpacing">
-    <w:name w:val="No Spacing"/>
-    <w:uiPriority w:val="1"/>
-    <w:qFormat/>
-    <w:rsid w:val="00DD3DDA"/>
-    <w:pPr>
-      <w:spacing w:beforeAutospacing="0" w:after="0" w:afterAutospacing="0"/>
-    </w:pPr>
-    <w:rPr>
-      <w:rFonts w:ascii="Helvetica" w:eastAsiaTheme="minorHAnsi" w:hAnsi="Helvetica"/>
-      <w:sz w:val="24"/>
-    </w:rPr>
-  </w:style>
-  <w:style w:type="paragraph" w:styleId="Quote">
-    <w:name w:val="Quote"/>
-    <w:basedOn w:val="Normal"/>
-    <w:next w:val="Normal"/>
-    <w:link w:val="QuoteChar"/>
-    <w:uiPriority w:val="29"/>
-    <w:rsid w:val="000F4FEF"/>
-    <w:pPr>
-      <w:spacing w:before="200" w:after="160"/>
-      <w:ind w:left="864" w:right="864"/>
-      <w:jc w:val="center"/>
-    </w:pPr>
-    <w:rPr>
-      <w:i/>
-      <w:iCs/>
-      <w:color w:val="404040" w:themeColor="text1" w:themeTint="BF"/>
-    </w:rPr>
-  </w:style>
-  <w:style w:type="character" w:customStyle="1" w:styleId="QuoteChar">
-    <w:name w:val="Quote Char"/>
-    <w:basedOn w:val="DefaultParagraphFont"/>
-    <w:link w:val="Quote"/>
-    <w:uiPriority w:val="29"/>
-    <w:rsid w:val="000F4FEF"/>
-    <w:rPr>
-      <w:rFonts w:ascii="Arial" w:hAnsi="Arial" w:cs="Arial"/>
-      <w:i/>
-      <w:iCs/>
-      <w:color w:val="404040" w:themeColor="text1" w:themeTint="BF"/>
-    </w:rPr>
-  </w:style>
-  <w:style w:type="character" w:styleId="SubtleEmphasis">
-    <w:name w:val="Subtle Emphasis"/>
-    <w:basedOn w:val="DefaultParagraphFont"/>
-    <w:uiPriority w:val="19"/>
-    <w:rsid w:val="000F4FEF"/>
-    <w:rPr>
-      <w:i/>
-      <w:iCs/>
-      <w:color w:val="404040" w:themeColor="text1" w:themeTint="BF"/>
-    </w:rPr>
-  </w:style>
-  <w:style w:type="paragraph" w:styleId="TOCHeading">
-    <w:name w:val="TOC Heading"/>
-    <w:basedOn w:val="Heading1"/>
-    <w:next w:val="Normal"/>
-    <w:uiPriority w:val="39"/>
-    <w:unhideWhenUsed/>
-    <w:qFormat/>
-    <w:rsid w:val="000F4FEF"/>
-    <w:pPr>
-      <w:spacing w:before="240" w:after="0" w:line="259" w:lineRule="auto"/>
-      <w:outlineLvl w:val="9"/>
-    </w:pPr>
-    <w:rPr>
-      <w:rFonts w:asciiTheme="majorHAnsi" w:eastAsiaTheme="majorEastAsia" w:hAnsiTheme="majorHAnsi" w:cstheme="majorBidi"/>
-      <w:color w:val="2F5496" w:themeColor="accent1" w:themeShade="BF"/>
-      <w:sz w:val="32"/>
-      <w:szCs w:val="32"/>
-    </w:rPr>
-  </w:style>
-  <w:style w:type="character" w:customStyle="1" w:styleId="BodyChar">
-    <w:name w:val="Body Char"/>
-    <w:basedOn w:val="DefaultParagraphFont"/>
-    <w:link w:val="Body"/>
-    <w:rsid w:val="000F4FEF"/>
-    <w:rPr>
-      <w:rFonts w:ascii="Helvetica" w:eastAsiaTheme="minorHAnsi" w:hAnsi="Helvetica" w:cs="Helvetica"/>
-      <w:sz w:val="24"/>
-      <w:szCs w:val="24"/>
-    </w:rPr>
-  </w:style>
-  <w:style w:type="paragraph" w:customStyle="1" w:styleId="interviewneedsediting">
-    <w:name w:val="interview needs editing"/>
-    <w:basedOn w:val="Normal"/>
-    <w:next w:val="Normal"/>
-    <w:qFormat/>
-    <w:rsid w:val="000F4FEF"/>
-    <w:pPr>
-      <w:shd w:val="clear" w:color="auto" w:fill="FFFF00"/>
-      <w:spacing w:after="60" w:line="360" w:lineRule="auto"/>
-    </w:pPr>
-    <w:rPr>
-      <w:sz w:val="21"/>
-      <w:szCs w:val="21"/>
-    </w:rPr>
-  </w:style>
-  <w:style w:type="table" w:customStyle="1" w:styleId="TableGridLight1">
-    <w:name w:val="Table Grid Light1"/>
-    <w:basedOn w:val="TableNormal"/>
-    <w:uiPriority w:val="40"/>
-    <w:rsid w:val="000F4FEF"/>
-    <w:pPr>
-      <w:spacing w:beforeAutospacing="0" w:after="0" w:afterAutospacing="0" w:line="240" w:lineRule="auto"/>
-    </w:pPr>
-    <w:rPr>
-      <w:rFonts w:eastAsiaTheme="minorHAnsi"/>
-    </w:rPr>
-    <w:tblPr>
-      <w:tblBorders>
-        <w:top w:val="single" w:sz="4" w:space="0" w:color="BFBFBF" w:themeColor="background1" w:themeShade="BF"/>
-        <w:left w:val="single" w:sz="4" w:space="0" w:color="BFBFBF" w:themeColor="background1" w:themeShade="BF"/>
-        <w:bottom w:val="single" w:sz="4" w:space="0" w:color="BFBFBF" w:themeColor="background1" w:themeShade="BF"/>
-        <w:right w:val="single" w:sz="4" w:space="0" w:color="BFBFBF" w:themeColor="background1" w:themeShade="BF"/>
-        <w:insideH w:val="single" w:sz="4" w:space="0" w:color="BFBFBF" w:themeColor="background1" w:themeShade="BF"/>
-        <w:insideV w:val="single" w:sz="4" w:space="0" w:color="BFBFBF" w:themeColor="background1" w:themeShade="BF"/>
-      </w:tblBorders>
-    </w:tblPr>
-  </w:style>
-</w:styles>
-</file>
-
-<file path=word/stylesWithEffects.xml><?xml version="1.0" encoding="utf-8"?>
-<w:styles xmlns:wpc="http://schemas.microsoft.com/office/word/2010/wordprocessingCanvas" xmlns:mc="http://schemas.openxmlformats.org/markup-compatibility/2006" xmlns:o="urn:schemas-microsoft-com:office:office" xmlns:r="http://schemas.openxmlformats.org/officeDocument/2006/relationships" xmlns:m="http://schemas.openxmlformats.org/officeDocument/2006/math" xmlns:v="urn:schemas-microsoft-com:vml" xmlns:wp14="http://schemas.microsoft.com/office/word/2010/wordprocessingDrawing" xmlns:wp="http://schemas.openxmlformats.org/drawingml/2006/wordprocessingDrawing" xmlns:w10="urn:schemas-microsoft-com:office:word" xmlns:w="http://schemas.openxmlformats.org/wordprocessingml/2006/main" xmlns:w14="http://schemas.microsoft.com/office/word/2010/wordml" xmlns:wpg="http://schemas.microsoft.com/office/word/2010/wordprocessingGroup" xmlns:wpi="http://schemas.microsoft.com/office/word/2010/wordprocessingInk" xmlns:wne="http://schemas.microsoft.com/office/word/2006/wordml" xmlns:wps="http://schemas.microsoft.com/office/word/2010/wordprocessingShape" mc:Ignorable="w14 wp14">
-  <w:docDefaults>
-    <w:rPrDefault>
-      <w:rPr>
-        <w:rFonts w:asciiTheme="minorHAnsi" w:eastAsia="Arial" w:hAnsiTheme="minorHAnsi" w:cstheme="minorBidi"/>
-        <w:sz w:val="22"/>
-        <w:szCs w:val="22"/>
-        <w:lang w:val="en-US" w:eastAsia="en-US" w:bidi="ar-SA"/>
-      </w:rPr>
-    </w:rPrDefault>
-    <w:pPrDefault>
-      <w:pPr>
-        <w:spacing w:beforeAutospacing="1" w:after="160" w:afterAutospacing="1" w:line="259" w:lineRule="auto"/>
-      </w:pPr>
-    </w:pPrDefault>
-  </w:docDefaults>
-  <w:latentStyles w:defLockedState="0" w:defUIPriority="99" w:defSemiHidden="1" w:defUnhideWhenUsed="1" w:defQFormat="0" w:count="267">
-    <w:lsdException w:name="Normal" w:semiHidden="0" w:uiPriority="0" w:unhideWhenUsed="0" w:qFormat="1"/>
-    <w:lsdException w:name="heading 1" w:semiHidden="0" w:uiPriority="9" w:unhideWhenUsed="0" w:qFormat="1"/>
-    <w:lsdException w:name="heading 2" w:uiPriority="9" w:qFormat="1"/>
-    <w:lsdException w:name="heading 3" w:uiPriority="9" w:qFormat="1"/>
-    <w:lsdException w:name="heading 4" w:uiPriority="9" w:qFormat="1"/>
-    <w:lsdException w:name="heading 5" w:uiPriority="9" w:qFormat="1"/>
-    <w:lsdException w:name="heading 6" w:uiPriority="9" w:qFormat="1"/>
-    <w:lsdException w:name="heading 7" w:uiPriority="9" w:qFormat="1"/>
-    <w:lsdException w:name="heading 8" w:uiPriority="9" w:qFormat="1"/>
-    <w:lsdException w:name="heading 9" w:uiPriority="9" w:qFormat="1"/>
-    <w:lsdException w:name="toc 1" w:uiPriority="39"/>
-    <w:lsdException w:name="toc 2" w:uiPriority="39"/>
-    <w:lsdException w:name="toc 3" w:uiPriority="39"/>
-    <w:lsdException w:name="toc 4" w:uiPriority="39"/>
-    <w:lsdException w:name="toc 5" w:uiPriority="39"/>
-    <w:lsdException w:name="toc 6" w:uiPriority="39"/>
-    <w:lsdException w:name="toc 7" w:uiPriority="39"/>
-    <w:lsdException w:name="toc 8" w:uiPriority="39"/>
-    <w:lsdException w:name="toc 9" w:uiPriority="39"/>
-    <w:lsdException w:name="annotation text" w:qFormat="1"/>
-    <w:lsdException w:name="caption" w:uiPriority="35" w:qFormat="1"/>
-    <w:lsdException w:name="annotation reference" w:qFormat="1"/>
-    <w:lsdException w:name="Title" w:semiHidden="0" w:uiPriority="10" w:unhideWhenUsed="0" w:qFormat="1"/>
-    <w:lsdException w:name="Default Paragraph Font" w:uiPriority="1"/>
-    <w:lsdException w:name="Body Text" w:uiPriority="1" w:qFormat="1"/>
-    <w:lsdException w:name="Subtitle" w:semiHidden="0" w:uiPriority="11" w:unhideWhenUsed="0" w:qFormat="1"/>
-    <w:lsdException w:name="Strong" w:semiHidden="0" w:uiPriority="22" w:unhideWhenUsed="0" w:qFormat="1"/>
-    <w:lsdException w:name="Emphasis" w:semiHidden="0" w:uiPriority="20" w:unhideWhenUsed="0" w:qFormat="1"/>
-    <w:lsdException w:name="Table Grid" w:semiHidden="0" w:uiPriority="39" w:unhideWhenUsed="0"/>
-    <w:lsdException w:name="Placeholder Text" w:unhideWhenUsed="0"/>
-    <w:lsdException w:name="No Spacing" w:semiHidden="0" w:uiPriority="1" w:unhideWhenUsed="0" w:qFormat="1"/>
-    <w:lsdException w:name="Light Shading" w:semiHidden="0" w:uiPriority="60" w:unhideWhenUsed="0"/>
-    <w:lsdException w:name="Light List" w:semiHidden="0" w:uiPriority="61" w:unhideWhenUsed="0"/>
-    <w:lsdException w:name="Light Grid" w:semiHidden="0" w:uiPriority="62" w:unhideWhenUsed="0"/>
-    <w:lsdException w:name="Medium Shading 1" w:semiHidden="0" w:uiPriority="63" w:unhideWhenUsed="0"/>
-    <w:lsdException w:name="Medium Shading 2" w:semiHidden="0" w:uiPriority="64" w:unhideWhenUsed="0"/>
-    <w:lsdException w:name="Medium List 1" w:semiHidden="0" w:uiPriority="65" w:unhideWhenUsed="0"/>
-    <w:lsdException w:name="Medium List 2" w:semiHidden="0" w:uiPriority="66" w:unhideWhenUsed="0"/>
-    <w:lsdException w:name="Medium Grid 1" w:semiHidden="0" w:uiPriority="67" w:unhideWhenUsed="0"/>
-    <w:lsdException w:name="Medium Grid 2" w:semiHidden="0" w:uiPriority="68" w:unhideWhenUsed="0"/>
-    <w:lsdException w:name="Medium Grid 3" w:semiHidden="0" w:uiPriority="69" w:unhideWhenUsed="0"/>
-    <w:lsdException w:name="Dark List" w:semiHidden="0" w:uiPriority="70" w:unhideWhenUsed="0"/>
-    <w:lsdException w:name="Colorful Shading" w:semiHidden="0" w:uiPriority="71" w:unhideWhenUsed="0"/>
-    <w:lsdException w:name="Colorful List" w:semiHidden="0" w:uiPriority="72" w:unhideWhenUsed="0"/>
-    <w:lsdException w:name="Colorful Grid" w:semiHidden="0" w:uiPriority="73" w:unhideWhenUsed="0"/>
-    <w:lsdException w:name="Light Shading Accent 1" w:semiHidden="0" w:uiPriority="60" w:unhideWhenUsed="0"/>
-    <w:lsdException w:name="Light List Accent 1" w:semiHidden="0" w:uiPriority="61" w:unhideWhenUsed="0"/>
-    <w:lsdException w:name="Light Grid Accent 1" w:semiHidden="0" w:uiPriority="62" w:unhideWhenUsed="0"/>
-    <w:lsdException w:name="Medium Shading 1 Accent 1" w:semiHidden="0" w:uiPriority="63" w:unhideWhenUsed="0"/>
-    <w:lsdException w:name="Medium Shading 2 Accent 1" w:semiHidden="0" w:uiPriority="64" w:unhideWhenUsed="0"/>
-    <w:lsdException w:name="Medium List 1 Accent 1" w:semiHidden="0" w:uiPriority="65" w:unhideWhenUsed="0"/>
-    <w:lsdException w:name="Revision" w:unhideWhenUsed="0"/>
-    <w:lsdException w:name="List Paragraph" w:semiHidden="0" w:uiPriority="34" w:unhideWhenUsed="0" w:qFormat="1"/>
-    <w:lsdException w:name="Quote" w:semiHidden="0" w:uiPriority="29" w:unhideWhenUsed="0" w:qFormat="1"/>
-    <w:lsdException w:name="Intense Quote" w:semiHidden="0" w:uiPriority="30" w:unhideWhenUsed="0" w:qFormat="1"/>
-    <w:lsdException w:name="Medium List 2 Accent 1" w:semiHidden="0" w:uiPriority="66" w:unhideWhenUsed="0"/>
-    <w:lsdException w:name="Medium Grid 1 Accent 1" w:semiHidden="0" w:uiPriority="67" w:unhideWhenUsed="0"/>
-    <w:lsdException w:name="Medium Grid 2 Accent 1" w:semiHidden="0" w:uiPriority="68" w:unhideWhenUsed="0"/>
-    <w:lsdException w:name="Medium Grid 3 Accent 1" w:semiHidden="0" w:uiPriority="69" w:unhideWhenUsed="0"/>
-    <w:lsdException w:name="Dark List Accent 1" w:semiHidden="0" w:uiPriority="70" w:unhideWhenUsed="0"/>
-    <w:lsdException w:name="Colorful Shading Accent 1" w:semiHidden="0" w:uiPriority="71" w:unhideWhenUsed="0"/>
-    <w:lsdException w:name="Colorful List Accent 1" w:semiHidden="0" w:uiPriority="72" w:unhideWhenUsed="0"/>
-    <w:lsdException w:name="Colorful Grid Accent 1" w:semiHidden="0" w:uiPriority="73" w:unhideWhenUsed="0"/>
-    <w:lsdException w:name="Light Shading Accent 2" w:semiHidden="0" w:uiPriority="60" w:unhideWhenUsed="0"/>
-    <w:lsdException w:name="Light List Accent 2" w:semiHidden="0" w:uiPriority="61" w:unhideWhenUsed="0"/>
-    <w:lsdException w:name="Light Grid Accent 2" w:semiHidden="0" w:uiPriority="62" w:unhideWhenUsed="0"/>
-    <w:lsdException w:name="Medium Shading 1 Accent 2" w:semiHidden="0" w:uiPriority="63" w:unhideWhenUsed="0"/>
-    <w:lsdException w:name="Medium Shading 2 Accent 2" w:semiHidden="0" w:uiPriority="64" w:unhideWhenUsed="0"/>
-    <w:lsdException w:name="Medium List 1 Accent 2" w:semiHidden="0" w:uiPriority="65" w:unhideWhenUsed="0"/>
-    <w:lsdException w:name="Medium List 2 Accent 2" w:semiHidden="0" w:uiPriority="66" w:unhideWhenUsed="0"/>
-    <w:lsdException w:name="Medium Grid 1 Accent 2" w:semiHidden="0" w:uiPriority="67" w:unhideWhenUsed="0"/>
-    <w:lsdException w:name="Medium Grid 2 Accent 2" w:semiHidden="0" w:uiPriority="68" w:unhideWhenUsed="0"/>
-    <w:lsdException w:name="Medium Grid 3 Accent 2" w:semiHidden="0" w:uiPriority="69" w:unhideWhenUsed="0"/>
-    <w:lsdException w:name="Dark List Accent 2" w:semiHidden="0" w:uiPriority="70" w:unhideWhenUsed="0"/>
-    <w:lsdException w:name="Colorful Shading Accent 2" w:semiHidden="0" w:uiPriority="71" w:unhideWhenUsed="0"/>
-    <w:lsdException w:name="Colorful List Accent 2" w:semiHidden="0" w:uiPriority="72" w:unhideWhenUsed="0"/>
-    <w:lsdException w:name="Colorful Grid Accent 2" w:semiHidden="0" w:uiPriority="73" w:unhideWhenUsed="0"/>
-    <w:lsdException w:name="Light Shading Accent 3" w:semiHidden="0" w:uiPriority="60" w:unhideWhenUsed="0"/>
-    <w:lsdException w:name="Light List Accent 3" w:semiHidden="0" w:uiPriority="61" w:unhideWhenUsed="0"/>
-    <w:lsdException w:name="Light Grid Accent 3" w:semiHidden="0" w:uiPriority="62" w:unhideWhenUsed="0"/>
-    <w:lsdException w:name="Medium Shading 1 Accent 3" w:semiHidden="0" w:uiPriority="63" w:unhideWhenUsed="0"/>
-    <w:lsdException w:name="Medium Shading 2 Accent 3" w:semiHidden="0" w:uiPriority="64" w:unhideWhenUsed="0"/>
-    <w:lsdException w:name="Medium List 1 Accent 3" w:semiHidden="0" w:uiPriority="65" w:unhideWhenUsed="0"/>
-    <w:lsdException w:name="Medium List 2 Accent 3" w:semiHidden="0" w:uiPriority="66" w:unhideWhenUsed="0"/>
-    <w:lsdException w:name="Medium Grid 1 Accent 3" w:semiHidden="0" w:uiPriority="67" w:unhideWhenUsed="0"/>
-    <w:lsdException w:name="Medium Grid 2 Accent 3" w:semiHidden="0" w:uiPriority="68" w:unhideWhenUsed="0"/>
-    <w:lsdException w:name="Medium Grid 3 Accent 3" w:semiHidden="0" w:uiPriority="69" w:unhideWhenUsed="0"/>
-    <w:lsdException w:name="Dark List Accent 3" w:semiHidden="0" w:uiPriority="70" w:unhideWhenUsed="0"/>
-    <w:lsdException w:name="Colorful Shading Accent 3" w:semiHidden="0" w:uiPriority="71" w:unhideWhenUsed="0"/>
-    <w:lsdException w:name="Colorful List Accent 3" w:semiHidden="0" w:uiPriority="72" w:unhideWhenUsed="0"/>
-    <w:lsdException w:name="Colorful Grid Accent 3" w:semiHidden="0" w:uiPriority="73" w:unhideWhenUsed="0"/>
-    <w:lsdException w:name="Light Shading Accent 4" w:semiHidden="0" w:uiPriority="60" w:unhideWhenUsed="0"/>
-    <w:lsdException w:name="Light List Accent 4" w:semiHidden="0" w:uiPriority="61" w:unhideWhenUsed="0"/>
-    <w:lsdException w:name="Light Grid Accent 4" w:semiHidden="0" w:uiPriority="62" w:unhideWhenUsed="0"/>
-    <w:lsdException w:name="Medium Shading 1 Accent 4" w:semiHidden="0" w:uiPriority="63" w:unhideWhenUsed="0"/>
-    <w:lsdException w:name="Medium Shading 2 Accent 4" w:semiHidden="0" w:uiPriority="64" w:unhideWhenUsed="0"/>
-    <w:lsdException w:name="Medium List 1 Accent 4" w:semiHidden="0" w:uiPriority="65" w:unhideWhenUsed="0"/>
-    <w:lsdException w:name="Medium List 2 Accent 4" w:semiHidden="0" w:uiPriority="66" w:unhideWhenUsed="0"/>
-    <w:lsdException w:name="Medium Grid 1 Accent 4" w:semiHidden="0" w:uiPriority="67" w:unhideWhenUsed="0"/>
-    <w:lsdException w:name="Medium Grid 2 Accent 4" w:semiHidden="0" w:uiPriority="68" w:unhideWhenUsed="0"/>
-    <w:lsdException w:name="Medium Grid 3 Accent 4" w:semiHidden="0" w:uiPriority="69" w:unhideWhenUsed="0"/>
-    <w:lsdException w:name="Dark List Accent 4" w:semiHidden="0" w:uiPriority="70" w:unhideWhenUsed="0"/>
-    <w:lsdException w:name="Colorful Shading Accent 4" w:semiHidden="0" w:uiPriority="71" w:unhideWhenUsed="0"/>
-    <w:lsdException w:name="Colorful List Accent 4" w:semiHidden="0" w:uiPriority="72" w:unhideWhenUsed="0"/>
-    <w:lsdException w:name="Colorful Grid Accent 4" w:semiHidden="0" w:uiPriority="73" w:unhideWhenUsed="0"/>
-    <w:lsdException w:name="Light Shading Accent 5" w:semiHidden="0" w:uiPriority="60" w:unhideWhenUsed="0"/>
-    <w:lsdException w:name="Light List Accent 5" w:semiHidden="0" w:uiPriority="61" w:unhideWhenUsed="0"/>
-    <w:lsdException w:name="Light Grid Accent 5" w:semiHidden="0" w:uiPriority="62" w:unhideWhenUsed="0"/>
-    <w:lsdException w:name="Medium Shading 1 Accent 5" w:semiHidden="0" w:uiPriority="63" w:unhideWhenUsed="0"/>
-    <w:lsdException w:name="Medium Shading 2 Accent 5" w:semiHidden="0" w:uiPriority="64" w:unhideWhenUsed="0"/>
-    <w:lsdException w:name="Medium List 1 Accent 5" w:semiHidden="0" w:uiPriority="65" w:unhideWhenUsed="0"/>
-    <w:lsdException w:name="Medium List 2 Accent 5" w:semiHidden="0" w:uiPriority="66" w:unhideWhenUsed="0"/>
-    <w:lsdException w:name="Medium Grid 1 Accent 5" w:semiHidden="0" w:uiPriority="67" w:unhideWhenUsed="0"/>
-    <w:lsdException w:name="Medium Grid 2 Accent 5" w:semiHidden="0" w:uiPriority="68" w:unhideWhenUsed="0"/>
-    <w:lsdException w:name="Medium Grid 3 Accent 5" w:semiHidden="0" w:uiPriority="69" w:unhideWhenUsed="0"/>
-    <w:lsdException w:name="Dark List Accent 5" w:semiHidden="0" w:uiPriority="70" w:unhideWhenUsed="0"/>
-    <w:lsdException w:name="Colorful Shading Accent 5" w:semiHidden="0" w:uiPriority="71" w:unhideWhenUsed="0"/>
-    <w:lsdException w:name="Colorful List Accent 5" w:semiHidden="0" w:uiPriority="72" w:unhideWhenUsed="0"/>
-    <w:lsdException w:name="Colorful Grid Accent 5" w:semiHidden="0" w:uiPriority="73" w:unhideWhenUsed="0"/>
-    <w:lsdException w:name="Light Shading Accent 6" w:semiHidden="0" w:uiPriority="60" w:unhideWhenUsed="0"/>
-    <w:lsdException w:name="Light List Accent 6" w:semiHidden="0" w:uiPriority="61" w:unhideWhenUsed="0"/>
-    <w:lsdException w:name="Light Grid Accent 6" w:semiHidden="0" w:uiPriority="62" w:unhideWhenUsed="0"/>
-    <w:lsdException w:name="Medium Shading 1 Accent 6" w:semiHidden="0" w:uiPriority="63" w:unhideWhenUsed="0"/>
-    <w:lsdException w:name="Medium Shading 2 Accent 6" w:semiHidden="0" w:uiPriority="64" w:unhideWhenUsed="0"/>
-    <w:lsdException w:name="Medium List 1 Accent 6" w:semiHidden="0" w:uiPriority="65" w:unhideWhenUsed="0"/>
-    <w:lsdException w:name="Medium List 2 Accent 6" w:semiHidden="0" w:uiPriority="66" w:unhideWhenUsed="0"/>
-    <w:lsdException w:name="Medium Grid 1 Accent 6" w:semiHidden="0" w:uiPriority="67" w:unhideWhenUsed="0"/>
-    <w:lsdException w:name="Medium Grid 2 Accent 6" w:semiHidden="0" w:uiPriority="68" w:unhideWhenUsed="0"/>
-    <w:lsdException w:name="Medium Grid 3 Accent 6" w:semiHidden="0" w:uiPriority="69" w:unhideWhenUsed="0"/>
-    <w:lsdException w:name="Dark List Accent 6" w:semiHidden="0" w:uiPriority="70" w:unhideWhenUsed="0"/>
-    <w:lsdException w:name="Colorful Shading Accent 6" w:semiHidden="0" w:uiPriority="71" w:unhideWhenUsed="0"/>
-    <w:lsdException w:name="Colorful List Accent 6" w:semiHidden="0" w:uiPriority="72" w:unhideWhenUsed="0"/>
-    <w:lsdException w:name="Colorful Grid Accent 6" w:semiHidden="0" w:uiPriority="73" w:unhideWhenUsed="0"/>
-    <w:lsdException w:name="Subtle Emphasis" w:semiHidden="0" w:uiPriority="19" w:unhideWhenUsed="0" w:qFormat="1"/>
-    <w:lsdException w:name="Intense Emphasis" w:semiHidden="0" w:uiPriority="21" w:unhideWhenUsed="0" w:qFormat="1"/>
-    <w:lsdException w:name="Subtle Reference" w:semiHidden="0" w:uiPriority="31" w:unhideWhenUsed="0" w:qFormat="1"/>
-    <w:lsdException w:name="Intense Reference" w:semiHidden="0" w:uiPriority="32" w:unhideWhenUsed="0" w:qFormat="1"/>
-    <w:lsdException w:name="Book Title" w:semiHidden="0" w:uiPriority="33" w:unhideWhenUsed="0" w:qFormat="1"/>
-    <w:lsdException w:name="Bibliography" w:uiPriority="37"/>
-    <w:lsdException w:name="TOC Heading" w:uiPriority="39" w:qFormat="1"/>
-  </w:latentStyles>
-  <w:style w:type="paragraph" w:default="1" w:styleId="Normal">
-    <w:name w:val="Normal"/>
-    <w:qFormat/>
-    <w:rsid w:val="000F4FEF"/>
-    <w:pPr>
-      <w:spacing w:before="-1" w:after="-1" w:line="240" w:lineRule="auto"/>
-    </w:pPr>
-    <w:rPr>
-      <w:rFonts w:ascii="Arial" w:hAnsi="Arial" w:cs="Arial"/>
-    </w:rPr>
-  </w:style>
-  <w:style w:type="paragraph" w:styleId="Heading1">
-    <w:name w:val="heading 1"/>
-    <w:basedOn w:val="Normal"/>
-    <w:link w:val="Heading1Char"/>
-    <w:uiPriority w:val="9"/>
-    <w:qFormat/>
-    <w:rsid w:val="000F4FEF"/>
-    <w:pPr>
-      <w:pBdr>
-        <w:bottom w:val="single" w:sz="4" w:space="1" w:color="A6A6A6" w:themeColor="background1" w:themeShade="A6"/>
-      </w:pBdr>
-      <w:spacing w:before="0" w:beforeAutospacing="0" w:after="100" w:line="276" w:lineRule="auto"/>
-      <w:outlineLvl w:val="0"/>
-    </w:pPr>
-    <w:rPr>
-      <w:rFonts w:ascii="Helvetica" w:hAnsi="Helvetica" w:cs="Helvetica"/>
-      <w:color w:val="0A2A78"/>
-      <w:spacing w:val="-4"/>
-      <w:sz w:val="40"/>
-      <w:szCs w:val="24"/>
-    </w:rPr>
-  </w:style>
-  <w:style w:type="paragraph" w:styleId="Heading2">
-    <w:name w:val="heading 2"/>
-    <w:basedOn w:val="Normal"/>
-    <w:next w:val="Normal"/>
-    <w:link w:val="Heading2Char"/>
-    <w:uiPriority w:val="9"/>
-    <w:unhideWhenUsed/>
-    <w:qFormat/>
-    <w:rsid w:val="000F4FEF"/>
-    <w:pPr>
-      <w:widowControl w:val="0"/>
-      <w:autoSpaceDE w:val="0"/>
-      <w:autoSpaceDN w:val="0"/>
-      <w:spacing w:before="0" w:beforeAutospacing="0" w:after="0" w:afterAutospacing="0" w:line="276" w:lineRule="auto"/>
-      <w:outlineLvl w:val="1"/>
-    </w:pPr>
-    <w:rPr>
-      <w:rFonts w:ascii="Helvetica" w:eastAsiaTheme="minorHAnsi" w:hAnsi="Helvetica" w:cs="Helvetica"/>
-      <w:color w:val="0A2A78"/>
-      <w:spacing w:val="-2"/>
-      <w:sz w:val="36"/>
-      <w:szCs w:val="24"/>
-    </w:rPr>
-  </w:style>
-  <w:style w:type="paragraph" w:styleId="Heading3">
-    <w:name w:val="heading 3"/>
-    <w:basedOn w:val="Heading2"/>
-    <w:next w:val="Body"/>
-    <w:link w:val="Heading3Char"/>
-    <w:uiPriority w:val="9"/>
-    <w:unhideWhenUsed/>
-    <w:qFormat/>
-    <w:rsid w:val="000F4FEF"/>
-    <w:pPr>
-      <w:outlineLvl w:val="2"/>
-    </w:pPr>
-    <w:rPr>
-      <w:sz w:val="32"/>
-    </w:rPr>
-  </w:style>
-  <w:style w:type="paragraph" w:styleId="Heading4">
-    <w:name w:val="heading 4"/>
-    <w:basedOn w:val="Normal"/>
-    <w:next w:val="Normal"/>
-    <w:link w:val="Heading4Char"/>
-    <w:uiPriority w:val="9"/>
-    <w:unhideWhenUsed/>
-    <w:qFormat/>
-    <w:rsid w:val="000F4FEF"/>
-    <w:pPr>
-      <w:widowControl w:val="0"/>
-      <w:autoSpaceDE w:val="0"/>
-      <w:autoSpaceDN w:val="0"/>
-      <w:spacing w:before="54" w:beforeAutospacing="0" w:after="120" w:afterAutospacing="0" w:line="276" w:lineRule="auto"/>
-      <w:ind w:left="360"/>
-      <w:outlineLvl w:val="3"/>
-    </w:pPr>
-    <w:rPr>
-      <w:rFonts w:ascii="Helvetica" w:eastAsiaTheme="minorHAnsi" w:hAnsi="Helvetica" w:cs="Helvetica"/>
-      <w:iCs/>
-      <w:color w:val="0A2A78"/>
-      <w:spacing w:val="-2"/>
-      <w:sz w:val="24"/>
-      <w:szCs w:val="24"/>
-    </w:rPr>
-  </w:style>
-  <w:style w:type="paragraph" w:styleId="Heading5">
-    <w:name w:val="heading 5"/>
-    <w:basedOn w:val="Normal"/>
-    <w:next w:val="Normal"/>
-    <w:link w:val="Heading5Char"/>
-    <w:uiPriority w:val="9"/>
-    <w:unhideWhenUsed/>
-    <w:qFormat/>
-    <w:rsid w:val="000F4FEF"/>
-    <w:pPr>
-      <w:keepNext/>
-      <w:keepLines/>
-      <w:spacing w:before="240" w:after="80"/>
-      <w:outlineLvl w:val="4"/>
-    </w:pPr>
-    <w:rPr>
-      <w:color w:val="666666"/>
-    </w:rPr>
-  </w:style>
-  <w:style w:type="paragraph" w:styleId="Heading6">
-    <w:name w:val="heading 6"/>
-    <w:basedOn w:val="Normal"/>
-    <w:next w:val="Normal"/>
-    <w:link w:val="Heading6Char"/>
-    <w:uiPriority w:val="9"/>
-    <w:semiHidden/>
-    <w:unhideWhenUsed/>
-    <w:qFormat/>
-    <w:rsid w:val="000F4FEF"/>
-    <w:pPr>
-      <w:keepNext/>
-      <w:keepLines/>
-      <w:spacing w:before="240" w:after="80"/>
-      <w:outlineLvl w:val="5"/>
-    </w:pPr>
-    <w:rPr>
-      <w:i/>
-      <w:color w:val="666666"/>
-    </w:rPr>
-  </w:style>
-  <w:style w:type="character" w:default="1" w:styleId="DefaultParagraphFont">
-    <w:name w:val="Default Paragraph Font"/>
-    <w:uiPriority w:val="1"/>
-    <w:unhideWhenUsed/>
-  </w:style>
-  <w:style w:type="table" w:default="1" w:styleId="TableNormal">
-    <w:name w:val="Normal Table"/>
-    <w:uiPriority w:val="99"/>
-    <w:semiHidden/>
-    <w:unhideWhenUsed/>
-    <w:tblPr>
-      <w:tblInd w:w="0" w:type="dxa"/>
-      <w:tblCellMar>
-        <w:top w:w="0" w:type="dxa"/>
-        <w:left w:w="108" w:type="dxa"/>
-        <w:bottom w:w="0" w:type="dxa"/>
-        <w:right w:w="108" w:type="dxa"/>
-      </w:tblCellMar>
-    </w:tblPr>
-  </w:style>
-  <w:style w:type="numbering" w:default="1" w:styleId="NoList">
-    <w:name w:val="No List"/>
-    <w:uiPriority w:val="99"/>
-    <w:semiHidden/>
-    <w:unhideWhenUsed/>
-  </w:style>
-  <w:style w:type="paragraph" w:customStyle="1" w:styleId="Code">
-    <w:name w:val="Code"/>
-    <w:basedOn w:val="Normal"/>
-    <w:qFormat/>
-    <w:rsid w:val="000F4FEF"/>
-    <w:rPr>
-      <w:rFonts w:ascii="Calibri" w:hAnsi="Calibri"/>
-    </w:rPr>
-  </w:style>
-  <w:style w:type="paragraph" w:customStyle="1" w:styleId="Body">
-    <w:name w:val="Body"/>
-    <w:basedOn w:val="Normal"/>
-    <w:link w:val="BodyChar"/>
-    <w:qFormat/>
-    <w:rsid w:val="000F4FEF"/>
-    <w:pPr>
-      <w:spacing w:before="0" w:beforeAutospacing="0" w:after="120" w:afterAutospacing="0" w:line="276" w:lineRule="auto"/>
-    </w:pPr>
-    <w:rPr>
-      <w:rFonts w:ascii="Helvetica" w:eastAsiaTheme="minorHAnsi" w:hAnsi="Helvetica" w:cs="Helvetica"/>
-      <w:sz w:val="24"/>
-      <w:szCs w:val="24"/>
-    </w:rPr>
-  </w:style>
-  <w:style w:type="character" w:customStyle="1" w:styleId="Heading1Char">
-    <w:name w:val="Heading 1 Char"/>
-    <w:basedOn w:val="DefaultParagraphFont"/>
-    <w:link w:val="Heading1"/>
-    <w:uiPriority w:val="9"/>
-    <w:rsid w:val="000F4FEF"/>
-    <w:rPr>
-      <w:rFonts w:ascii="Helvetica" w:hAnsi="Helvetica" w:cs="Helvetica"/>
-      <w:color w:val="0A2A78"/>
-      <w:spacing w:val="-4"/>
-      <w:sz w:val="40"/>
-      <w:szCs w:val="24"/>
-    </w:rPr>
-  </w:style>
-  <w:style w:type="paragraph" w:styleId="ListParagraph">
-    <w:name w:val="List Paragraph"/>
-    <w:basedOn w:val="BodyText"/>
-    <w:uiPriority w:val="34"/>
-    <w:qFormat/>
-    <w:rsid w:val="000F4FEF"/>
-    <w:pPr>
-      <w:widowControl w:val="0"/>
-      <w:numPr>
-        <w:numId w:val="35"/>
-      </w:numPr>
-      <w:autoSpaceDE w:val="0"/>
-      <w:autoSpaceDN w:val="0"/>
-      <w:spacing w:before="54" w:beforeAutospacing="0" w:afterAutospacing="0" w:line="276" w:lineRule="auto"/>
-    </w:pPr>
-    <w:rPr>
-      <w:rFonts w:ascii="Helvetica" w:eastAsiaTheme="minorHAnsi" w:hAnsi="Helvetica" w:cs="Helvetica"/>
-      <w:color w:val="202529"/>
-      <w:spacing w:val="-2"/>
-      <w:sz w:val="24"/>
-      <w:szCs w:val="24"/>
-    </w:rPr>
-  </w:style>
-  <w:style w:type="paragraph" w:customStyle="1" w:styleId="TFVariable">
-    <w:name w:val="TF Variable"/>
-    <w:basedOn w:val="Heading3"/>
-    <w:next w:val="Body"/>
-    <w:qFormat/>
-    <w:rsid w:val="000F4FEF"/>
-    <w:pPr>
-      <w:numPr>
-        <w:numId w:val="38"/>
-      </w:numPr>
-    </w:pPr>
-  </w:style>
-  <w:style w:type="character" w:customStyle="1" w:styleId="Heading3Char">
-    <w:name w:val="Heading 3 Char"/>
-    <w:basedOn w:val="DefaultParagraphFont"/>
-    <w:link w:val="Heading3"/>
-    <w:uiPriority w:val="9"/>
-    <w:qFormat/>
-    <w:rsid w:val="000F4FEF"/>
-    <w:rPr>
-      <w:rFonts w:ascii="Helvetica" w:eastAsiaTheme="minorHAnsi" w:hAnsi="Helvetica" w:cs="Helvetica"/>
-      <w:color w:val="0A2A78"/>
-      <w:spacing w:val="-2"/>
-      <w:sz w:val="32"/>
-      <w:szCs w:val="24"/>
-    </w:rPr>
-  </w:style>
-  <w:style w:type="paragraph" w:customStyle="1" w:styleId="interviewcondition">
-    <w:name w:val="interview condition"/>
-    <w:basedOn w:val="Normal"/>
-    <w:link w:val="interviewconditionChar"/>
-    <w:qFormat/>
-    <w:rsid w:val="00F44633"/>
-    <w:pPr>
-      <w:spacing w:after="60" w:line="360" w:lineRule="auto"/>
-    </w:pPr>
-    <w:rPr>
-      <w:rFonts w:asciiTheme="minorHAnsi" w:hAnsiTheme="minorHAnsi" w:cstheme="minorBidi"/>
-      <w:color w:val="00B050"/>
-      <w:u w:val="single"/>
-    </w:rPr>
-  </w:style>
-  <w:style w:type="character" w:customStyle="1" w:styleId="interviewconditionChar">
-    <w:name w:val="interview condition Char"/>
-    <w:basedOn w:val="DefaultParagraphFont"/>
-    <w:link w:val="interviewcondition"/>
-    <w:rsid w:val="00F44633"/>
-    <w:rPr>
-      <w:color w:val="00B050"/>
-      <w:u w:val="single"/>
-    </w:rPr>
-  </w:style>
-  <w:style w:type="paragraph" w:customStyle="1" w:styleId="interviewbutton">
-    <w:name w:val="interview button"/>
-    <w:basedOn w:val="Normal"/>
-    <w:next w:val="Normal"/>
-    <w:link w:val="interviewbuttonChar"/>
-    <w:qFormat/>
-    <w:rsid w:val="000F4FEF"/>
-    <w:pPr>
-      <w:shd w:val="clear" w:color="auto" w:fill="0070C0"/>
-      <w:spacing w:after="60" w:line="360" w:lineRule="auto"/>
-    </w:pPr>
-    <w:rPr>
-      <w:rFonts w:asciiTheme="minorHAnsi" w:hAnsiTheme="minorHAnsi" w:cstheme="minorBidi"/>
-      <w:color w:val="FFFFFF" w:themeColor="background1"/>
-      <w:szCs w:val="40"/>
-    </w:rPr>
-  </w:style>
-  <w:style w:type="character" w:customStyle="1" w:styleId="interviewbuttonChar">
-    <w:name w:val="interview button Char"/>
-    <w:basedOn w:val="DefaultParagraphFont"/>
-    <w:link w:val="interviewbutton"/>
-    <w:qFormat/>
-    <w:rsid w:val="000F4FEF"/>
-    <w:rPr>
-      <w:color w:val="FFFFFF" w:themeColor="background1"/>
-      <w:szCs w:val="40"/>
-      <w:shd w:val="clear" w:color="auto" w:fill="0070C0"/>
-    </w:rPr>
-  </w:style>
-  <w:style w:type="paragraph" w:styleId="BodyText">
-    <w:name w:val="Body Text"/>
-    <w:basedOn w:val="Normal"/>
-    <w:link w:val="BodyTextChar"/>
-    <w:uiPriority w:val="1"/>
-    <w:unhideWhenUsed/>
-    <w:qFormat/>
-    <w:rsid w:val="000F4FEF"/>
-    <w:pPr>
-      <w:spacing w:after="120"/>
-    </w:pPr>
-  </w:style>
-  <w:style w:type="character" w:customStyle="1" w:styleId="BodyTextChar">
-    <w:name w:val="Body Text Char"/>
-    <w:basedOn w:val="DefaultParagraphFont"/>
-    <w:link w:val="BodyText"/>
-    <w:uiPriority w:val="1"/>
-    <w:rsid w:val="000F4FEF"/>
-    <w:rPr>
-      <w:rFonts w:ascii="Arial" w:hAnsi="Arial" w:cs="Arial"/>
-    </w:rPr>
-  </w:style>
-  <w:style w:type="character" w:customStyle="1" w:styleId="interviewcondition2">
-    <w:name w:val="interview condition 2"/>
-    <w:basedOn w:val="Hyperlink"/>
-    <w:uiPriority w:val="1"/>
-    <w:qFormat/>
-    <w:rsid w:val="000F4FEF"/>
-    <w:rPr>
-      <w:rFonts w:ascii="Helvetica" w:eastAsia="Arial" w:hAnsi="Helvetica" w:cs="Helvetica"/>
-      <w:color w:val="009999"/>
-      <w:spacing w:val="-2"/>
-      <w:sz w:val="24"/>
-      <w:szCs w:val="24"/>
-      <w:u w:val="none"/>
-    </w:rPr>
-  </w:style>
-  <w:style w:type="character" w:styleId="Hyperlink">
-    <w:name w:val="Hyperlink"/>
-    <w:basedOn w:val="DefaultParagraphFont"/>
-    <w:uiPriority w:val="99"/>
-    <w:unhideWhenUsed/>
-    <w:rsid w:val="000F4FEF"/>
-    <w:rPr>
-      <w:rFonts w:ascii="Helvetica" w:hAnsi="Helvetica" w:cs="Helvetica"/>
-      <w:color w:val="0563C1" w:themeColor="hyperlink"/>
-      <w:spacing w:val="-2"/>
-      <w:sz w:val="24"/>
-      <w:szCs w:val="24"/>
-      <w:u w:val="none"/>
-    </w:rPr>
-  </w:style>
-  <w:style w:type="paragraph" w:customStyle="1" w:styleId="variable">
-    <w:name w:val="variable"/>
-    <w:basedOn w:val="Normal"/>
-    <w:qFormat/>
-    <w:rsid w:val="00B61CCF"/>
-    <w:pPr>
-      <w:spacing w:after="120" w:line="276" w:lineRule="auto"/>
-    </w:pPr>
-    <w:rPr>
-      <w:color w:val="FF7C80"/>
-      <w:shd w:val="clear" w:color="auto" w:fill="FFFFCC"/>
-      <w:lang w:val="en"/>
-    </w:rPr>
-  </w:style>
-  <w:style w:type="character" w:customStyle="1" w:styleId="Heading2Char">
-    <w:name w:val="Heading 2 Char"/>
-    <w:basedOn w:val="DefaultParagraphFont"/>
-    <w:link w:val="Heading2"/>
-    <w:uiPriority w:val="9"/>
-    <w:rsid w:val="000F4FEF"/>
-    <w:rPr>
-      <w:rFonts w:ascii="Helvetica" w:eastAsiaTheme="minorHAnsi" w:hAnsi="Helvetica" w:cs="Helvetica"/>
-      <w:color w:val="0A2A78"/>
-      <w:spacing w:val="-2"/>
-      <w:sz w:val="36"/>
-      <w:szCs w:val="24"/>
-    </w:rPr>
-  </w:style>
-  <w:style w:type="character" w:customStyle="1" w:styleId="Heading4Char">
-    <w:name w:val="Heading 4 Char"/>
-    <w:basedOn w:val="DefaultParagraphFont"/>
-    <w:link w:val="Heading4"/>
-    <w:uiPriority w:val="9"/>
-    <w:qFormat/>
-    <w:rsid w:val="000F4FEF"/>
-    <w:rPr>
-      <w:rFonts w:ascii="Helvetica" w:eastAsiaTheme="minorHAnsi" w:hAnsi="Helvetica" w:cs="Helvetica"/>
-      <w:iCs/>
-      <w:color w:val="0A2A78"/>
-      <w:spacing w:val="-2"/>
-      <w:sz w:val="24"/>
-      <w:szCs w:val="24"/>
-    </w:rPr>
-  </w:style>
-  <w:style w:type="paragraph" w:customStyle="1" w:styleId="Example">
-    <w:name w:val="Example"/>
-    <w:basedOn w:val="Heading4"/>
-    <w:next w:val="Normal"/>
-    <w:qFormat/>
-    <w:rsid w:val="000F4FEF"/>
-  </w:style>
-  <w:style w:type="paragraph" w:customStyle="1" w:styleId="Exampleparagraph">
-    <w:name w:val="Example paragraph"/>
-    <w:basedOn w:val="Body"/>
-    <w:next w:val="Body"/>
-    <w:qFormat/>
-    <w:rsid w:val="00CA58DD"/>
-    <w:pPr>
-      <w:ind w:left="416"/>
-    </w:pPr>
-    <w:rPr>
-      <w:color w:val="202529"/>
-      <w:spacing w:val="-2"/>
-    </w:rPr>
-  </w:style>
-  <w:style w:type="paragraph" w:customStyle="1" w:styleId="ListParagraphNumbered">
-    <w:name w:val="List Paragraph Numbered"/>
-    <w:basedOn w:val="ListParagraph"/>
-    <w:qFormat/>
-    <w:rsid w:val="000F4FEF"/>
-    <w:pPr>
-      <w:numPr>
-        <w:numId w:val="36"/>
-      </w:numPr>
-    </w:pPr>
-    <w:rPr>
-      <w:b/>
-    </w:rPr>
-  </w:style>
-  <w:style w:type="paragraph" w:customStyle="1" w:styleId="ExampleorImportantblock">
-    <w:name w:val="Example or Important block"/>
-    <w:basedOn w:val="Body"/>
-    <w:qFormat/>
-    <w:rsid w:val="000F4FEF"/>
-    <w:pPr>
-      <w:widowControl w:val="0"/>
-      <w:suppressAutoHyphens/>
-      <w:ind w:left="403"/>
-    </w:pPr>
-    <w:rPr>
-      <w:color w:val="202529"/>
-      <w:spacing w:val="-2"/>
-    </w:rPr>
-  </w:style>
-  <w:style w:type="paragraph" w:customStyle="1" w:styleId="Listnumbered">
-    <w:name w:val="List numbered"/>
-    <w:basedOn w:val="Normal"/>
-    <w:qFormat/>
-    <w:rsid w:val="000F4FEF"/>
-    <w:pPr>
-      <w:widowControl w:val="0"/>
-      <w:autoSpaceDE w:val="0"/>
-      <w:autoSpaceDN w:val="0"/>
-      <w:spacing w:before="54" w:beforeAutospacing="0" w:after="120" w:afterAutospacing="0" w:line="276" w:lineRule="auto"/>
-    </w:pPr>
-    <w:rPr>
-      <w:rFonts w:ascii="Helvetica" w:eastAsiaTheme="minorHAnsi" w:hAnsi="Helvetica" w:cs="Helvetica"/>
-      <w:color w:val="202529"/>
-      <w:spacing w:val="-2"/>
-      <w:sz w:val="24"/>
-      <w:szCs w:val="24"/>
-    </w:rPr>
-  </w:style>
-  <w:style w:type="character" w:customStyle="1" w:styleId="Helptextinquestionmark">
-    <w:name w:val="Help text in question mark"/>
-    <w:basedOn w:val="DefaultParagraphFont"/>
-    <w:uiPriority w:val="1"/>
-    <w:qFormat/>
-    <w:rsid w:val="000F4FEF"/>
-    <w:rPr>
-      <w:rFonts w:ascii="Tahoma" w:hAnsi="Tahoma" w:cs="Tahoma"/>
-      <w:color w:val="FFFFFF" w:themeColor="background1"/>
-      <w:szCs w:val="24"/>
-      <w:shd w:val="clear" w:color="auto" w:fill="33CCFF"/>
-    </w:rPr>
-  </w:style>
-  <w:style w:type="character" w:customStyle="1" w:styleId="interviewtextbox">
-    <w:name w:val="interview text box"/>
-    <w:basedOn w:val="DefaultParagraphFont"/>
-    <w:uiPriority w:val="1"/>
-    <w:qFormat/>
-    <w:rsid w:val="000F4FEF"/>
-    <w:rPr>
-      <w:shd w:val="clear" w:color="auto" w:fill="D9D9D9" w:themeFill="background1" w:themeFillShade="D9"/>
-    </w:rPr>
-  </w:style>
-  <w:style w:type="character" w:customStyle="1" w:styleId="interviewhelpquestionmark">
-    <w:name w:val="interview help question mark"/>
-    <w:basedOn w:val="DefaultParagraphFont"/>
-    <w:uiPriority w:val="1"/>
-    <w:qFormat/>
-    <w:rsid w:val="000F4FEF"/>
-    <w:rPr>
-      <w:color w:val="FFFFFF" w:themeColor="background1"/>
-      <w:shd w:val="clear" w:color="auto" w:fill="9CC2E5" w:themeFill="accent5" w:themeFillTint="99"/>
-    </w:rPr>
-  </w:style>
-  <w:style w:type="paragraph" w:customStyle="1" w:styleId="ListPlevel2">
-    <w:name w:val="List P level 2"/>
-    <w:basedOn w:val="ListParagraph"/>
-    <w:qFormat/>
-    <w:rsid w:val="000F4FEF"/>
-    <w:pPr>
-      <w:ind w:left="765"/>
-    </w:pPr>
-    <w:rPr>
-      <w:color w:val="auto"/>
-      <w:spacing w:val="0"/>
-    </w:rPr>
-  </w:style>
-  <w:style w:type="paragraph" w:customStyle="1" w:styleId="ListPlevel3">
-    <w:name w:val="List P level 3"/>
-    <w:basedOn w:val="ListPlevel2"/>
-    <w:qFormat/>
-    <w:rsid w:val="000F4FEF"/>
-    <w:pPr>
-      <w:tabs>
-        <w:tab w:val="num" w:pos="360"/>
-      </w:tabs>
-      <w:ind w:left="2160"/>
-    </w:pPr>
-  </w:style>
-  <w:style w:type="paragraph" w:customStyle="1" w:styleId="ListParagraphNumberedBold">
-    <w:name w:val="List Paragraph Numbered (Bold)"/>
-    <w:basedOn w:val="ListParagraphNumbered"/>
-    <w:qFormat/>
-    <w:rsid w:val="00AA522D"/>
-    <w:pPr>
-      <w:ind w:left="405"/>
-    </w:pPr>
-    <w:rPr>
-      <w:color w:val="auto"/>
-      <w:spacing w:val="0"/>
-    </w:rPr>
-  </w:style>
-  <w:style w:type="paragraph" w:styleId="Footer">
-    <w:name w:val="footer"/>
-    <w:basedOn w:val="Normal"/>
-    <w:link w:val="FooterChar"/>
-    <w:uiPriority w:val="99"/>
-    <w:unhideWhenUsed/>
-    <w:rsid w:val="000F4FEF"/>
-    <w:pPr>
-      <w:tabs>
-        <w:tab w:val="center" w:pos="4680"/>
-        <w:tab w:val="right" w:pos="9360"/>
-      </w:tabs>
-    </w:pPr>
-  </w:style>
-  <w:style w:type="character" w:customStyle="1" w:styleId="FooterChar">
-    <w:name w:val="Footer Char"/>
-    <w:basedOn w:val="DefaultParagraphFont"/>
-    <w:link w:val="Footer"/>
-    <w:uiPriority w:val="99"/>
-    <w:qFormat/>
-    <w:rsid w:val="000F4FEF"/>
-    <w:rPr>
-      <w:rFonts w:ascii="Arial" w:hAnsi="Arial" w:cs="Arial"/>
-    </w:rPr>
-  </w:style>
-  <w:style w:type="paragraph" w:customStyle="1" w:styleId="FooterRight">
-    <w:name w:val="Footer Right"/>
-    <w:basedOn w:val="Footer"/>
-    <w:qFormat/>
-    <w:rsid w:val="00FA6057"/>
-    <w:pPr>
-      <w:jc w:val="right"/>
-    </w:pPr>
-  </w:style>
-  <w:style w:type="paragraph" w:customStyle="1" w:styleId="interviewsituationpara">
-    <w:name w:val="interview situation para"/>
-    <w:basedOn w:val="Body"/>
-    <w:next w:val="interviewsituationcondition"/>
-    <w:link w:val="interviewsituationparaChar"/>
-    <w:qFormat/>
-    <w:rsid w:val="00DD3DDA"/>
-    <w:pPr>
-      <w:spacing w:before="120" w:after="0" w:line="240" w:lineRule="auto"/>
-      <w:contextualSpacing/>
-    </w:pPr>
-  </w:style>
-  <w:style w:type="character" w:customStyle="1" w:styleId="interviewsituationparaChar">
-    <w:name w:val="interview situation para Char"/>
-    <w:basedOn w:val="BodyChar"/>
-    <w:link w:val="interviewsituationpara"/>
-    <w:rsid w:val="00DD3DDA"/>
-    <w:rPr>
-      <w:rFonts w:ascii="Helvetica" w:eastAsiaTheme="minorHAnsi" w:hAnsi="Helvetica" w:cs="Helvetica"/>
-      <w:sz w:val="24"/>
-      <w:szCs w:val="24"/>
-    </w:rPr>
-  </w:style>
-  <w:style w:type="paragraph" w:customStyle="1" w:styleId="Done">
-    <w:name w:val="Done"/>
-    <w:basedOn w:val="ListParagraph"/>
-    <w:qFormat/>
-    <w:rsid w:val="00DD3DDA"/>
-    <w:pPr>
-      <w:numPr>
-        <w:ilvl w:val="1"/>
-        <w:numId w:val="19"/>
-      </w:numPr>
-    </w:pPr>
-  </w:style>
-  <w:style w:type="character" w:customStyle="1" w:styleId="subject">
-    <w:name w:val="subject"/>
-    <w:basedOn w:val="DefaultParagraphFont"/>
-    <w:rsid w:val="000F4FEF"/>
-  </w:style>
-  <w:style w:type="character" w:customStyle="1" w:styleId="convention">
-    <w:name w:val="convention"/>
-    <w:basedOn w:val="DefaultParagraphFont"/>
-    <w:uiPriority w:val="1"/>
-    <w:qFormat/>
-    <w:rsid w:val="000F4FEF"/>
-    <w:rPr>
-      <w:sz w:val="22"/>
-      <w:szCs w:val="22"/>
-      <w:shd w:val="clear" w:color="auto" w:fill="A6A6A6" w:themeFill="background1" w:themeFillShade="A6"/>
-    </w:rPr>
-  </w:style>
-  <w:style w:type="paragraph" w:customStyle="1" w:styleId="Default">
-    <w:name w:val="Default"/>
-    <w:rsid w:val="000F4FEF"/>
-    <w:pPr>
-      <w:autoSpaceDE w:val="0"/>
-      <w:autoSpaceDN w:val="0"/>
-      <w:adjustRightInd w:val="0"/>
-      <w:spacing w:beforeAutospacing="0" w:after="0" w:afterAutospacing="0" w:line="240" w:lineRule="auto"/>
-    </w:pPr>
-    <w:rPr>
-      <w:rFonts w:ascii="Arial" w:eastAsiaTheme="minorHAnsi" w:hAnsi="Arial" w:cs="Arial"/>
-      <w:color w:val="000000"/>
-      <w:sz w:val="24"/>
-      <w:szCs w:val="24"/>
-    </w:rPr>
-  </w:style>
-  <w:style w:type="paragraph" w:customStyle="1" w:styleId="Example-bulleted">
-    <w:name w:val="Example - bulleted"/>
-    <w:basedOn w:val="Body"/>
-    <w:qFormat/>
-    <w:rsid w:val="000F4FEF"/>
-    <w:pPr>
-      <w:widowControl w:val="0"/>
-      <w:numPr>
-        <w:numId w:val="28"/>
-      </w:numPr>
-      <w:suppressAutoHyphens/>
-      <w:autoSpaceDE w:val="0"/>
-      <w:autoSpaceDN w:val="0"/>
-      <w:spacing w:before="60"/>
-    </w:pPr>
-    <w:rPr>
-      <w:rFonts w:eastAsia="Calibri"/>
-    </w:rPr>
-  </w:style>
-  <w:style w:type="character" w:customStyle="1" w:styleId="f1-light">
-    <w:name w:val="f1-light"/>
-    <w:basedOn w:val="DefaultParagraphFont"/>
-    <w:rsid w:val="000F4FEF"/>
-  </w:style>
-  <w:style w:type="paragraph" w:customStyle="1" w:styleId="H3numberedfordirections">
-    <w:name w:val="H3 numbered for directions"/>
-    <w:basedOn w:val="Heading3"/>
-    <w:next w:val="Normal"/>
-    <w:qFormat/>
-    <w:rsid w:val="000F4FEF"/>
-    <w:pPr>
-      <w:numPr>
-        <w:numId w:val="29"/>
-      </w:numPr>
-      <w:outlineLvl w:val="9"/>
-    </w:pPr>
-  </w:style>
-  <w:style w:type="character" w:customStyle="1" w:styleId="Interviewbutton0">
-    <w:name w:val="Interview button"/>
-    <w:basedOn w:val="DefaultParagraphFont"/>
-    <w:uiPriority w:val="1"/>
-    <w:qFormat/>
-    <w:rsid w:val="000F4FEF"/>
-    <w:rPr>
-      <w:color w:val="FFFFFF" w:themeColor="background1"/>
-      <w:bdr w:val="none" w:sz="0" w:space="0" w:color="auto"/>
-      <w:shd w:val="clear" w:color="auto" w:fill="0B5ED8"/>
-    </w:rPr>
-  </w:style>
-  <w:style w:type="paragraph" w:customStyle="1" w:styleId="interviewbuttons">
-    <w:name w:val="interview buttons"/>
-    <w:basedOn w:val="Normal"/>
-    <w:qFormat/>
-    <w:rsid w:val="000F4FEF"/>
-    <w:pPr>
-      <w:pBdr>
-        <w:top w:val="single" w:sz="12" w:space="1" w:color="0070C0"/>
-        <w:left w:val="single" w:sz="12" w:space="4" w:color="0070C0"/>
-        <w:bottom w:val="single" w:sz="12" w:space="1" w:color="0070C0"/>
-        <w:right w:val="single" w:sz="12" w:space="4" w:color="0070C0"/>
-        <w:between w:val="single" w:sz="12" w:space="1" w:color="0070C0"/>
-        <w:bar w:val="single" w:sz="12" w:color="0070C0"/>
-      </w:pBdr>
-      <w:shd w:val="clear" w:color="auto" w:fill="FFFFFF"/>
-      <w:spacing w:after="0"/>
-      <w:ind w:left="-58" w:right="-216"/>
-    </w:pPr>
-    <w:rPr>
-      <w:sz w:val="21"/>
-      <w:szCs w:val="21"/>
-    </w:rPr>
-  </w:style>
-  <w:style w:type="paragraph" w:customStyle="1" w:styleId="interviewcheckboxes">
-    <w:name w:val="interview checkboxes"/>
-    <w:basedOn w:val="ListParagraph"/>
-    <w:qFormat/>
-    <w:rsid w:val="000F4FEF"/>
-    <w:pPr>
-      <w:numPr>
-        <w:numId w:val="31"/>
-      </w:numPr>
-      <w:pBdr>
-        <w:top w:val="single" w:sz="12" w:space="1" w:color="0070C0"/>
-        <w:left w:val="single" w:sz="12" w:space="4" w:color="0070C0"/>
-        <w:bottom w:val="single" w:sz="12" w:space="1" w:color="0070C0"/>
-        <w:right w:val="single" w:sz="12" w:space="4" w:color="0070C0"/>
-        <w:between w:val="single" w:sz="12" w:space="1" w:color="0070C0"/>
-        <w:bar w:val="single" w:sz="12" w:color="0070C0"/>
-      </w:pBdr>
-    </w:pPr>
-  </w:style>
-  <w:style w:type="character" w:customStyle="1" w:styleId="interviewclickformoreinfo-definition">
-    <w:name w:val="interview click for more info - definition"/>
-    <w:uiPriority w:val="1"/>
-    <w:qFormat/>
-    <w:rsid w:val="000F4FEF"/>
-    <w:rPr>
-      <w:color w:val="00B050"/>
-      <w:u w:val="dash" w:color="92D050"/>
-    </w:rPr>
-  </w:style>
-  <w:style w:type="character" w:customStyle="1" w:styleId="InterviewCommentText">
-    <w:name w:val="Interview Comment Text"/>
-    <w:basedOn w:val="BodyTextChar"/>
-    <w:uiPriority w:val="1"/>
-    <w:qFormat/>
-    <w:rsid w:val="000F4FEF"/>
-    <w:rPr>
-      <w:rFonts w:ascii="Helvetica" w:eastAsia="Arial" w:hAnsi="Helvetica" w:cs="Helvetica"/>
-      <w:color w:val="7030A0"/>
-      <w:spacing w:val="-2"/>
-      <w:sz w:val="24"/>
-      <w:szCs w:val="24"/>
-    </w:rPr>
-  </w:style>
-  <w:style w:type="character" w:customStyle="1" w:styleId="interviewconvention">
-    <w:name w:val="interview convention"/>
-    <w:basedOn w:val="DefaultParagraphFont"/>
-    <w:uiPriority w:val="1"/>
-    <w:qFormat/>
-    <w:rsid w:val="000F4FEF"/>
-    <w:rPr>
-      <w:sz w:val="22"/>
-      <w:szCs w:val="22"/>
-      <w:shd w:val="clear" w:color="auto" w:fill="A6A6A6" w:themeFill="background1" w:themeFillShade="A6"/>
-    </w:rPr>
-  </w:style>
-  <w:style w:type="paragraph" w:customStyle="1" w:styleId="interviewglossarywordintemplate">
-    <w:name w:val="interview glossary word in template"/>
-    <w:basedOn w:val="Normal"/>
-    <w:link w:val="interviewglossarywordintemplateChar"/>
-    <w:qFormat/>
-    <w:rsid w:val="000F4FEF"/>
-    <w:pPr>
-      <w:spacing w:after="60" w:line="360" w:lineRule="auto"/>
-    </w:pPr>
-    <w:rPr>
-      <w:rFonts w:asciiTheme="minorHAnsi" w:hAnsiTheme="minorHAnsi" w:cstheme="minorBidi"/>
-    </w:rPr>
-  </w:style>
-  <w:style w:type="character" w:customStyle="1" w:styleId="interviewglossarywordintemplateChar">
-    <w:name w:val="interview glossary word in template Char"/>
-    <w:basedOn w:val="DefaultParagraphFont"/>
-    <w:link w:val="interviewglossarywordintemplate"/>
-    <w:rsid w:val="000F4FEF"/>
-  </w:style>
-  <w:style w:type="character" w:customStyle="1" w:styleId="interviewsituation">
-    <w:name w:val="interview situation"/>
-    <w:basedOn w:val="interviewneedstobewritten"/>
-    <w:uiPriority w:val="1"/>
-    <w:qFormat/>
-    <w:rsid w:val="00DD3DDA"/>
-    <w:rPr>
-      <w:shd w:val="clear" w:color="auto" w:fill="FFFF00"/>
-    </w:rPr>
-  </w:style>
-  <w:style w:type="character" w:customStyle="1" w:styleId="interviewneedstobewritten">
-    <w:name w:val="interview needs to be written"/>
-    <w:basedOn w:val="DefaultParagraphFont"/>
-    <w:uiPriority w:val="1"/>
-    <w:qFormat/>
-    <w:rsid w:val="000F4FEF"/>
-    <w:rPr>
-      <w:shd w:val="clear" w:color="auto" w:fill="FFFF00"/>
-    </w:rPr>
-  </w:style>
-  <w:style w:type="character" w:customStyle="1" w:styleId="interviewPAPtexttrigger">
-    <w:name w:val="interview PAP text trigger"/>
-    <w:basedOn w:val="DefaultParagraphFont"/>
-    <w:uiPriority w:val="1"/>
-    <w:qFormat/>
-    <w:rsid w:val="000F4FEF"/>
-    <w:rPr>
-      <w:shd w:val="clear" w:color="auto" w:fill="009999"/>
-    </w:rPr>
-  </w:style>
-  <w:style w:type="character" w:customStyle="1" w:styleId="interviewpdf">
-    <w:name w:val="interview pdf"/>
-    <w:basedOn w:val="DefaultParagraphFont"/>
-    <w:uiPriority w:val="1"/>
-    <w:qFormat/>
-    <w:rsid w:val="000F4FEF"/>
-    <w:rPr>
-      <w:b/>
-      <w:szCs w:val="24"/>
-      <w:shd w:val="clear" w:color="auto" w:fill="FF00FF"/>
-    </w:rPr>
-  </w:style>
-  <w:style w:type="paragraph" w:customStyle="1" w:styleId="interviewquestionid">
-    <w:name w:val="interview question id"/>
-    <w:basedOn w:val="BodyText"/>
-    <w:qFormat/>
-    <w:rsid w:val="000F4FEF"/>
-    <w:pPr>
-      <w:spacing w:before="240" w:after="0"/>
-    </w:pPr>
-    <w:rPr>
-      <w:color w:val="FF9F9F"/>
-    </w:rPr>
-  </w:style>
-  <w:style w:type="paragraph" w:customStyle="1" w:styleId="interviewradiobuttons">
-    <w:name w:val="interview radio buttons"/>
-    <w:basedOn w:val="ListParagraph"/>
-    <w:qFormat/>
-    <w:rsid w:val="000F4FEF"/>
-    <w:pPr>
-      <w:numPr>
-        <w:numId w:val="32"/>
-      </w:numPr>
-      <w:pBdr>
-        <w:top w:val="single" w:sz="12" w:space="1" w:color="0070C0"/>
-        <w:left w:val="single" w:sz="12" w:space="4" w:color="0070C0"/>
-        <w:bottom w:val="single" w:sz="12" w:space="1" w:color="0070C0"/>
-        <w:right w:val="single" w:sz="12" w:space="4" w:color="0070C0"/>
-        <w:between w:val="single" w:sz="12" w:space="1" w:color="0070C0"/>
-        <w:bar w:val="single" w:sz="12" w:color="0070C0"/>
-      </w:pBdr>
-      <w:shd w:val="clear" w:color="auto" w:fill="FFFFFF"/>
-      <w:spacing w:after="480" w:line="360" w:lineRule="auto"/>
-      <w:ind w:right="-220"/>
-    </w:pPr>
-    <w:rPr>
-      <w:szCs w:val="21"/>
-    </w:rPr>
-  </w:style>
-  <w:style w:type="character" w:customStyle="1" w:styleId="interviewvariable">
-    <w:name w:val="interview variable"/>
-    <w:basedOn w:val="DefaultParagraphFont"/>
-    <w:uiPriority w:val="1"/>
-    <w:qFormat/>
-    <w:rsid w:val="000F4FEF"/>
-    <w:rPr>
-      <w:color w:val="FF7C80"/>
-      <w:shd w:val="clear" w:color="auto" w:fill="FFFFCC"/>
-    </w:rPr>
-  </w:style>
-  <w:style w:type="paragraph" w:customStyle="1" w:styleId="Listnumberedunderbullet">
-    <w:name w:val="List numbered under bullet"/>
-    <w:basedOn w:val="Normal"/>
-    <w:qFormat/>
-    <w:rsid w:val="000F4FEF"/>
-    <w:pPr>
-      <w:widowControl w:val="0"/>
-      <w:numPr>
-        <w:ilvl w:val="4"/>
-        <w:numId w:val="33"/>
-      </w:numPr>
-      <w:autoSpaceDE w:val="0"/>
-      <w:autoSpaceDN w:val="0"/>
-      <w:spacing w:before="54" w:beforeAutospacing="0" w:after="120" w:afterAutospacing="0" w:line="276" w:lineRule="auto"/>
-    </w:pPr>
-    <w:rPr>
-      <w:rFonts w:ascii="Helvetica" w:eastAsiaTheme="minorHAnsi" w:hAnsi="Helvetica" w:cs="Helvetica"/>
-      <w:color w:val="202529"/>
-      <w:spacing w:val="-2"/>
-      <w:sz w:val="24"/>
-      <w:szCs w:val="24"/>
-    </w:rPr>
-  </w:style>
-  <w:style w:type="paragraph" w:customStyle="1" w:styleId="MLRIAdvocacyguideforPDFPart">
-    <w:name w:val="MLRI Advocacy guide for PDF Part"/>
-    <w:basedOn w:val="Normal"/>
-    <w:qFormat/>
-    <w:rsid w:val="000F4FEF"/>
-    <w:pPr>
-      <w:spacing w:before="480" w:after="80" w:line="320" w:lineRule="exact"/>
-      <w:ind w:left="187"/>
-    </w:pPr>
-    <w:rPr>
-      <w:rFonts w:ascii="Bookman Old Style" w:hAnsi="Bookman Old Style"/>
-      <w:color w:val="808080"/>
-      <w:szCs w:val="28"/>
-    </w:rPr>
-  </w:style>
-  <w:style w:type="character" w:customStyle="1" w:styleId="NumChar">
-    <w:name w:val="NumChar"/>
-    <w:basedOn w:val="DefaultParagraphFont"/>
-    <w:uiPriority w:val="1"/>
-    <w:qFormat/>
-    <w:rsid w:val="000F4FEF"/>
-    <w:rPr>
-      <w:rFonts w:eastAsiaTheme="minorHAnsi"/>
-    </w:rPr>
-  </w:style>
-  <w:style w:type="paragraph" w:customStyle="1" w:styleId="one-indent">
-    <w:name w:val="one-indent"/>
-    <w:basedOn w:val="Normal"/>
-    <w:rsid w:val="000F4FEF"/>
-    <w:pPr>
-      <w:spacing w:before="100" w:after="100"/>
-    </w:pPr>
-    <w:rPr>
-      <w:rFonts w:ascii="Times New Roman" w:eastAsia="Times New Roman" w:hAnsi="Times New Roman" w:cs="Times New Roman"/>
-      <w:sz w:val="24"/>
-      <w:szCs w:val="24"/>
-    </w:rPr>
-  </w:style>
-  <w:style w:type="character" w:customStyle="1" w:styleId="small">
-    <w:name w:val="small"/>
-    <w:basedOn w:val="DefaultParagraphFont"/>
-    <w:rsid w:val="000F4FEF"/>
-    <w:rPr>
-      <w:rFonts w:cs="Times New Roman"/>
-    </w:rPr>
-  </w:style>
-  <w:style w:type="paragraph" w:customStyle="1" w:styleId="StyleHeading1Hanging008">
-    <w:name w:val="Style Heading 1 + Hanging:  0.08&quot;"/>
-    <w:basedOn w:val="Heading1"/>
-    <w:qFormat/>
-    <w:rsid w:val="000F4FEF"/>
-    <w:pPr>
-      <w:spacing w:before="120"/>
-      <w:ind w:hanging="115"/>
-    </w:pPr>
-    <w:rPr>
-      <w:rFonts w:eastAsia="Times New Roman" w:cs="Times New Roman"/>
-      <w:szCs w:val="20"/>
-    </w:rPr>
-  </w:style>
-  <w:style w:type="numbering" w:customStyle="1" w:styleId="Style1">
-    <w:name w:val="Style1"/>
-    <w:uiPriority w:val="99"/>
-    <w:rsid w:val="000F4FEF"/>
-    <w:pPr>
-      <w:numPr>
-        <w:numId w:val="17"/>
-      </w:numPr>
-    </w:pPr>
-  </w:style>
-  <w:style w:type="paragraph" w:customStyle="1" w:styleId="TableParagraph">
-    <w:name w:val="Table Paragraph"/>
-    <w:basedOn w:val="Normal"/>
-    <w:uiPriority w:val="1"/>
-    <w:qFormat/>
-    <w:rsid w:val="000F4FEF"/>
-  </w:style>
-  <w:style w:type="character" w:customStyle="1" w:styleId="UnresolvedMention">
-    <w:name w:val="Unresolved Mention"/>
+  <w:style w:type="character" w:customStyle="1" w:styleId="UnresolvedMention1">
+    <w:name w:val="Unresolved Mention1"/>
     <w:basedOn w:val="DefaultParagraphFont"/>
     <w:uiPriority w:val="99"/>
     <w:semiHidden/>
@@ -7736,7 +5871,7 @@
   <a:extraClrSchemeLst/>
   <a:extLst>
     <a:ext uri="{05A4C25C-085E-4340-85A3-A5531E510DB2}">
-      <thm15:themeFamily xmlns="" xmlns:thm15="http://schemas.microsoft.com/office/thememl/2012/main" name="Office Theme" id="{62F939B6-93AF-4DB8-9C6B-D6C7DFDC589F}" vid="{4A3C46E8-61CC-4603-A589-7422A47A8E4A}"/>
+      <thm15:themeFamily xmlns:thm15="http://schemas.microsoft.com/office/thememl/2012/main" name="Office Theme" id="{62F939B6-93AF-4DB8-9C6B-D6C7DFDC589F}" vid="{4A3C46E8-61CC-4603-A589-7422A47A8E4A}"/>
     </a:ext>
   </a:extLst>
 </a:theme>

</xml_diff>